<commit_message>
Original-order manuscript: reduce references from 58 to 45; repair two fields emptied by earlier edits
Co-Authored-By: Claude Sonnet 5.5 <noreply@anthropic.com>
Claude-Session: https://claude.ai/code/session_01Y1g9vByMLTE8eGJ9K81zt6
</commit_message>
<xml_diff>
--- a/Manuscript_AS_original_order.docx
+++ b/Manuscript_AS_original_order.docx
@@ -549,7 +549,7 @@
         <w:rPr>
           <w:lang w:val="en-US"/>
         </w:rPr>
-        <w:instrText xml:space="preserve"> ADDIN ZOTERO_ITEM CSL_CITATION {"citationID":"gcwrXJv5","properties":{"unsorted":false,"formattedCitation":"\\super [1\\uc0\\u8211{}5]\\nosupersub{}","plainCitation":"[1–5]","noteIndex":0},"citationItems":[{"id":2422,"uris":["http://zotero.org/users/16939557/items/7HK364IB","http://zotero.org/users/16939557/items/HI3MKCRP"],"itemData":{"id":2422,"type":"article-journal","citation-key":"zhengBiodegradableMetals2014","container-title":"Materials Science and Engineering: R: Reports","DOI":"10.1016/j.mser.2014.01.001","ISSN":"0927796X","journalAbbreviation":"Materials Science and Engineering: R: Reports","language":"en","page":"1-34","source":"DOI.org (Crossref)","title":"Biodegradable metals","volume":"77","author":[{"family":"Zheng","given":"Y.F."},{"family":"Gu","given":"X.N."},{"family":"Witte","given":"F."}],"issued":{"date-parts":[["2014",3]]}}},{"id":4051,"uris":["http://zotero.org/users/16939557/items/NLMFFJG3"],"itemData":{"id":4051,"type":"article-journal","abstract":"Abstract\n            Repair of large bone defects caused by trauma or disease poses significant clinical challenges. Extensive research has focused on metallic materials for bone repair because of their favorable mechanical properties, biocompatibility, and manufacturing processes. Traditional metallic materials, such as stainless steel and titanium alloys, are widely used in clinics. Biodegradable metallic materials, such as iron, magnesium, and zinc alloys, are promising candidates for bone repair because of their ability to degrade over time. Emerging metallic materials, such as porous tantalum and bismuth alloys, have gained attention as bone implants owing to their bone affinity and multifunctionality. However, these metallic materials encounter many practical difficulties that require urgent improvement. This article systematically reviews and analyzes the metallic materials used for bone repair, providing a comprehensive overview of their morphology, mechanical properties, biocompatibility, and in vivo implantation. Furthermore, the strategies and efforts made to address the short‐comings of metallic materials are summarized. Finally, the perspectives for the development of metallic materials to guide future research and advancements in clinical practice are identified.","citation-key":"fanMetallicMaterialsBone2024","container-title":"Advanced Healthcare Materials","DOI":"10.1002/adhm.202302132","ISSN":"2192-2640, 2192-2659","issue":"3","journalAbbreviation":"Adv Healthcare Materials","language":"en","page":"2302132","source":"DOI.org (Crossref)","title":"Metallic Materials for Bone Repair","volume":"13","author":[{"family":"Fan","given":"Linlin"},{"family":"Chen","given":"Sen"},{"family":"Yang","given":"Minghui"},{"family":"Liu","given":"Yajun"},{"family":"Liu","given":"Jing"}],"issued":{"date-parts":[["2024",1]]}}},{"id":4052,"uris":["http://zotero.org/users/16939557/items/9885FN5J"],"itemData":{"id":4052,"type":"article-journal","citation-key":"hanCurrentStatusOutlook2019","container-title":"Materials Today","DOI":"10.1016/j.mattod.2018.05.018","ISSN":"13697021","journalAbbreviation":"Materials Today","language":"en","page":"57-71","source":"DOI.org (Crossref)","title":"Current status and outlook on the clinical translation of biodegradable metals","volume":"23","author":[{"family":"Han","given":"Hyung-Seop"},{"family":"Loffredo","given":"Sergio"},{"family":"Jun","given":"Indong"},{"family":"Edwards","given":"James"},{"family":"Kim","given":"Yu-Chan"},{"family":"Seok","given":"Hyun-Kwang"},{"family":"Witte","given":"Frank"},{"family":"Mantovani","given":"Diego"},{"family":"Glyn-Jones","given":"Sion"}],"issued":{"date-parts":[["2019",3]]}}},{"id":4055,"uris":["http://zotero.org/users/16939557/items/SEXZHEDE"],"itemData":{"id":4055,"type":"article-journal","citation-key":"liProgressBiodegradableMetals2014","container-title":"Progress in Natural Science: Materials International","DOI":"10.1016/j.pnsc.2014.08.014","ISSN":"10020071","issue":"5","journalAbbreviation":"Progress in Natural Science: Materials International","language":"en","page":"414-422","source":"DOI.org (Crossref)","title":"Progress of biodegradable metals","volume":"24","author":[{"family":"Li","given":"Huafang"},{"family":"Zheng","given":"Yufeng"},{"family":"Qin","given":"Ling"}],"issued":{"date-parts":[["2014",10]]}}},{"id":4050,"uris":["http://zotero.org/users/16939557/items/Z3WHKH2K"],"itemData":{"id":4050,"type":"article-journal","abstract":"Recent progress made in biomaterials and their clinical applications is well known. In the last five decades, great advances have been made in the field of biomaterials, including ceramics, glasses, polymers, composites, glass-ceramics and metal alloys. A variety of bioimplants are currently used in either one of the aforesaid forms. Some of these materials are designed to degrade or to be resorbed inside the body rather than removing the implant after its function is served. Many properties such as mechanical properties, non-toxicity, surface modification, degradation rate, biocompatibility, and corrosion rate and scaffold design are taken into consideration. The current review focuses on state-of-the-art biodegradable bioceramics, polymers, metal alloys and a few implants that employ bioresorbable/biodegradable materials. The essential functions, properties and their critical factors are discussed in detail, in addition to their challenges to be overcome.","citation-key":"prakasamBiodegradableMaterialsMetallic2017","container-title":"Journal of Functional Biomaterials","DOI":"10.3390/jfb8040044","ISSN":"2079-4983","issue":"4","journalAbbreviation":"JFB","language":"en","page":"44","source":"DOI.org (Crossref)","title":"Biodegradable Materials and Metallic Implants—A Review","volume":"8","author":[{"family":"Prakasam","given":"Mythili"},{"family":"Locs","given":"Janis"},{"family":"Salma-Ancane","given":"Kristine"},{"family":"Loca","given":"Dagnija"},{"family":"Largeteau","given":"Alain"},{"family":"Berzina-Cimdina","given":"Liga"}],"issued":{"date-parts":[["2017",9,26]]}}}],"schema":"https://github.com/citation-style-language/schema/raw/master/csl-citation.json"} </w:instrText>
+        <w:instrText xml:space="preserve"> ADDIN ZOTERO_ITEM CSL_CITATION {"citationID":"gcwrXJv5","properties":{"unsorted":false,"formattedCitation":"\\super [1\\uc0\\u8211{}3]\\nosupersub{}","plainCitation":"[1–3]","noteIndex":0},"citationItems":[{"id":2422,"uris":["http://zotero.org/users/16939557/items/7HK364IB","http://zotero.org/users/16939557/items/HI3MKCRP"],"itemData":{"id":2422,"type":"article-journal","citation-key":"zhengBiodegradableMetals2014","container-title":"Materials Science and Engineering: R: Reports","DOI":"10.1016/j.mser.2014.01.001","ISSN":"0927796X","journalAbbreviation":"Materials Science and Engineering: R: Reports","language":"en","page":"1-34","source":"DOI.org (Crossref)","title":"Biodegradable metals","volume":"77","author":[{"family":"Zheng","given":"Y.F."},{"family":"Gu","given":"X.N."},{"family":"Witte","given":"F."}],"issued":{"date-parts":[["2014",3]]}}},{"id":4051,"uris":["http://zotero.org/users/16939557/items/NLMFFJG3"],"itemData":{"id":4051,"type":"article-journal","abstract":"Abstract\n            Repair of large bone defects caused by trauma or disease poses significant clinical challenges. Extensive research has focused on metallic materials for bone repair because of their favorable mechanical properties, biocompatibility, and manufacturing processes. Traditional metallic materials, such as stainless steel and titanium alloys, are widely used in clinics. Biodegradable metallic materials, such as iron, magnesium, and zinc alloys, are promising candidates for bone repair because of their ability to degrade over time. Emerging metallic materials, such as porous tantalum and bismuth alloys, have gained attention as bone implants owing to their bone affinity and multifunctionality. However, these metallic materials encounter many practical difficulties that require urgent improvement. This article systematically reviews and analyzes the metallic materials used for bone repair, providing a comprehensive overview of their morphology, mechanical properties, biocompatibility, and in vivo implantation. Furthermore, the strategies and efforts made to address the short‐comings of metallic materials are summarized. Finally, the perspectives for the development of metallic materials to guide future research and advancements in clinical practice are identified.","citation-key":"fanMetallicMaterialsBone2024","container-title":"Advanced Healthcare Materials","DOI":"10.1002/adhm.202302132","ISSN":"2192-2640, 2192-2659","issue":"3","journalAbbreviation":"Adv Healthcare Materials","language":"en","page":"2302132","source":"DOI.org (Crossref)","title":"Metallic Materials for Bone Repair","volume":"13","author":[{"family":"Fan","given":"Linlin"},{"family":"Chen","given":"Sen"},{"family":"Yang","given":"Minghui"},{"family":"Liu","given":"Yajun"},{"family":"Liu","given":"Jing"}],"issued":{"date-parts":[["2024",1]]}}},{"id":4052,"uris":["http://zotero.org/users/16939557/items/9885FN5J"],"itemData":{"id":4052,"type":"article-journal","citation-key":"hanCurrentStatusOutlook2019","container-title":"Materials Today","DOI":"10.1016/j.mattod.2018.05.018","ISSN":"13697021","journalAbbreviation":"Materials Today","language":"en","page":"57-71","source":"DOI.org (Crossref)","title":"Current status and outlook on the clinical translation of biodegradable metals","volume":"23","author":[{"family":"Han","given":"Hyung-Seop"},{"family":"Loffredo","given":"Sergio"},{"family":"Jun","given":"Indong"},{"family":"Edwards","given":"James"},{"family":"Kim","given":"Yu-Chan"},{"family":"Seok","given":"Hyun-Kwang"},{"family":"Witte","given":"Frank"},{"family":"Mantovani","given":"Diego"},{"family":"Glyn-Jones","given":"Sion"}],"issued":{"date-parts":[["2019",3]]}}}],"schema":"https://github.com/citation-style-language/schema/raw/master/csl-citation.json"} </w:instrText>
       </w:r>
       <w:r>
         <w:rPr>
@@ -562,7 +562,7 @@
           <w:rFonts w:cs="Times New Roman"/>
           <w:vertAlign w:val="superscript"/>
         </w:rPr>
-        <w:t>[1–5]</w:t>
+        <w:t xml:space="preserve">[1–3]</w:t>
       </w:r>
       <w:r>
         <w:rPr>
@@ -598,7 +598,7 @@
         <w:rPr>
           <w:lang w:val="en-US"/>
         </w:rPr>
-        <w:instrText xml:space="preserve"> ADDIN ZOTERO_ITEM CSL_CITATION {"citationID":"1rGkhhoi","properties":{"unsorted":false,"formattedCitation":"\\super [6\\uc0\\u8211{}8]\\nosupersub{}","plainCitation":"[6–8]","noteIndex":0},"citationItems":[{"id":4057,"uris":["http://zotero.org/users/16939557/items/GZTNZ8IE"],"itemData":{"id":4057,"type":"article-journal","citation-key":"hermawanUpdatesResearchDevelopment2018","container-title":"Progress in Biomaterials","DOI":"10.1007/s40204-018-0091-4","ISSN":"2194-0509, 2194-0517","issue":"2","journalAbbreviation":"Prog Biomater","language":"en","page":"93-110","source":"DOI.org (Crossref)","title":"Updates on the research and development of absorbable metals for biomedical applications","volume":"7","author":[{"family":"Hermawan","given":"Hendra"}],"issued":{"date-parts":[["2018",6]]}}},{"id":4019,"uris":["http://zotero.org/users/16939557/items/JAHQ7T4K"],"itemData":{"id":4019,"type":"article-journal","abstract":"Metallic stents are used to promote revascularization and maintain patency of plaqued or damaged arteries following balloon angioplasty. To mitigate the long‐term side effects associated with corrosion‐resistant stents (i.e., chronic inflammation and late stage thrombosis), a new generation of so‐called “bioabsorbable” stents is currently being developed. The bioabsorbable coronary stents will corrode and be absorbed by the artery after completing their task as vascular scaffolding. Research spanning the last two decades has focused on biodegradable polymeric, iron‐based, and magnesium‐based stent materials. The inherent mechanical and surface properties of metals make them more attractive stent material candidates than their polymeric counterparts. A third class of metallic bioabsorbable materials that are based on zinc has been introduced in the last few years. This new zinc‐based class of materials demonstrates the potential for an absorbable metallic stent with the mechanical and biodegradation characteristics required for optimal stent performance. This review compares bioabsorbable materials and summarizes progress towards bioabsorbable stents. It emphasizes the current understanding of physiological and biological benefits of zinc and its biocompatibility. Finally, the review provides an outlook on challenges in designing zinc‐based stents of optimal mechanical properties and biodegradation rate.","citation-key":"bowenBiodegradableMetalsCardiovascular2016","container-title":"Advanced Healthcare Materials","DOI":"10.1002/adhm.201501019","ISSN":"2192-2640, 2192-2659","issue":"10","journalAbbreviation":"Adv Healthcare Materials","language":"en","license":"http://onlinelibrary.wiley.com/termsAndConditions#vor","page":"1121-1140","source":"DOI.org (Crossref)","title":"Biodegradable Metals for Cardiovascular Stents: from Clinical Concerns to Recent Zn‐Alloys","title-short":"Biodegradable Metals for Cardiovascular Stents","volume":"5","author":[{"family":"Bowen","given":"Patrick K."},{"family":"Shearier","given":"Emily R."},{"family":"Zhao","given":"Shan"},{"family":"Guillory","given":"Roger J."},{"family":"Zhao","given":"Feng"},{"family":"Goldman","given":"Jeremy"},{"family":"Drelich","given":"Jaroslaw W."}],"issued":{"date-parts":[["2016",5]]}}},{"id":4059,"uris":["http://zotero.org/users/16939557/items/6K3Z95R9"],"itemData":{"id":4059,"type":"article-journal","abstract":"This paper provides a review of recent developments in the field of Mg corrosion and puts those into context. This includes considerations of corrosion manifestations, material influences, surface treatment, anodization, coatings, inhibition, biodegradable medical applications, stress corrosion cracking, flammability, corrosion mechanisms for HP Mg, critical evaluation of corrosion mechanisms, and concluding remarks. There has been much research recently, and much research continues in this area. This is expected to produce significantly better, more‐corrosion‐resistant Mg alloys.","citation-key":"atrensReviewRecentDevelopments2015","container-title":"Advanced Engineering Materials","DOI":"10.1002/adem.201400434","ISSN":"1438-1656, 1527-2648","issue":"4","journalAbbreviation":"Adv Eng Mater","language":"en","license":"http://onlinelibrary.wiley.com/termsAndConditions#vor","page":"400-453","source":"DOI.org (Crossref)","title":"Review of Recent Developments in the Field of Magnesium Corrosion","volume":"17","author":[{"family":"Atrens","given":"Andrej"},{"family":"Song","given":"Guang‐Ling"},{"family":"Liu","given":"Ming"},{"family":"Shi","given":"Zhiming"},{"family":"Cao","given":"Fuyong"},{"family":"Dargusch","given":"Matthew S."}],"issued":{"date-parts":[["2015",4]]}}}],"schema":"https://github.com/citation-style-language/schema/raw/master/csl-citation.json"} </w:instrText>
+        <w:instrText xml:space="preserve"> ADDIN ZOTERO_ITEM CSL_CITATION {"citationID":"1rGkhhoi","properties":{"unsorted":false,"formattedCitation":"\\super [4,5]\\nosupersub{}","plainCitation":"[4,5]","noteIndex":0},"citationItems":[{"id":4019,"uris":["http://zotero.org/users/16939557/items/JAHQ7T4K"],"itemData":{"id":4019,"type":"article-journal","abstract":"Metallic stents are used to promote revascularization and maintain patency of plaqued or damaged arteries following balloon angioplasty. To mitigate the long‐term side effects associated with corrosion‐resistant stents (i.e., chronic inflammation and late stage thrombosis), a new generation of so‐called “bioabsorbable” stents is currently being developed. The bioabsorbable coronary stents will corrode and be absorbed by the artery after completing their task as vascular scaffolding. Research spanning the last two decades has focused on biodegradable polymeric, iron‐based, and magnesium‐based stent materials. The inherent mechanical and surface properties of metals make them more attractive stent material candidates than their polymeric counterparts. A third class of metallic bioabsorbable materials that are based on zinc has been introduced in the last few years. This new zinc‐based class of materials demonstrates the potential for an absorbable metallic stent with the mechanical and biodegradation characteristics required for optimal stent performance. This review compares bioabsorbable materials and summarizes progress towards bioabsorbable stents. It emphasizes the current understanding of physiological and biological benefits of zinc and its biocompatibility. Finally, the review provides an outlook on challenges in designing zinc‐based stents of optimal mechanical properties and biodegradation rate.","citation-key":"bowenBiodegradableMetalsCardiovascular2016","container-title":"Advanced Healthcare Materials","DOI":"10.1002/adhm.201501019","ISSN":"2192-2640, 2192-2659","issue":"10","journalAbbreviation":"Adv Healthcare Materials","language":"en","license":"http://onlinelibrary.wiley.com/termsAndConditions#vor","page":"1121-1140","source":"DOI.org (Crossref)","title":"Biodegradable Metals for Cardiovascular Stents: from Clinical Concerns to Recent Zn‐Alloys","title-short":"Biodegradable Metals for Cardiovascular Stents","volume":"5","author":[{"family":"Bowen","given":"Patrick K."},{"family":"Shearier","given":"Emily R."},{"family":"Zhao","given":"Shan"},{"family":"Guillory","given":"Roger J."},{"family":"Zhao","given":"Feng"},{"family":"Goldman","given":"Jeremy"},{"family":"Drelich","given":"Jaroslaw W."}],"issued":{"date-parts":[["2016",5]]}}},{"id":4059,"uris":["http://zotero.org/users/16939557/items/6K3Z95R9"],"itemData":{"id":4059,"type":"article-journal","abstract":"This paper provides a review of recent developments in the field of Mg corrosion and puts those into context. This includes considerations of corrosion manifestations, material influences, surface treatment, anodization, coatings, inhibition, biodegradable medical applications, stress corrosion cracking, flammability, corrosion mechanisms for HP Mg, critical evaluation of corrosion mechanisms, and concluding remarks. There has been much research recently, and much research continues in this area. This is expected to produce significantly better, more‐corrosion‐resistant Mg alloys.","citation-key":"atrensReviewRecentDevelopments2015","container-title":"Advanced Engineering Materials","DOI":"10.1002/adem.201400434","ISSN":"1438-1656, 1527-2648","issue":"4","journalAbbreviation":"Adv Eng Mater","language":"en","license":"http://onlinelibrary.wiley.com/termsAndConditions#vor","page":"400-453","source":"DOI.org (Crossref)","title":"Review of Recent Developments in the Field of Magnesium Corrosion","volume":"17","author":[{"family":"Atrens","given":"Andrej"},{"family":"Song","given":"Guang‐Ling"},{"family":"Liu","given":"Ming"},{"family":"Shi","given":"Zhiming"},{"family":"Cao","given":"Fuyong"},{"family":"Dargusch","given":"Matthew S."}],"issued":{"date-parts":[["2015",4]]}}}],"schema":"https://github.com/citation-style-language/schema/raw/master/csl-citation.json"} </w:instrText>
       </w:r>
       <w:r>
         <w:rPr>
@@ -611,7 +611,7 @@
           <w:rFonts w:cs="Times New Roman"/>
           <w:vertAlign w:val="superscript"/>
         </w:rPr>
-        <w:t>[6–8]</w:t>
+        <w:t xml:space="preserve">[4,5]</w:t>
       </w:r>
       <w:r>
         <w:rPr>
@@ -647,7 +647,7 @@
         <w:rPr>
           <w:lang w:val="en-US"/>
         </w:rPr>
-        <w:instrText xml:space="preserve"> ADDIN ZOTERO_ITEM CSL_CITATION {"citationID":"VbCtkV7L","properties":{"unsorted":false,"formattedCitation":"\\super [9\\uc0\\u8211{}12]\\nosupersub{}","plainCitation":"[9–12]","noteIndex":0},"citationItems":[{"id":2383,"uris":["http://zotero.org/users/16939557/items/VPZV3JTU"],"itemData":{"id":2383,"type":"article-journal","abstract":"In the last decade, iron and magnesium, both pure and alloyed, have been extensively studied as potential biodegradable metals for medical applications. However, broad experience with these material systems has uncovered critical limitations in terms of their suitability for clinical applications. Recently, zinc and zinc-based alloys have been proposed as new additions to the list of degradable metals and as promising alternatives to magnesium and iron. The main byproduct of zinc metal corrosion, Zn2+, is highly regulated within physiological systems and plays a critical role in numerous fundamental cellular processes. Zn2+ released from an implant may suppress harmful smooth muscle cells and restenosis in arteries, while stimulating beneficial osteogenesis in bone. An important limitation of pure zinc as a potential biodegradable structural support, however, lies in its low strength (σUTS ~ 30 MPa) and plasticity (ε &lt; 0.25%) that are insufficient for most medical device applications. Developing high strength and ductility zinc with sufficient hardness, while retaining its biocompatibility, is one of the main goals of metallurgical engineering. This paper will review and compare the biocompatibility, corrosion behavior and mechanical properties of pure zinc, as well as currently researched zinc alloys.","citation-key":"katarivaslevyProspectsZincStructural2017","container-title":"Metals","DOI":"10.3390/met7100402","ISSN":"2075-4701","issue":"10","journalAbbreviation":"Metals","language":"en","license":"https://creativecommons.org/licenses/by/4.0/","page":"402","source":"DOI.org (Crossref)","title":"The Prospects of Zinc as a Structural Material for Biodegradable Implants—A Review Paper","volume":"7","author":[{"family":"Katarivas Levy","given":"Galit"},{"family":"Goldman","given":"Jeremy"},{"family":"Aghion","given":"Eli"}],"issued":{"date-parts":[["2017",10,1]]}}},{"id":3667,"uris":["http://zotero.org/users/16939557/items/I4ED2BJH"],"itemData":{"id":3667,"type":"article-journal","citation-key":"vojtechMechanicalCorrosionProperties2011","container-title":"Acta Biomaterialia","DOI":"10.1016/j.actbio.2011.05.008","ISSN":"17427061","issue":"9","journalAbbreviation":"Acta Biomaterialia","language":"en","page":"3515-3522","source":"DOI.org (Crossref)","title":"Mechanical and corrosion properties of newly developed biodegradable Zn-based alloys for bone fixation","volume":"7","author":[{"family":"Vojtěch","given":"D."},{"family":"Kubásek","given":"J."},{"family":"Šerák","given":"J."},{"family":"Novák","given":"P."}],"issued":{"date-parts":[["2011",9]]}}},{"id":907,"uris":["http://zotero.org/users/16939557/items/C5KKU9Q4"],"itemData":{"id":907,"type":"article-journal","citation-key":"raoCriticalReviewBiodegradable2024","container-title":"ACS Biomaterials Science &amp; Engineering","DOI":"10.1021/acsbiomaterials.4c00210","ISSN":"2373-9878, 2373-9878","issue":"9","journalAbbreviation":"ACS Biomater. Sci. Eng.","language":"en","license":"https://doi.org/10.15223/policy-029","page":"5454-5473","source":"DOI.org (Crossref)","title":"A Critical Review of Biodegradable Zinc Alloys toward Clinical Applications","volume":"10","author":[{"family":"Rao","given":"Jiahui"},{"family":"Gao","given":"Hairui"},{"family":"Sun","given":"Jiwei"},{"family":"Yu","given":"Ran"},{"family":"Zhao","given":"Danlei"},{"family":"Ding","given":"Yumei"}],"issued":{"date-parts":[["2024",9,9]]}}},{"id":4410,"uris":["http://zotero.org/users/16939557/items/9S3RFSL4"],"itemData":{"id":4410,"type":"article-journal","abstract":"ABSTRACT\n            As a new generation of biomaterials, biodegradable zinc (Zn)‐based implants hold substantial promise for clinical use due to their favorable biocompatibility and controllable degradation behavior. This review summarizes recent progress in Zn‐based implants, focusing on the physiological roles of Zn, current Zn‐based implant systems, and relevant applicable standards. To address the critical challenges faced in practical applications, such as optimizing corrosion rate, antibacterial performance, and biocompatibility, researchers have employed innovative strategies, including alloying (e.g., Zn‐Mg, Zn‐Mn, Zn‐Li), surface modifications, and functional coatings. Meanwhile, a detailed overview is provided of in vitro and in vivo degradation evaluation systems, advances in preclinical animal studies, and the status of clinical trials, together with regulatory requirements for biodegradable metals set by domestic and international authorities. Key mechanistic and translational bottlenecks that currently limit clinical adoption are identified, together with critical directions for the rational design and standardized evaluation of next‐generation Zn‐based implants.","citation-key":"zhaoBiodegradableZnBasedImplants2026","container-title":"Advanced Science","DOI":"10.1002/advs.76066","ISSN":"2198-3844, 2198-3844","issue":"39","journalAbbreviation":"Advanced Science","language":"en","page":"e76066","source":"DOI.org (Crossref)","title":"Biodegradable Zn‐Based Implants: Progress, Challenges, and Pathways toward Clinical Translation","title-short":"Biodegradable Zn‐Based Implants","volume":"13","author":[{"family":"Zhao","given":"Panfeng"},{"family":"Wang","given":"Zhengquan"},{"family":"Yang","given":"Hui"},{"family":"Zhang","given":"Xiyuan"},{"family":"Liu","given":"Hanyuan"},{"family":"Lu","given":"Xiaotong"},{"family":"Li","given":"Xiaocheng"},{"family":"Liu","given":"Yanyan"},{"family":"Zhao","given":"Xi"},{"family":"Zhou","given":"Wenhao"},{"family":"Zheng","given":"Yufeng"}],"issued":{"date-parts":[["2026",7]]}}}],"schema":"https://github.com/citation-style-language/schema/raw/master/csl-citation.json"} </w:instrText>
+        <w:instrText xml:space="preserve"> ADDIN ZOTERO_ITEM CSL_CITATION {"citationID":"VbCtkV7L","properties":{"unsorted":false,"formattedCitation":"\\super [6\\uc0\\u8211{}9]\\nosupersub{}","plainCitation":"[6–9]","noteIndex":0},"citationItems":[{"id":2383,"uris":["http://zotero.org/users/16939557/items/VPZV3JTU"],"itemData":{"id":2383,"type":"article-journal","abstract":"In the last decade, iron and magnesium, both pure and alloyed, have been extensively studied as potential biodegradable metals for medical applications. However, broad experience with these material systems has uncovered critical limitations in terms of their suitability for clinical applications. Recently, zinc and zinc-based alloys have been proposed as new additions to the list of degradable metals and as promising alternatives to magnesium and iron. The main byproduct of zinc metal corrosion, Zn2+, is highly regulated within physiological systems and plays a critical role in numerous fundamental cellular processes. Zn2+ released from an implant may suppress harmful smooth muscle cells and restenosis in arteries, while stimulating beneficial osteogenesis in bone. An important limitation of pure zinc as a potential biodegradable structural support, however, lies in its low strength (σUTS ~ 30 MPa) and plasticity (ε &lt; 0.25%) that are insufficient for most medical device applications. Developing high strength and ductility zinc with sufficient hardness, while retaining its biocompatibility, is one of the main goals of metallurgical engineering. This paper will review and compare the biocompatibility, corrosion behavior and mechanical properties of pure zinc, as well as currently researched zinc alloys.","citation-key":"katarivaslevyProspectsZincStructural2017","container-title":"Metals","DOI":"10.3390/met7100402","ISSN":"2075-4701","issue":"10","journalAbbreviation":"Metals","language":"en","license":"https://creativecommons.org/licenses/by/4.0/","page":"402","source":"DOI.org (Crossref)","title":"The Prospects of Zinc as a Structural Material for Biodegradable Implants—A Review Paper","volume":"7","author":[{"family":"Katarivas Levy","given":"Galit"},{"family":"Goldman","given":"Jeremy"},{"family":"Aghion","given":"Eli"}],"issued":{"date-parts":[["2017",10,1]]}}},{"id":3667,"uris":["http://zotero.org/users/16939557/items/I4ED2BJH"],"itemData":{"id":3667,"type":"article-journal","citation-key":"vojtechMechanicalCorrosionProperties2011","container-title":"Acta Biomaterialia","DOI":"10.1016/j.actbio.2011.05.008","ISSN":"17427061","issue":"9","journalAbbreviation":"Acta Biomaterialia","language":"en","page":"3515-3522","source":"DOI.org (Crossref)","title":"Mechanical and corrosion properties of newly developed biodegradable Zn-based alloys for bone fixation","volume":"7","author":[{"family":"Vojtěch","given":"D."},{"family":"Kubásek","given":"J."},{"family":"Šerák","given":"J."},{"family":"Novák","given":"P."}],"issued":{"date-parts":[["2011",9]]}}},{"id":907,"uris":["http://zotero.org/users/16939557/items/C5KKU9Q4"],"itemData":{"id":907,"type":"article-journal","citation-key":"raoCriticalReviewBiodegradable2024","container-title":"ACS Biomaterials Science &amp; Engineering","DOI":"10.1021/acsbiomaterials.4c00210","ISSN":"2373-9878, 2373-9878","issue":"9","journalAbbreviation":"ACS Biomater. Sci. Eng.","language":"en","license":"https://doi.org/10.15223/policy-029","page":"5454-5473","source":"DOI.org (Crossref)","title":"A Critical Review of Biodegradable Zinc Alloys toward Clinical Applications","volume":"10","author":[{"family":"Rao","given":"Jiahui"},{"family":"Gao","given":"Hairui"},{"family":"Sun","given":"Jiwei"},{"family":"Yu","given":"Ran"},{"family":"Zhao","given":"Danlei"},{"family":"Ding","given":"Yumei"}],"issued":{"date-parts":[["2024",9,9]]}}},{"id":4410,"uris":["http://zotero.org/users/16939557/items/9S3RFSL4"],"itemData":{"id":4410,"type":"article-journal","abstract":"ABSTRACT\n            As a new generation of biomaterials, biodegradable zinc (Zn)‐based implants hold substantial promise for clinical use due to their favorable biocompatibility and controllable degradation behavior. This review summarizes recent progress in Zn‐based implants, focusing on the physiological roles of Zn, current Zn‐based implant systems, and relevant applicable standards. To address the critical challenges faced in practical applications, such as optimizing corrosion rate, antibacterial performance, and biocompatibility, researchers have employed innovative strategies, including alloying (e.g., Zn‐Mg, Zn‐Mn, Zn‐Li), surface modifications, and functional coatings. Meanwhile, a detailed overview is provided of in vitro and in vivo degradation evaluation systems, advances in preclinical animal studies, and the status of clinical trials, together with regulatory requirements for biodegradable metals set by domestic and international authorities. Key mechanistic and translational bottlenecks that currently limit clinical adoption are identified, together with critical directions for the rational design and standardized evaluation of next‐generation Zn‐based implants.","citation-key":"zhaoBiodegradableZnBasedImplants2026","container-title":"Advanced Science","DOI":"10.1002/advs.76066","ISSN":"2198-3844, 2198-3844","issue":"39","journalAbbreviation":"Advanced Science","language":"en","page":"e76066","source":"DOI.org (Crossref)","title":"Biodegradable Zn‐Based Implants: Progress, Challenges, and Pathways toward Clinical Translation","title-short":"Biodegradable Zn‐Based Implants","volume":"13","author":[{"family":"Zhao","given":"Panfeng"},{"family":"Wang","given":"Zhengquan"},{"family":"Yang","given":"Hui"},{"family":"Zhang","given":"Xiyuan"},{"family":"Liu","given":"Hanyuan"},{"family":"Lu","given":"Xiaotong"},{"family":"Li","given":"Xiaocheng"},{"family":"Liu","given":"Yanyan"},{"family":"Zhao","given":"Xi"},{"family":"Zhou","given":"Wenhao"},{"family":"Zheng","given":"Yufeng"}],"issued":{"date-parts":[["2026",7]]}}}],"schema":"https://github.com/citation-style-language/schema/raw/master/csl-citation.json"} </w:instrText>
       </w:r>
       <w:r>
         <w:rPr>
@@ -660,7 +660,7 @@
           <w:rFonts w:cs="Times New Roman"/>
           <w:vertAlign w:val="superscript"/>
         </w:rPr>
-        <w:t>[9–12]</w:t>
+        <w:t xml:space="preserve">[6–9]</w:t>
       </w:r>
       <w:r>
         <w:rPr>
@@ -704,7 +704,7 @@
           <w:color w:val="FF0000"/>
           <w:lang w:val="en-US"/>
         </w:rPr>
-        <w:instrText xml:space="preserve"> ADDIN ZOTERO_ITEM CSL_CITATION {"citationID":"LkkxaMJH","properties":{"unsorted":false,"formattedCitation":"\\super [13,14]\\nosupersub{}","plainCitation":"[13,14]","noteIndex":0},"citationItems":[{"id":3650,"uris":["http://zotero.org/users/16939557/items/N85G5KZ3"],"itemData":{"id":3650,"type":"article-journal","citation-key":"yangEvolutionDegradationMechanism2017","container-title":"Biomaterials","DOI":"10.1016/j.biomaterials.2017.08.022","ISSN":"01429612","journalAbbreviation":"Biomaterials","language":"en","page":"92-105","source":"DOI.org (Crossref)","title":"Evolution of the degradation mechanism of pure zinc stent in the one-year study of rabbit abdominal aorta model","volume":"145","author":[{"family":"Yang","given":"Hongtao"},{"family":"Wang","given":"Cong"},{"family":"Liu","given":"Chaoqiang"},{"family":"Chen","given":"Houwen"},{"family":"Wu","given":"Yifan"},{"family":"Han","given":"Jintao"},{"family":"Jia","given":"Zichang"},{"family":"Lin","given":"Wenjiao"},{"family":"Zhang","given":"Deyuan"},{"family":"Li","given":"Wenting"},{"family":"Yuan","given":"Wei"},{"family":"Guo","given":"Hui"},{"family":"Li","given":"Huafang"},{"family":"Yang","given":"Guangxin"},{"family":"Kong","given":"Deling"},{"family":"Zhu","given":"Donghui"},{"family":"Takashima","given":"Kazuki"},{"family":"Ruan","given":"Liqun"},{"family":"Nie","given":"Jianfeng"},{"family":"Li","given":"Xuan"},{"family":"Zheng","given":"Yufeng"}],"issued":{"date-parts":[["2017",11]]}}},{"id":1682,"uris":["http://zotero.org/users/16939557/items/QND25UKM"],"itemData":{"id":1682,"type":"article-journal","abstract":"Most of the studies on the finite element analysis (FEA) of biodegradable vascular stents (BVSs) during the degradation process have limited the accuracy of the simulation results due to the application of the uniform degradation model. This paper aims to establish an FEA model for the non-uniform degradation of BVSs by considering factors such as the dynamic changes of the corrosion properties and material properties of the element, as well as the pitting corrosion and stress corrosion. The results revealed that adjusting the corrosion rate according to the number of exposed surfaces of the element and reducing the stress threshold according to the corrosion status accelerates the degradation time of BVSs by 26% and 25%, respectively, compared with the uniform degradation model. The addition of the pitting model reduces the service life of the BVSs by up to 12%. The effective support of the stent to the vessel could reach at least 60% of the treatment effect before the vessel collapsed. These data indicate that the proposed non-uniform degradation model of BVSs with multiple factors produces different phenomena compared with the commonly used models and make the numerical simulation results more consistent with the real degradation scenario.","citation-key":"zhangFiniteElementAnalysis2022","container-title":"Journal of Functional Biomaterials","DOI":"10.3390/jfb13030152","ISSN":"2079-4983","issue":"3","journalAbbreviation":"JFB","language":"en","license":"https://creativecommons.org/licenses/by/4.0/","page":"152","source":"DOI.org (Crossref)","title":"Finite Element Analysis of the Non-Uniform Degradation of Biodegradable Vascular Stents","volume":"13","author":[{"family":"Zhang","given":"Hanbing"},{"family":"Du","given":"Tianming"},{"family":"Chen","given":"Shiliang"},{"family":"Liu","given":"Yang"},{"family":"Yang","given":"Yujia"},{"family":"Hou","given":"Qianwen"},{"family":"Qiao","given":"Aike"}],"issued":{"date-parts":[["2022",9,14]]}}}],"schema":"https://github.com/citation-style-language/schema/raw/master/csl-citation.json"} </w:instrText>
+        <w:instrText xml:space="preserve"> ADDIN ZOTERO_ITEM CSL_CITATION {"citationID":"LkkxaMJH","properties":{"unsorted":false,"formattedCitation":"\\super [10,11]\\nosupersub{}","plainCitation":"[10,11]","noteIndex":0},"citationItems":[{"id":3650,"uris":["http://zotero.org/users/16939557/items/N85G5KZ3"],"itemData":{"id":3650,"type":"article-journal","citation-key":"yangEvolutionDegradationMechanism2017","container-title":"Biomaterials","DOI":"10.1016/j.biomaterials.2017.08.022","ISSN":"01429612","journalAbbreviation":"Biomaterials","language":"en","page":"92-105","source":"DOI.org (Crossref)","title":"Evolution of the degradation mechanism of pure zinc stent in the one-year study of rabbit abdominal aorta model","volume":"145","author":[{"family":"Yang","given":"Hongtao"},{"family":"Wang","given":"Cong"},{"family":"Liu","given":"Chaoqiang"},{"family":"Chen","given":"Houwen"},{"family":"Wu","given":"Yifan"},{"family":"Han","given":"Jintao"},{"family":"Jia","given":"Zichang"},{"family":"Lin","given":"Wenjiao"},{"family":"Zhang","given":"Deyuan"},{"family":"Li","given":"Wenting"},{"family":"Yuan","given":"Wei"},{"family":"Guo","given":"Hui"},{"family":"Li","given":"Huafang"},{"family":"Yang","given":"Guangxin"},{"family":"Kong","given":"Deling"},{"family":"Zhu","given":"Donghui"},{"family":"Takashima","given":"Kazuki"},{"family":"Ruan","given":"Liqun"},{"family":"Nie","given":"Jianfeng"},{"family":"Li","given":"Xuan"},{"family":"Zheng","given":"Yufeng"}],"issued":{"date-parts":[["2017",11]]}}},{"id":1682,"uris":["http://zotero.org/users/16939557/items/QND25UKM"],"itemData":{"id":1682,"type":"article-journal","abstract":"Most of the studies on the finite element analysis (FEA) of biodegradable vascular stents (BVSs) during the degradation process have limited the accuracy of the simulation results due to the application of the uniform degradation model. This paper aims to establish an FEA model for the non-uniform degradation of BVSs by considering factors such as the dynamic changes of the corrosion properties and material properties of the element, as well as the pitting corrosion and stress corrosion. The results revealed that adjusting the corrosion rate according to the number of exposed surfaces of the element and reducing the stress threshold according to the corrosion status accelerates the degradation time of BVSs by 26% and 25%, respectively, compared with the uniform degradation model. The addition of the pitting model reduces the service life of the BVSs by up to 12%. The effective support of the stent to the vessel could reach at least 60% of the treatment effect before the vessel collapsed. These data indicate that the proposed non-uniform degradation model of BVSs with multiple factors produces different phenomena compared with the commonly used models and make the numerical simulation results more consistent with the real degradation scenario.","citation-key":"zhangFiniteElementAnalysis2022","container-title":"Journal of Functional Biomaterials","DOI":"10.3390/jfb13030152","ISSN":"2079-4983","issue":"3","journalAbbreviation":"JFB","language":"en","license":"https://creativecommons.org/licenses/by/4.0/","page":"152","source":"DOI.org (Crossref)","title":"Finite Element Analysis of the Non-Uniform Degradation of Biodegradable Vascular Stents","volume":"13","author":[{"family":"Zhang","given":"Hanbing"},{"family":"Du","given":"Tianming"},{"family":"Chen","given":"Shiliang"},{"family":"Liu","given":"Yang"},{"family":"Yang","given":"Yujia"},{"family":"Hou","given":"Qianwen"},{"family":"Qiao","given":"Aike"}],"issued":{"date-parts":[["2022",9,14]]}}}],"schema":"https://github.com/citation-style-language/schema/raw/master/csl-citation.json"} </w:instrText>
       </w:r>
       <w:r>
         <w:rPr>
@@ -718,7 +718,7 @@
           <w:rFonts w:cs="Times New Roman"/>
           <w:vertAlign w:val="superscript"/>
         </w:rPr>
-        <w:t>[13,14]</w:t>
+        <w:t xml:space="preserve">[10,11]</w:t>
       </w:r>
       <w:r>
         <w:rPr>
@@ -769,7 +769,7 @@
         <w:rPr>
           <w:lang w:val="en-US"/>
         </w:rPr>
-        <w:instrText xml:space="preserve"> ADDIN ZOTERO_ITEM CSL_CITATION {"citationID":"fs656Jwf","properties":{"unsorted":false,"formattedCitation":"\\super [15,16]\\nosupersub{}","plainCitation":"[15,16]","noteIndex":0},"citationItems":[{"id":3530,"uris":["http://zotero.org/users/16939557/items/M9SKJLJE"],"itemData":{"id":3530,"type":"article-journal","abstract":"Abstract\n            The combination of bioactive Zn‐2Mg alloy and additively manufactured porous scaffold is expected to achieve customizable biodegradable performance and enhanced bone regeneration. Herein, Zn‐2Mg alloy scaffolds with different porosities, including 40% (G‐40‐2), 60% (G‐60‐2), and 80% (G‐80‐2), and different unit sizes, including 1.5 mm (G‐60‐1.5), 2 mm (G‐60‐2), and 2.5 mm (G‐60‐2.5), are manufactured by a triply periodic minimal surface design and a reliable laser powder bed fusion process. With the same unit size, compressive strength (CS) and elastic modulus (EM) of scaffolds substantially decrease with increasing porosities. With the same porosity, CS and EM just slightly decrease with increasing unit sizes. The weight loss after degradation increases with increasing porosities and decreasing unit sizes. In vivo tests indicate that Zn‐2Mg alloy scaffolds exhibit satisfactory biocompatibility and osteogenic ability. The osteogenic ability of scaffolds is mainly determined by their physical and chemical characteristics. Scaffolds with lower porosities and smaller unit sizes show better osteogenesis due to their suitable pore size and larger surface area. The results indicate that the biodegradable performance of scaffolds can be accurately regulated on a large scale by structure design and the additively manufactured Zn‐2Mg alloy scaffolds have improved osteogenic ability for treating bone defects.","citation-key":"wangAdditivelyManufacturedZn2Mg2024","container-title":"Advanced Science","DOI":"10.1002/advs.202307329","ISSN":"2198-3844, 2198-3844","issue":"5","journalAbbreviation":"Advanced Science","language":"en","page":"2307329","source":"DOI.org (Crossref)","title":"Additively Manufactured Zn‐2Mg Alloy Porous Scaffolds with Customizable Biodegradable Performance and Enhanced Osteogenic Ability","volume":"11","author":[{"family":"Wang","given":"Xuan"},{"family":"Liu","given":"Aobo"},{"family":"Zhang","given":"Zhenbao"},{"family":"Hao","given":"Dazhong"},{"family":"Liang","given":"Yijie"},{"family":"Dai","given":"Jiabao"},{"family":"Jin","given":"Xiang"},{"family":"Deng","given":"Huanze"},{"family":"Zhao","given":"Yantao"},{"family":"Wen","given":"Peng"},{"family":"Li","given":"Yanfeng"}],"issued":{"date-parts":[["2024",2]]}}},{"id":3914,"uris":["http://zotero.org/users/16939557/items/I3TWLCLT"],"itemData":{"id":3914,"type":"article-journal","abstract":"Abstract\n            The advent of additively manufactured biodegradable porous metals presents a transformative opportunity to meet the criteria of ideal bone substitutes. Precisely tailoring their degradation behavior constitutes a pivotal aspect of this endeavor. In this study, we investigated the effects of topological designs on the degradation profile of laser powder bed fusion (LPBF) Zn scaffolds under dynamic in vitro immersion tests. Specifically, four types of Zn-0.4Mn-0.2Mg scaffolds (beam-based: diamond, face center cubic; surface-based: gyroid, schwarz-P) were designed and fabricated. The degradation mechanism of the scaffolds was comprehensively evaluated using both experimental and simulation methods. The results illuminate the profound impact of structural design on the degradation properties of the Zn alloy scaffolds. The beam-based diamond and face center cubic scaffolds exhibited a degradation rate of 0.08–0.12 mm per year with a relatively uniform degradation mode under dynamic immersion. On the contrary, the surface-based gyroid and Schwarz-P scaffolds demonstrated a notably reduced degradation rate due to lower permeability. This restricted the diffusion of medium ions within the pores, culminating in the accumulation of degradation products and more severe localized degradation. This study underscores the potential of topological design as a compelling strategy for tailoring the degradation profile of additively manufactured biodegradable scaffolds, thereby advancing their suitability as bone substitutes.","citation-key":"shiEffectTopologicalDesign2024","container-title":"npj Materials Degradation","DOI":"10.1038/s41529-024-00451-z","ISSN":"2397-2106","issue":"1","journalAbbreviation":"npj Mater Degrad","language":"en","page":"42","source":"DOI.org (Crossref)","title":"The effect of topological design on the degradation behavior of additively manufactured porous zinc alloy","volume":"8","author":[{"family":"Shi","given":"Yixuan"},{"family":"Xu","given":"Wei"},{"family":"Che","given":"Haodong"},{"family":"Zhao","given":"Shangyan"},{"family":"Chang","given":"Weiwei"},{"family":"Li","given":"Xuan"},{"family":"Lu","given":"Yuchen"},{"family":"Xue","given":"Chenran"},{"family":"Zhang","given":"Dawei"},{"family":"Wang","given":"Lu-Ning"},{"family":"Li","given":"Yageng"}],"issued":{"date-parts":[["2024",4,24]]}}}],"schema":"https://github.com/citation-style-language/schema/raw/master/csl-citation.json"} </w:instrText>
+        <w:instrText xml:space="preserve"> ADDIN ZOTERO_ITEM CSL_CITATION {"citationID":"fs656Jwf","properties":{"unsorted":false,"formattedCitation":"\\super [12,13]\\nosupersub{}","plainCitation":"[12,13]","noteIndex":0},"citationItems":[{"id":3530,"uris":["http://zotero.org/users/16939557/items/M9SKJLJE"],"itemData":{"id":3530,"type":"article-journal","abstract":"Abstract\n            The combination of bioactive Zn‐2Mg alloy and additively manufactured porous scaffold is expected to achieve customizable biodegradable performance and enhanced bone regeneration. Herein, Zn‐2Mg alloy scaffolds with different porosities, including 40% (G‐40‐2), 60% (G‐60‐2), and 80% (G‐80‐2), and different unit sizes, including 1.5 mm (G‐60‐1.5), 2 mm (G‐60‐2), and 2.5 mm (G‐60‐2.5), are manufactured by a triply periodic minimal surface design and a reliable laser powder bed fusion process. With the same unit size, compressive strength (CS) and elastic modulus (EM) of scaffolds substantially decrease with increasing porosities. With the same porosity, CS and EM just slightly decrease with increasing unit sizes. The weight loss after degradation increases with increasing porosities and decreasing unit sizes. In vivo tests indicate that Zn‐2Mg alloy scaffolds exhibit satisfactory biocompatibility and osteogenic ability. The osteogenic ability of scaffolds is mainly determined by their physical and chemical characteristics. Scaffolds with lower porosities and smaller unit sizes show better osteogenesis due to their suitable pore size and larger surface area. The results indicate that the biodegradable performance of scaffolds can be accurately regulated on a large scale by structure design and the additively manufactured Zn‐2Mg alloy scaffolds have improved osteogenic ability for treating bone defects.","citation-key":"wangAdditivelyManufacturedZn2Mg2024","container-title":"Advanced Science","DOI":"10.1002/advs.202307329","ISSN":"2198-3844, 2198-3844","issue":"5","journalAbbreviation":"Advanced Science","language":"en","page":"2307329","source":"DOI.org (Crossref)","title":"Additively Manufactured Zn‐2Mg Alloy Porous Scaffolds with Customizable Biodegradable Performance and Enhanced Osteogenic Ability","volume":"11","author":[{"family":"Wang","given":"Xuan"},{"family":"Liu","given":"Aobo"},{"family":"Zhang","given":"Zhenbao"},{"family":"Hao","given":"Dazhong"},{"family":"Liang","given":"Yijie"},{"family":"Dai","given":"Jiabao"},{"family":"Jin","given":"Xiang"},{"family":"Deng","given":"Huanze"},{"family":"Zhao","given":"Yantao"},{"family":"Wen","given":"Peng"},{"family":"Li","given":"Yanfeng"}],"issued":{"date-parts":[["2024",2]]}}},{"id":3914,"uris":["http://zotero.org/users/16939557/items/I3TWLCLT"],"itemData":{"id":3914,"type":"article-journal","abstract":"Abstract\n            The advent of additively manufactured biodegradable porous metals presents a transformative opportunity to meet the criteria of ideal bone substitutes. Precisely tailoring their degradation behavior constitutes a pivotal aspect of this endeavor. In this study, we investigated the effects of topological designs on the degradation profile of laser powder bed fusion (LPBF) Zn scaffolds under dynamic in vitro immersion tests. Specifically, four types of Zn-0.4Mn-0.2Mg scaffolds (beam-based: diamond, face center cubic; surface-based: gyroid, schwarz-P) were designed and fabricated. The degradation mechanism of the scaffolds was comprehensively evaluated using both experimental and simulation methods. The results illuminate the profound impact of structural design on the degradation properties of the Zn alloy scaffolds. The beam-based diamond and face center cubic scaffolds exhibited a degradation rate of 0.08–0.12 mm per year with a relatively uniform degradation mode under dynamic immersion. On the contrary, the surface-based gyroid and Schwarz-P scaffolds demonstrated a notably reduced degradation rate due to lower permeability. This restricted the diffusion of medium ions within the pores, culminating in the accumulation of degradation products and more severe localized degradation. This study underscores the potential of topological design as a compelling strategy for tailoring the degradation profile of additively manufactured biodegradable scaffolds, thereby advancing their suitability as bone substitutes.","citation-key":"shiEffectTopologicalDesign2024","container-title":"npj Materials Degradation","DOI":"10.1038/s41529-024-00451-z","ISSN":"2397-2106","issue":"1","journalAbbreviation":"npj Mater Degrad","language":"en","page":"42","source":"DOI.org (Crossref)","title":"The effect of topological design on the degradation behavior of additively manufactured porous zinc alloy","volume":"8","author":[{"family":"Shi","given":"Yixuan"},{"family":"Xu","given":"Wei"},{"family":"Che","given":"Haodong"},{"family":"Zhao","given":"Shangyan"},{"family":"Chang","given":"Weiwei"},{"family":"Li","given":"Xuan"},{"family":"Lu","given":"Yuchen"},{"family":"Xue","given":"Chenran"},{"family":"Zhang","given":"Dawei"},{"family":"Wang","given":"Lu-Ning"},{"family":"Li","given":"Yageng"}],"issued":{"date-parts":[["2024",4,24]]}}}],"schema":"https://github.com/citation-style-language/schema/raw/master/csl-citation.json"} </w:instrText>
       </w:r>
       <w:r>
         <w:rPr>
@@ -782,7 +782,7 @@
           <w:rFonts w:cs="Times New Roman"/>
           <w:vertAlign w:val="superscript"/>
         </w:rPr>
-        <w:t>[15,16]</w:t>
+        <w:t xml:space="preserve">[12,13]</w:t>
       </w:r>
       <w:r>
         <w:rPr>
@@ -832,7 +832,7 @@
         <w:rPr>
           <w:lang w:val="en-US"/>
         </w:rPr>
-        <w:instrText xml:space="preserve"> ADDIN ZOTERO_ITEM CSL_CITATION {"citationID":"iN8kgDlX","properties":{"unsorted":false,"formattedCitation":"\\super [17\\uc0\\u8211{}19]\\nosupersub{}","plainCitation":"[17–19]","noteIndex":0},"citationItems":[{"id":4063,"uris":["http://zotero.org/users/16939557/items/XXF93JXQ"],"itemData":{"id":4063,"type":"article-journal","citation-key":"yangVitroVivoStudies2018","container-title":"Acta Biomaterialia","DOI":"10.1016/j.actbio.2018.03.007","ISSN":"17427061","journalAbbreviation":"Acta Biomaterialia","language":"en","page":"200-214","source":"DOI.org (Crossref)","title":"In vitro and in vivo studies on zinc-hydroxyapatite composites as novel biodegradable metal matrix composite for orthopedic applications","volume":"71","author":[{"family":"Yang","given":"Hongtao"},{"family":"Qu","given":"Xinhua"},{"family":"Lin","given":"Wenjiao"},{"family":"Wang","given":"Cong"},{"family":"Zhu","given":"Donghui"},{"family":"Dai","given":"Kerong"},{"family":"Zheng","given":"Yufeng"}],"issued":{"date-parts":[["2018",4]]}}},{"id":1967,"uris":["http://zotero.org/users/16939557/items/AW4T6BVH"],"itemData":{"id":1967,"type":"article-journal","citation-key":"albaraghthehSilicoStudiesMagnesiumbased2022","container-title":"Journal of Magnesium and Alloys","DOI":"10.1016/j.jma.2022.09.029","ISSN":"2213-9567","issue":"11","language":"en","license":"https://www.elsevier.com/tdm/userlicense/1.0/","page":"2968-2996","publisher":"Elsevier BV","source":"Crossref","title":"In silico studies of magnesium-based implants: A review of the current stage and challenges","title-short":"In silico studies of magnesium-based implants","volume":"10","author":[{"family":"Albaraghtheh","given":"Tamadur"},{"family":"Willumeit-Römer","given":"Regine"},{"family":"Zeller-Plumhoff","given":"Berit"}],"issued":{"date-parts":[["2022",11]]}}},{"id":306,"uris":["http://zotero.org/users/16939557/items/Q7DJVU79"],"itemData":{"id":306,"type":"article-journal","abstract":"The field of percutaneous coronary intervention has witnessed many progressions over the last few decades, more recently with the advancement of fully degradable bioabsorbable stents. Bioabsorbable materials, such as metallic alloys and aliphatic polyesters, have the potential to yield stents which provide temporary support to the blood vessel and allow native healing of the tissue to occur. Many chemical and physical reactions are reported to play a part in the degradation of such bioabsorbable materials, including, but not limited to, corrosion mechanisms for metals and the hydrolysis and crystallization of the backbone chains in polymers. In the design and analysis of bioabsorbable stents it is important to consider the effect of each aspect of the degradation on the material’s in vivo performance. The development of robust computational modelling techniques which fully capture the degradation behaviour of these bioabsorbable materials is a key factor in the design of bioabsorable stents. A critical review of the current computational modelling techniques used in the design and analysis of these next generation devices is presented here, with the main accomplishments and limitations of each technique highlighted.","citation-key":"bolandReviewMaterialDegradation2016","container-title":"Annals of Biomedical Engineering","DOI":"10.1007/s10439-015-1413-5","ISSN":"1573-9686","issue":"2","journalAbbreviation":"Annals of Biomedical Engineering","page":"341-356","title":"A Review of Material Degradation Modelling for the Analysis and Design of Bioabsorbable Stents","volume":"44","author":[{"family":"Boland","given":"Enda L."},{"family":"Shine","given":"Connor J."},{"family":"Kelly","given":"Nicola"},{"family":"Sweeney","given":"Caoimhe A."},{"family":"McHugh","given":"Peter E."}],"issued":{"date-parts":[["2016",2,1]]}}}],"schema":"https://github.com/citation-style-language/schema/raw/master/csl-citation.json"} </w:instrText>
+        <w:instrText xml:space="preserve"> ADDIN ZOTERO_ITEM CSL_CITATION {"citationID":"iN8kgDlX","properties":{"unsorted":false,"formattedCitation":"\\super [14,15]\\nosupersub{}","plainCitation":"[14,15]","noteIndex":0},"citationItems":[{"id":1967,"uris":["http://zotero.org/users/16939557/items/AW4T6BVH"],"itemData":{"id":1967,"type":"article-journal","citation-key":"albaraghthehSilicoStudiesMagnesiumbased2022","container-title":"Journal of Magnesium and Alloys","DOI":"10.1016/j.jma.2022.09.029","ISSN":"2213-9567","issue":"11","language":"en","license":"https://www.elsevier.com/tdm/userlicense/1.0/","page":"2968-2996","publisher":"Elsevier BV","source":"Crossref","title":"In silico studies of magnesium-based implants: A review of the current stage and challenges","title-short":"In silico studies of magnesium-based implants","volume":"10","author":[{"family":"Albaraghtheh","given":"Tamadur"},{"family":"Willumeit-Römer","given":"Regine"},{"family":"Zeller-Plumhoff","given":"Berit"}],"issued":{"date-parts":[["2022",11]]}}},{"id":306,"uris":["http://zotero.org/users/16939557/items/Q7DJVU79"],"itemData":{"id":306,"type":"article-journal","abstract":"The field of percutaneous coronary intervention has witnessed many progressions over the last few decades, more recently with the advancement of fully degradable bioabsorbable stents. Bioabsorbable materials, such as metallic alloys and aliphatic polyesters, have the potential to yield stents which provide temporary support to the blood vessel and allow native healing of the tissue to occur. Many chemical and physical reactions are reported to play a part in the degradation of such bioabsorbable materials, including, but not limited to, corrosion mechanisms for metals and the hydrolysis and crystallization of the backbone chains in polymers. In the design and analysis of bioabsorbable stents it is important to consider the effect of each aspect of the degradation on the material’s in vivo performance. The development of robust computational modelling techniques which fully capture the degradation behaviour of these bioabsorbable materials is a key factor in the design of bioabsorable stents. A critical review of the current computational modelling techniques used in the design and analysis of these next generation devices is presented here, with the main accomplishments and limitations of each technique highlighted.","citation-key":"bolandReviewMaterialDegradation2016","container-title":"Annals of Biomedical Engineering","DOI":"10.1007/s10439-015-1413-5","ISSN":"1573-9686","issue":"2","journalAbbreviation":"Annals of Biomedical Engineering","page":"341-356","title":"A Review of Material Degradation Modelling for the Analysis and Design of Bioabsorbable Stents","volume":"44","author":[{"family":"Boland","given":"Enda L."},{"family":"Shine","given":"Connor J."},{"family":"Kelly","given":"Nicola"},{"family":"Sweeney","given":"Caoimhe A."},{"family":"McHugh","given":"Peter E."}],"issued":{"date-parts":[["2016",2,1]]}}}],"schema":"https://github.com/citation-style-language/schema/raw/master/csl-citation.json"} </w:instrText>
       </w:r>
       <w:r>
         <w:rPr>
@@ -845,7 +845,7 @@
           <w:rFonts w:cs="Times New Roman"/>
           <w:vertAlign w:val="superscript"/>
         </w:rPr>
-        <w:t>[17–19]</w:t>
+        <w:t xml:space="preserve">[14,15]</w:t>
       </w:r>
       <w:r>
         <w:rPr>
@@ -889,7 +889,7 @@
         <w:rPr>
           <w:lang w:val="en-US"/>
         </w:rPr>
-        <w:instrText xml:space="preserve"> ADDIN ZOTERO_ITEM CSL_CITATION {"citationID":"R0P5Wfv8","properties":{"unsorted":false,"formattedCitation":"\\super [20\\uc0\\u8211{}23]\\nosupersub{}","plainCitation":"[20–23]","noteIndex":0},"citationItems":[{"id":1695,"uris":["http://zotero.org/users/16939557/items/LR7GE9JU"],"itemData":{"id":1695,"type":"article-journal","citation-key":"gastaldiContinuumDamageModel2011","container-title":"Journal of the Mechanical Behavior of Biomedical Materials","DOI":"10.1016/j.jmbbm.2010.11.003","ISSN":"17516161","issue":"3","journalAbbreviation":"Journal of the Mechanical Behavior of Biomedical Materials","language":"en","license":"https://www.elsevier.com/tdm/userlicense/1.0/","page":"352-365","source":"DOI.org (Crossref)","title":"Continuum damage model for bioresorbable magnesium alloy devices — Application to coronary stents","volume":"4","author":[{"family":"Gastaldi","given":"D."},{"family":"Sassi","given":"V."},{"family":"Petrini","given":"L."},{"family":"Vedani","given":"M."},{"family":"Trasatti","given":"S."},{"family":"Migliavacca","given":"F."}],"issued":{"date-parts":[["2011",4]]}}},{"id":1708,"uris":["http://zotero.org/users/16939557/items/LU9YTFKP"],"itemData":{"id":1708,"type":"article-journal","citation-key":"groganCorrosionModelBioabsorbable2011","container-title":"Acta Biomaterialia","DOI":"10.1016/j.actbio.2011.05.032","ISSN":"17427061","issue":"9","journalAbbreviation":"Acta Biomaterialia","language":"en","page":"3523-3533","source":"DOI.org (Crossref)","title":"A corrosion model for bioabsorbable metallic stents","volume":"7","author":[{"family":"Grogan","given":"J.A."},{"family":"O’Brien","given":"B.J."},{"family":"Leen","given":"S.B."},{"family":"McHugh","given":"P.E."}],"issued":{"date-parts":[["2011",9]]}}},{"id":1684,"uris":["http://zotero.org/users/16939557/items/WYN5599T"],"itemData":{"id":1684,"type":"article-journal","citation-key":"pengMechanicalAnalysisNovel2019","container-title":"BioMedical Engineering OnLine","DOI":"10.1186/s12938-019-0661-2","ISSN":"1475-925X","issue":"1","journalAbbreviation":"BioMed Eng OnLine","language":"en","page":"39","source":"DOI.org (Crossref)","title":"Mechanical analysis of a novel biodegradable zinc alloy stent based on a degradation model","volume":"18","author":[{"family":"Peng","given":"Kun"},{"family":"Cui","given":"Xinyang"},{"family":"Qiao","given":"Aike"},{"family":"Mu","given":"Yongliang"}],"issued":{"date-parts":[["2019",12]]}}},{"id":1687,"uris":["http://zotero.org/users/16939557/items/ELL6GHN8"],"itemData":{"id":1687,"type":"article-journal","abstract":"Current research on the fatigue properties of degradable zinc alloy stents has not yet considered the issue of the fatigue life changing with material properties during the dynamic degradation process. Therefore, in this paper, we established a fatigue damage algorithm to study the fatigue problem affected by the changing of material properties during the dynamic degradation process of the stent under the action of pulsating cyclic loading. Three models: the dynamic degradation model, the dynamic degradation model under pulsating cyclic loading, and the coupled model of fatigue damage and dynamic degradation, were developed to verify the effect of fatigue damage on stent life. The results show that fatigue damage leads to a deeper degree of inhomogeneous degradation of the stent, which affects the service life of the stent. Fatigue damage is a factor that cannot be ignored. Therefore, when studying the mechanical properties and lifetime of degradable stents, incorporating fatigue damage into the study can help more accurately assess the lifetime of the stents.","citation-key":"qiNumericalSimulationDynamic2023","container-title":"Journal of Functional Biomaterials","DOI":"10.3390/jfb14110547","ISSN":"2079-4983","issue":"11","journalAbbreviation":"JFB","language":"en","license":"https://creativecommons.org/licenses/by/4.0/","page":"547","source":"DOI.org (Crossref)","title":"Numerical Simulation of Dynamic Degradation and Fatigue Damage of Degradable Zinc Alloy Stents","volume":"14","author":[{"family":"Qi","given":"Jing"},{"family":"Zhang","given":"Hanbing"},{"family":"Chen","given":"Shiliang"},{"family":"Du","given":"Tianming"},{"family":"Zhang","given":"Yanping"},{"family":"Qiao","given":"Aike"}],"issued":{"date-parts":[["2023",11,15]]}}}],"schema":"https://github.com/citation-style-language/schema/raw/master/csl-citation.json"} </w:instrText>
+        <w:instrText xml:space="preserve"> ADDIN ZOTERO_ITEM CSL_CITATION {"citationID":"R0P5Wfv8","properties":{"unsorted":false,"formattedCitation":"\\super [16,17]\\nosupersub{}","plainCitation":"[16,17]","noteIndex":0},"citationItems":[{"id":1695,"uris":["http://zotero.org/users/16939557/items/LR7GE9JU"],"itemData":{"id":1695,"type":"article-journal","citation-key":"gastaldiContinuumDamageModel2011","container-title":"Journal of the Mechanical Behavior of Biomedical Materials","DOI":"10.1016/j.jmbbm.2010.11.003","ISSN":"17516161","issue":"3","journalAbbreviation":"Journal of the Mechanical Behavior of Biomedical Materials","language":"en","license":"https://www.elsevier.com/tdm/userlicense/1.0/","page":"352-365","source":"DOI.org (Crossref)","title":"Continuum damage model for bioresorbable magnesium alloy devices — Application to coronary stents","volume":"4","author":[{"family":"Gastaldi","given":"D."},{"family":"Sassi","given":"V."},{"family":"Petrini","given":"L."},{"family":"Vedani","given":"M."},{"family":"Trasatti","given":"S."},{"family":"Migliavacca","given":"F."}],"issued":{"date-parts":[["2011",4]]}}},{"id":1708,"uris":["http://zotero.org/users/16939557/items/LU9YTFKP"],"itemData":{"id":1708,"type":"article-journal","citation-key":"groganCorrosionModelBioabsorbable2011","container-title":"Acta Biomaterialia","DOI":"10.1016/j.actbio.2011.05.032","ISSN":"17427061","issue":"9","journalAbbreviation":"Acta Biomaterialia","language":"en","page":"3523-3533","source":"DOI.org (Crossref)","title":"A corrosion model for bioabsorbable metallic stents","volume":"7","author":[{"family":"Grogan","given":"J.A."},{"family":"O’Brien","given":"B.J."},{"family":"Leen","given":"S.B."},{"family":"McHugh","given":"P.E."}],"issued":{"date-parts":[["2011",9]]}}}],"schema":"https://github.com/citation-style-language/schema/raw/master/csl-citation.json"} </w:instrText>
       </w:r>
       <w:r>
         <w:rPr>
@@ -902,7 +902,7 @@
           <w:rFonts w:cs="Times New Roman"/>
           <w:vertAlign w:val="superscript"/>
         </w:rPr>
-        <w:t>[20–23]</w:t>
+        <w:t xml:space="preserve">[16,17]</w:t>
       </w:r>
       <w:r>
         <w:rPr>
@@ -951,7 +951,7 @@
         <w:rPr>
           <w:lang w:val="en-US"/>
         </w:rPr>
-        <w:instrText xml:space="preserve"> ADDIN ZOTERO_ITEM CSL_CITATION {"citationID":"K9WZRStW","properties":{"unsorted":false,"formattedCitation":"\\super [24]\\nosupersub{}","plainCitation":"[24]","noteIndex":0},"citationItems":[{"id":1137,"uris":["http://zotero.org/users/16939557/items/UXPD67I3"],"itemData":{"id":1137,"type":"article-journal","citation-key":"barzegariComputationalModelingDegradation2021","container-title":"Corrosion Science","DOI":"10.1016/j.corsci.2021.109674","ISSN":"0010938X","journalAbbreviation":"Corrosion Science","language":"en","page":"109674","source":"DOI.org (Crossref)","title":"Computational modeling of degradation process of biodegradable magnesium biomaterials","volume":"190","author":[{"family":"Barzegari","given":"Mojtaba"},{"family":"Mei","given":"Di"},{"family":"Lamaka","given":"Sviatlana V."},{"family":"Geris","given":"Liesbet"}],"issued":{"date-parts":[["2021",9]]}}}],"schema":"https://github.com/citation-style-language/schema/raw/master/csl-citation.json"} </w:instrText>
+        <w:instrText xml:space="preserve"> ADDIN ZOTERO_ITEM CSL_CITATION {"citationID":"K9WZRStW","properties":{"unsorted":false,"formattedCitation":"\\super [18]\\nosupersub{}","plainCitation":"[18]","noteIndex":0},"citationItems":[{"id":1137,"uris":["http://zotero.org/users/16939557/items/UXPD67I3"],"itemData":{"id":1137,"type":"article-journal","citation-key":"barzegariComputationalModelingDegradation2021","container-title":"Corrosion Science","DOI":"10.1016/j.corsci.2021.109674","ISSN":"0010938X","journalAbbreviation":"Corrosion Science","language":"en","page":"109674","source":"DOI.org (Crossref)","title":"Computational modeling of degradation process of biodegradable magnesium biomaterials","volume":"190","author":[{"family":"Barzegari","given":"Mojtaba"},{"family":"Mei","given":"Di"},{"family":"Lamaka","given":"Sviatlana V."},{"family":"Geris","given":"Liesbet"}],"issued":{"date-parts":[["2021",9]]}}}],"schema":"https://github.com/citation-style-language/schema/raw/master/csl-citation.json"} </w:instrText>
       </w:r>
       <w:r>
         <w:rPr>
@@ -964,7 +964,7 @@
           <w:rFonts w:cs="Times New Roman"/>
           <w:vertAlign w:val="superscript"/>
         </w:rPr>
-        <w:t>[24]</w:t>
+        <w:t xml:space="preserve">[18]</w:t>
       </w:r>
       <w:r>
         <w:rPr>
@@ -1000,7 +1000,7 @@
         <w:rPr>
           <w:lang w:val="en-US"/>
         </w:rPr>
-        <w:instrText xml:space="preserve"> ADDIN ZOTERO_ITEM CSL_CITATION {"citationID":"zCUdaA0U","properties":{"unsorted":false,"formattedCitation":"\\super [24\\uc0\\u8211{}26]\\nosupersub{}","plainCitation":"[24–26]","noteIndex":0},"citationItems":[{"id":1137,"uris":["http://zotero.org/users/16939557/items/UXPD67I3"],"itemData":{"id":1137,"type":"article-journal","citation-key":"barzegariComputationalModelingDegradation2021","container-title":"Corrosion Science","DOI":"10.1016/j.corsci.2021.109674","ISSN":"0010938X","journalAbbreviation":"Corrosion Science","language":"en","page":"109674","source":"DOI.org (Crossref)","title":"Computational modeling of degradation process of biodegradable magnesium biomaterials","volume":"190","author":[{"family":"Barzegari","given":"Mojtaba"},{"family":"Mei","given":"Di"},{"family":"Lamaka","given":"Sviatlana V."},{"family":"Geris","given":"Liesbet"}],"issued":{"date-parts":[["2021",9]]}}},{"id":1722,"uris":["http://zotero.org/users/16939557/items/FZJ2S65B"],"itemData":{"id":1722,"type":"article-journal","citation-key":"bajgerMathematicalModellingDegradation2017","container-title":"Biomechanics and Modeling in Mechanobiology","DOI":"10.1007/s10237-016-0812-3","ISSN":"1617-7959, 1617-7940","issue":"1","journalAbbreviation":"Biomech Model Mechanobiol","language":"en","page":"227-238","source":"DOI.org (Crossref)","title":"Mathematical modelling of the degradation behaviour of biodegradable metals","volume":"16","author":[{"family":"Bajger","given":"P."},{"family":"Ashbourn","given":"J. M. A."},{"family":"Manhas","given":"V."},{"family":"Guyot","given":"Y."},{"family":"Lietaert","given":"K."},{"family":"Geris","given":"L."}],"issued":{"date-parts":[["2017",2]]}}},{"id":1340,"uris":["http://zotero.org/users/16939557/items/Z9K6PRX6"],"itemData":{"id":1340,"type":"article-journal","citation-key":"kovacevicPhasefieldModelingPitting2023","container-title":"Acta Biomaterialia","DOI":"10.1016/j.actbio.2023.04.011","ISSN":"17427061","journalAbbreviation":"Acta Biomaterialia","language":"en","page":"641-658","source":"DOI.org (Crossref)","title":"Phase-field modeling of pitting and mechanically-assisted corrosion of Mg alloys for biomedical applications","volume":"164","author":[{"family":"Kovacevic","given":"Sasa"},{"family":"Ali","given":"Wahaaj"},{"family":"Martínez-Pañeda","given":"Emilio"},{"family":"LLorca","given":"Javier"}],"issued":{"date-parts":[["2023",7]]}}}],"schema":"https://github.com/citation-style-language/schema/raw/master/csl-citation.json"} </w:instrText>
+        <w:instrText xml:space="preserve"> ADDIN ZOTERO_ITEM CSL_CITATION {"citationID":"zCUdaA0U","properties":{"unsorted":false,"formattedCitation":"\\super [18,19]\\nosupersub{}","plainCitation":"[18,19]","noteIndex":0},"citationItems":[{"id":1137,"uris":["http://zotero.org/users/16939557/items/UXPD67I3"],"itemData":{"id":1137,"type":"article-journal","citation-key":"barzegariComputationalModelingDegradation2021","container-title":"Corrosion Science","DOI":"10.1016/j.corsci.2021.109674","ISSN":"0010938X","journalAbbreviation":"Corrosion Science","language":"en","page":"109674","source":"DOI.org (Crossref)","title":"Computational modeling of degradation process of biodegradable magnesium biomaterials","volume":"190","author":[{"family":"Barzegari","given":"Mojtaba"},{"family":"Mei","given":"Di"},{"family":"Lamaka","given":"Sviatlana V."},{"family":"Geris","given":"Liesbet"}],"issued":{"date-parts":[["2021",9]]}}},{"id":1722,"uris":["http://zotero.org/users/16939557/items/FZJ2S65B"],"itemData":{"id":1722,"type":"article-journal","citation-key":"bajgerMathematicalModellingDegradation2017","container-title":"Biomechanics and Modeling in Mechanobiology","DOI":"10.1007/s10237-016-0812-3","ISSN":"1617-7959, 1617-7940","issue":"1","journalAbbreviation":"Biomech Model Mechanobiol","language":"en","page":"227-238","source":"DOI.org (Crossref)","title":"Mathematical modelling of the degradation behaviour of biodegradable metals","volume":"16","author":[{"family":"Bajger","given":"P."},{"family":"Ashbourn","given":"J. M. A."},{"family":"Manhas","given":"V."},{"family":"Guyot","given":"Y."},{"family":"Lietaert","given":"K."},{"family":"Geris","given":"L."}],"issued":{"date-parts":[["2017",2]]}}}],"schema":"https://github.com/citation-style-language/schema/raw/master/csl-citation.json"} </w:instrText>
       </w:r>
       <w:r>
         <w:rPr>
@@ -1013,7 +1013,7 @@
           <w:rFonts w:cs="Times New Roman"/>
           <w:vertAlign w:val="superscript"/>
         </w:rPr>
-        <w:t>[24–26]</w:t>
+        <w:t xml:space="preserve">[18,19]</w:t>
       </w:r>
       <w:r>
         <w:rPr>
@@ -1049,7 +1049,7 @@
         <w:rPr>
           <w:lang w:val="en-US"/>
         </w:rPr>
-        <w:instrText xml:space="preserve"> ADDIN ZOTERO_ITEM CSL_CITATION {"citationID":"JjiwEIC1","properties":{"unsorted":false,"formattedCitation":"\\super [27,28]\\nosupersub{}","plainCitation":"[27,28]","noteIndex":0},"citationItems":[{"id":3648,"uris":["http://zotero.org/users/16939557/items/388QLJYL"],"itemData":{"id":3648,"type":"article-journal","citation-key":"songCorrosionMechanismsMagnesium1999","container-title":"Advanced Engineering Materials","DOI":"10.1002/(SICI)1527-2648(199909)1:1&lt;11::AID-ADEM11&gt;3.0.CO;2-N","ISSN":"1438-1656, 1527-2648","issue":"1","journalAbbreviation":"Adv. Eng. Mater.","language":"en","license":"http://doi.wiley.com/10.1002/tdm_license_1.1","page":"11-33","source":"DOI.org (Crossref)","title":"Corrosion Mechanisms of Magnesium Alloys","volume":"1","author":[{"family":"Song","given":"G. L."},{"family":"Atrens","given":"A."}],"issued":{"date-parts":[["1999",9]]}}},{"id":4066,"uris":["http://zotero.org/users/16939557/items/SZINESN2"],"itemData":{"id":4066,"type":"article-journal","citation-key":"thomasCorrosionMechanismHydrogen2015","container-title":"Current Opinion in Solid State and Materials Science","DOI":"10.1016/j.cossms.2014.09.005","ISSN":"13590286","issue":"2","journalAbbreviation":"Current Opinion in Solid State and Materials Science","language":"en","page":"85-94","source":"DOI.org (Crossref)","title":"Corrosion mechanism and hydrogen evolution on Mg","volume":"19","author":[{"family":"Thomas","given":"S."},{"family":"Medhekar","given":"N.V."},{"family":"Frankel","given":"G.S."},{"family":"Birbilis","given":"N."}],"issued":{"date-parts":[["2015",4]]}}}],"schema":"https://github.com/citation-style-language/schema/raw/master/csl-citation.json"} </w:instrText>
+        <w:instrText xml:space="preserve"> ADDIN ZOTERO_ITEM CSL_CITATION {"citationID":"JjiwEIC1","properties":{"unsorted":false,"formattedCitation":"\\super [20]\\nosupersub{}","plainCitation":"[20]","noteIndex":0},"citationItems":[{"id":4066,"uris":["http://zotero.org/users/16939557/items/SZINESN2"],"itemData":{"id":4066,"type":"article-journal","citation-key":"thomasCorrosionMechanismHydrogen2015","container-title":"Current Opinion in Solid State and Materials Science","DOI":"10.1016/j.cossms.2014.09.005","ISSN":"13590286","issue":"2","journalAbbreviation":"Current Opinion in Solid State and Materials Science","language":"en","page":"85-94","source":"DOI.org (Crossref)","title":"Corrosion mechanism and hydrogen evolution on Mg","volume":"19","author":[{"family":"Thomas","given":"S."},{"family":"Medhekar","given":"N.V."},{"family":"Frankel","given":"G.S."},{"family":"Birbilis","given":"N."}],"issued":{"date-parts":[["2015",4]]}}}],"schema":"https://github.com/citation-style-language/schema/raw/master/csl-citation.json"} </w:instrText>
       </w:r>
       <w:r>
         <w:rPr>
@@ -1062,7 +1062,7 @@
           <w:rFonts w:cs="Times New Roman"/>
           <w:vertAlign w:val="superscript"/>
         </w:rPr>
-        <w:t>[27,28]</w:t>
+        <w:t xml:space="preserve">[20]</w:t>
       </w:r>
       <w:r>
         <w:rPr>
@@ -1086,7 +1086,7 @@
         <w:rPr>
           <w:lang w:val="en-US"/>
         </w:rPr>
-        <w:instrText xml:space="preserve"> ADDIN ZOTERO_ITEM CSL_CITATION {"citationID":"hWHE5P8j","properties":{"unsorted":false,"formattedCitation":"\\super [29\\uc0\\u8211{}31]\\nosupersub{}","plainCitation":"[29–31]","noteIndex":0},"citationItems":[{"id":3837,"uris":["http://zotero.org/users/16939557/items/FRKT7M6B"],"itemData":{"id":3837,"type":"article-journal","citation-key":"zhangComparativeInvestigationCorrosion2024","container-title":"Materials Today Communications","DOI":"10.1016/j.mtcomm.2024.108811","ISSN":"23524928","journalAbbreviation":"Materials Today Communications","language":"en","page":"108811","source":"DOI.org (Crossref)","title":"Comparative investigation of the corrosion behavior of biomedical zinc alloys in oxygen-enriched simulated body fluid environments","volume":"39","author":[{"family":"Zhang","given":"Dekang"},{"family":"Zhang","given":"Lu"},{"family":"Zhang","given":"Xin"},{"family":"Dai","given":"Jianwei"},{"family":"Zhao","given":"Yanbin"},{"family":"Yang","given":"Qianzi"},{"family":"Bai","given":"Jing"},{"family":"Xue","given":"Feng"},{"family":"Chu","given":"Paul K."},{"family":"Chu","given":"Chenglin"}],"issued":{"date-parts":[["2024",6]]}}},{"id":3838,"uris":["http://zotero.org/users/16939557/items/WLSBQ7BL"],"itemData":{"id":3838,"type":"article-journal","citation-key":"yadavOxygenReductionMechanism2005","container-title":"Journal of Electroanalytical Chemistry","DOI":"10.1016/j.jelechem.2005.08.007","ISSN":"15726657","issue":"1","journalAbbreviation":"Journal of Electroanalytical Chemistry","language":"en","license":"https://www.elsevier.com/tdm/userlicense/1.0/","page":"142-149","source":"DOI.org (Crossref)","title":"Oxygen reduction mechanism on corroded zinc","volume":"585","author":[{"family":"Yadav","given":"Amar Prasad"},{"family":"Nishikata","given":"Atsushi"},{"family":"Tsuru","given":"Tooru"}],"issued":{"date-parts":[["2005",11]]}}},{"id":3924,"uris":["http://zotero.org/users/16939557/items/WXQB2LW6"],"itemData":{"id":3924,"type":"article-journal","citation-key":"dafyddKineticsMechanismCathodic2005","container-title":"Corrosion Science","DOI":"10.1016/j.corsci.2005.05.036","ISSN":"0010938X","issue":"12","journalAbbreviation":"Corrosion Science","language":"en","license":"https://www.elsevier.com/tdm/userlicense/1.0/","page":"3006-3018","source":"DOI.org (Crossref)","title":"The kinetics and mechanism of cathodic oxygen reduction on zinc and zinc–aluminium alloy galvanized coatings","volume":"47","author":[{"family":"Dafydd","given":"H."},{"family":"Worsley","given":"D.A."},{"family":"McMurray","given":"H.N."}],"issued":{"date-parts":[["2005",12]]}}}],"schema":"https://github.com/citation-style-language/schema/raw/master/csl-citation.json"} </w:instrText>
+        <w:instrText xml:space="preserve"> ADDIN ZOTERO_ITEM CSL_CITATION {"citationID":"hWHE5P8j","properties":{"unsorted":false,"formattedCitation":"\\super [21,22]\\nosupersub{}","plainCitation":"[21,22]","noteIndex":0},"citationItems":[{"id":3837,"uris":["http://zotero.org/users/16939557/items/FRKT7M6B"],"itemData":{"id":3837,"type":"article-journal","citation-key":"zhangComparativeInvestigationCorrosion2024","container-title":"Materials Today Communications","DOI":"10.1016/j.mtcomm.2024.108811","ISSN":"23524928","journalAbbreviation":"Materials Today Communications","language":"en","page":"108811","source":"DOI.org (Crossref)","title":"Comparative investigation of the corrosion behavior of biomedical zinc alloys in oxygen-enriched simulated body fluid environments","volume":"39","author":[{"family":"Zhang","given":"Dekang"},{"family":"Zhang","given":"Lu"},{"family":"Zhang","given":"Xin"},{"family":"Dai","given":"Jianwei"},{"family":"Zhao","given":"Yanbin"},{"family":"Yang","given":"Qianzi"},{"family":"Bai","given":"Jing"},{"family":"Xue","given":"Feng"},{"family":"Chu","given":"Paul K."},{"family":"Chu","given":"Chenglin"}],"issued":{"date-parts":[["2024",6]]}}},{"id":3838,"uris":["http://zotero.org/users/16939557/items/WLSBQ7BL"],"itemData":{"id":3838,"type":"article-journal","citation-key":"yadavOxygenReductionMechanism2005","container-title":"Journal of Electroanalytical Chemistry","DOI":"10.1016/j.jelechem.2005.08.007","ISSN":"15726657","issue":"1","journalAbbreviation":"Journal of Electroanalytical Chemistry","language":"en","license":"https://www.elsevier.com/tdm/userlicense/1.0/","page":"142-149","source":"DOI.org (Crossref)","title":"Oxygen reduction mechanism on corroded zinc","volume":"585","author":[{"family":"Yadav","given":"Amar Prasad"},{"family":"Nishikata","given":"Atsushi"},{"family":"Tsuru","given":"Tooru"}],"issued":{"date-parts":[["2005",11]]}}}],"schema":"https://github.com/citation-style-language/schema/raw/master/csl-citation.json"} </w:instrText>
       </w:r>
       <w:r>
         <w:rPr>
@@ -1099,7 +1099,7 @@
           <w:rFonts w:cs="Times New Roman"/>
           <w:vertAlign w:val="superscript"/>
         </w:rPr>
-        <w:t>[29–31]</w:t>
+        <w:t xml:space="preserve">[21,22]</w:t>
       </w:r>
       <w:r>
         <w:rPr>
@@ -1161,7 +1161,7 @@
         <w:rPr>
           <w:lang w:val="en-US"/>
         </w:rPr>
-        <w:instrText xml:space="preserve"> ADDIN ZOTERO_ITEM CSL_CITATION {"citationID":"ZPFqAJFj","properties":{"unsorted":false,"formattedCitation":"\\super [32]\\nosupersub{}","plainCitation":"[32]","noteIndex":0},"citationItems":[{"id":4071,"uris":["http://zotero.org/users/16939557/items/4JIRLVIZ"],"itemData":{"id":4071,"type":"article-journal","abstract":"Abstract\n            Salt-spray testing is widely used in the automotive and materials industries to assess the corrosion resistance of protective coatings, where uniform corrosion is a key indicator of material performance. This work presents a numerical uniform corrosion model that predicts the corrosion rate of hot-dip zinc in salt-spray environments by incorporating electrochemical reactions, mass transport via the Nernst–Planck equation, and ionic-strength effects through the Brønsted–Bjerrum relation. The model is calibrated using immersion-test data and extended to account for electrolyte layer growth, droplet deposition, and periodic run-off in salt-spray environments. The calibration establishes a relationship between the porosity of the zinc oxide layer and the rate constant of zinc oxide precipitation. The validated model reproduces the transition from activation- to diffusion-controlled corrosion and captures the experimentally observed corrosion kinetics with an error margin of 20% when electrolyte renewal is included. The results highlight the decisive role of electrolyte dynamics in salt-spray environments and provide a foundation for extending the framework to more complex cyclic corrosion tests.","citation-key":"chenModelingUniformCorrosion2026","container-title":"npj Materials Degradation","DOI":"10.1038/s41529-026-00749-0","ISSN":"2397-2106","issue":"1","journalAbbreviation":"npj Mater Degrad","language":"en","page":"37","source":"DOI.org (Crossref)","title":"Modeling the uniform corrosion behavior of zinc in salt spray testing","volume":"10","author":[{"family":"Chen","given":"Chin"},{"family":"Hofmann","given":"Martin"},{"family":"Wallmersperger","given":"Thomas"}],"issued":{"date-parts":[["2026",2,17]]}}}],"schema":"https://github.com/citation-style-language/schema/raw/master/csl-citation.json"} </w:instrText>
+        <w:instrText xml:space="preserve"> ADDIN ZOTERO_ITEM CSL_CITATION {"citationID":"ZPFqAJFj","properties":{"unsorted":false,"formattedCitation":"\\super [23]\\nosupersub{}","plainCitation":"[23]","noteIndex":0},"citationItems":[{"id":4071,"uris":["http://zotero.org/users/16939557/items/4JIRLVIZ"],"itemData":{"id":4071,"type":"article-journal","abstract":"Abstract\n            Salt-spray testing is widely used in the automotive and materials industries to assess the corrosion resistance of protective coatings, where uniform corrosion is a key indicator of material performance. This work presents a numerical uniform corrosion model that predicts the corrosion rate of hot-dip zinc in salt-spray environments by incorporating electrochemical reactions, mass transport via the Nernst–Planck equation, and ionic-strength effects through the Brønsted–Bjerrum relation. The model is calibrated using immersion-test data and extended to account for electrolyte layer growth, droplet deposition, and periodic run-off in salt-spray environments. The calibration establishes a relationship between the porosity of the zinc oxide layer and the rate constant of zinc oxide precipitation. The validated model reproduces the transition from activation- to diffusion-controlled corrosion and captures the experimentally observed corrosion kinetics with an error margin of 20% when electrolyte renewal is included. The results highlight the decisive role of electrolyte dynamics in salt-spray environments and provide a foundation for extending the framework to more complex cyclic corrosion tests.","citation-key":"chenModelingUniformCorrosion2026","container-title":"npj Materials Degradation","DOI":"10.1038/s41529-026-00749-0","ISSN":"2397-2106","issue":"1","journalAbbreviation":"npj Mater Degrad","language":"en","page":"37","source":"DOI.org (Crossref)","title":"Modeling the uniform corrosion behavior of zinc in salt spray testing","volume":"10","author":[{"family":"Chen","given":"Chin"},{"family":"Hofmann","given":"Martin"},{"family":"Wallmersperger","given":"Thomas"}],"issued":{"date-parts":[["2026",2,17]]}}}],"schema":"https://github.com/citation-style-language/schema/raw/master/csl-citation.json"} </w:instrText>
       </w:r>
       <w:r>
         <w:rPr>
@@ -1174,7 +1174,7 @@
           <w:rFonts w:cs="Times New Roman"/>
           <w:vertAlign w:val="superscript"/>
         </w:rPr>
-        <w:t>[32]</w:t>
+        <w:t xml:space="preserve">[23]</w:t>
       </w:r>
       <w:r>
         <w:rPr>
@@ -1210,7 +1210,7 @@
         <w:rPr>
           <w:lang w:val="en-US"/>
         </w:rPr>
-        <w:instrText xml:space="preserve"> ADDIN ZOTERO_ITEM CSL_CITATION {"citationID":"mn3ATXEF","properties":{"unsorted":false,"formattedCitation":"\\super [33,34]\\nosupersub{}","plainCitation":"[33,34]","noteIndex":0},"citationItems":[{"id":1811,"uris":["http://zotero.org/users/16939557/items/3M3XWPLB"],"itemData":{"id":1811,"type":"article-journal","citation-key":"bryzgalovAtomicscaleStudyLattice2025","container-title":"Computational Materials Science","DOI":"10.1016/j.commatsci.2025.113797","ISSN":"09270256","journalAbbreviation":"Computational Materials Science","language":"en","page":"113797","source":"DOI.org (Crossref)","title":"Atomic-scale study of lattice distortion and oxygen-rich environment impact on the surface degradation dynamics of zinc-based alloys","volume":"252","author":[{"family":"Bryzgalov","given":"Vladimir A."},{"family":"Kistanov","given":"Andrey A."},{"family":"Izosimov","given":"Artem A."},{"family":"Korznikova","given":"Elena A."}],"issued":{"date-parts":[["2025",4]]}}},{"id":3829,"uris":["http://zotero.org/users/16939557/items/3L5EP6GK","http://zotero.org/users/16939557/items/JYLURFQR"],"itemData":{"id":3829,"type":"article-journal","abstract":"Nowadays, biodegradable metals and alloys, as well as their corrosion behavior, are of particular interest. The corrosion process of metals and alloys under various harsh conditions can be studied via the investigation of corrosion atom adsorption on metal surfaces. This can be performed using density functional theory-based simulations. Importantly, comprehensive analytical data obtained in simulations including parameters such as adsorption energy, the amount of charge transferred, atomic coordinates, etc., can be utilized in machine learning models to predict corrosion behavior, adsorption ability, catalytic activity, etc., of metals and alloys. In this work, data on the corrosion indicators of Zn surfaces in Cl-, S-, and O-rich harsh environments are collected. A dataset containing adsorption height, adsorption energy, partial density of states, work function values, and electronic charges of individual atoms is presented. In addition, based on these corrosion descriptors, it is found that a Cl-rich environment is less harmful for different Zn surfaces compared to an O-rich environment, and more harmful compared to a S-rich environment.","citation-key":"mukhametovDensityFunctionalTheoryBased2024","container-title":"Molecules","DOI":"10.3390/molecules29163790","ISSN":"1420-3049","issue":"16","journalAbbreviation":"Molecules","language":"en","page":"3790","source":"DOI.org (Crossref)","title":"Density Functional Theory-Based Indicators to Estimate the Corrosion Potentials of Zinc Alloys in Chlorine-, Oxidizing-, and Sulfur-Harsh Environments","volume":"29","author":[{"family":"Mukhametov","given":"Azamat"},{"family":"Samikov","given":"Insaf"},{"family":"Korznikova","given":"Elena A."},{"family":"Kistanov","given":"Andrey A."}],"issued":{"date-parts":[["2024",8,10]]}}}],"schema":"https://github.com/citation-style-language/schema/raw/master/csl-citation.json"} </w:instrText>
+        <w:instrText xml:space="preserve"> ADDIN ZOTERO_ITEM CSL_CITATION {"citationID":"mn3ATXEF","properties":{"unsorted":false,"formattedCitation":"\\super [24]\\nosupersub{}","plainCitation":"[24]","noteIndex":0},"citationItems":[{"id":1811,"uris":["http://zotero.org/users/16939557/items/3M3XWPLB"],"itemData":{"id":1811,"type":"article-journal","citation-key":"bryzgalovAtomicscaleStudyLattice2025","container-title":"Computational Materials Science","DOI":"10.1016/j.commatsci.2025.113797","ISSN":"09270256","journalAbbreviation":"Computational Materials Science","language":"en","page":"113797","source":"DOI.org (Crossref)","title":"Atomic-scale study of lattice distortion and oxygen-rich environment impact on the surface degradation dynamics of zinc-based alloys","volume":"252","author":[{"family":"Bryzgalov","given":"Vladimir A."},{"family":"Kistanov","given":"Andrey A."},{"family":"Izosimov","given":"Artem A."},{"family":"Korznikova","given":"Elena A."}],"issued":{"date-parts":[["2025",4]]}}}],"schema":"https://github.com/citation-style-language/schema/raw/master/csl-citation.json"} </w:instrText>
       </w:r>
       <w:r>
         <w:rPr>
@@ -1223,7 +1223,7 @@
           <w:rFonts w:cs="Times New Roman"/>
           <w:vertAlign w:val="superscript"/>
         </w:rPr>
-        <w:t>[33,34]</w:t>
+        <w:t xml:space="preserve">[24]</w:t>
       </w:r>
       <w:r>
         <w:rPr>
@@ -1271,7 +1271,7 @@
         <w:rPr>
           <w:lang w:val="en-US"/>
         </w:rPr>
-        <w:instrText xml:space="preserve"> ADDIN ZOTERO_ITEM CSL_CITATION {"citationID":"bMB1q7VU","properties":{"unsorted":false,"formattedCitation":"\\super [35]\\nosupersub{}","plainCitation":"[35]","noteIndex":0},"citationItems":[{"id":4470,"uris":["http://zotero.org/users/16939557/items/WJC43EWN"],"itemData":{"id":4470,"type":"article-journal","abstract":"Abstract\n            Computational models of electrochemical biodegradation of magnesium (Mg)‐based implants are uncertain. To quantify the model uncertainty, iterative evaluations are needed. This presents a challenge, especially for complex, multiscale models as is the case here. Approximating high‐cost and complex models with easy‐to‐evaluate surrogate models can reduce the computational burden. However, the application of this approach to complex degradation models remains limited and understudied. This work provides a workflow to quantify different types of uncertainty within biodegradation models. Three surrogate models—Kriging, polynomial chaos expansion, and polynomial chaos Kriging—are compared based on the minimum number of samples required for surrogate model construction, surrogate model accuracy, and computational time. The surrogate models are tested for three computational models representing Mg‐based implant biodegradation. Global sensitivity analysis and uncertainty propagation are used to analyze the uncertainties associated with the different models. The findings indicate that Kriging proves effective for calibrating diverse computational models with minimal computational time and cost, while polynomial chaos expansion and polynomial chaos Kriging exhibit greater capability in predicting propagated uncertainties within the computational models.","citation-key":"albaraghthehBestPracticesDeveloping2024","container-title":"Advanced Science","DOI":"10.1002/advs.202403543","ISSN":"2198-3844, 2198-3844","issue":"46","journalAbbreviation":"Advanced Science","language":"en","page":"2403543","source":"DOI.org (Crossref)","title":"Best Practices in Developing a Workflow for Uncertainty Quantification for Modeling the Biodegradation of Mg‐Based Implants","volume":"11","author":[{"family":"AlBaraghtheh","given":"Tamadur"},{"family":"Willumeit‐Römer","given":"Regine"},{"family":"Zeller‐Plumhoff","given":"Berit"}],"issued":{"date-parts":[["2024",12]]}}}],"schema":"https://github.com/citation-style-language/schema/raw/master/csl-citation.json"} </w:instrText>
+        <w:instrText xml:space="preserve"> ADDIN ZOTERO_ITEM CSL_CITATION {"citationID":"bMB1q7VU","properties":{"unsorted":false,"formattedCitation":"\\super [25]\\nosupersub{}","plainCitation":"[25]","noteIndex":0},"citationItems":[{"id":4470,"uris":["http://zotero.org/users/16939557/items/WJC43EWN"],"itemData":{"id":4470,"type":"article-journal","abstract":"Abstract\n            Computational models of electrochemical biodegradation of magnesium (Mg)‐based implants are uncertain. To quantify the model uncertainty, iterative evaluations are needed. This presents a challenge, especially for complex, multiscale models as is the case here. Approximating high‐cost and complex models with easy‐to‐evaluate surrogate models can reduce the computational burden. However, the application of this approach to complex degradation models remains limited and understudied. This work provides a workflow to quantify different types of uncertainty within biodegradation models. Three surrogate models—Kriging, polynomial chaos expansion, and polynomial chaos Kriging—are compared based on the minimum number of samples required for surrogate model construction, surrogate model accuracy, and computational time. The surrogate models are tested for three computational models representing Mg‐based implant biodegradation. Global sensitivity analysis and uncertainty propagation are used to analyze the uncertainties associated with the different models. The findings indicate that Kriging proves effective for calibrating diverse computational models with minimal computational time and cost, while polynomial chaos expansion and polynomial chaos Kriging exhibit greater capability in predicting propagated uncertainties within the computational models.","citation-key":"albaraghthehBestPracticesDeveloping2024","container-title":"Advanced Science","DOI":"10.1002/advs.202403543","ISSN":"2198-3844, 2198-3844","issue":"46","journalAbbreviation":"Advanced Science","language":"en","page":"2403543","source":"DOI.org (Crossref)","title":"Best Practices in Developing a Workflow for Uncertainty Quantification for Modeling the Biodegradation of Mg‐Based Implants","volume":"11","author":[{"family":"AlBaraghtheh","given":"Tamadur"},{"family":"Willumeit‐Römer","given":"Regine"},{"family":"Zeller‐Plumhoff","given":"Berit"}],"issued":{"date-parts":[["2024",12]]}}}],"schema":"https://github.com/citation-style-language/schema/raw/master/csl-citation.json"} </w:instrText>
       </w:r>
       <w:r>
         <w:rPr>
@@ -1284,7 +1284,7 @@
           <w:rFonts w:cs="Times New Roman"/>
           <w:vertAlign w:val="superscript"/>
         </w:rPr>
-        <w:t>[35]</w:t>
+        <w:t xml:space="preserve">[25]</w:t>
       </w:r>
       <w:r>
         <w:rPr>
@@ -1939,7 +1939,7 @@
           <w:rFonts w:cs="Times New Roman"/>
           <w:lang w:val="en-US"/>
         </w:rPr>
-        <w:instrText xml:space="preserve"> ADDIN ZOTERO_ITEM CSL_CITATION {"citationID":"rLlZ5nbt","properties":{"unsorted":false,"formattedCitation":"\\super [36]\\nosupersub{}","plainCitation":"[36]","noteIndex":0},"citationItems":[{"id":4073,"uris":["http://zotero.org/users/16939557/items/WQTZABRY"],"itemData":{"id":4073,"type":"article-journal","citation-key":"huangInsightCorrosionBehaviour2021","container-title":"Corrosion Science","DOI":"10.1016/j.corsci.2020.109071","ISSN":"0010938X","journalAbbreviation":"Corrosion Science","language":"en","page":"109071","source":"DOI.org (Crossref)","title":"Insight into the corrosion behaviour and degradation mechanism of pure zinc in simulated body fluid","volume":"178","author":[{"family":"Huang","given":"Shiyu"},{"family":"Wu","given":"Wei"},{"family":"Su","given":"Yanjing"},{"family":"Qiao","given":"Lijie"},{"family":"Yan","given":"Yu"}],"issued":{"date-parts":[["2021",1]]}}}],"schema":"https://github.com/citation-style-language/schema/raw/master/csl-citation.json"} </w:instrText>
+        <w:instrText xml:space="preserve"> ADDIN ZOTERO_ITEM CSL_CITATION {"citationID":"rLlZ5nbt","properties":{"unsorted":false,"formattedCitation":"\\super [26]\\nosupersub{}","plainCitation":"[26]","noteIndex":0},"citationItems":[{"id":4073,"uris":["http://zotero.org/users/16939557/items/WQTZABRY"],"itemData":{"id":4073,"type":"article-journal","citation-key":"huangInsightCorrosionBehaviour2021","container-title":"Corrosion Science","DOI":"10.1016/j.corsci.2020.109071","ISSN":"0010938X","journalAbbreviation":"Corrosion Science","language":"en","page":"109071","source":"DOI.org (Crossref)","title":"Insight into the corrosion behaviour and degradation mechanism of pure zinc in simulated body fluid","volume":"178","author":[{"family":"Huang","given":"Shiyu"},{"family":"Wu","given":"Wei"},{"family":"Su","given":"Yanjing"},{"family":"Qiao","given":"Lijie"},{"family":"Yan","given":"Yu"}],"issued":{"date-parts":[["2021",1]]}}}],"schema":"https://github.com/citation-style-language/schema/raw/master/csl-citation.json"} </w:instrText>
       </w:r>
       <w:r>
         <w:rPr>
@@ -1953,7 +1953,7 @@
           <w:rFonts w:cs="Times New Roman"/>
           <w:vertAlign w:val="superscript"/>
         </w:rPr>
-        <w:t>[36]</w:t>
+        <w:t xml:space="preserve">[26]</w:t>
       </w:r>
       <w:r>
         <w:rPr>
@@ -2039,7 +2039,7 @@
           <w:rFonts w:cs="Times New Roman"/>
           <w:lang w:val="en-US"/>
         </w:rPr>
-        <w:instrText xml:space="preserve"> ADDIN ZOTERO_ITEM CSL_CITATION {"citationID":"AvP6pqck","properties":{"unsorted":false,"formattedCitation":"\\super [1,37]\\nosupersub{}","plainCitation":"[1,37]","noteIndex":0},"citationItems":[{"id":2422,"uris":["http://zotero.org/users/16939557/items/7HK364IB","http://zotero.org/users/16939557/items/HI3MKCRP"],"itemData":{"id":2422,"type":"article-journal","citation-key":"zhengBiodegradableMetals2014","container-title":"Materials Science and Engineering: R: Reports","DOI":"10.1016/j.mser.2014.01.001","ISSN":"0927796X","journalAbbreviation":"Materials Science and Engineering: R: Reports","language":"en","page":"1-34","source":"DOI.org (Crossref)","title":"Biodegradable metals","volume":"77","author":[{"family":"Zheng","given":"Y.F."},{"family":"Gu","given":"X.N."},{"family":"Witte","given":"F."}],"issued":{"date-parts":[["2014",3]]}}},{"id":3926,"uris":["http://zotero.org/users/16939557/items/JZVNJ2XU"],"itemData":{"id":3926,"type":"article-journal","citation-key":"thomasOxygenConsumptionElectrochemically2014","container-title":"Journal of Applied Electrochemistry","DOI":"10.1007/s10800-014-0684-0","ISSN":"0021-891X, 1572-8838","issue":"6","journalAbbreviation":"J Appl Electrochem","language":"en","license":"http://www.springer.com/tdm","page":"747-757","source":"DOI.org (Crossref)","title":"Oxygen consumption upon electrochemically polarised zinc","volume":"44","author":[{"family":"Thomas","given":"S."},{"family":"Cole","given":"I. S."},{"family":"Gonzalez-Garcia","given":"Y."},{"family":"Chen","given":"M."},{"family":"Musameh","given":"M."},{"family":"Mol","given":"J. M. C."},{"family":"Terryn","given":"H."},{"family":"Birbilis","given":"N."}],"issued":{"date-parts":[["2014",6]]}}}],"schema":"https://github.com/citation-style-language/schema/raw/master/csl-citation.json"} </w:instrText>
+        <w:instrText xml:space="preserve"> ADDIN ZOTERO_ITEM CSL_CITATION {"citationID":"AvP6pqck","properties":{"unsorted":false,"formattedCitation":"\\super [1]\\nosupersub{}","plainCitation":"[1]","noteIndex":0},"citationItems":[{"id":2422,"uris":["http://zotero.org/users/16939557/items/7HK364IB","http://zotero.org/users/16939557/items/HI3MKCRP"],"itemData":{"id":2422,"type":"article-journal","citation-key":"zhengBiodegradableMetals2014","container-title":"Materials Science and Engineering: R: Reports","DOI":"10.1016/j.mser.2014.01.001","ISSN":"0927796X","journalAbbreviation":"Materials Science and Engineering: R: Reports","language":"en","page":"1-34","source":"DOI.org (Crossref)","title":"Biodegradable metals","volume":"77","author":[{"family":"Zheng","given":"Y.F."},{"family":"Gu","given":"X.N."},{"family":"Witte","given":"F."}],"issued":{"date-parts":[["2014",3]]}}}],"schema":"https://github.com/citation-style-language/schema/raw/master/csl-citation.json"} </w:instrText>
       </w:r>
       <w:r>
         <w:rPr>
@@ -2053,7 +2053,7 @@
           <w:rFonts w:cs="Times New Roman"/>
           <w:vertAlign w:val="superscript"/>
         </w:rPr>
-        <w:t>[1,37]</w:t>
+        <w:t xml:space="preserve">[1]</w:t>
       </w:r>
       <w:r>
         <w:rPr>
@@ -2186,7 +2186,7 @@
           <w:rFonts w:cs="Times New Roman"/>
           <w:lang w:val="en-US"/>
         </w:rPr>
-        <w:instrText xml:space="preserve"> ADDIN ZOTERO_ITEM CSL_CITATION {"citationID":"kZxopyxL","properties":{"unsorted":false,"formattedCitation":"\\super [36,38]\\nosupersub{}","plainCitation":"[36,38]","noteIndex":0},"citationItems":[{"id":4073,"uris":["http://zotero.org/users/16939557/items/WQTZABRY"],"itemData":{"id":4073,"type":"article-journal","citation-key":"huangInsightCorrosionBehaviour2021","container-title":"Corrosion Science","DOI":"10.1016/j.corsci.2020.109071","ISSN":"0010938X","journalAbbreviation":"Corrosion Science","language":"en","page":"109071","source":"DOI.org (Crossref)","title":"Insight into the corrosion behaviour and degradation mechanism of pure zinc in simulated body fluid","volume":"178","author":[{"family":"Huang","given":"Shiyu"},{"family":"Wu","given":"Wei"},{"family":"Su","given":"Yanjing"},{"family":"Qiao","given":"Lijie"},{"family":"Yan","given":"Yu"}],"issued":{"date-parts":[["2021",1]]}}},{"id":4074,"uris":["http://zotero.org/users/16939557/items/3MX3HALM","http://zotero.org/users/16939557/items/33BRYGX4"],"itemData":{"id":4074,"type":"article-journal","citation-key":"liuComparativeStudiesDegradation2019","container-title":"JOM","DOI":"10.1007/s11837-019-03357-3","ISSN":"1047-4838, 1543-1851","issue":"4","journalAbbreviation":"JOM","language":"en","page":"1414-1425","source":"DOI.org (Crossref)","title":"Comparative Studies on Degradation Behavior of Pure Zinc in Various Simulated Body Fluids","volume":"71","author":[{"family":"Liu","given":"Xiao"},{"family":"Yang","given":"Hongtao"},{"family":"Liu","given":"Yang"},{"family":"Xiong","given":"Pan"},{"family":"Guo","given":"Hui"},{"family":"Huang","given":"Her-Hsiung"},{"family":"Zheng","given":"Yufeng"}],"issued":{"date-parts":[["2019",4]]}}}],"schema":"https://github.com/citation-style-language/schema/raw/master/csl-citation.json"} </w:instrText>
+        <w:instrText xml:space="preserve"> ADDIN ZOTERO_ITEM CSL_CITATION {"citationID":"kZxopyxL","properties":{"unsorted":false,"formattedCitation":"\\super [26,27]\\nosupersub{}","plainCitation":"[26,27]","noteIndex":0},"citationItems":[{"id":4073,"uris":["http://zotero.org/users/16939557/items/WQTZABRY"],"itemData":{"id":4073,"type":"article-journal","citation-key":"huangInsightCorrosionBehaviour2021","container-title":"Corrosion Science","DOI":"10.1016/j.corsci.2020.109071","ISSN":"0010938X","journalAbbreviation":"Corrosion Science","language":"en","page":"109071","source":"DOI.org (Crossref)","title":"Insight into the corrosion behaviour and degradation mechanism of pure zinc in simulated body fluid","volume":"178","author":[{"family":"Huang","given":"Shiyu"},{"family":"Wu","given":"Wei"},{"family":"Su","given":"Yanjing"},{"family":"Qiao","given":"Lijie"},{"family":"Yan","given":"Yu"}],"issued":{"date-parts":[["2021",1]]}}},{"id":4074,"uris":["http://zotero.org/users/16939557/items/3MX3HALM","http://zotero.org/users/16939557/items/33BRYGX4"],"itemData":{"id":4074,"type":"article-journal","citation-key":"liuComparativeStudiesDegradation2019","container-title":"JOM","DOI":"10.1007/s11837-019-03357-3","ISSN":"1047-4838, 1543-1851","issue":"4","journalAbbreviation":"JOM","language":"en","page":"1414-1425","source":"DOI.org (Crossref)","title":"Comparative Studies on Degradation Behavior of Pure Zinc in Various Simulated Body Fluids","volume":"71","author":[{"family":"Liu","given":"Xiao"},{"family":"Yang","given":"Hongtao"},{"family":"Liu","given":"Yang"},{"family":"Xiong","given":"Pan"},{"family":"Guo","given":"Hui"},{"family":"Huang","given":"Her-Hsiung"},{"family":"Zheng","given":"Yufeng"}],"issued":{"date-parts":[["2019",4]]}}}],"schema":"https://github.com/citation-style-language/schema/raw/master/csl-citation.json"} </w:instrText>
       </w:r>
       <w:r>
         <w:rPr>
@@ -2200,7 +2200,7 @@
           <w:rFonts w:cs="Times New Roman"/>
           <w:vertAlign w:val="superscript"/>
         </w:rPr>
-        <w:t>[36,38]</w:t>
+        <w:t xml:space="preserve">[26,27]</w:t>
       </w:r>
       <w:r>
         <w:rPr>
@@ -2256,7 +2256,7 @@
           <w:rFonts w:cs="Times New Roman"/>
           <w:lang w:val="en-US"/>
         </w:rPr>
-        <w:instrText xml:space="preserve"> ADDIN ZOTERO_ITEM CSL_CITATION {"citationID":"LtlwN6AI","properties":{"unsorted":false,"formattedCitation":"\\super [30,36,38]\\nosupersub{}","plainCitation":"[30,36,38]","noteIndex":0},"citationItems":[{"id":3838,"uris":["http://zotero.org/users/16939557/items/WLSBQ7BL"],"itemData":{"id":3838,"type":"article-journal","citation-key":"yadavOxygenReductionMechanism2005","container-title":"Journal of Electroanalytical Chemistry","DOI":"10.1016/j.jelechem.2005.08.007","ISSN":"15726657","issue":"1","journalAbbreviation":"Journal of Electroanalytical Chemistry","language":"en","license":"https://www.elsevier.com/tdm/userlicense/1.0/","page":"142-149","source":"DOI.org (Crossref)","title":"Oxygen reduction mechanism on corroded zinc","volume":"585","author":[{"family":"Yadav","given":"Amar Prasad"},{"family":"Nishikata","given":"Atsushi"},{"family":"Tsuru","given":"Tooru"}],"issued":{"date-parts":[["2005",11]]}}},{"id":4073,"uris":["http://zotero.org/users/16939557/items/WQTZABRY"],"itemData":{"id":4073,"type":"article-journal","citation-key":"huangInsightCorrosionBehaviour2021","container-title":"Corrosion Science","DOI":"10.1016/j.corsci.2020.109071","ISSN":"0010938X","journalAbbreviation":"Corrosion Science","language":"en","page":"109071","source":"DOI.org (Crossref)","title":"Insight into the corrosion behaviour and degradation mechanism of pure zinc in simulated body fluid","volume":"178","author":[{"family":"Huang","given":"Shiyu"},{"family":"Wu","given":"Wei"},{"family":"Su","given":"Yanjing"},{"family":"Qiao","given":"Lijie"},{"family":"Yan","given":"Yu"}],"issued":{"date-parts":[["2021",1]]}}},{"id":4074,"uris":["http://zotero.org/users/16939557/items/3MX3HALM","http://zotero.org/users/16939557/items/33BRYGX4"],"itemData":{"id":4074,"type":"article-journal","citation-key":"liuComparativeStudiesDegradation2019","container-title":"JOM","DOI":"10.1007/s11837-019-03357-3","ISSN":"1047-4838, 1543-1851","issue":"4","journalAbbreviation":"JOM","language":"en","page":"1414-1425","source":"DOI.org (Crossref)","title":"Comparative Studies on Degradation Behavior of Pure Zinc in Various Simulated Body Fluids","volume":"71","author":[{"family":"Liu","given":"Xiao"},{"family":"Yang","given":"Hongtao"},{"family":"Liu","given":"Yang"},{"family":"Xiong","given":"Pan"},{"family":"Guo","given":"Hui"},{"family":"Huang","given":"Her-Hsiung"},{"family":"Zheng","given":"Yufeng"}],"issued":{"date-parts":[["2019",4]]}}}],"schema":"https://github.com/citation-style-language/schema/raw/master/csl-citation.json"} </w:instrText>
+        <w:instrText xml:space="preserve"> ADDIN ZOTERO_ITEM CSL_CITATION {"citationID":"LtlwN6AI","properties":{"unsorted":false,"formattedCitation":"\\super [22,26,27]\\nosupersub{}","plainCitation":"[22,26,27]","noteIndex":0},"citationItems":[{"id":3838,"uris":["http://zotero.org/users/16939557/items/WLSBQ7BL"],"itemData":{"id":3838,"type":"article-journal","citation-key":"yadavOxygenReductionMechanism2005","container-title":"Journal of Electroanalytical Chemistry","DOI":"10.1016/j.jelechem.2005.08.007","ISSN":"15726657","issue":"1","journalAbbreviation":"Journal of Electroanalytical Chemistry","language":"en","license":"https://www.elsevier.com/tdm/userlicense/1.0/","page":"142-149","source":"DOI.org (Crossref)","title":"Oxygen reduction mechanism on corroded zinc","volume":"585","author":[{"family":"Yadav","given":"Amar Prasad"},{"family":"Nishikata","given":"Atsushi"},{"family":"Tsuru","given":"Tooru"}],"issued":{"date-parts":[["2005",11]]}}},{"id":4073,"uris":["http://zotero.org/users/16939557/items/WQTZABRY"],"itemData":{"id":4073,"type":"article-journal","citation-key":"huangInsightCorrosionBehaviour2021","container-title":"Corrosion Science","DOI":"10.1016/j.corsci.2020.109071","ISSN":"0010938X","journalAbbreviation":"Corrosion Science","language":"en","page":"109071","source":"DOI.org (Crossref)","title":"Insight into the corrosion behaviour and degradation mechanism of pure zinc in simulated body fluid","volume":"178","author":[{"family":"Huang","given":"Shiyu"},{"family":"Wu","given":"Wei"},{"family":"Su","given":"Yanjing"},{"family":"Qiao","given":"Lijie"},{"family":"Yan","given":"Yu"}],"issued":{"date-parts":[["2021",1]]}}},{"id":4074,"uris":["http://zotero.org/users/16939557/items/3MX3HALM","http://zotero.org/users/16939557/items/33BRYGX4"],"itemData":{"id":4074,"type":"article-journal","citation-key":"liuComparativeStudiesDegradation2019","container-title":"JOM","DOI":"10.1007/s11837-019-03357-3","ISSN":"1047-4838, 1543-1851","issue":"4","journalAbbreviation":"JOM","language":"en","page":"1414-1425","source":"DOI.org (Crossref)","title":"Comparative Studies on Degradation Behavior of Pure Zinc in Various Simulated Body Fluids","volume":"71","author":[{"family":"Liu","given":"Xiao"},{"family":"Yang","given":"Hongtao"},{"family":"Liu","given":"Yang"},{"family":"Xiong","given":"Pan"},{"family":"Guo","given":"Hui"},{"family":"Huang","given":"Her-Hsiung"},{"family":"Zheng","given":"Yufeng"}],"issued":{"date-parts":[["2019",4]]}}}],"schema":"https://github.com/citation-style-language/schema/raw/master/csl-citation.json"} </w:instrText>
       </w:r>
       <w:r>
         <w:rPr>
@@ -2270,7 +2270,7 @@
           <w:rFonts w:cs="Times New Roman"/>
           <w:vertAlign w:val="superscript"/>
         </w:rPr>
-        <w:t>[30,36,38]</w:t>
+        <w:t xml:space="preserve">[22,26,27]</w:t>
       </w:r>
       <w:r>
         <w:rPr>
@@ -3161,7 +3161,7 @@
           <w:rFonts w:cs="Times New Roman"/>
           <w:lang w:val="en-US"/>
         </w:rPr>
-        <w:instrText xml:space="preserve"> ADDIN ZOTERO_ITEM CSL_CITATION {"citationID":"0bd0E917","properties":{"unsorted":false,"formattedCitation":"\\super [39]\\nosupersub{}","plainCitation":"[39]","noteIndex":0},"citationItems":[{"id":4561,"uris":["http://zotero.org/users/16939557/items/G4GYW7JX"],"itemData":{"id":4561,"type":"article-journal","abstract":"Zinc corrosion product formation is thermodynamically predicted from the macro- to nanoscale through quantification of complexation, curvature, and chemical trajectory.\n          , \n            \n              A chemical stability map is advanced by incorporating ion complexation, solubility, and chemical trajectories to predict ZnO, Zn(OH)\n              2\n              , ZnCO\n              3\n              , ZnCl\n              2\n              , Zn\n              5\n              (CO\n              3\n              )\n              2\n              (OH)\n              6\n              , and Zn\n              5\n              (OH)\n              8\n              Cl\n              2\n              ·H\n              2\n              O precipitation as a function of the total Zn content and pH of an NaCl solution. These calculations demonstrate equilibrium stability of solid Zn products often not considered while tracking the consumed and produced aqueous Zn ion species concentrations through chemical trajectories. The effect of Cl-based ligand formation is incorporated into these stability predictions, enabling enhanced appreciation for the local corrosion conditions experienced at the Zn surface in chloride-containing environments. Additionally, the complexation of Cl\n              −\n              with Zn\n              2+\n              is demonstrated to compete with the formation of solid phases, making precipitation more difficult. The present work also extends the chemical stability diagram derivations by incorporating a Gibbs–Thompson curvature relation to predict the effect of nanoscale precipitate phase formation on species solubility. These thermodynamic predictions correlate well with experimental results for Zn corrosion in full and alternate NaCl immersion, and have far-reaching utility in a variety of fields requiring nanoscale, semiconductor, and/or structural materials.","citation-key":"mcmahonAdvancedChemicalStability2019","container-title":"RSC Advances","DOI":"10.1039/C9RA00228F","ISSN":"2046-2069","issue":"35","journalAbbreviation":"RSC Adv.","language":"en","page":"19905-19916","source":"DOI.org (Crossref)","title":"Advanced chemical stability diagrams to predict the formation of complex zinc compounds in a chloride environment","volume":"9","author":[{"family":"McMahon","given":"M. E."},{"family":"Santucci","given":"R. J."},{"family":"Scully","given":"J. R."}],"issued":{"date-parts":[["2019"]]}}}],"schema":"https://github.com/citation-style-language/schema/raw/master/csl-citation.json"} </w:instrText>
+        <w:instrText xml:space="preserve"> ADDIN ZOTERO_ITEM CSL_CITATION {"citationID":"0bd0E917","properties":{"unsorted":false,"formattedCitation":"\\super [28]\\nosupersub{}","plainCitation":"[28]","noteIndex":0},"citationItems":[{"id":4561,"uris":["http://zotero.org/users/16939557/items/G4GYW7JX"],"itemData":{"id":4561,"type":"article-journal","abstract":"Zinc corrosion product formation is thermodynamically predicted from the macro- to nanoscale through quantification of complexation, curvature, and chemical trajectory.\n          , \n            \n              A chemical stability map is advanced by incorporating ion complexation, solubility, and chemical trajectories to predict ZnO, Zn(OH)\n              2\n              , ZnCO\n              3\n              , ZnCl\n              2\n              , Zn\n              5\n              (CO\n              3\n              )\n              2\n              (OH)\n              6\n              , and Zn\n              5\n              (OH)\n              8\n              Cl\n              2\n              ·H\n              2\n              O precipitation as a function of the total Zn content and pH of an NaCl solution. These calculations demonstrate equilibrium stability of solid Zn products often not considered while tracking the consumed and produced aqueous Zn ion species concentrations through chemical trajectories. The effect of Cl-based ligand formation is incorporated into these stability predictions, enabling enhanced appreciation for the local corrosion conditions experienced at the Zn surface in chloride-containing environments. Additionally, the complexation of Cl\n              −\n              with Zn\n              2+\n              is demonstrated to compete with the formation of solid phases, making precipitation more difficult. The present work also extends the chemical stability diagram derivations by incorporating a Gibbs–Thompson curvature relation to predict the effect of nanoscale precipitate phase formation on species solubility. These thermodynamic predictions correlate well with experimental results for Zn corrosion in full and alternate NaCl immersion, and have far-reaching utility in a variety of fields requiring nanoscale, semiconductor, and/or structural materials.","citation-key":"mcmahonAdvancedChemicalStability2019","container-title":"RSC Advances","DOI":"10.1039/C9RA00228F","ISSN":"2046-2069","issue":"35","journalAbbreviation":"RSC Adv.","language":"en","page":"19905-19916","source":"DOI.org (Crossref)","title":"Advanced chemical stability diagrams to predict the formation of complex zinc compounds in a chloride environment","volume":"9","author":[{"family":"McMahon","given":"M. E."},{"family":"Santucci","given":"R. J."},{"family":"Scully","given":"J. R."}],"issued":{"date-parts":[["2019"]]}}}],"schema":"https://github.com/citation-style-language/schema/raw/master/csl-citation.json"} </w:instrText>
       </w:r>
       <w:r>
         <w:rPr>
@@ -3175,7 +3175,7 @@
           <w:rFonts w:cs="Times New Roman"/>
           <w:vertAlign w:val="superscript"/>
         </w:rPr>
-        <w:t>[39]</w:t>
+        <w:t xml:space="preserve">[28]</w:t>
       </w:r>
       <w:r>
         <w:rPr>
@@ -3648,7 +3648,7 @@
           <w:rFonts w:cs="Times New Roman"/>
           <w:lang w:val="en-US"/>
         </w:rPr>
-        <w:instrText xml:space="preserve"> ADDIN ZOTERO_ITEM CSL_CITATION {"citationID":"r0ugdedM","properties":{"unsorted":false,"formattedCitation":"\\super [38,40]\\nosupersub{}","plainCitation":"[38,40]","noteIndex":0},"citationItems":[{"id":4074,"uris":["http://zotero.org/users/16939557/items/3MX3HALM","http://zotero.org/users/16939557/items/33BRYGX4"],"itemData":{"id":4074,"type":"article-journal","citation-key":"liuComparativeStudiesDegradation2019","container-title":"JOM","DOI":"10.1007/s11837-019-03357-3","ISSN":"1047-4838, 1543-1851","issue":"4","journalAbbreviation":"JOM","language":"en","page":"1414-1425","source":"DOI.org (Crossref)","title":"Comparative Studies on Degradation Behavior of Pure Zinc in Various Simulated Body Fluids","volume":"71","author":[{"family":"Liu","given":"Xiao"},{"family":"Yang","given":"Hongtao"},{"family":"Liu","given":"Yang"},{"family":"Xiong","given":"Pan"},{"family":"Guo","given":"Hui"},{"family":"Huang","given":"Her-Hsiung"},{"family":"Zheng","given":"Yufeng"}],"issued":{"date-parts":[["2019",4]]}}},{"id":4067,"uris":["http://zotero.org/users/16939557/items/99NR3KGI"],"itemData":{"id":4067,"type":"article-journal","citation-key":"pupilloFollowingZnCorrosion2025","container-title":"Electrochimica Acta","DOI":"10.1016/j.electacta.2025.146411","ISSN":"00134686","journalAbbreviation":"Electrochimica Acta","language":"en","page":"146411","source":"DOI.org (Crossref)","title":"Following Zn corrosion during long term immersion test in physiological solutions to establish the potential of zinc as biodegradable prosthetic material","volume":"531","author":[{"family":"Pupillo","given":"D."},{"family":"Di Franco","given":"F."},{"family":"Iannucci","given":"L."},{"family":"Grassini","given":"S."},{"family":"Virtanen","given":"S."},{"family":"Santamaria","given":"M."}],"issued":{"date-parts":[["2025",8]]}}}],"schema":"https://github.com/citation-style-language/schema/raw/master/csl-citation.json"} </w:instrText>
+        <w:instrText xml:space="preserve"> ADDIN ZOTERO_ITEM CSL_CITATION {"citationID":"r0ugdedM","properties":{"unsorted":false,"formattedCitation":"\\super [27]\\nosupersub{}","plainCitation":"[27]","noteIndex":0},"citationItems":[{"id":4074,"uris":["http://zotero.org/users/16939557/items/3MX3HALM","http://zotero.org/users/16939557/items/33BRYGX4"],"itemData":{"id":4074,"type":"article-journal","citation-key":"liuComparativeStudiesDegradation2019","container-title":"JOM","DOI":"10.1007/s11837-019-03357-3","ISSN":"1047-4838, 1543-1851","issue":"4","journalAbbreviation":"JOM","language":"en","page":"1414-1425","source":"DOI.org (Crossref)","title":"Comparative Studies on Degradation Behavior of Pure Zinc in Various Simulated Body Fluids","volume":"71","author":[{"family":"Liu","given":"Xiao"},{"family":"Yang","given":"Hongtao"},{"family":"Liu","given":"Yang"},{"family":"Xiong","given":"Pan"},{"family":"Guo","given":"Hui"},{"family":"Huang","given":"Her-Hsiung"},{"family":"Zheng","given":"Yufeng"}],"issued":{"date-parts":[["2019",4]]}}}],"schema":"https://github.com/citation-style-language/schema/raw/master/csl-citation.json"} </w:instrText>
       </w:r>
       <w:r>
         <w:rPr>
@@ -3662,7 +3662,7 @@
           <w:rFonts w:cs="Times New Roman"/>
           <w:vertAlign w:val="superscript"/>
         </w:rPr>
-        <w:t>[38,40]</w:t>
+        <w:t xml:space="preserve">[27]</w:t>
       </w:r>
       <w:r>
         <w:rPr>
@@ -3721,7 +3721,7 @@
           <w:rFonts w:cs="Times New Roman"/>
           <w:lang w:val="en-US"/>
         </w:rPr>
-        <w:instrText xml:space="preserve"> ADDIN ZOTERO_ITEM CSL_CITATION {"citationID":"LmMK5e9z","properties":{"unsorted":false,"formattedCitation":"\\super [41]\\nosupersub{}","plainCitation":"[41]","noteIndex":0},"citationItems":[{"id":3871,"uris":["http://zotero.org/users/16939557/items/VR5DEBC2"],"itemData":{"id":3871,"type":"article-journal","citation-key":"bowenZincExhibitsIdeal2013","container-title":"Advanced Materials","DOI":"10.1002/adma.201300226","ISSN":"0935-9648, 1521-4095","issue":"18","journalAbbreviation":"Advanced Materials","language":"en","license":"http://onlinelibrary.wiley.com/termsAndConditions#vor","page":"2577-2582","source":"DOI.org (Crossref)","title":"Zinc Exhibits Ideal Physiological Corrosion Behavior for Bioabsorbable Stents","volume":"25","author":[{"family":"Bowen","given":"Patrick K."},{"family":"Drelich","given":"Jaroslaw"},{"family":"Goldman","given":"Jeremy"}],"issued":{"date-parts":[["2013",5,14]]}}}],"schema":"https://github.com/citation-style-language/schema/raw/master/csl-citation.json"} </w:instrText>
+        <w:instrText xml:space="preserve"> ADDIN ZOTERO_ITEM CSL_CITATION {"citationID":"LmMK5e9z","properties":{"unsorted":false,"formattedCitation":"\\super [29]\\nosupersub{}","plainCitation":"[29]","noteIndex":0},"citationItems":[{"id":3871,"uris":["http://zotero.org/users/16939557/items/VR5DEBC2"],"itemData":{"id":3871,"type":"article-journal","citation-key":"bowenZincExhibitsIdeal2013","container-title":"Advanced Materials","DOI":"10.1002/adma.201300226","ISSN":"0935-9648, 1521-4095","issue":"18","journalAbbreviation":"Advanced Materials","language":"en","license":"http://onlinelibrary.wiley.com/termsAndConditions#vor","page":"2577-2582","source":"DOI.org (Crossref)","title":"Zinc Exhibits Ideal Physiological Corrosion Behavior for Bioabsorbable Stents","volume":"25","author":[{"family":"Bowen","given":"Patrick K."},{"family":"Drelich","given":"Jaroslaw"},{"family":"Goldman","given":"Jeremy"}],"issued":{"date-parts":[["2013",5,14]]}}}],"schema":"https://github.com/citation-style-language/schema/raw/master/csl-citation.json"} </w:instrText>
       </w:r>
       <w:r>
         <w:rPr>
@@ -3735,7 +3735,7 @@
           <w:rFonts w:cs="Times New Roman"/>
           <w:vertAlign w:val="superscript"/>
         </w:rPr>
-        <w:t>[41]</w:t>
+        <w:t xml:space="preserve">[29]</w:t>
       </w:r>
       <w:r>
         <w:rPr>
@@ -4013,7 +4013,7 @@
           <w:rFonts w:cs="Times New Roman"/>
           <w:lang w:val="en-US"/>
         </w:rPr>
-        <w:instrText xml:space="preserve"> ADDIN ZOTERO_ITEM CSL_CITATION {"citationID":"6EMeCtG4","properties":{"unsorted":false,"formattedCitation":"\\super [24,25]\\nosupersub{}","plainCitation":"[24,25]","noteIndex":0},"citationItems":[{"id":1722,"uris":["http://zotero.org/users/16939557/items/FZJ2S65B"],"itemData":{"id":1722,"type":"article-journal","citation-key":"bajgerMathematicalModellingDegradation2017","container-title":"Biomechanics and Modeling in Mechanobiology","DOI":"10.1007/s10237-016-0812-3","ISSN":"1617-7959, 1617-7940","issue":"1","journalAbbreviation":"Biomech Model Mechanobiol","language":"en","page":"227-238","source":"DOI.org (Crossref)","title":"Mathematical modelling of the degradation behaviour of biodegradable metals","volume":"16","author":[{"family":"Bajger","given":"P."},{"family":"Ashbourn","given":"J. M. A."},{"family":"Manhas","given":"V."},{"family":"Guyot","given":"Y."},{"family":"Lietaert","given":"K."},{"family":"Geris","given":"L."}],"issued":{"date-parts":[["2017",2]]}}},{"id":1137,"uris":["http://zotero.org/users/16939557/items/UXPD67I3"],"itemData":{"id":1137,"type":"article-journal","citation-key":"barzegariComputationalModelingDegradation2021","container-title":"Corrosion Science","DOI":"10.1016/j.corsci.2021.109674","ISSN":"0010938X","journalAbbreviation":"Corrosion Science","language":"en","page":"109674","source":"DOI.org (Crossref)","title":"Computational modeling of degradation process of biodegradable magnesium biomaterials","volume":"190","author":[{"family":"Barzegari","given":"Mojtaba"},{"family":"Mei","given":"Di"},{"family":"Lamaka","given":"Sviatlana V."},{"family":"Geris","given":"Liesbet"}],"issued":{"date-parts":[["2021",9]]}}}],"schema":"https://github.com/citation-style-language/schema/raw/master/csl-citation.json"} </w:instrText>
+        <w:instrText xml:space="preserve"> ADDIN ZOTERO_ITEM CSL_CITATION {"citationID":"6EMeCtG4","properties":{"unsorted":false,"formattedCitation":"\\super [18,19]\\nosupersub{}","plainCitation":"[18,19]","noteIndex":0},"citationItems":[{"id":1722,"uris":["http://zotero.org/users/16939557/items/FZJ2S65B"],"itemData":{"id":1722,"type":"article-journal","citation-key":"bajgerMathematicalModellingDegradation2017","container-title":"Biomechanics and Modeling in Mechanobiology","DOI":"10.1007/s10237-016-0812-3","ISSN":"1617-7959, 1617-7940","issue":"1","journalAbbreviation":"Biomech Model Mechanobiol","language":"en","page":"227-238","source":"DOI.org (Crossref)","title":"Mathematical modelling of the degradation behaviour of biodegradable metals","volume":"16","author":[{"family":"Bajger","given":"P."},{"family":"Ashbourn","given":"J. M. A."},{"family":"Manhas","given":"V."},{"family":"Guyot","given":"Y."},{"family":"Lietaert","given":"K."},{"family":"Geris","given":"L."}],"issued":{"date-parts":[["2017",2]]}}},{"id":1137,"uris":["http://zotero.org/users/16939557/items/UXPD67I3"],"itemData":{"id":1137,"type":"article-journal","citation-key":"barzegariComputationalModelingDegradation2021","container-title":"Corrosion Science","DOI":"10.1016/j.corsci.2021.109674","ISSN":"0010938X","journalAbbreviation":"Corrosion Science","language":"en","page":"109674","source":"DOI.org (Crossref)","title":"Computational modeling of degradation process of biodegradable magnesium biomaterials","volume":"190","author":[{"family":"Barzegari","given":"Mojtaba"},{"family":"Mei","given":"Di"},{"family":"Lamaka","given":"Sviatlana V."},{"family":"Geris","given":"Liesbet"}],"issued":{"date-parts":[["2021",9]]}}}],"schema":"https://github.com/citation-style-language/schema/raw/master/csl-citation.json"} </w:instrText>
       </w:r>
       <w:r>
         <w:rPr>
@@ -4027,7 +4027,7 @@
           <w:rFonts w:cs="Times New Roman"/>
           <w:vertAlign w:val="superscript"/>
         </w:rPr>
-        <w:t>[24,25]</w:t>
+        <w:t xml:space="preserve">[18,19]</w:t>
       </w:r>
       <w:r>
         <w:rPr>
@@ -4070,7 +4070,7 @@
           <w:rFonts w:cs="Times New Roman"/>
           <w:lang w:val="en-US"/>
         </w:rPr>
-        <w:instrText xml:space="preserve"> ADDIN ZOTERO_ITEM CSL_CITATION {"citationID":"2YDw3E7n","properties":{"unsorted":false,"formattedCitation":"\\super [42]\\nosupersub{}","plainCitation":"[42]","noteIndex":0},"citationItems":[{"id":4562,"uris":["http://zotero.org/users/16939557/items/8FBQWKCF"],"itemData":{"id":4562,"type":"article-journal","citation-key":"katonaValidatingCorrosionModels2026","container-title":"Corrosion Science","DOI":"10.1016/j.corsci.2025.113495","ISSN":"0010938X","journalAbbreviation":"Corrosion Science","language":"en","page":"113495","source":"DOI.org (Crossref)","title":"Validating corrosion models: A comparison of governing equations","title-short":"Validating corrosion models","volume":"259","author":[{"family":"Katona","given":"R.M."},{"family":"Taylor","given":"J."},{"family":"Schaller","given":"R.F."}],"issued":{"date-parts":[["2026",2]]}}}],"schema":"https://github.com/citation-style-language/schema/raw/master/csl-citation.json"} </w:instrText>
+        <w:instrText xml:space="preserve"> ADDIN ZOTERO_ITEM CSL_CITATION {"citationID":"2YDw3E7n","properties":{"unsorted":false,"formattedCitation":"\\super [30]\\nosupersub{}","plainCitation":"[30]","noteIndex":0},"citationItems":[{"id":4562,"uris":["http://zotero.org/users/16939557/items/8FBQWKCF"],"itemData":{"id":4562,"type":"article-journal","citation-key":"katonaValidatingCorrosionModels2026","container-title":"Corrosion Science","DOI":"10.1016/j.corsci.2025.113495","ISSN":"0010938X","journalAbbreviation":"Corrosion Science","language":"en","page":"113495","source":"DOI.org (Crossref)","title":"Validating corrosion models: A comparison of governing equations","title-short":"Validating corrosion models","volume":"259","author":[{"family":"Katona","given":"R.M."},{"family":"Taylor","given":"J."},{"family":"Schaller","given":"R.F."}],"issued":{"date-parts":[["2026",2]]}}}],"schema":"https://github.com/citation-style-language/schema/raw/master/csl-citation.json"} </w:instrText>
       </w:r>
       <w:r>
         <w:rPr>
@@ -4084,7 +4084,7 @@
           <w:rFonts w:cs="Times New Roman"/>
           <w:vertAlign w:val="superscript"/>
         </w:rPr>
-        <w:t>[42]</w:t>
+        <w:t xml:space="preserve">[30]</w:t>
       </w:r>
       <w:r>
         <w:rPr>
@@ -4801,7 +4801,7 @@
           <w:rFonts w:cs="Times New Roman"/>
           <w:lang w:val="en-US"/>
         </w:rPr>
-        <w:instrText xml:space="preserve"> ADDIN ZOTERO_ITEM CSL_CITATION {"citationID":"y91lExEM","properties":{"unsorted":false,"formattedCitation":"\\super [30]\\nosupersub{}","plainCitation":"[30]","noteIndex":0},"citationItems":[{"id":3838,"uris":["http://zotero.org/users/16939557/items/WLSBQ7BL"],"itemData":{"id":3838,"type":"article-journal","citation-key":"yadavOxygenReductionMechanism2005","container-title":"Journal of Electroanalytical Chemistry","DOI":"10.1016/j.jelechem.2005.08.007","ISSN":"15726657","issue":"1","journalAbbreviation":"Journal of Electroanalytical Chemistry","language":"en","license":"https://www.elsevier.com/tdm/userlicense/1.0/","page":"142-149","source":"DOI.org (Crossref)","title":"Oxygen reduction mechanism on corroded zinc","volume":"585","author":[{"family":"Yadav","given":"Amar Prasad"},{"family":"Nishikata","given":"Atsushi"},{"family":"Tsuru","given":"Tooru"}],"issued":{"date-parts":[["2005",11]]}}}],"schema":"https://github.com/citation-style-language/schema/raw/master/csl-citation.json"} </w:instrText>
+        <w:instrText xml:space="preserve"> ADDIN ZOTERO_ITEM CSL_CITATION {"citationID":"y91lExEM","properties":{"unsorted":false,"formattedCitation":"\\super [22]\\nosupersub{}","plainCitation":"[22]","noteIndex":0},"citationItems":[{"id":3838,"uris":["http://zotero.org/users/16939557/items/WLSBQ7BL"],"itemData":{"id":3838,"type":"article-journal","citation-key":"yadavOxygenReductionMechanism2005","container-title":"Journal of Electroanalytical Chemistry","DOI":"10.1016/j.jelechem.2005.08.007","ISSN":"15726657","issue":"1","journalAbbreviation":"Journal of Electroanalytical Chemistry","language":"en","license":"https://www.elsevier.com/tdm/userlicense/1.0/","page":"142-149","source":"DOI.org (Crossref)","title":"Oxygen reduction mechanism on corroded zinc","volume":"585","author":[{"family":"Yadav","given":"Amar Prasad"},{"family":"Nishikata","given":"Atsushi"},{"family":"Tsuru","given":"Tooru"}],"issued":{"date-parts":[["2005",11]]}}}],"schema":"https://github.com/citation-style-language/schema/raw/master/csl-citation.json"} </w:instrText>
       </w:r>
       <w:r>
         <w:rPr>
@@ -4815,7 +4815,7 @@
           <w:rFonts w:cs="Times New Roman"/>
           <w:vertAlign w:val="superscript"/>
         </w:rPr>
-        <w:t>[30]</w:t>
+        <w:t xml:space="preserve">[22]</w:t>
       </w:r>
       <w:r>
         <w:rPr>
@@ -5352,7 +5352,7 @@
           <w:rFonts w:cs="Times New Roman"/>
           <w:lang w:val="en-US"/>
         </w:rPr>
-        <w:instrText xml:space="preserve"> ADDIN ZOTERO_ITEM CSL_CITATION {"citationID":"rN5Gluur","properties":{"unsorted":false,"formattedCitation":"\\super [30]\\nosupersub{}","plainCitation":"[30]","noteIndex":0},"citationItems":[{"id":3838,"uris":["http://zotero.org/users/16939557/items/WLSBQ7BL"],"itemData":{"id":3838,"type":"article-journal","citation-key":"yadavOxygenReductionMechanism2005","container-title":"Journal of Electroanalytical Chemistry","DOI":"10.1016/j.jelechem.2005.08.007","ISSN":"15726657","issue":"1","journalAbbreviation":"Journal of Electroanalytical Chemistry","language":"en","license":"https://www.elsevier.com/tdm/userlicense/1.0/","page":"142-149","source":"DOI.org (Crossref)","title":"Oxygen reduction mechanism on corroded zinc","volume":"585","author":[{"family":"Yadav","given":"Amar Prasad"},{"family":"Nishikata","given":"Atsushi"},{"family":"Tsuru","given":"Tooru"}],"issued":{"date-parts":[["2005",11]]}}}],"schema":"https://github.com/citation-style-language/schema/raw/master/csl-citation.json"} </w:instrText>
+        <w:instrText xml:space="preserve"> ADDIN ZOTERO_ITEM CSL_CITATION {"citationID":"rN5Gluur","properties":{"unsorted":false,"formattedCitation":"\\super [22]\\nosupersub{}","plainCitation":"[22]","noteIndex":0},"citationItems":[{"id":3838,"uris":["http://zotero.org/users/16939557/items/WLSBQ7BL"],"itemData":{"id":3838,"type":"article-journal","citation-key":"yadavOxygenReductionMechanism2005","container-title":"Journal of Electroanalytical Chemistry","DOI":"10.1016/j.jelechem.2005.08.007","ISSN":"15726657","issue":"1","journalAbbreviation":"Journal of Electroanalytical Chemistry","language":"en","license":"https://www.elsevier.com/tdm/userlicense/1.0/","page":"142-149","source":"DOI.org (Crossref)","title":"Oxygen reduction mechanism on corroded zinc","volume":"585","author":[{"family":"Yadav","given":"Amar Prasad"},{"family":"Nishikata","given":"Atsushi"},{"family":"Tsuru","given":"Tooru"}],"issued":{"date-parts":[["2005",11]]}}}],"schema":"https://github.com/citation-style-language/schema/raw/master/csl-citation.json"} </w:instrText>
       </w:r>
       <w:r>
         <w:rPr>
@@ -5366,7 +5366,7 @@
           <w:rFonts w:cs="Times New Roman"/>
           <w:vertAlign w:val="superscript"/>
         </w:rPr>
-        <w:t>[30]</w:t>
+        <w:t xml:space="preserve">[22]</w:t>
       </w:r>
       <w:r>
         <w:rPr>
@@ -6047,7 +6047,7 @@
           <w:rFonts w:cs="Times New Roman"/>
           <w:lang w:val="en-US"/>
         </w:rPr>
-        <w:instrText xml:space="preserve"> ADDIN ZOTERO_ITEM CSL_CITATION {"citationID":"eTfl7xu9","properties":{"unsorted":false,"formattedCitation":"\\super [25]\\nosupersub{}","plainCitation":"[25]","noteIndex":0},"citationItems":[{"id":1722,"uris":["http://zotero.org/users/16939557/items/FZJ2S65B"],"itemData":{"id":1722,"type":"article-journal","citation-key":"bajgerMathematicalModellingDegradation2017","container-title":"Biomechanics and Modeling in Mechanobiology","DOI":"10.1007/s10237-016-0812-3","ISSN":"1617-7959, 1617-7940","issue":"1","journalAbbreviation":"Biomech Model Mechanobiol","language":"en","page":"227-238","source":"DOI.org (Crossref)","title":"Mathematical modelling of the degradation behaviour of biodegradable metals","volume":"16","author":[{"family":"Bajger","given":"P."},{"family":"Ashbourn","given":"J. M. A."},{"family":"Manhas","given":"V."},{"family":"Guyot","given":"Y."},{"family":"Lietaert","given":"K."},{"family":"Geris","given":"L."}],"issued":{"date-parts":[["2017",2]]}}}],"schema":"https://github.com/citation-style-language/schema/raw/master/csl-citation.json"} </w:instrText>
+        <w:instrText xml:space="preserve"> ADDIN ZOTERO_ITEM CSL_CITATION {"citationID":"eTfl7xu9","properties":{"unsorted":false,"formattedCitation":"\\super [19]\\nosupersub{}","plainCitation":"[19]","noteIndex":0},"citationItems":[{"id":1722,"uris":["http://zotero.org/users/16939557/items/FZJ2S65B"],"itemData":{"id":1722,"type":"article-journal","citation-key":"bajgerMathematicalModellingDegradation2017","container-title":"Biomechanics and Modeling in Mechanobiology","DOI":"10.1007/s10237-016-0812-3","ISSN":"1617-7959, 1617-7940","issue":"1","journalAbbreviation":"Biomech Model Mechanobiol","language":"en","page":"227-238","source":"DOI.org (Crossref)","title":"Mathematical modelling of the degradation behaviour of biodegradable metals","volume":"16","author":[{"family":"Bajger","given":"P."},{"family":"Ashbourn","given":"J. M. A."},{"family":"Manhas","given":"V."},{"family":"Guyot","given":"Y."},{"family":"Lietaert","given":"K."},{"family":"Geris","given":"L."}],"issued":{"date-parts":[["2017",2]]}}}],"schema":"https://github.com/citation-style-language/schema/raw/master/csl-citation.json"} </w:instrText>
       </w:r>
       <w:r>
         <w:rPr>
@@ -6061,7 +6061,7 @@
           <w:rFonts w:cs="Times New Roman"/>
           <w:vertAlign w:val="superscript"/>
         </w:rPr>
-        <w:t>[25]</w:t>
+        <w:t xml:space="preserve">[19]</w:t>
       </w:r>
       <w:r>
         <w:rPr>
@@ -7699,7 +7699,7 @@
           <w:rFonts w:cs="Times New Roman"/>
           <w:lang w:val="en-US"/>
         </w:rPr>
-        <w:instrText xml:space="preserve"> ADDIN ZOTERO_ITEM CSL_CITATION {"citationID":"EBWNUWMs","properties":{"unsorted":false,"formattedCitation":"\\super [25]\\nosupersub{}","plainCitation":"[25]","noteIndex":0},"citationItems":[{"id":1722,"uris":["http://zotero.org/users/16939557/items/FZJ2S65B"],"itemData":{"id":1722,"type":"article-journal","citation-key":"bajgerMathematicalModellingDegradation2017","container-title":"Biomechanics and Modeling in Mechanobiology","DOI":"10.1007/s10237-016-0812-3","ISSN":"1617-7959, 1617-7940","issue":"1","journalAbbreviation":"Biomech Model Mechanobiol","language":"en","page":"227-238","source":"DOI.org (Crossref)","title":"Mathematical modelling of the degradation behaviour of biodegradable metals","volume":"16","author":[{"family":"Bajger","given":"P."},{"family":"Ashbourn","given":"J. M. A."},{"family":"Manhas","given":"V."},{"family":"Guyot","given":"Y."},{"family":"Lietaert","given":"K."},{"family":"Geris","given":"L."}],"issued":{"date-parts":[["2017",2]]}}}],"schema":"https://github.com/citation-style-language/schema/raw/master/csl-citation.json"} </w:instrText>
+        <w:instrText xml:space="preserve"> ADDIN ZOTERO_ITEM CSL_CITATION {"citationID":"EBWNUWMs","properties":{"unsorted":false,"formattedCitation":"\\super [19]\\nosupersub{}","plainCitation":"[19]","noteIndex":0},"citationItems":[{"id":1722,"uris":["http://zotero.org/users/16939557/items/FZJ2S65B"],"itemData":{"id":1722,"type":"article-journal","citation-key":"bajgerMathematicalModellingDegradation2017","container-title":"Biomechanics and Modeling in Mechanobiology","DOI":"10.1007/s10237-016-0812-3","ISSN":"1617-7959, 1617-7940","issue":"1","journalAbbreviation":"Biomech Model Mechanobiol","language":"en","page":"227-238","source":"DOI.org (Crossref)","title":"Mathematical modelling of the degradation behaviour of biodegradable metals","volume":"16","author":[{"family":"Bajger","given":"P."},{"family":"Ashbourn","given":"J. M. A."},{"family":"Manhas","given":"V."},{"family":"Guyot","given":"Y."},{"family":"Lietaert","given":"K."},{"family":"Geris","given":"L."}],"issued":{"date-parts":[["2017",2]]}}}],"schema":"https://github.com/citation-style-language/schema/raw/master/csl-citation.json"} </w:instrText>
       </w:r>
       <w:r>
         <w:rPr>
@@ -7713,7 +7713,7 @@
           <w:rFonts w:cs="Times New Roman"/>
           <w:vertAlign w:val="superscript"/>
         </w:rPr>
-        <w:t>[25]</w:t>
+        <w:t xml:space="preserve">[19]</w:t>
       </w:r>
       <w:r>
         <w:rPr>
@@ -7745,7 +7745,7 @@
         <w:rPr>
           <w:lang w:val="en-US"/>
         </w:rPr>
-        <w:instrText xml:space="preserve"> ADDIN ZOTERO_ITEM CSL_CITATION {"citationID":"aPcMg5PW","properties":{"unsorted":false,"formattedCitation":"\\super [43]\\nosupersub{}","plainCitation":"[43]","noteIndex":0},"citationItems":[{"id":4560,"uris":["http://zotero.org/users/16939557/items/5GV9KWGS"],"itemData":{"id":4560,"type":"book","abstract":"Diffusion in Natural Porous Media: Contaminant Transport, Sorption/Desorption and Dissolution Kinetics introduces the general principles of diffusion in the subsurface environment and discusses the implications for the fate and transport of contaminants in soils and groundwater. Emphasis is placed on sorption/desorption and the dissolution kinetics of organic contaminants, both of which are limited by the slow speed of molecular diffusion. Diffusion in Natural Porous Media: Contaminant Transport, Sorption/Desorption and Dissolution Kinetics compiles methods for calculating the diffusion coefficients of organic compounds (in aqueous solution or vapor phase) in natural porous media. The author uses analytical solutions of Fick's 2nd law and some simple numerical models to model diffusive transport under various initial and boundary conditions. A number of these models may be solved using spreadsheets. The book examines sorption/desorption rates of organic compounds in various soils and aquifer materials, and also examines the dissolution kinetics of nonaqueous phase liquids in aquifers, in both the trapped residual phase and in pools. Diffusion in Natural Porous Media: Contaminant Transport, Sorption/Desorption and Dissolution Kinetics concludes with a discussion of the impact of slow diffusion processes on soil and groundwater decontamination and the implications of these processes for groundwater risk assessment","citation-key":"grathwohlDiffusionNaturalPorous1998","collection-number":"1","collection-title":"Topics in Environmental Fluid Mechanics","DOI":"10.1007/978-1-4615-5683-1","ISBN":"978-1-4613-7602-6","language":"eng","number-of-pages":"207","publisher":"Springer","publisher-place":"Boston, MA","source":"K10plus ISBN","title":"Diffusion in Natural Porous Media: Contaminant Transport, Sorption/Desorption and Dissolution Kinetics","title-short":"Diffusion in Natural Porous Media","author":[{"family":"Grathwohl","given":"Peter"}],"issued":{"date-parts":[["1998"]]}}}],"schema":"https://github.com/citation-style-language/schema/raw/master/csl-citation.json"} </w:instrText>
+        <w:instrText xml:space="preserve"> ADDIN ZOTERO_ITEM CSL_CITATION {"citationID":"aPcMg5PW","properties":{"unsorted":false,"formattedCitation":"\\super [31]\\nosupersub{}","plainCitation":"[31]","noteIndex":0},"citationItems":[{"id":4560,"uris":["http://zotero.org/users/16939557/items/5GV9KWGS"],"itemData":{"id":4560,"type":"book","abstract":"Diffusion in Natural Porous Media: Contaminant Transport, Sorption/Desorption and Dissolution Kinetics introduces the general principles of diffusion in the subsurface environment and discusses the implications for the fate and transport of contaminants in soils and groundwater. Emphasis is placed on sorption/desorption and the dissolution kinetics of organic contaminants, both of which are limited by the slow speed of molecular diffusion. Diffusion in Natural Porous Media: Contaminant Transport, Sorption/Desorption and Dissolution Kinetics compiles methods for calculating the diffusion coefficients of organic compounds (in aqueous solution or vapor phase) in natural porous media. The author uses analytical solutions of Fick's 2nd law and some simple numerical models to model diffusive transport under various initial and boundary conditions. A number of these models may be solved using spreadsheets. The book examines sorption/desorption rates of organic compounds in various soils and aquifer materials, and also examines the dissolution kinetics of nonaqueous phase liquids in aquifers, in both the trapped residual phase and in pools. Diffusion in Natural Porous Media: Contaminant Transport, Sorption/Desorption and Dissolution Kinetics concludes with a discussion of the impact of slow diffusion processes on soil and groundwater decontamination and the implications of these processes for groundwater risk assessment","citation-key":"grathwohlDiffusionNaturalPorous1998","collection-number":"1","collection-title":"Topics in Environmental Fluid Mechanics","DOI":"10.1007/978-1-4615-5683-1","ISBN":"978-1-4613-7602-6","language":"eng","number-of-pages":"207","publisher":"Springer","publisher-place":"Boston, MA","source":"K10plus ISBN","title":"Diffusion in Natural Porous Media: Contaminant Transport, Sorption/Desorption and Dissolution Kinetics","title-short":"Diffusion in Natural Porous Media","author":[{"family":"Grathwohl","given":"Peter"}],"issued":{"date-parts":[["1998"]]}}}],"schema":"https://github.com/citation-style-language/schema/raw/master/csl-citation.json"} </w:instrText>
       </w:r>
       <w:r>
         <w:rPr>
@@ -7758,7 +7758,7 @@
           <w:rFonts w:cs="Times New Roman"/>
           <w:vertAlign w:val="superscript"/>
         </w:rPr>
-        <w:t>[43]</w:t>
+        <w:t xml:space="preserve">[31]</w:t>
       </w:r>
       <w:r>
         <w:rPr>
@@ -8452,7 +8452,7 @@
           <w:rFonts w:cs="Times New Roman"/>
           <w:lang w:val="en-US"/>
         </w:rPr>
-        <w:instrText xml:space="preserve"> ADDIN ZOTERO_ITEM CSL_CITATION {"citationID":"r7domCi5","properties":{"unsorted":false,"formattedCitation":"\\super [44]\\nosupersub{}","plainCitation":"[44]","noteIndex":0},"citationItems":[{"id":1729,"uris":["http://zotero.org/users/16939557/items/TDPP5UDX"],"itemData":{"id":1729,"type":"article-journal","citation-key":"wilderAdaptiveLevelSet2015","container-title":"Journal of Engineering Mathematics","DOI":"10.1007/s10665-014-9732-3","ISSN":"0022-0833, 1573-2703","issue":"1","journalAbbreviation":"J Eng Math","language":"en","page":"121-142","source":"DOI.org (Crossref)","title":"An adaptive level set approach for modeling damage due to galvanic corrosion","volume":"91","author":[{"family":"Wilder","given":"Joseph W."},{"family":"Clemons","given":"Curtis"},{"family":"Golovaty","given":"Dmitry"},{"family":"Kreider","given":"Kevin L."},{"family":"Young","given":"Gerald W."},{"family":"Lillard","given":"R. Scott"}],"issued":{"date-parts":[["2015",4]]}}}],"schema":"https://github.com/citation-style-language/schema/raw/master/csl-citation.json"} </w:instrText>
+        <w:instrText xml:space="preserve"> ADDIN ZOTERO_ITEM CSL_CITATION {"citationID":"r7domCi5","properties":{"unsorted":false,"formattedCitation":"\\super [32]\\nosupersub{}","plainCitation":"[32]","noteIndex":0},"citationItems":[{"id":1729,"uris":["http://zotero.org/users/16939557/items/TDPP5UDX"],"itemData":{"id":1729,"type":"article-journal","citation-key":"wilderAdaptiveLevelSet2015","container-title":"Journal of Engineering Mathematics","DOI":"10.1007/s10665-014-9732-3","ISSN":"0022-0833, 1573-2703","issue":"1","journalAbbreviation":"J Eng Math","language":"en","page":"121-142","source":"DOI.org (Crossref)","title":"An adaptive level set approach for modeling damage due to galvanic corrosion","volume":"91","author":[{"family":"Wilder","given":"Joseph W."},{"family":"Clemons","given":"Curtis"},{"family":"Golovaty","given":"Dmitry"},{"family":"Kreider","given":"Kevin L."},{"family":"Young","given":"Gerald W."},{"family":"Lillard","given":"R. Scott"}],"issued":{"date-parts":[["2015",4]]}}}],"schema":"https://github.com/citation-style-language/schema/raw/master/csl-citation.json"} </w:instrText>
       </w:r>
       <w:r>
         <w:rPr>
@@ -8466,7 +8466,7 @@
           <w:rFonts w:cs="Times New Roman"/>
           <w:vertAlign w:val="superscript"/>
         </w:rPr>
-        <w:t>[44]</w:t>
+        <w:t xml:space="preserve">[32]</w:t>
       </w:r>
       <w:r>
         <w:rPr>
@@ -8801,7 +8801,7 @@
           <w:rFonts w:cs="Times New Roman"/>
           <w:lang w:val="en-US"/>
         </w:rPr>
-        <w:instrText xml:space="preserve"> ADDIN ZOTERO_ITEM CSL_CITATION {"citationID":"BuP2nsvm","properties":{"unsorted":false,"formattedCitation":"\\super [45]\\nosupersub{}","plainCitation":"[45]","noteIndex":0},"citationItems":[{"id":1697,"uris":["http://zotero.org/users/16939557/items/M7J7YKJU"],"itemData":{"id":1697,"type":"article-journal","citation-key":"groganPhysicalCorrosionModel2014","container-title":"Acta Biomaterialia","DOI":"10.1016/j.actbio.2013.12.059","ISSN":"17427061","issue":"5","journalAbbreviation":"Acta Biomaterialia","language":"en","page":"2313-2322","source":"DOI.org (Crossref)","title":"A physical corrosion model for bioabsorbable metal stents","volume":"10","author":[{"family":"Grogan","given":"J.A."},{"family":"Leen","given":"S.B."},{"family":"McHugh","given":"P.E."}],"issued":{"date-parts":[["2014",5]]}}}],"schema":"https://github.com/citation-style-language/schema/raw/master/csl-citation.json"} </w:instrText>
+        <w:instrText xml:space="preserve"> ADDIN ZOTERO_ITEM CSL_CITATION {"citationID":"BuP2nsvm","properties":{"unsorted":false,"formattedCitation":"\\super [33]\\nosupersub{}","plainCitation":"[33]","noteIndex":0},"citationItems":[{"id":1697,"uris":["http://zotero.org/users/16939557/items/M7J7YKJU"],"itemData":{"id":1697,"type":"article-journal","citation-key":"groganPhysicalCorrosionModel2014","container-title":"Acta Biomaterialia","DOI":"10.1016/j.actbio.2013.12.059","ISSN":"17427061","issue":"5","journalAbbreviation":"Acta Biomaterialia","language":"en","page":"2313-2322","source":"DOI.org (Crossref)","title":"A physical corrosion model for bioabsorbable metal stents","volume":"10","author":[{"family":"Grogan","given":"J.A."},{"family":"Leen","given":"S.B."},{"family":"McHugh","given":"P.E."}],"issued":{"date-parts":[["2014",5]]}}}],"schema":"https://github.com/citation-style-language/schema/raw/master/csl-citation.json"} </w:instrText>
       </w:r>
       <w:r>
         <w:rPr>
@@ -8815,7 +8815,7 @@
           <w:rFonts w:cs="Times New Roman"/>
           <w:vertAlign w:val="superscript"/>
         </w:rPr>
-        <w:t>[45]</w:t>
+        <w:t xml:space="preserve">[33]</w:t>
       </w:r>
       <w:r>
         <w:rPr>
@@ -11128,7 +11128,7 @@
                 <w:szCs w:val="22"/>
                 <w:lang w:val="en-US"/>
               </w:rPr>
-              <w:instrText xml:space="preserve"> ADDIN ZOTERO_ITEM CSL_CITATION {"citationID":"xAToO0U2","properties":{"unsorted":false,"formattedCitation":"\\super [46]\\nosupersub{}","plainCitation":"[46]","noteIndex":0},"citationItems":[{"id":3844,"uris":["http://zotero.org/users/16939557/items/YSXNXCNJ"],"itemData":{"id":3844,"type":"book","abstract":"Presents chemistry and physics tables and profiles notable scientists, highlighting their achievements","citation-key":"rumbleCRCHandbookChemistry2017","edition":"98th edition 2017-2018","ISBN":"978-1-4987-8454-2","language":"eng","publisher":"CRC Press, Taylor &amp; Francis Group","publisher-place":"Boca Raton London New York","source":"K10plus ISBN","title":"CRC handbook of chemistry and physics","editor":[{"family":"Rumble","given":"John R."}],"issued":{"date-parts":[["2017"]]}}}],"schema":"https://github.com/citation-style-language/schema/raw/master/csl-citation.json"} </w:instrText>
+              <w:instrText xml:space="preserve"> ADDIN ZOTERO_ITEM CSL_CITATION {"citationID":"xAToO0U2","properties":{"unsorted":false,"formattedCitation":"\\super [34]\\nosupersub{}","plainCitation":"[34]","noteIndex":0},"citationItems":[{"id":3844,"uris":["http://zotero.org/users/16939557/items/YSXNXCNJ"],"itemData":{"id":3844,"type":"book","abstract":"Presents chemistry and physics tables and profiles notable scientists, highlighting their achievements","citation-key":"rumbleCRCHandbookChemistry2017","edition":"98th edition 2017-2018","ISBN":"978-1-4987-8454-2","language":"eng","publisher":"CRC Press, Taylor &amp; Francis Group","publisher-place":"Boca Raton London New York","source":"K10plus ISBN","title":"CRC handbook of chemistry and physics","editor":[{"family":"Rumble","given":"John R."}],"issued":{"date-parts":[["2017"]]}}}],"schema":"https://github.com/citation-style-language/schema/raw/master/csl-citation.json"} </w:instrText>
             </w:r>
             <w:r>
               <w:rPr>
@@ -11145,7 +11145,7 @@
                 <w:sz w:val="22"/>
                 <w:vertAlign w:val="superscript"/>
               </w:rPr>
-              <w:t>[46]</w:t>
+              <w:t xml:space="preserve">[34]</w:t>
             </w:r>
             <w:r>
               <w:rPr>
@@ -11322,7 +11322,7 @@
                 <w:szCs w:val="22"/>
                 <w:lang w:val="en-US"/>
               </w:rPr>
-              <w:instrText xml:space="preserve"> ADDIN ZOTERO_ITEM CSL_CITATION {"citationID":"fY7GQsE5","properties":{"unsorted":false,"formattedCitation":"\\super [46]\\nosupersub{}","plainCitation":"[46]","noteIndex":0},"citationItems":[{"id":3844,"uris":["http://zotero.org/users/16939557/items/YSXNXCNJ"],"itemData":{"id":3844,"type":"book","abstract":"Presents chemistry and physics tables and profiles notable scientists, highlighting their achievements","citation-key":"rumbleCRCHandbookChemistry2017","edition":"98th edition 2017-2018","ISBN":"978-1-4987-8454-2","language":"eng","publisher":"CRC Press, Taylor &amp; Francis Group","publisher-place":"Boca Raton London New York","source":"K10plus ISBN","title":"CRC handbook of chemistry and physics","editor":[{"family":"Rumble","given":"John R."}],"issued":{"date-parts":[["2017"]]}}}],"schema":"https://github.com/citation-style-language/schema/raw/master/csl-citation.json"} </w:instrText>
+              <w:instrText xml:space="preserve"> ADDIN ZOTERO_ITEM CSL_CITATION {"citationID":"fY7GQsE5","properties":{"unsorted":false,"formattedCitation":"\\super [34]\\nosupersub{}","plainCitation":"[34]","noteIndex":0},"citationItems":[{"id":3844,"uris":["http://zotero.org/users/16939557/items/YSXNXCNJ"],"itemData":{"id":3844,"type":"book","abstract":"Presents chemistry and physics tables and profiles notable scientists, highlighting their achievements","citation-key":"rumbleCRCHandbookChemistry2017","edition":"98th edition 2017-2018","ISBN":"978-1-4987-8454-2","language":"eng","publisher":"CRC Press, Taylor &amp; Francis Group","publisher-place":"Boca Raton London New York","source":"K10plus ISBN","title":"CRC handbook of chemistry and physics","editor":[{"family":"Rumble","given":"John R."}],"issued":{"date-parts":[["2017"]]}}}],"schema":"https://github.com/citation-style-language/schema/raw/master/csl-citation.json"} </w:instrText>
             </w:r>
             <w:r>
               <w:rPr>
@@ -11339,7 +11339,7 @@
                 <w:sz w:val="22"/>
                 <w:vertAlign w:val="superscript"/>
               </w:rPr>
-              <w:t>[46]</w:t>
+              <w:t xml:space="preserve">[34]</w:t>
             </w:r>
             <w:r>
               <w:rPr>
@@ -11709,7 +11709,7 @@
                 <w:szCs w:val="22"/>
                 <w:lang w:val="en-US"/>
               </w:rPr>
-              <w:instrText xml:space="preserve"> ADDIN ZOTERO_ITEM CSL_CITATION {"citationID":"FohI0P9c","properties":{"unsorted":false,"formattedCitation":"\\super [47]\\nosupersub{}","plainCitation":"[47]","noteIndex":0},"citationItems":[{"id":4251,"uris":["http://zotero.org/users/16939557/items/GLJFP5WA"],"itemData":{"id":4251,"type":"book","citation-key":"Lide1991","edition":"72","publisher":"CRC Press","publisher-place":"Boca Raton","title":"CRC handbook of chemistry and physics","editor":[{"family":"Lide","given":"D. R."}],"issued":{"date-parts":[["1991"]]}}}],"schema":"https://github.com/citation-style-language/schema/raw/master/csl-citation.json"} </w:instrText>
+              <w:instrText xml:space="preserve"> ADDIN ZOTERO_ITEM CSL_CITATION {"citationID":"FohI0P9c","properties":{"unsorted":false,"formattedCitation":"\\super [35]\\nosupersub{}","plainCitation":"[35]","noteIndex":0},"citationItems":[{"id":4251,"uris":["http://zotero.org/users/16939557/items/GLJFP5WA"],"itemData":{"id":4251,"type":"book","citation-key":"Lide1991","edition":"72","publisher":"CRC Press","publisher-place":"Boca Raton","title":"CRC handbook of chemistry and physics","editor":[{"family":"Lide","given":"D. R."}],"issued":{"date-parts":[["1991"]]}}}],"schema":"https://github.com/citation-style-language/schema/raw/master/csl-citation.json"} </w:instrText>
             </w:r>
             <w:r>
               <w:rPr>
@@ -11726,7 +11726,7 @@
                 <w:sz w:val="22"/>
                 <w:vertAlign w:val="superscript"/>
               </w:rPr>
-              <w:t>[47]</w:t>
+              <w:t xml:space="preserve">[35]</w:t>
             </w:r>
             <w:r>
               <w:rPr>
@@ -12005,7 +12005,7 @@
                 <w:szCs w:val="22"/>
                 <w:lang w:val="en-US"/>
               </w:rPr>
-              <w:instrText xml:space="preserve"> ADDIN ZOTERO_ITEM CSL_CITATION {"citationID":"IpJnXCkS","properties":{"unsorted":false,"formattedCitation":"\\super [47]\\nosupersub{}","plainCitation":"[47]","noteIndex":0},"citationItems":[{"id":4251,"uris":["http://zotero.org/users/16939557/items/GLJFP5WA"],"itemData":{"id":4251,"type":"book","citation-key":"Lide1991","edition":"72","publisher":"CRC Press","publisher-place":"Boca Raton","title":"CRC handbook of chemistry and physics","editor":[{"family":"Lide","given":"D. R."}],"issued":{"date-parts":[["1991"]]}}}],"schema":"https://github.com/citation-style-language/schema/raw/master/csl-citation.json"} </w:instrText>
+              <w:instrText xml:space="preserve"> ADDIN ZOTERO_ITEM CSL_CITATION {"citationID":"IpJnXCkS","properties":{"unsorted":false,"formattedCitation":"\\super [35]\\nosupersub{}","plainCitation":"[35]","noteIndex":0},"citationItems":[{"id":4251,"uris":["http://zotero.org/users/16939557/items/GLJFP5WA"],"itemData":{"id":4251,"type":"book","citation-key":"Lide1991","edition":"72","publisher":"CRC Press","publisher-place":"Boca Raton","title":"CRC handbook of chemistry and physics","editor":[{"family":"Lide","given":"D. R."}],"issued":{"date-parts":[["1991"]]}}}],"schema":"https://github.com/citation-style-language/schema/raw/master/csl-citation.json"} </w:instrText>
             </w:r>
             <w:r>
               <w:rPr>
@@ -12022,7 +12022,7 @@
                 <w:sz w:val="22"/>
                 <w:vertAlign w:val="superscript"/>
               </w:rPr>
-              <w:t>[47]</w:t>
+              <w:t xml:space="preserve">[35]</w:t>
             </w:r>
             <w:r>
               <w:rPr>
@@ -12302,7 +12302,7 @@
                 <w:szCs w:val="22"/>
                 <w:lang w:val="en-US"/>
               </w:rPr>
-              <w:instrText xml:space="preserve"> ADDIN ZOTERO_ITEM CSL_CITATION {"citationID":"WlQtYYIw","properties":{"unsorted":false,"formattedCitation":"\\super [47]\\nosupersub{}","plainCitation":"[47]","noteIndex":0},"citationItems":[{"id":4251,"uris":["http://zotero.org/users/16939557/items/GLJFP5WA"],"itemData":{"id":4251,"type":"book","citation-key":"Lide1991","edition":"72","publisher":"CRC Press","publisher-place":"Boca Raton","title":"CRC handbook of chemistry and physics","editor":[{"family":"Lide","given":"D. R."}],"issued":{"date-parts":[["1991"]]}}}],"schema":"https://github.com/citation-style-language/schema/raw/master/csl-citation.json"} </w:instrText>
+              <w:instrText xml:space="preserve"> ADDIN ZOTERO_ITEM CSL_CITATION {"citationID":"WlQtYYIw","properties":{"unsorted":false,"formattedCitation":"\\super [35]\\nosupersub{}","plainCitation":"[35]","noteIndex":0},"citationItems":[{"id":4251,"uris":["http://zotero.org/users/16939557/items/GLJFP5WA"],"itemData":{"id":4251,"type":"book","citation-key":"Lide1991","edition":"72","publisher":"CRC Press","publisher-place":"Boca Raton","title":"CRC handbook of chemistry and physics","editor":[{"family":"Lide","given":"D. R."}],"issued":{"date-parts":[["1991"]]}}}],"schema":"https://github.com/citation-style-language/schema/raw/master/csl-citation.json"} </w:instrText>
             </w:r>
             <w:r>
               <w:rPr>
@@ -12319,7 +12319,7 @@
                 <w:sz w:val="22"/>
                 <w:vertAlign w:val="superscript"/>
               </w:rPr>
-              <w:t>[47]</w:t>
+              <w:t xml:space="preserve">[35]</w:t>
             </w:r>
             <w:r>
               <w:rPr>
@@ -12614,7 +12614,7 @@
                 <w:szCs w:val="22"/>
                 <w:lang w:val="en-US"/>
               </w:rPr>
-              <w:instrText xml:space="preserve"> ADDIN ZOTERO_ITEM CSL_CITATION {"citationID":"m13lUIve","properties":{"unsorted":false,"formattedCitation":"\\super [48]\\nosupersub{}","plainCitation":"[48]","noteIndex":0},"citationItems":[{"id":3994,"uris":["http://zotero.org/users/16939557/items/TWITJIEX","http://zotero.org/users/16939557/items/6XPFCI3L"],"itemData":{"id":3994,"type":"article-journal","citation-key":"hanTemperatureDependenceOxygen1996","container-title":"The Journal of Physical Chemistry","DOI":"10.1021/jp952903y","ISSN":"0022-3654, 1541-5740","issue":"13","journalAbbreviation":"J. Phys. Chem.","language":"en","page":"5597-5602","source":"DOI.org (Crossref)","title":"&lt;b&gt;Temperature Dependence of Oxygen Diffusion in&lt;/b&gt; &lt;b&gt;H&lt;/b&gt; &lt;b&gt;&lt;sub&gt;2&lt;/sub&gt; &lt;/b&gt; &lt;b&gt;O and D&lt;/b&gt; &lt;b&gt;&lt;sub&gt;2&lt;/sub&gt; &lt;/b&gt; &lt;b&gt;O&lt;/b&gt;","volume":"100","author":[{"family":"Han","given":"Ping"},{"family":"Bartels","given":"David M."}],"issued":{"date-parts":[["1996",1,1]]}}}],"schema":"https://github.com/citation-style-language/schema/raw/master/csl-citation.json"} </w:instrText>
+              <w:instrText xml:space="preserve"> ADDIN ZOTERO_ITEM CSL_CITATION {"citationID":"m13lUIve","properties":{"unsorted":false,"formattedCitation":"\\super [36]\\nosupersub{}","plainCitation":"[36]","noteIndex":0},"citationItems":[{"id":3994,"uris":["http://zotero.org/users/16939557/items/TWITJIEX","http://zotero.org/users/16939557/items/6XPFCI3L"],"itemData":{"id":3994,"type":"article-journal","citation-key":"hanTemperatureDependenceOxygen1996","container-title":"The Journal of Physical Chemistry","DOI":"10.1021/jp952903y","ISSN":"0022-3654, 1541-5740","issue":"13","journalAbbreviation":"J. Phys. Chem.","language":"en","page":"5597-5602","source":"DOI.org (Crossref)","title":"&lt;b&gt;Temperature Dependence of Oxygen Diffusion in&lt;/b&gt; &lt;b&gt;H&lt;/b&gt; &lt;b&gt;&lt;sub&gt;2&lt;/sub&gt; &lt;/b&gt; &lt;b&gt;O and D&lt;/b&gt; &lt;b&gt;&lt;sub&gt;2&lt;/sub&gt; &lt;/b&gt; &lt;b&gt;O&lt;/b&gt;","volume":"100","author":[{"family":"Han","given":"Ping"},{"family":"Bartels","given":"David M."}],"issued":{"date-parts":[["1996",1,1]]}}}],"schema":"https://github.com/citation-style-language/schema/raw/master/csl-citation.json"} </w:instrText>
             </w:r>
             <w:r>
               <w:rPr>
@@ -12631,7 +12631,7 @@
                 <w:sz w:val="22"/>
                 <w:vertAlign w:val="superscript"/>
               </w:rPr>
-              <w:t>[48]</w:t>
+              <w:t xml:space="preserve">[36]</w:t>
             </w:r>
             <w:r>
               <w:rPr>
@@ -12898,7 +12898,7 @@
                 <w:szCs w:val="22"/>
                 <w:lang w:val="en-US"/>
               </w:rPr>
-              <w:instrText xml:space="preserve"> ADDIN ZOTERO_ITEM CSL_CITATION {"citationID":"AFJiXUVg","properties":{"unsorted":false,"formattedCitation":"\\super [47]\\nosupersub{}","plainCitation":"[47]","noteIndex":0},"citationItems":[{"id":4251,"uris":["http://zotero.org/users/16939557/items/GLJFP5WA"],"itemData":{"id":4251,"type":"book","citation-key":"Lide1991","edition":"72","publisher":"CRC Press","publisher-place":"Boca Raton","title":"CRC handbook of chemistry and physics","editor":[{"family":"Lide","given":"D. R."}],"issued":{"date-parts":[["1991"]]}}}],"schema":"https://github.com/citation-style-language/schema/raw/master/csl-citation.json"} </w:instrText>
+              <w:instrText xml:space="preserve"> ADDIN ZOTERO_ITEM CSL_CITATION {"citationID":"AFJiXUVg","properties":{"unsorted":false,"formattedCitation":"\\super [35]\\nosupersub{}","plainCitation":"[35]","noteIndex":0},"citationItems":[{"id":4251,"uris":["http://zotero.org/users/16939557/items/GLJFP5WA"],"itemData":{"id":4251,"type":"book","citation-key":"Lide1991","edition":"72","publisher":"CRC Press","publisher-place":"Boca Raton","title":"CRC handbook of chemistry and physics","editor":[{"family":"Lide","given":"D. R."}],"issued":{"date-parts":[["1991"]]}}}],"schema":"https://github.com/citation-style-language/schema/raw/master/csl-citation.json"} </w:instrText>
             </w:r>
             <w:r>
               <w:rPr>
@@ -12915,7 +12915,7 @@
                 <w:sz w:val="22"/>
                 <w:vertAlign w:val="superscript"/>
               </w:rPr>
-              <w:t>[47]</w:t>
+              <w:t xml:space="preserve">[35]</w:t>
             </w:r>
             <w:r>
               <w:rPr>
@@ -13054,7 +13054,7 @@
                 <w:szCs w:val="22"/>
                 <w:lang w:val="en-US"/>
               </w:rPr>
-              <w:instrText xml:space="preserve"> ADDIN ZOTERO_ITEM CSL_CITATION {"citationID":"oOAQfSGY","properties":{"unsorted":false,"formattedCitation":"\\super [49]\\nosupersub{}","plainCitation":"[49]","noteIndex":0},"citationItems":[{"id":4093,"uris":["http://zotero.org/users/16939557/items/UL4PDBDZ"],"itemData":{"id":4093,"type":"article-journal","abstract":"Porous films of metals and metal oxides exhibit larger surface areas and higher reactivities than those of dense films. Therefore, they have gained growing attention as potential materials for use in various applications. This study reports the use of a modified direct current magnetron sputtering method to form porous Zn-ZnO composite films, wherein a subsequent wet post-oxidation process is employed to fabricate pure porous ZnO films. The porous Zn-ZnO composite films were initially formed in clusters, and evaluation of their resulting properties allowed the optimal conditions to be determined. An oxygen ratio of 0.3% in the argon gas flow resulted in the best porosity, while a process pressure of 14 mTorr was optimal. Following deposition, porous ZnO films were obtained through rapid thermal annealing in the presence of water vapor, and the properties and porosities of the obtained films were analyzed. An oxidation temperature of 500 °C was optimal, with an oxidation time of 5 min giving a pure ZnO film with 26% porosity. Due to the fact that the films produced using this method are highly reliable, they could be employed in applications that require large specific surface areas, such as sensors, supercapacitors, and batteries.","citation-key":"parkFabricationHighlyPorous2021","container-title":"Materials","DOI":"10.3390/ma14206112","ISSN":"1996-1944","issue":"20","journalAbbreviation":"Materials","language":"en","page":"6112","source":"DOI.org (Crossref)","title":"Fabrication of Highly Porous and Pure Zinc Oxide Films Using Modified DC Magnetron Sputtering and Post-Oxidation","volume":"14","author":[{"family":"Park","given":"Se-Yong"},{"family":"Rho","given":"Soon-Ho"},{"family":"Lee","given":"Hwan-Seok"},{"family":"Kim","given":"Kyoung-Min"},{"family":"Lee","given":"Hee-Chul"}],"issued":{"date-parts":[["2021",10,15]]}}}],"schema":"https://github.com/citation-style-language/schema/raw/master/csl-citation.json"} </w:instrText>
+              <w:instrText xml:space="preserve"> ADDIN ZOTERO_ITEM CSL_CITATION {"citationID":"oOAQfSGY","properties":{"unsorted":false,"formattedCitation":"\\super [37]\\nosupersub{}","plainCitation":"[37]","noteIndex":0},"citationItems":[{"id":4093,"uris":["http://zotero.org/users/16939557/items/UL4PDBDZ"],"itemData":{"id":4093,"type":"article-journal","abstract":"Porous films of metals and metal oxides exhibit larger surface areas and higher reactivities than those of dense films. Therefore, they have gained growing attention as potential materials for use in various applications. This study reports the use of a modified direct current magnetron sputtering method to form porous Zn-ZnO composite films, wherein a subsequent wet post-oxidation process is employed to fabricate pure porous ZnO films. The porous Zn-ZnO composite films were initially formed in clusters, and evaluation of their resulting properties allowed the optimal conditions to be determined. An oxygen ratio of 0.3% in the argon gas flow resulted in the best porosity, while a process pressure of 14 mTorr was optimal. Following deposition, porous ZnO films were obtained through rapid thermal annealing in the presence of water vapor, and the properties and porosities of the obtained films were analyzed. An oxidation temperature of 500 °C was optimal, with an oxidation time of 5 min giving a pure ZnO film with 26% porosity. Due to the fact that the films produced using this method are highly reliable, they could be employed in applications that require large specific surface areas, such as sensors, supercapacitors, and batteries.","citation-key":"parkFabricationHighlyPorous2021","container-title":"Materials","DOI":"10.3390/ma14206112","ISSN":"1996-1944","issue":"20","journalAbbreviation":"Materials","language":"en","page":"6112","source":"DOI.org (Crossref)","title":"Fabrication of Highly Porous and Pure Zinc Oxide Films Using Modified DC Magnetron Sputtering and Post-Oxidation","volume":"14","author":[{"family":"Park","given":"Se-Yong"},{"family":"Rho","given":"Soon-Ho"},{"family":"Lee","given":"Hwan-Seok"},{"family":"Kim","given":"Kyoung-Min"},{"family":"Lee","given":"Hee-Chul"}],"issued":{"date-parts":[["2021",10,15]]}}}],"schema":"https://github.com/citation-style-language/schema/raw/master/csl-citation.json"} </w:instrText>
             </w:r>
             <w:r>
               <w:rPr>
@@ -13071,7 +13071,7 @@
                 <w:sz w:val="22"/>
                 <w:vertAlign w:val="superscript"/>
               </w:rPr>
-              <w:t>[49]</w:t>
+              <w:t xml:space="preserve">[37]</w:t>
             </w:r>
             <w:r>
               <w:rPr>
@@ -13305,7 +13305,7 @@
                 <w:vertAlign w:val="superscript"/>
                 <w:lang w:val="en-US"/>
               </w:rPr>
-              <w:instrText xml:space="preserve"> ADDIN ZOTERO_ITEM CSL_CITATION {"citationID":"Au8QZnxE","properties":{"unsorted":false,"formattedCitation":"\\super [50]\\nosupersub{}","plainCitation":"[50]","noteIndex":0},"citationItems":[{"id":3991,"uris":["http://zotero.org/users/16939557/items/PJ5WSM85"],"itemData":{"id":3991,"type":"chapter","abstract":"Abstract\n            \n              It is generally assumed that transport resistance in porous media, which can also be expressed as tortuosity, correlates somehow with the pore volume fraction. Hence, mathematical expressions such as the Bruggeman relation (i.e.,\n              τ\n              2\n               = \n              ε\n              −1/2\n              ) are often used to describe tortuosity (\n              τ\n              )—porosity (\n              ε\n              ) relationships in porous materials. In this chapter, the validity of such mathematical expressions is critically evaluated based on empirical data from literature. More than 2200 datapoints (i.e.,\n              τ\n              –\n              ε\n              couples) are collected from 69 studies on porous media transport. When the empirical data is analysed separately for different material types (e.g., for battery electrodes, SOFC electrodes, sandstones, packed spheres etc.), the resulting\n              τ\n              versus\n              ε\n              —plots do not show clear trend lines, that could be expressed with a mathematical expression. Instead, the datapoints for different materials show strongly scattered distributions in rather ill-defined ‘characteristic’ fields. Overall, those characteristic fields are strongly overlapping, which means that the\n              τ\n              –\n              ε\n              characteristics of different materials cannot be separated clearly. When the empirical data is analysed for different tortuosity types, a much more consistent pattern becomes apparent. Hence, the observed\n              τ\n              −\n              ε\n              pattern indicates that the measured tortuosity values strongly depend on the involved type of tortuosity. A relative order of measured tortuosity values then becomes apparent. For example, the values observed for direct geometric and mixed tortuosities are concentrated in a relatively narrow band close to the Bruggeman trend line, with values that are typically &lt; 2. In contrast, indirect tortuosities show higher values, and they scatter over a much larger range. Based on the analysis of empirical data, a detailed pattern with a very consistent relative order among the different tortuosity types can be established. The main conclusion from this chapter is thus that the tortuosity value that is measured for a specific material, is much more dependent on the type of tortuosity than it is dependent on the material and its microstructure. The empirical data also illustrates that tortuosity is not strictly bound to porosity. As the pore volume decreases, the more scattering of tortuosity values can be observed. Consequently, any mathematical expression that aims to provide a generalized description of\n              τ\n              −\n              ε\n              relationships in porous media must be questioned. A short section is thus provided with a discussion of the limitations of such mathematical expressions for\n              τ\n              −\n              ε\n              relationships. This discussion also includes a description of the rare and special cases, for which the use of such mathematical expressions can be justified.","citation-key":"holzerTortuosityPorosityRelationshipsReview2023","container-title":"Tortuosity and Microstructure Effects in Porous Media","DOI":"10.1007/978-3-031-30477-4_3","ISBN":"978-3-031-30476-7","language":"en","note":"collection-title: Springer Series in Materials Science","page":"51-89","publisher":"Springer International Publishing","publisher-place":"Cham","source":"DOI.org (Crossref)","title":"Tortuosity-Porosity Relationships: Review of Empirical Data from Literature","title-short":"Tortuosity-Porosity Relationships","URL":"https://link.springer.com/10.1007/978-3-031-30477-4_3","volume":"333","container-author":[{"family":"Holzer","given":"Lorenz"},{"family":"Marmet","given":"Philip"},{"family":"Fingerle","given":"Mathias"},{"family":"Wiegmann","given":"Andreas"},{"family":"Neumann","given":"Matthias"},{"family":"Schmidt","given":"Volker"}],"author":[{"family":"Holzer","given":"Lorenz"},{"family":"Marmet","given":"Philip"},{"family":"Fingerle","given":"Mathias"},{"family":"Wiegmann","given":"Andreas"},{"family":"Neumann","given":"Matthias"},{"family":"Schmidt","given":"Volker"}],"accessed":{"date-parts":[["2026",3,12]]},"issued":{"date-parts":[["2023"]]}}}],"schema":"https://github.com/citation-style-language/schema/raw/master/csl-citation.json"} </w:instrText>
+              <w:instrText xml:space="preserve"> ADDIN ZOTERO_ITEM CSL_CITATION {"citationID":"Au8QZnxE","properties":{"unsorted":false,"formattedCitation":"\\super [38]\\nosupersub{}","plainCitation":"[38]","noteIndex":0},"citationItems":[{"id":3991,"uris":["http://zotero.org/users/16939557/items/PJ5WSM85"],"itemData":{"id":3991,"type":"chapter","abstract":"Abstract\n            \n              It is generally assumed that transport resistance in porous media, which can also be expressed as tortuosity, correlates somehow with the pore volume fraction. Hence, mathematical expressions such as the Bruggeman relation (i.e.,\n              τ\n              2\n               = \n              ε\n              −1/2\n              ) are often used to describe tortuosity (\n              τ\n              )—porosity (\n              ε\n              ) relationships in porous materials. In this chapter, the validity of such mathematical expressions is critically evaluated based on empirical data from literature. More than 2200 datapoints (i.e.,\n              τ\n              –\n              ε\n              couples) are collected from 69 studies on porous media transport. When the empirical data is analysed separately for different material types (e.g., for battery electrodes, SOFC electrodes, sandstones, packed spheres etc.), the resulting\n              τ\n              versus\n              ε\n              —plots do not show clear trend lines, that could be expressed with a mathematical expression. Instead, the datapoints for different materials show strongly scattered distributions in rather ill-defined ‘characteristic’ fields. Overall, those characteristic fields are strongly overlapping, which means that the\n              τ\n              –\n              ε\n              characteristics of different materials cannot be separated clearly. When the empirical data is analysed for different tortuosity types, a much more consistent pattern becomes apparent. Hence, the observed\n              τ\n              −\n              ε\n              pattern indicates that the measured tortuosity values strongly depend on the involved type of tortuosity. A relative order of measured tortuosity values then becomes apparent. For example, the values observed for direct geometric and mixed tortuosities are concentrated in a relatively narrow band close to the Bruggeman trend line, with values that are typically &lt; 2. In contrast, indirect tortuosities show higher values, and they scatter over a much larger range. Based on the analysis of empirical data, a detailed pattern with a very consistent relative order among the different tortuosity types can be established. The main conclusion from this chapter is thus that the tortuosity value that is measured for a specific material, is much more dependent on the type of tortuosity than it is dependent on the material and its microstructure. The empirical data also illustrates that tortuosity is not strictly bound to porosity. As the pore volume decreases, the more scattering of tortuosity values can be observed. Consequently, any mathematical expression that aims to provide a generalized description of\n              τ\n              −\n              ε\n              relationships in porous media must be questioned. A short section is thus provided with a discussion of the limitations of such mathematical expressions for\n              τ\n              −\n              ε\n              relationships. This discussion also includes a description of the rare and special cases, for which the use of such mathematical expressions can be justified.","citation-key":"holzerTortuosityPorosityRelationshipsReview2023","container-title":"Tortuosity and Microstructure Effects in Porous Media","DOI":"10.1007/978-3-031-30477-4_3","ISBN":"978-3-031-30476-7","language":"en","note":"collection-title: Springer Series in Materials Science","page":"51-89","publisher":"Springer International Publishing","publisher-place":"Cham","source":"DOI.org (Crossref)","title":"Tortuosity-Porosity Relationships: Review of Empirical Data from Literature","title-short":"Tortuosity-Porosity Relationships","URL":"https://link.springer.com/10.1007/978-3-031-30477-4_3","volume":"333","container-author":[{"family":"Holzer","given":"Lorenz"},{"family":"Marmet","given":"Philip"},{"family":"Fingerle","given":"Mathias"},{"family":"Wiegmann","given":"Andreas"},{"family":"Neumann","given":"Matthias"},{"family":"Schmidt","given":"Volker"}],"author":[{"family":"Holzer","given":"Lorenz"},{"family":"Marmet","given":"Philip"},{"family":"Fingerle","given":"Mathias"},{"family":"Wiegmann","given":"Andreas"},{"family":"Neumann","given":"Matthias"},{"family":"Schmidt","given":"Volker"}],"accessed":{"date-parts":[["2026",3,12]]},"issued":{"date-parts":[["2023"]]}}}],"schema":"https://github.com/citation-style-language/schema/raw/master/csl-citation.json"} </w:instrText>
             </w:r>
             <w:r>
               <w:rPr>
@@ -13322,7 +13322,7 @@
                 <w:sz w:val="22"/>
                 <w:vertAlign w:val="superscript"/>
               </w:rPr>
-              <w:t>[50]</w:t>
+              <w:t xml:space="preserve">[38]</w:t>
             </w:r>
             <w:r>
               <w:rPr>
@@ -13363,7 +13363,7 @@
                 <w:szCs w:val="22"/>
                 <w:lang w:val="en-US"/>
               </w:rPr>
-              <w:instrText xml:space="preserve"> ADDIN ZOTERO_ITEM CSL_CITATION {"citationID":"9qIzsxfq","properties":{"unsorted":false,"formattedCitation":"\\super [46]\\nosupersub{}","plainCitation":"[46]","noteIndex":0},"citationItems":[{"id":3844,"uris":["http://zotero.org/users/16939557/items/YSXNXCNJ"],"itemData":{"id":3844,"type":"book","abstract":"Presents chemistry and physics tables and profiles notable scientists, highlighting their achievements","citation-key":"rumbleCRCHandbookChemistry2017","edition":"98th edition 2017-2018","ISBN":"978-1-4987-8454-2","language":"eng","publisher":"CRC Press, Taylor &amp; Francis Group","publisher-place":"Boca Raton London New York","source":"K10plus ISBN","title":"CRC handbook of chemistry and physics","editor":[{"family":"Rumble","given":"John R."}],"issued":{"date-parts":[["2017"]]}}}],"schema":"https://github.com/citation-style-language/schema/raw/master/csl-citation.json"} </w:instrText>
+              <w:instrText xml:space="preserve"> ADDIN ZOTERO_ITEM CSL_CITATION {"citationID":"9qIzsxfq","properties":{"unsorted":false,"formattedCitation":"\\super [34]\\nosupersub{}","plainCitation":"[34]","noteIndex":0},"citationItems":[{"id":3844,"uris":["http://zotero.org/users/16939557/items/YSXNXCNJ"],"itemData":{"id":3844,"type":"book","abstract":"Presents chemistry and physics tables and profiles notable scientists, highlighting their achievements","citation-key":"rumbleCRCHandbookChemistry2017","edition":"98th edition 2017-2018","ISBN":"978-1-4987-8454-2","language":"eng","publisher":"CRC Press, Taylor &amp; Francis Group","publisher-place":"Boca Raton London New York","source":"K10plus ISBN","title":"CRC handbook of chemistry and physics","editor":[{"family":"Rumble","given":"John R."}],"issued":{"date-parts":[["2017"]]}}}],"schema":"https://github.com/citation-style-language/schema/raw/master/csl-citation.json"} </w:instrText>
             </w:r>
             <w:r>
               <w:rPr>
@@ -13380,7 +13380,7 @@
                 <w:sz w:val="22"/>
                 <w:vertAlign w:val="superscript"/>
               </w:rPr>
-              <w:t>[46]</w:t>
+              <w:t xml:space="preserve">[34]</w:t>
             </w:r>
             <w:r>
               <w:rPr>
@@ -13716,7 +13716,7 @@
                 <w:szCs w:val="22"/>
                 <w:lang w:val="en-US"/>
               </w:rPr>
-              <w:instrText xml:space="preserve"> ADDIN ZOTERO_ITEM CSL_CITATION {"citationID":"4uE0bPh7","properties":{"unsorted":false,"formattedCitation":"\\super [51]\\nosupersub{}","plainCitation":"[51]","noteIndex":0},"citationItems":[{"id":3507,"uris":["http://zotero.org/users/16939557/items/3SWFGNFX"],"itemData":{"id":3507,"type":"article-journal","citation-key":"chenFluidinducedCorrosionBehavior2021","container-title":"Journal of Materials Science &amp; Technology","DOI":"10.1016/j.jmst.2021.02.050","ISSN":"10050302","journalAbbreviation":"Journal of Materials Science &amp; Technology","language":"en","page":"134-147","source":"DOI.org (Crossref)","title":"Fluid-induced corrosion behavior of degradable zinc for stent application","volume":"91","author":[{"family":"Chen","given":"Kai"},{"family":"Gu","given":"Xuenan"},{"family":"Sun","given":"Hui"},{"family":"Tang","given":"Hongyan"},{"family":"Yang","given":"Hongtao"},{"family":"Gong","given":"Xianghui"},{"family":"Fan","given":"Yubo"}],"issued":{"date-parts":[["2021",11]]}}}],"schema":"https://github.com/citation-style-language/schema/raw/master/csl-citation.json"} </w:instrText>
+              <w:instrText xml:space="preserve"> ADDIN ZOTERO_ITEM CSL_CITATION {"citationID":"4uE0bPh7","properties":{"unsorted":false,"formattedCitation":"\\super [39]\\nosupersub{}","plainCitation":"[39]","noteIndex":0},"citationItems":[{"id":3507,"uris":["http://zotero.org/users/16939557/items/3SWFGNFX"],"itemData":{"id":3507,"type":"article-journal","citation-key":"chenFluidinducedCorrosionBehavior2021","container-title":"Journal of Materials Science &amp; Technology","DOI":"10.1016/j.jmst.2021.02.050","ISSN":"10050302","journalAbbreviation":"Journal of Materials Science &amp; Technology","language":"en","page":"134-147","source":"DOI.org (Crossref)","title":"Fluid-induced corrosion behavior of degradable zinc for stent application","volume":"91","author":[{"family":"Chen","given":"Kai"},{"family":"Gu","given":"Xuenan"},{"family":"Sun","given":"Hui"},{"family":"Tang","given":"Hongyan"},{"family":"Yang","given":"Hongtao"},{"family":"Gong","given":"Xianghui"},{"family":"Fan","given":"Yubo"}],"issued":{"date-parts":[["2021",11]]}}}],"schema":"https://github.com/citation-style-language/schema/raw/master/csl-citation.json"} </w:instrText>
             </w:r>
             <w:r>
               <w:rPr>
@@ -13733,7 +13733,7 @@
                 <w:sz w:val="22"/>
                 <w:vertAlign w:val="superscript"/>
               </w:rPr>
-              <w:t>[51]</w:t>
+              <w:t xml:space="preserve">[39]</w:t>
             </w:r>
             <w:r>
               <w:rPr>
@@ -14269,7 +14269,7 @@
                 <w:szCs w:val="22"/>
                 <w:lang w:val="en-US"/>
               </w:rPr>
-              <w:instrText xml:space="preserve"> ADDIN ZOTERO_ITEM CSL_CITATION {"citationID":"ZtOdV6sS","properties":{"unsorted":false,"formattedCitation":"\\super [52]\\nosupersub{}","plainCitation":"[52]","noteIndex":0},"citationItems":[{"id":4092,"uris":["http://zotero.org/users/16939557/items/946AFXXG"],"itemData":{"id":4092,"type":"article-journal","abstract":"The electrochemical corrosion characteristics of AZ31 and AZ61 magnesium alloys were analyzed in terms of potentiodynamic tests and electrochemical impedance spectroscopy. The influence of the solution composition and material surface finish was examined also through the analysis of corrosion products created on the samples’ surface after electrochemical measurements in terms of scanning electron microscopy using energy-dispersive spectroscopy. Obtained data revealed the differences in the response of the magnesium alloys to enriched Hank’s Balanced Salt Solution—HBSS+ (with Mg2+ and Ca2+ ions) and Hank’s Balanced Salt Solution—HBSS (without Mg2+ and Ca2+ ions). Both examined alloys exhibited better corrosion resistance from the thermodynamic and kinetic point of view in the enriched HBSS+. AZ61 magnesium alloy reached higher values of polarization resistance than AZ31 magnesium alloy in both the used corrosion solutions. Phosphate-based corrosion products were characteristic for the AZ31 and AZ61 alloys tested in the HBSS (without Mg2+ and Ca2+ ions). The combination of phosphate-based corrosion products and clusters of MgO and Mg(OH)2 was typical for the surface of samples tested in the enriched HBSS+ (with Mg2+ and Ca2+ ions). Pitting corrosion attack was observed only in the case of enriched HBSS+.","citation-key":"tkaczInfluenceCompositionHanks2017","container-title":"Metals","DOI":"10.3390/met7110465","ISSN":"2075-4701","issue":"11","journalAbbreviation":"Metals","language":"en","page":"465","source":"DOI.org (Crossref)","title":"Influence of the Composition of the Hank’s Balanced Salt Solution on the Corrosion Behavior of AZ31 and AZ61 Magnesium Alloys","volume":"7","author":[{"family":"Tkacz","given":"Jakub"},{"family":"Slouková","given":"Karolína"},{"family":"Minda","given":"Jozef"},{"family":"Drábiková","given":"Juliána"},{"family":"Fintová","given":"Stanislava"},{"family":"Doležal","given":"Pavel"},{"family":"Wasserbauer","given":"Jaromír"}],"issued":{"date-parts":[["2017",11,1]]}}}],"schema":"https://github.com/citation-style-language/schema/raw/master/csl-citation.json"} </w:instrText>
+              <w:instrText xml:space="preserve"> ADDIN ZOTERO_ITEM CSL_CITATION {"citationID":"ZtOdV6sS","properties":{"unsorted":false,"formattedCitation":"\\super [40]\\nosupersub{}","plainCitation":"[40]","noteIndex":0},"citationItems":[{"id":4092,"uris":["http://zotero.org/users/16939557/items/946AFXXG"],"itemData":{"id":4092,"type":"article-journal","abstract":"The electrochemical corrosion characteristics of AZ31 and AZ61 magnesium alloys were analyzed in terms of potentiodynamic tests and electrochemical impedance spectroscopy. The influence of the solution composition and material surface finish was examined also through the analysis of corrosion products created on the samples’ surface after electrochemical measurements in terms of scanning electron microscopy using energy-dispersive spectroscopy. Obtained data revealed the differences in the response of the magnesium alloys to enriched Hank’s Balanced Salt Solution—HBSS+ (with Mg2+ and Ca2+ ions) and Hank’s Balanced Salt Solution—HBSS (without Mg2+ and Ca2+ ions). Both examined alloys exhibited better corrosion resistance from the thermodynamic and kinetic point of view in the enriched HBSS+. AZ61 magnesium alloy reached higher values of polarization resistance than AZ31 magnesium alloy in both the used corrosion solutions. Phosphate-based corrosion products were characteristic for the AZ31 and AZ61 alloys tested in the HBSS (without Mg2+ and Ca2+ ions). The combination of phosphate-based corrosion products and clusters of MgO and Mg(OH)2 was typical for the surface of samples tested in the enriched HBSS+ (with Mg2+ and Ca2+ ions). Pitting corrosion attack was observed only in the case of enriched HBSS+.","citation-key":"tkaczInfluenceCompositionHanks2017","container-title":"Metals","DOI":"10.3390/met7110465","ISSN":"2075-4701","issue":"11","journalAbbreviation":"Metals","language":"en","page":"465","source":"DOI.org (Crossref)","title":"Influence of the Composition of the Hank’s Balanced Salt Solution on the Corrosion Behavior of AZ31 and AZ61 Magnesium Alloys","volume":"7","author":[{"family":"Tkacz","given":"Jakub"},{"family":"Slouková","given":"Karolína"},{"family":"Minda","given":"Jozef"},{"family":"Drábiková","given":"Juliána"},{"family":"Fintová","given":"Stanislava"},{"family":"Doležal","given":"Pavel"},{"family":"Wasserbauer","given":"Jaromír"}],"issued":{"date-parts":[["2017",11,1]]}}}],"schema":"https://github.com/citation-style-language/schema/raw/master/csl-citation.json"} </w:instrText>
             </w:r>
             <w:r>
               <w:rPr>
@@ -14286,7 +14286,7 @@
                 <w:sz w:val="22"/>
                 <w:vertAlign w:val="superscript"/>
               </w:rPr>
-              <w:t>[52]</w:t>
+              <w:t xml:space="preserve">[40]</w:t>
             </w:r>
             <w:r>
               <w:rPr>
@@ -14543,7 +14543,7 @@
                 <w:szCs w:val="22"/>
                 <w:lang w:val="en-US"/>
               </w:rPr>
-              <w:instrText xml:space="preserve"> ADDIN ZOTERO_ITEM CSL_CITATION {"citationID":"Qb99DDIy","properties":{"unsorted":false,"formattedCitation":"\\super [29]\\nosupersub{}","plainCitation":"[29]","noteIndex":0},"citationItems":[{"id":3837,"uris":["http://zotero.org/users/16939557/items/FRKT7M6B"],"itemData":{"id":3837,"type":"article-journal","citation-key":"zhangComparativeInvestigationCorrosion2024","container-title":"Materials Today Communications","DOI":"10.1016/j.mtcomm.2024.108811","ISSN":"23524928","journalAbbreviation":"Materials Today Communications","language":"en","page":"108811","source":"DOI.org (Crossref)","title":"Comparative investigation of the corrosion behavior of biomedical zinc alloys in oxygen-enriched simulated body fluid environments","volume":"39","author":[{"family":"Zhang","given":"Dekang"},{"family":"Zhang","given":"Lu"},{"family":"Zhang","given":"Xin"},{"family":"Dai","given":"Jianwei"},{"family":"Zhao","given":"Yanbin"},{"family":"Yang","given":"Qianzi"},{"family":"Bai","given":"Jing"},{"family":"Xue","given":"Feng"},{"family":"Chu","given":"Paul K."},{"family":"Chu","given":"Chenglin"}],"issued":{"date-parts":[["2024",6]]}}}],"schema":"https://github.com/citation-style-language/schema/raw/master/csl-citation.json"} </w:instrText>
+              <w:instrText xml:space="preserve"> ADDIN ZOTERO_ITEM CSL_CITATION {"citationID":"Qb99DDIy","properties":{"unsorted":false,"formattedCitation":"\\super [21]\\nosupersub{}","plainCitation":"[21]","noteIndex":0},"citationItems":[{"id":3837,"uris":["http://zotero.org/users/16939557/items/FRKT7M6B"],"itemData":{"id":3837,"type":"article-journal","citation-key":"zhangComparativeInvestigationCorrosion2024","container-title":"Materials Today Communications","DOI":"10.1016/j.mtcomm.2024.108811","ISSN":"23524928","journalAbbreviation":"Materials Today Communications","language":"en","page":"108811","source":"DOI.org (Crossref)","title":"Comparative investigation of the corrosion behavior of biomedical zinc alloys in oxygen-enriched simulated body fluid environments","volume":"39","author":[{"family":"Zhang","given":"Dekang"},{"family":"Zhang","given":"Lu"},{"family":"Zhang","given":"Xin"},{"family":"Dai","given":"Jianwei"},{"family":"Zhao","given":"Yanbin"},{"family":"Yang","given":"Qianzi"},{"family":"Bai","given":"Jing"},{"family":"Xue","given":"Feng"},{"family":"Chu","given":"Paul K."},{"family":"Chu","given":"Chenglin"}],"issued":{"date-parts":[["2024",6]]}}}],"schema":"https://github.com/citation-style-language/schema/raw/master/csl-citation.json"} </w:instrText>
             </w:r>
             <w:r>
               <w:rPr>
@@ -14560,7 +14560,7 @@
                 <w:sz w:val="22"/>
                 <w:vertAlign w:val="superscript"/>
               </w:rPr>
-              <w:t>[29]</w:t>
+              <w:t xml:space="preserve">[21]</w:t>
             </w:r>
             <w:r>
               <w:rPr>
@@ -14695,7 +14695,7 @@
                 <w:szCs w:val="22"/>
                 <w:lang w:val="en-US"/>
               </w:rPr>
-              <w:instrText xml:space="preserve"> ADDIN ZOTERO_ITEM CSL_CITATION {"citationID":"GVtRPvVm","properties":{"unsorted":false,"formattedCitation":"\\super [53]\\nosupersub{}","plainCitation":"[53]","noteIndex":0},"citationItems":[{"id":3922,"uris":["http://zotero.org/users/16939557/items/9XZFX7JJ"],"itemData":{"id":3922,"type":"article-journal","citation-key":"kokuboHowUsefulSBF2006","container-title":"Biomaterials","DOI":"10.1016/j.biomaterials.2006.01.017","ISSN":"01429612","issue":"15","journalAbbreviation":"Biomaterials","language":"en","page":"2907-2915","source":"DOI.org (Crossref)","title":"How useful is SBF in predicting in vivo bone bioactivity?","volume":"27","author":[{"family":"Kokubo","given":"Tadashi"},{"family":"Takadama","given":"Hiroaki"}],"issued":{"date-parts":[["2006",5]]}}}],"schema":"https://github.com/citation-style-language/schema/raw/master/csl-citation.json"} </w:instrText>
+              <w:instrText xml:space="preserve"> ADDIN ZOTERO_ITEM CSL_CITATION {"citationID":"GVtRPvVm","properties":{"unsorted":false,"formattedCitation":"\\super [41]\\nosupersub{}","plainCitation":"[41]","noteIndex":0},"citationItems":[{"id":3922,"uris":["http://zotero.org/users/16939557/items/9XZFX7JJ"],"itemData":{"id":3922,"type":"article-journal","citation-key":"kokuboHowUsefulSBF2006","container-title":"Biomaterials","DOI":"10.1016/j.biomaterials.2006.01.017","ISSN":"01429612","issue":"15","journalAbbreviation":"Biomaterials","language":"en","page":"2907-2915","source":"DOI.org (Crossref)","title":"How useful is SBF in predicting in vivo bone bioactivity?","volume":"27","author":[{"family":"Kokubo","given":"Tadashi"},{"family":"Takadama","given":"Hiroaki"}],"issued":{"date-parts":[["2006",5]]}}}],"schema":"https://github.com/citation-style-language/schema/raw/master/csl-citation.json"} </w:instrText>
             </w:r>
             <w:r>
               <w:rPr>
@@ -14712,7 +14712,7 @@
                 <w:sz w:val="22"/>
                 <w:vertAlign w:val="superscript"/>
               </w:rPr>
-              <w:t>[53]</w:t>
+              <w:t xml:space="preserve">[41]</w:t>
             </w:r>
             <w:r>
               <w:rPr>
@@ -14956,7 +14956,7 @@
         <w:rPr>
           <w:lang w:val="en-US"/>
         </w:rPr>
-        <w:t xml:space="preserve"> used published 14-day mass-loss measurements obtained from revised simulated body fluid (r-SBF) immersion experiments reported by Liu et al. [54] (Section S5).</w:t>
+        <w:t xml:space="preserve"> used published 14-day mass-loss measurements obtained from revised simulated body fluid (r-SBF) immersion experiments reported by Liu et al. </w:t>
       </w:r>
       <w:r>
         <w:rPr>
@@ -14970,7 +14970,7 @@
           <w:rFonts w:cs="Times New Roman"/>
           <w:lang w:val="en-US"/>
         </w:rPr>
-        <w:instrText xml:space="preserve"> ADDIN ZOTERO_ITEM CSL_CITATION {"citationID":"4C0fw3Ct","properties":{"unsorted":false,"formattedCitation":"\\super [54]\\nosupersub{}","plainCitation":"[54]","noteIndex":0},"citationItems":[{"id":3943,"uris":["http://zotero.org/users/16939557/items/QAXDRACS"],"itemData":{"id":3943,"type":"article-journal","citation-key":"liuInitialFormationCorrosion2018","container-title":"Journal of Materials Science &amp; Technology","DOI":"10.1016/j.jmst.2018.05.005","ISSN":"10050302","issue":"12","journalAbbreviation":"Journal of Materials Science &amp; Technology","language":"en","page":"2271-2282","source":"DOI.org (Crossref)","title":"Initial formation of corrosion products on pure zinc in simulated body fluid","volume":"34","author":[{"family":"Liu","given":"Lijun"},{"family":"Meng","given":"Yao"},{"family":"Dong","given":"Chaofang"},{"family":"Yan","given":"Yu"},{"family":"Volinsky","given":"Alex A."},{"family":"Wang","given":"Lu-Ning"}],"issued":{"date-parts":[["2018",12]]}}}],"schema":"https://github.com/citation-style-language/schema/raw/master/csl-citation.json"} </w:instrText>
+        <w:instrText xml:space="preserve"> ADDIN ZOTERO_ITEM CSL_CITATION {"citationID":"4C0fw3Ct","properties":{"unsorted":false,"formattedCitation":"\\super [42]\\nosupersub{}","plainCitation":"[42]","noteIndex":0},"citationItems":[{"id":3943,"uris":["http://zotero.org/users/16939557/items/QAXDRACS"],"itemData":{"id":3943,"type":"article-journal","citation-key":"liuInitialFormationCorrosion2018","container-title":"Journal of Materials Science &amp; Technology","DOI":"10.1016/j.jmst.2018.05.005","ISSN":"10050302","issue":"12","journalAbbreviation":"Journal of Materials Science &amp; Technology","language":"en","page":"2271-2282","source":"DOI.org (Crossref)","title":"Initial formation of corrosion products on pure zinc in simulated body fluid","volume":"34","author":[{"family":"Liu","given":"Lijun"},{"family":"Meng","given":"Yao"},{"family":"Dong","given":"Chaofang"},{"family":"Yan","given":"Yu"},{"family":"Volinsky","given":"Alex A."},{"family":"Wang","given":"Lu-Ning"}],"issued":{"date-parts":[["2018",12]]}}}],"schema":"https://github.com/citation-style-language/schema/raw/master/csl-citation.json"} </w:instrText>
       </w:r>
       <w:r>
         <w:rPr>
@@ -14984,7 +14984,7 @@
           <w:rFonts w:cs="Times New Roman"/>
           <w:vertAlign w:val="superscript"/>
         </w:rPr>
-        <w:t xml:space="preserve"/>
+        <w:t xml:space="preserve">[42]</w:t>
       </w:r>
       <w:r>
         <w:rPr>
@@ -14992,6 +14992,12 @@
           <w:lang w:val="en-US"/>
         </w:rPr>
         <w:fldChar w:fldCharType="end"/>
+      </w:r>
+      <w:r>
+        <w:rPr>
+          <w:lang w:val="en-US"/>
+        </w:rPr>
+        <w:t xml:space="preserve"> (Section S5).</w:t>
       </w:r>
       <w:r>
         <w:rPr>
@@ -15257,7 +15263,7 @@
         <w:rPr>
           <w:lang w:val="en-US"/>
         </w:rPr>
-        <w:instrText xml:space="preserve"> ADDIN ZOTERO_ITEM CSL_CITATION {"citationID":"9eSARvh4","properties":{"unsorted":false,"formattedCitation":"\\super [13,55]\\nosupersub{}","plainCitation":"[13,55]","noteIndex":0},"citationItems":[{"id":3479,"uris":["http://zotero.org/users/16939557/items/VGDYQBA9"],"itemData":{"id":3479,"type":"article-journal","citation-key":"mostaedZincbasedAlloysDegradable2018","container-title":"Acta Biomaterialia","DOI":"10.1016/j.actbio.2018.03.005","ISSN":"17427061","journalAbbreviation":"Acta Biomaterialia","language":"en","page":"1-23","source":"DOI.org (Crossref)","title":"Zinc-based alloys for degradable vascular stent applications","volume":"71","author":[{"family":"Mostaed","given":"Ehsan"},{"family":"Sikora-Jasinska","given":"Malgorzata"},{"family":"Drelich","given":"Jaroslaw W."},{"family":"Vedani","given":"Maurizio"}],"issued":{"date-parts":[["2018",4]]}}},{"id":3650,"uris":["http://zotero.org/users/16939557/items/N85G5KZ3"],"itemData":{"id":3650,"type":"article-journal","citation-key":"yangEvolutionDegradationMechanism2017","container-title":"Biomaterials","DOI":"10.1016/j.biomaterials.2017.08.022","ISSN":"01429612","journalAbbreviation":"Biomaterials","language":"en","page":"92-105","source":"DOI.org (Crossref)","title":"Evolution of the degradation mechanism of pure zinc stent in the one-year study of rabbit abdominal aorta model","volume":"145","author":[{"family":"Yang","given":"Hongtao"},{"family":"Wang","given":"Cong"},{"family":"Liu","given":"Chaoqiang"},{"family":"Chen","given":"Houwen"},{"family":"Wu","given":"Yifan"},{"family":"Han","given":"Jintao"},{"family":"Jia","given":"Zichang"},{"family":"Lin","given":"Wenjiao"},{"family":"Zhang","given":"Deyuan"},{"family":"Li","given":"Wenting"},{"family":"Yuan","given":"Wei"},{"family":"Guo","given":"Hui"},{"family":"Li","given":"Huafang"},{"family":"Yang","given":"Guangxin"},{"family":"Kong","given":"Deling"},{"family":"Zhu","given":"Donghui"},{"family":"Takashima","given":"Kazuki"},{"family":"Ruan","given":"Liqun"},{"family":"Nie","given":"Jianfeng"},{"family":"Li","given":"Xuan"},{"family":"Zheng","given":"Yufeng"}],"issued":{"date-parts":[["2017",11]]}}}],"schema":"https://github.com/citation-style-language/schema/raw/master/csl-citation.json"} </w:instrText>
+        <w:instrText xml:space="preserve"> ADDIN ZOTERO_ITEM CSL_CITATION {"citationID":"9eSARvh4","properties":{"unsorted":false,"formattedCitation":"\\super [10]\\nosupersub{}","plainCitation":"[10]","noteIndex":0},"citationItems":[{"id":3479,"uris":["http://zotero.org/users/16939557/items/VGDYQBA9"],"itemData":{"id":3479,"type":"article-journal","citation-key":"mostaedZincbasedAlloysDegradable2018","container-title":"Acta Biomaterialia","DOI":"10.1016/j.actbio.2018.03.005","ISSN":"17427061","journalAbbreviation":"Acta Biomaterialia","language":"en","page":"1-23","source":"DOI.org (Crossref)","title":"Zinc-based alloys for degradable vascular stent applications","volume":"71","author":[{"family":"Mostaed","given":"Ehsan"},{"family":"Sikora-Jasinska","given":"Malgorzata"},{"family":"Drelich","given":"Jaroslaw W."},{"family":"Vedani","given":"Maurizio"}],"issued":{"date-parts":[["2018",4]]}}}],"schema":"https://github.com/citation-style-language/schema/raw/master/csl-citation.json"} </w:instrText>
       </w:r>
       <w:r>
         <w:rPr>
@@ -15270,7 +15276,7 @@
           <w:rFonts w:cs="Times New Roman"/>
           <w:vertAlign w:val="superscript"/>
         </w:rPr>
-        <w:t>[13,55]</w:t>
+        <w:t xml:space="preserve">[10]</w:t>
       </w:r>
       <w:r>
         <w:rPr>
@@ -15535,7 +15541,7 @@
         <w:rPr>
           <w:lang w:val="en-US"/>
         </w:rPr>
-        <w:instrText xml:space="preserve"> ADDIN ZOTERO_ITEM CSL_CITATION {"citationID":"aixMBNSv","properties":{"unsorted":false,"formattedCitation":"\\super [13]\\nosupersub{}","plainCitation":"[13]","noteIndex":0},"citationItems":[{"id":3650,"uris":["http://zotero.org/users/16939557/items/N85G5KZ3"],"itemData":{"id":3650,"type":"article-journal","citation-key":"yangEvolutionDegradationMechanism2017","container-title":"Biomaterials","DOI":"10.1016/j.biomaterials.2017.08.022","ISSN":"01429612","journalAbbreviation":"Biomaterials","language":"en","page":"92-105","source":"DOI.org (Crossref)","title":"Evolution of the degradation mechanism of pure zinc stent in the one-year study of rabbit abdominal aorta model","volume":"145","author":[{"family":"Yang","given":"Hongtao"},{"family":"Wang","given":"Cong"},{"family":"Liu","given":"Chaoqiang"},{"family":"Chen","given":"Houwen"},{"family":"Wu","given":"Yifan"},{"family":"Han","given":"Jintao"},{"family":"Jia","given":"Zichang"},{"family":"Lin","given":"Wenjiao"},{"family":"Zhang","given":"Deyuan"},{"family":"Li","given":"Wenting"},{"family":"Yuan","given":"Wei"},{"family":"Guo","given":"Hui"},{"family":"Li","given":"Huafang"},{"family":"Yang","given":"Guangxin"},{"family":"Kong","given":"Deling"},{"family":"Zhu","given":"Donghui"},{"family":"Takashima","given":"Kazuki"},{"family":"Ruan","given":"Liqun"},{"family":"Nie","given":"Jianfeng"},{"family":"Li","given":"Xuan"},{"family":"Zheng","given":"Yufeng"}],"issued":{"date-parts":[["2017",11]]}}}],"schema":"https://github.com/citation-style-language/schema/raw/master/csl-citation.json"} </w:instrText>
+        <w:instrText xml:space="preserve"> ADDIN ZOTERO_ITEM CSL_CITATION {"citationID":"aixMBNSv","properties":{"unsorted":false,"formattedCitation":"\\super [10]\\nosupersub{}","plainCitation":"[10]","noteIndex":0},"citationItems":[{"id":3650,"uris":["http://zotero.org/users/16939557/items/N85G5KZ3"],"itemData":{"id":3650,"type":"article-journal","citation-key":"yangEvolutionDegradationMechanism2017","container-title":"Biomaterials","DOI":"10.1016/j.biomaterials.2017.08.022","ISSN":"01429612","journalAbbreviation":"Biomaterials","language":"en","page":"92-105","source":"DOI.org (Crossref)","title":"Evolution of the degradation mechanism of pure zinc stent in the one-year study of rabbit abdominal aorta model","volume":"145","author":[{"family":"Yang","given":"Hongtao"},{"family":"Wang","given":"Cong"},{"family":"Liu","given":"Chaoqiang"},{"family":"Chen","given":"Houwen"},{"family":"Wu","given":"Yifan"},{"family":"Han","given":"Jintao"},{"family":"Jia","given":"Zichang"},{"family":"Lin","given":"Wenjiao"},{"family":"Zhang","given":"Deyuan"},{"family":"Li","given":"Wenting"},{"family":"Yuan","given":"Wei"},{"family":"Guo","given":"Hui"},{"family":"Li","given":"Huafang"},{"family":"Yang","given":"Guangxin"},{"family":"Kong","given":"Deling"},{"family":"Zhu","given":"Donghui"},{"family":"Takashima","given":"Kazuki"},{"family":"Ruan","given":"Liqun"},{"family":"Nie","given":"Jianfeng"},{"family":"Li","given":"Xuan"},{"family":"Zheng","given":"Yufeng"}],"issued":{"date-parts":[["2017",11]]}}}],"schema":"https://github.com/citation-style-language/schema/raw/master/csl-citation.json"} </w:instrText>
       </w:r>
       <w:r>
         <w:rPr>
@@ -15548,7 +15554,7 @@
           <w:rFonts w:cs="Times New Roman"/>
           <w:vertAlign w:val="superscript"/>
         </w:rPr>
-        <w:t>[13]</w:t>
+        <w:t xml:space="preserve">[10]</w:t>
       </w:r>
       <w:r>
         <w:rPr>
@@ -16210,7 +16216,7 @@
           <w:rFonts w:cs="Times New Roman"/>
           <w:lang w:val="en-US"/>
         </w:rPr>
-        <w:instrText xml:space="preserve"> ADDIN ZOTERO_ITEM CSL_CITATION {"citationID":"mKeaFACI","properties":{"unsorted":false,"formattedCitation":"\\super [29]\\nosupersub{}","plainCitation":"[29]","noteIndex":0},"citationItems":[{"id":3837,"uris":["http://zotero.org/users/16939557/items/FRKT7M6B"],"itemData":{"id":3837,"type":"article-journal","citation-key":"zhangComparativeInvestigationCorrosion2024","container-title":"Materials Today Communications","DOI":"10.1016/j.mtcomm.2024.108811","ISSN":"23524928","journalAbbreviation":"Materials Today Communications","language":"en","page":"108811","source":"DOI.org (Crossref)","title":"Comparative investigation of the corrosion behavior of biomedical zinc alloys in oxygen-enriched simulated body fluid environments","volume":"39","author":[{"family":"Zhang","given":"Dekang"},{"family":"Zhang","given":"Lu"},{"family":"Zhang","given":"Xin"},{"family":"Dai","given":"Jianwei"},{"family":"Zhao","given":"Yanbin"},{"family":"Yang","given":"Qianzi"},{"family":"Bai","given":"Jing"},{"family":"Xue","given":"Feng"},{"family":"Chu","given":"Paul K."},{"family":"Chu","given":"Chenglin"}],"issued":{"date-parts":[["2024",6]]}}}],"schema":"https://github.com/citation-style-language/schema/raw/master/csl-citation.json"} </w:instrText>
+        <w:instrText xml:space="preserve"> ADDIN ZOTERO_ITEM CSL_CITATION {"citationID":"mKeaFACI","properties":{"unsorted":false,"formattedCitation":"\\super [21]\\nosupersub{}","plainCitation":"[21]","noteIndex":0},"citationItems":[{"id":3837,"uris":["http://zotero.org/users/16939557/items/FRKT7M6B"],"itemData":{"id":3837,"type":"article-journal","citation-key":"zhangComparativeInvestigationCorrosion2024","container-title":"Materials Today Communications","DOI":"10.1016/j.mtcomm.2024.108811","ISSN":"23524928","journalAbbreviation":"Materials Today Communications","language":"en","page":"108811","source":"DOI.org (Crossref)","title":"Comparative investigation of the corrosion behavior of biomedical zinc alloys in oxygen-enriched simulated body fluid environments","volume":"39","author":[{"family":"Zhang","given":"Dekang"},{"family":"Zhang","given":"Lu"},{"family":"Zhang","given":"Xin"},{"family":"Dai","given":"Jianwei"},{"family":"Zhao","given":"Yanbin"},{"family":"Yang","given":"Qianzi"},{"family":"Bai","given":"Jing"},{"family":"Xue","given":"Feng"},{"family":"Chu","given":"Paul K."},{"family":"Chu","given":"Chenglin"}],"issued":{"date-parts":[["2024",6]]}}}],"schema":"https://github.com/citation-style-language/schema/raw/master/csl-citation.json"} </w:instrText>
       </w:r>
       <w:r>
         <w:rPr>
@@ -16224,7 +16230,7 @@
           <w:rFonts w:cs="Times New Roman"/>
           <w:vertAlign w:val="superscript"/>
         </w:rPr>
-        <w:t>[29]</w:t>
+        <w:t xml:space="preserve">[21]</w:t>
       </w:r>
       <w:r>
         <w:rPr>
@@ -20174,7 +20180,7 @@
           <w:rFonts w:cs="Times New Roman"/>
           <w:lang w:val="en-US"/>
         </w:rPr>
-        <w:instrText xml:space="preserve"> ADDIN ZOTERO_ITEM CSL_CITATION {"citationID":"LQYpQdDy","properties":{"unsorted":false,"formattedCitation":"\\super [54,56]\\nosupersub{}","plainCitation":"[54,56]","noteIndex":0},"citationItems":[{"id":2423,"uris":["http://zotero.org/users/16939557/items/CXTYID6S"],"itemData":{"id":2423,"type":"article-journal","citation-key":"mengInitialFormationCorrosion2019","container-title":"Bioactive Materials","DOI":"10.1016/j.bioactmat.2018.08.003","ISSN":"2452199X","journalAbbreviation":"Bioactive Materials","language":"en","page":"87-96","source":"DOI.org (Crossref)","title":"Initial formation of corrosion products on pure zinc in saline solution","volume":"4","author":[{"family":"Meng","given":"Yao"},{"family":"Liu","given":"Lijun"},{"family":"Zhang","given":"Dawei"},{"family":"Dong","given":"Chaofang"},{"family":"Yan","given":"Yu"},{"family":"Volinsky","given":"Alex A."},{"family":"Wang","given":"Lu-Ning"}],"issued":{"date-parts":[["2019",12]]}}},{"id":3943,"uris":["http://zotero.org/users/16939557/items/QAXDRACS"],"itemData":{"id":3943,"type":"article-journal","citation-key":"liuInitialFormationCorrosion2018","container-title":"Journal of Materials Science &amp; Technology","DOI":"10.1016/j.jmst.2018.05.005","ISSN":"10050302","issue":"12","journalAbbreviation":"Journal of Materials Science &amp; Technology","language":"en","page":"2271-2282","source":"DOI.org (Crossref)","title":"Initial formation of corrosion products on pure zinc in simulated body fluid","volume":"34","author":[{"family":"Liu","given":"Lijun"},{"family":"Meng","given":"Yao"},{"family":"Dong","given":"Chaofang"},{"family":"Yan","given":"Yu"},{"family":"Volinsky","given":"Alex A."},{"family":"Wang","given":"Lu-Ning"}],"issued":{"date-parts":[["2018",12]]}}}],"schema":"https://github.com/citation-style-language/schema/raw/master/csl-citation.json"} </w:instrText>
+        <w:instrText xml:space="preserve"> ADDIN ZOTERO_ITEM CSL_CITATION {"citationID":"LQYpQdDy","properties":{"unsorted":false,"formattedCitation":"\\super [42,43]\\nosupersub{}","plainCitation":"[42,43]","noteIndex":0},"citationItems":[{"id":2423,"uris":["http://zotero.org/users/16939557/items/CXTYID6S"],"itemData":{"id":2423,"type":"article-journal","citation-key":"mengInitialFormationCorrosion2019","container-title":"Bioactive Materials","DOI":"10.1016/j.bioactmat.2018.08.003","ISSN":"2452199X","journalAbbreviation":"Bioactive Materials","language":"en","page":"87-96","source":"DOI.org (Crossref)","title":"Initial formation of corrosion products on pure zinc in saline solution","volume":"4","author":[{"family":"Meng","given":"Yao"},{"family":"Liu","given":"Lijun"},{"family":"Zhang","given":"Dawei"},{"family":"Dong","given":"Chaofang"},{"family":"Yan","given":"Yu"},{"family":"Volinsky","given":"Alex A."},{"family":"Wang","given":"Lu-Ning"}],"issued":{"date-parts":[["2019",12]]}}},{"id":3943,"uris":["http://zotero.org/users/16939557/items/QAXDRACS"],"itemData":{"id":3943,"type":"article-journal","citation-key":"liuInitialFormationCorrosion2018","container-title":"Journal of Materials Science &amp; Technology","DOI":"10.1016/j.jmst.2018.05.005","ISSN":"10050302","issue":"12","journalAbbreviation":"Journal of Materials Science &amp; Technology","language":"en","page":"2271-2282","source":"DOI.org (Crossref)","title":"Initial formation of corrosion products on pure zinc in simulated body fluid","volume":"34","author":[{"family":"Liu","given":"Lijun"},{"family":"Meng","given":"Yao"},{"family":"Dong","given":"Chaofang"},{"family":"Yan","given":"Yu"},{"family":"Volinsky","given":"Alex A."},{"family":"Wang","given":"Lu-Ning"}],"issued":{"date-parts":[["2018",12]]}}}],"schema":"https://github.com/citation-style-language/schema/raw/master/csl-citation.json"} </w:instrText>
       </w:r>
       <w:r>
         <w:rPr>
@@ -20188,7 +20194,7 @@
           <w:rFonts w:cs="Times New Roman"/>
           <w:vertAlign w:val="superscript"/>
         </w:rPr>
-        <w:t>[54,56]</w:t>
+        <w:t xml:space="preserve">[42,43]</w:t>
       </w:r>
       <w:r>
         <w:rPr>
@@ -21700,7 +21706,7 @@
         <w:rPr>
           <w:lang w:val="en-US"/>
         </w:rPr>
-        <w:instrText xml:space="preserve"> ADDIN ZOTERO_ITEM CSL_CITATION {"citationID":"6uxvWidd","properties":{"unsorted":false,"formattedCitation":"\\super [56]\\nosupersub{}","plainCitation":"[56]","noteIndex":0},"citationItems":[{"id":2423,"uris":["http://zotero.org/users/16939557/items/CXTYID6S"],"itemData":{"id":2423,"type":"article-journal","citation-key":"mengInitialFormationCorrosion2019","container-title":"Bioactive Materials","DOI":"10.1016/j.bioactmat.2018.08.003","ISSN":"2452199X","journalAbbreviation":"Bioactive Materials","language":"en","page":"87-96","source":"DOI.org (Crossref)","title":"Initial formation of corrosion products on pure zinc in saline solution","volume":"4","author":[{"family":"Meng","given":"Yao"},{"family":"Liu","given":"Lijun"},{"family":"Zhang","given":"Dawei"},{"family":"Dong","given":"Chaofang"},{"family":"Yan","given":"Yu"},{"family":"Volinsky","given":"Alex A."},{"family":"Wang","given":"Lu-Ning"}],"issued":{"date-parts":[["2019",12]]}}}],"schema":"https://github.com/citation-style-language/schema/raw/master/csl-citation.json"} </w:instrText>
+        <w:instrText xml:space="preserve"> ADDIN ZOTERO_ITEM CSL_CITATION {"citationID":"6uxvWidd","properties":{"unsorted":false,"formattedCitation":"\\super [43]\\nosupersub{}","plainCitation":"[43]","noteIndex":0},"citationItems":[{"id":2423,"uris":["http://zotero.org/users/16939557/items/CXTYID6S"],"itemData":{"id":2423,"type":"article-journal","citation-key":"mengInitialFormationCorrosion2019","container-title":"Bioactive Materials","DOI":"10.1016/j.bioactmat.2018.08.003","ISSN":"2452199X","journalAbbreviation":"Bioactive Materials","language":"en","page":"87-96","source":"DOI.org (Crossref)","title":"Initial formation of corrosion products on pure zinc in saline solution","volume":"4","author":[{"family":"Meng","given":"Yao"},{"family":"Liu","given":"Lijun"},{"family":"Zhang","given":"Dawei"},{"family":"Dong","given":"Chaofang"},{"family":"Yan","given":"Yu"},{"family":"Volinsky","given":"Alex A."},{"family":"Wang","given":"Lu-Ning"}],"issued":{"date-parts":[["2019",12]]}}}],"schema":"https://github.com/citation-style-language/schema/raw/master/csl-citation.json"} </w:instrText>
       </w:r>
       <w:r>
         <w:rPr>
@@ -21713,7 +21719,7 @@
           <w:rFonts w:cs="Times New Roman"/>
           <w:vertAlign w:val="superscript"/>
         </w:rPr>
-        <w:t>[56]</w:t>
+        <w:t xml:space="preserve">[43]</w:t>
       </w:r>
       <w:r>
         <w:rPr>
@@ -22047,7 +22053,7 @@
         <w:rPr>
           <w:lang w:val="en-US"/>
         </w:rPr>
-        <w:instrText xml:space="preserve"> ADDIN ZOTERO_ITEM CSL_CITATION {"citationID":"zWLvEZL3","properties":{"unsorted":false,"formattedCitation":"\\super [54]\\nosupersub{}","plainCitation":"[54]","noteIndex":0},"citationItems":[{"id":3943,"uris":["http://zotero.org/users/16939557/items/QAXDRACS"],"itemData":{"id":3943,"type":"article-journal","citation-key":"liuInitialFormationCorrosion2018","container-title":"Journal of Materials Science &amp; Technology","DOI":"10.1016/j.jmst.2018.05.005","ISSN":"10050302","issue":"12","journalAbbreviation":"Journal of Materials Science &amp; Technology","language":"en","page":"2271-2282","source":"DOI.org (Crossref)","title":"Initial formation of corrosion products on pure zinc in simulated body fluid","volume":"34","author":[{"family":"Liu","given":"Lijun"},{"family":"Meng","given":"Yao"},{"family":"Dong","given":"Chaofang"},{"family":"Yan","given":"Yu"},{"family":"Volinsky","given":"Alex A."},{"family":"Wang","given":"Lu-Ning"}],"issued":{"date-parts":[["2018",12]]}}}],"schema":"https://github.com/citation-style-language/schema/raw/master/csl-citation.json"} </w:instrText>
+        <w:instrText xml:space="preserve"> ADDIN ZOTERO_ITEM CSL_CITATION {"citationID":"zWLvEZL3","properties":{"unsorted":false,"formattedCitation":"\\super [42]\\nosupersub{}","plainCitation":"[42]","noteIndex":0},"citationItems":[{"id":3943,"uris":["http://zotero.org/users/16939557/items/QAXDRACS"],"itemData":{"id":3943,"type":"article-journal","citation-key":"liuInitialFormationCorrosion2018","container-title":"Journal of Materials Science &amp; Technology","DOI":"10.1016/j.jmst.2018.05.005","ISSN":"10050302","issue":"12","journalAbbreviation":"Journal of Materials Science &amp; Technology","language":"en","page":"2271-2282","source":"DOI.org (Crossref)","title":"Initial formation of corrosion products on pure zinc in simulated body fluid","volume":"34","author":[{"family":"Liu","given":"Lijun"},{"family":"Meng","given":"Yao"},{"family":"Dong","given":"Chaofang"},{"family":"Yan","given":"Yu"},{"family":"Volinsky","given":"Alex A."},{"family":"Wang","given":"Lu-Ning"}],"issued":{"date-parts":[["2018",12]]}}}],"schema":"https://github.com/citation-style-language/schema/raw/master/csl-citation.json"} </w:instrText>
       </w:r>
       <w:r>
         <w:rPr>
@@ -22061,7 +22067,7 @@
           <w:szCs w:val="24"/>
           <w:vertAlign w:val="superscript"/>
         </w:rPr>
-        <w:t>[54]</w:t>
+        <w:t xml:space="preserve">[42]</w:t>
       </w:r>
       <w:r>
         <w:rPr>
@@ -22178,7 +22184,7 @@
           <w:rFonts w:cs="Times New Roman"/>
           <w:lang w:val="en-US"/>
         </w:rPr>
-        <w:instrText xml:space="preserve"> ADDIN ZOTERO_ITEM CSL_CITATION {"citationID":"TNsDeudZ","properties":{"unsorted":false,"formattedCitation":"\\super [54]\\nosupersub{}","plainCitation":"[54]","noteIndex":0},"citationItems":[{"id":3943,"uris":["http://zotero.org/users/16939557/items/QAXDRACS"],"itemData":{"id":3943,"type":"article-journal","citation-key":"liuInitialFormationCorrosion2018","container-title":"Journal of Materials Science &amp; Technology","DOI":"10.1016/j.jmst.2018.05.005","ISSN":"10050302","issue":"12","journalAbbreviation":"Journal of Materials Science &amp; Technology","language":"en","page":"2271-2282","source":"DOI.org (Crossref)","title":"Initial formation of corrosion products on pure zinc in simulated body fluid","volume":"34","author":[{"family":"Liu","given":"Lijun"},{"family":"Meng","given":"Yao"},{"family":"Dong","given":"Chaofang"},{"family":"Yan","given":"Yu"},{"family":"Volinsky","given":"Alex A."},{"family":"Wang","given":"Lu-Ning"}],"issued":{"date-parts":[["2018",12]]}}}],"schema":"https://github.com/citation-style-language/schema/raw/master/csl-citation.json"} </w:instrText>
+        <w:instrText xml:space="preserve"> ADDIN ZOTERO_ITEM CSL_CITATION {"citationID":"TNsDeudZ","properties":{"unsorted":false,"formattedCitation":"\\super [42]\\nosupersub{}","plainCitation":"[42]","noteIndex":0},"citationItems":[{"id":3943,"uris":["http://zotero.org/users/16939557/items/QAXDRACS"],"itemData":{"id":3943,"type":"article-journal","citation-key":"liuInitialFormationCorrosion2018","container-title":"Journal of Materials Science &amp; Technology","DOI":"10.1016/j.jmst.2018.05.005","ISSN":"10050302","issue":"12","journalAbbreviation":"Journal of Materials Science &amp; Technology","language":"en","page":"2271-2282","source":"DOI.org (Crossref)","title":"Initial formation of corrosion products on pure zinc in simulated body fluid","volume":"34","author":[{"family":"Liu","given":"Lijun"},{"family":"Meng","given":"Yao"},{"family":"Dong","given":"Chaofang"},{"family":"Yan","given":"Yu"},{"family":"Volinsky","given":"Alex A."},{"family":"Wang","given":"Lu-Ning"}],"issued":{"date-parts":[["2018",12]]}}}],"schema":"https://github.com/citation-style-language/schema/raw/master/csl-citation.json"} </w:instrText>
       </w:r>
       <w:r>
         <w:rPr>
@@ -22192,7 +22198,7 @@
           <w:rFonts w:cs="Times New Roman"/>
           <w:vertAlign w:val="superscript"/>
         </w:rPr>
-        <w:t>[54]</w:t>
+        <w:t xml:space="preserve">[42]</w:t>
       </w:r>
       <w:r>
         <w:rPr>
@@ -22559,7 +22565,7 @@
         <w:rPr>
           <w:lang w:val="en-US"/>
         </w:rPr>
-        <w:instrText xml:space="preserve"> ADDIN ZOTERO_ITEM CSL_CITATION {"citationID":"QOinm1MF","properties":{"unsorted":false,"formattedCitation":"\\super [13]\\nosupersub{}","plainCitation":"[13]","noteIndex":0},"citationItems":[{"id":3650,"uris":["http://zotero.org/users/16939557/items/N85G5KZ3"],"itemData":{"id":3650,"type":"article-journal","citation-key":"yangEvolutionDegradationMechanism2017","container-title":"Biomaterials","DOI":"10.1016/j.biomaterials.2017.08.022","ISSN":"01429612","journalAbbreviation":"Biomaterials","language":"en","page":"92-105","source":"DOI.org (Crossref)","title":"Evolution of the degradation mechanism of pure zinc stent in the one-year study of rabbit abdominal aorta model","volume":"145","author":[{"family":"Yang","given":"Hongtao"},{"family":"Wang","given":"Cong"},{"family":"Liu","given":"Chaoqiang"},{"family":"Chen","given":"Houwen"},{"family":"Wu","given":"Yifan"},{"family":"Han","given":"Jintao"},{"family":"Jia","given":"Zichang"},{"family":"Lin","given":"Wenjiao"},{"family":"Zhang","given":"Deyuan"},{"family":"Li","given":"Wenting"},{"family":"Yuan","given":"Wei"},{"family":"Guo","given":"Hui"},{"family":"Li","given":"Huafang"},{"family":"Yang","given":"Guangxin"},{"family":"Kong","given":"Deling"},{"family":"Zhu","given":"Donghui"},{"family":"Takashima","given":"Kazuki"},{"family":"Ruan","given":"Liqun"},{"family":"Nie","given":"Jianfeng"},{"family":"Li","given":"Xuan"},{"family":"Zheng","given":"Yufeng"}],"issued":{"date-parts":[["2017",11]]}}}],"schema":"https://github.com/citation-style-language/schema/raw/master/csl-citation.json"} </w:instrText>
+        <w:instrText xml:space="preserve"> ADDIN ZOTERO_ITEM CSL_CITATION {"citationID":"QOinm1MF","properties":{"unsorted":false,"formattedCitation":"\\super [10]\\nosupersub{}","plainCitation":"[10]","noteIndex":0},"citationItems":[{"id":3650,"uris":["http://zotero.org/users/16939557/items/N85G5KZ3"],"itemData":{"id":3650,"type":"article-journal","citation-key":"yangEvolutionDegradationMechanism2017","container-title":"Biomaterials","DOI":"10.1016/j.biomaterials.2017.08.022","ISSN":"01429612","journalAbbreviation":"Biomaterials","language":"en","page":"92-105","source":"DOI.org (Crossref)","title":"Evolution of the degradation mechanism of pure zinc stent in the one-year study of rabbit abdominal aorta model","volume":"145","author":[{"family":"Yang","given":"Hongtao"},{"family":"Wang","given":"Cong"},{"family":"Liu","given":"Chaoqiang"},{"family":"Chen","given":"Houwen"},{"family":"Wu","given":"Yifan"},{"family":"Han","given":"Jintao"},{"family":"Jia","given":"Zichang"},{"family":"Lin","given":"Wenjiao"},{"family":"Zhang","given":"Deyuan"},{"family":"Li","given":"Wenting"},{"family":"Yuan","given":"Wei"},{"family":"Guo","given":"Hui"},{"family":"Li","given":"Huafang"},{"family":"Yang","given":"Guangxin"},{"family":"Kong","given":"Deling"},{"family":"Zhu","given":"Donghui"},{"family":"Takashima","given":"Kazuki"},{"family":"Ruan","given":"Liqun"},{"family":"Nie","given":"Jianfeng"},{"family":"Li","given":"Xuan"},{"family":"Zheng","given":"Yufeng"}],"issued":{"date-parts":[["2017",11]]}}}],"schema":"https://github.com/citation-style-language/schema/raw/master/csl-citation.json"} </w:instrText>
       </w:r>
       <w:r>
         <w:rPr>
@@ -22572,7 +22578,7 @@
           <w:rFonts w:cs="Times New Roman"/>
           <w:vertAlign w:val="superscript"/>
         </w:rPr>
-        <w:t>[13]</w:t>
+        <w:t xml:space="preserve">[10]</w:t>
       </w:r>
       <w:r>
         <w:rPr>
@@ -23149,7 +23155,7 @@
         <w:rPr>
           <w:lang w:val="en-US"/>
         </w:rPr>
-        <w:t xml:space="preserve">Because no spatial variation in corrosion kinetics was prescribed, this heterogeneous degradation arose from the coupled effects of geometry, oxygen transport, corrosion-product accumulation, and interface recession. Oxygen availability remained higher along the outward-facing crown surfaces, which were exposed to the surrounding electrolyte and supplied from multiple directions, whereas transport to the inner-curvature regions was progressively restricted by geometric confinement and corrosion-product accumulation (Figure 7b; Section S7).</w:t>
+        <w:t xml:space="preserve">Because no spatial variation in corrosion kinetics was prescribed, this heterogeneous degradation arose from the coupled effects of geometry, oxygen transport, corrosion-product accumulation, and interface recession. Oxygen availability remained higher along the outward-facing crown surfaces, which were exposed to the surrounding electrolyte and supplied from multiple directions, whereas transport to the inner-curvature regions was progressively restricted by geometric confinement and corrosion-product accumulation (</w:t>
       </w:r>
       <w:r>
         <w:rPr>
@@ -23194,7 +23200,7 @@
           <w:bCs/>
           <w:lang w:val="en-US"/>
         </w:rPr>
-        <w:t xml:space="preserve"/>
+        <w:t xml:space="preserve">Figure 7</w:t>
       </w:r>
       <w:r>
         <w:rPr>
@@ -23203,6 +23209,12 @@
           <w:lang w:val="en-US"/>
         </w:rPr>
         <w:fldChar w:fldCharType="end"/>
+      </w:r>
+      <w:r>
+        <w:rPr>
+          <w:lang w:val="en-US"/>
+        </w:rPr>
+        <w:t xml:space="preserve">b; Section S7).</w:t>
       </w:r>
       <w:r>
         <w:rPr>
@@ -24002,7 +24014,7 @@
         <w:rPr>
           <w:lang w:val="en-US"/>
         </w:rPr>
-        <w:instrText xml:space="preserve"> ADDIN ZOTERO_ITEM CSL_CITATION {"citationID":"buOc1Jes","properties":{"unsorted":false,"formattedCitation":"\\super [16]\\nosupersub{}","plainCitation":"[16]","noteIndex":0},"citationItems":[{"id":3914,"uris":["http://zotero.org/users/16939557/items/I3TWLCLT"],"itemData":{"id":3914,"type":"article-journal","abstract":"Abstract\n            The advent of additively manufactured biodegradable porous metals presents a transformative opportunity to meet the criteria of ideal bone substitutes. Precisely tailoring their degradation behavior constitutes a pivotal aspect of this endeavor. In this study, we investigated the effects of topological designs on the degradation profile of laser powder bed fusion (LPBF) Zn scaffolds under dynamic in vitro immersion tests. Specifically, four types of Zn-0.4Mn-0.2Mg scaffolds (beam-based: diamond, face center cubic; surface-based: gyroid, schwarz-P) were designed and fabricated. The degradation mechanism of the scaffolds was comprehensively evaluated using both experimental and simulation methods. The results illuminate the profound impact of structural design on the degradation properties of the Zn alloy scaffolds. The beam-based diamond and face center cubic scaffolds exhibited a degradation rate of 0.08–0.12 mm per year with a relatively uniform degradation mode under dynamic immersion. On the contrary, the surface-based gyroid and Schwarz-P scaffolds demonstrated a notably reduced degradation rate due to lower permeability. This restricted the diffusion of medium ions within the pores, culminating in the accumulation of degradation products and more severe localized degradation. This study underscores the potential of topological design as a compelling strategy for tailoring the degradation profile of additively manufactured biodegradable scaffolds, thereby advancing their suitability as bone substitutes.","citation-key":"shiEffectTopologicalDesign2024","container-title":"npj Materials Degradation","DOI":"10.1038/s41529-024-00451-z","ISSN":"2397-2106","issue":"1","journalAbbreviation":"npj Mater Degrad","language":"en","page":"42","source":"DOI.org (Crossref)","title":"The effect of topological design on the degradation behavior of additively manufactured porous zinc alloy","volume":"8","author":[{"family":"Shi","given":"Yixuan"},{"family":"Xu","given":"Wei"},{"family":"Che","given":"Haodong"},{"family":"Zhao","given":"Shangyan"},{"family":"Chang","given":"Weiwei"},{"family":"Li","given":"Xuan"},{"family":"Lu","given":"Yuchen"},{"family":"Xue","given":"Chenran"},{"family":"Zhang","given":"Dawei"},{"family":"Wang","given":"Lu-Ning"},{"family":"Li","given":"Yageng"}],"issued":{"date-parts":[["2024",4,24]]}}}],"schema":"https://github.com/citation-style-language/schema/raw/master/csl-citation.json"} </w:instrText>
+        <w:instrText xml:space="preserve"> ADDIN ZOTERO_ITEM CSL_CITATION {"citationID":"buOc1Jes","properties":{"unsorted":false,"formattedCitation":"\\super [13]\\nosupersub{}","plainCitation":"[13]","noteIndex":0},"citationItems":[{"id":3914,"uris":["http://zotero.org/users/16939557/items/I3TWLCLT"],"itemData":{"id":3914,"type":"article-journal","abstract":"Abstract\n            The advent of additively manufactured biodegradable porous metals presents a transformative opportunity to meet the criteria of ideal bone substitutes. Precisely tailoring their degradation behavior constitutes a pivotal aspect of this endeavor. In this study, we investigated the effects of topological designs on the degradation profile of laser powder bed fusion (LPBF) Zn scaffolds under dynamic in vitro immersion tests. Specifically, four types of Zn-0.4Mn-0.2Mg scaffolds (beam-based: diamond, face center cubic; surface-based: gyroid, schwarz-P) were designed and fabricated. The degradation mechanism of the scaffolds was comprehensively evaluated using both experimental and simulation methods. The results illuminate the profound impact of structural design on the degradation properties of the Zn alloy scaffolds. The beam-based diamond and face center cubic scaffolds exhibited a degradation rate of 0.08–0.12 mm per year with a relatively uniform degradation mode under dynamic immersion. On the contrary, the surface-based gyroid and Schwarz-P scaffolds demonstrated a notably reduced degradation rate due to lower permeability. This restricted the diffusion of medium ions within the pores, culminating in the accumulation of degradation products and more severe localized degradation. This study underscores the potential of topological design as a compelling strategy for tailoring the degradation profile of additively manufactured biodegradable scaffolds, thereby advancing their suitability as bone substitutes.","citation-key":"shiEffectTopologicalDesign2024","container-title":"npj Materials Degradation","DOI":"10.1038/s41529-024-00451-z","ISSN":"2397-2106","issue":"1","journalAbbreviation":"npj Mater Degrad","language":"en","page":"42","source":"DOI.org (Crossref)","title":"The effect of topological design on the degradation behavior of additively manufactured porous zinc alloy","volume":"8","author":[{"family":"Shi","given":"Yixuan"},{"family":"Xu","given":"Wei"},{"family":"Che","given":"Haodong"},{"family":"Zhao","given":"Shangyan"},{"family":"Chang","given":"Weiwei"},{"family":"Li","given":"Xuan"},{"family":"Lu","given":"Yuchen"},{"family":"Xue","given":"Chenran"},{"family":"Zhang","given":"Dawei"},{"family":"Wang","given":"Lu-Ning"},{"family":"Li","given":"Yageng"}],"issued":{"date-parts":[["2024",4,24]]}}}],"schema":"https://github.com/citation-style-language/schema/raw/master/csl-citation.json"} </w:instrText>
       </w:r>
       <w:r>
         <w:rPr>
@@ -24015,7 +24027,7 @@
           <w:rFonts w:cs="Times New Roman"/>
           <w:vertAlign w:val="superscript"/>
         </w:rPr>
-        <w:t>[16]</w:t>
+        <w:t xml:space="preserve">[13]</w:t>
       </w:r>
       <w:r>
         <w:rPr>
@@ -24450,7 +24462,7 @@
         <w:rPr>
           <w:lang w:val="en-US"/>
         </w:rPr>
-        <w:instrText xml:space="preserve"> ADDIN ZOTERO_ITEM CSL_CITATION {"citationID":"bMB1q7VU","properties":{"unsorted":false,"formattedCitation":"\\super [35]\\nosupersub{}","plainCitation":"[35]","noteIndex":0},"citationItems":[{"id":4470,"uris":["http://zotero.org/users/16939557/items/WJC43EWN"],"itemData":{"id":4470,"type":"article-journal","abstract":"Abstract\n            Computational models of electrochemical biodegradation of magnesium (Mg)‐based implants are uncertain. To quantify the model uncertainty, iterative evaluations are needed. This presents a challenge, especially for complex, multiscale models as is the case here. Approximating high‐cost and complex models with easy‐to‐evaluate surrogate models can reduce the computational burden. However, the application of this approach to complex degradation models remains limited and understudied. This work provides a workflow to quantify different types of uncertainty within biodegradation models. Three surrogate models—Kriging, polynomial chaos expansion, and polynomial chaos Kriging—are compared based on the minimum number of samples required for surrogate model construction, surrogate model accuracy, and computational time. The surrogate models are tested for three computational models representing Mg‐based implant biodegradation. Global sensitivity analysis and uncertainty propagation are used to analyze the uncertainties associated with the different models. The findings indicate that Kriging proves effective for calibrating diverse computational models with minimal computational time and cost, while polynomial chaos expansion and polynomial chaos Kriging exhibit greater capability in predicting propagated uncertainties within the computational models.","citation-key":"albaraghthehBestPracticesDeveloping2024","container-title":"Advanced Science","DOI":"10.1002/advs.202403543","ISSN":"2198-3844, 2198-3844","issue":"46","journalAbbreviation":"Advanced Science","language":"en","page":"2403543","source":"DOI.org (Crossref)","title":"Best Practices in Developing a Workflow for Uncertainty Quantification for Modeling the Biodegradation of Mg‐Based Implants","volume":"11","author":[{"family":"AlBaraghtheh","given":"Tamadur"},{"family":"Willumeit‐Römer","given":"Regine"},{"family":"Zeller‐Plumhoff","given":"Berit"}],"issued":{"date-parts":[["2024",12]]}}}],"schema":"https://github.com/citation-style-language/schema/raw/master/csl-citation.json"} </w:instrText>
+        <w:instrText xml:space="preserve"> ADDIN ZOTERO_ITEM CSL_CITATION {"citationID":"bMB1q7VU","properties":{"unsorted":false,"formattedCitation":"\\super [25]\\nosupersub{}","plainCitation":"[25]","noteIndex":0},"citationItems":[{"id":4470,"uris":["http://zotero.org/users/16939557/items/WJC43EWN"],"itemData":{"id":4470,"type":"article-journal","abstract":"Abstract\n            Computational models of electrochemical biodegradation of magnesium (Mg)‐based implants are uncertain. To quantify the model uncertainty, iterative evaluations are needed. This presents a challenge, especially for complex, multiscale models as is the case here. Approximating high‐cost and complex models with easy‐to‐evaluate surrogate models can reduce the computational burden. However, the application of this approach to complex degradation models remains limited and understudied. This work provides a workflow to quantify different types of uncertainty within biodegradation models. Three surrogate models—Kriging, polynomial chaos expansion, and polynomial chaos Kriging—are compared based on the minimum number of samples required for surrogate model construction, surrogate model accuracy, and computational time. The surrogate models are tested for three computational models representing Mg‐based implant biodegradation. Global sensitivity analysis and uncertainty propagation are used to analyze the uncertainties associated with the different models. The findings indicate that Kriging proves effective for calibrating diverse computational models with minimal computational time and cost, while polynomial chaos expansion and polynomial chaos Kriging exhibit greater capability in predicting propagated uncertainties within the computational models.","citation-key":"albaraghthehBestPracticesDeveloping2024","container-title":"Advanced Science","DOI":"10.1002/advs.202403543","ISSN":"2198-3844, 2198-3844","issue":"46","journalAbbreviation":"Advanced Science","language":"en","page":"2403543","source":"DOI.org (Crossref)","title":"Best Practices in Developing a Workflow for Uncertainty Quantification for Modeling the Biodegradation of Mg‐Based Implants","volume":"11","author":[{"family":"AlBaraghtheh","given":"Tamadur"},{"family":"Willumeit‐Römer","given":"Regine"},{"family":"Zeller‐Plumhoff","given":"Berit"}],"issued":{"date-parts":[["2024",12]]}}}],"schema":"https://github.com/citation-style-language/schema/raw/master/csl-citation.json"} </w:instrText>
       </w:r>
       <w:r>
         <w:rPr>
@@ -24463,7 +24475,7 @@
           <w:rFonts w:cs="Times New Roman"/>
           <w:vertAlign w:val="superscript"/>
         </w:rPr>
-        <w:t>[35]</w:t>
+        <w:t xml:space="preserve">[25]</w:t>
       </w:r>
       <w:r>
         <w:rPr>
@@ -24489,7 +24501,7 @@
         <w:rPr>
           <w:lang w:val="en-US"/>
         </w:rPr>
-        <w:t xml:space="preserve">Structural optimization of biomedical implants, from patient-specific bone replacements to porous scaffolds, has so far targeted mechanical performance in the as-fabricated state [57,58]. For biodegradable implants this is insufficient, because geometry, transport, and degradation are coupled: degradation reshapes the structure that carries load, so mechanical properties evolve with time. By resolving how geometry controls local oxygen availability and recession, the present formulation supplies the degradation component that such optimization currently lacks.</w:t>
+        <w:t xml:space="preserve">Structural optimization of biomedical implants, from patient-specific bone replacements to porous scaffolds, has so far targeted mechanical performance in the as-fabricated state [44,45]. For biodegradable implants this is insufficient, because geometry, transport, and degradation are coupled: degradation reshapes the structure that carries load, so mechanical properties evolve with time. By resolving how geometry controls local oxygen availability and recession, the present formulation supplies the degradation component that such optimization currently lacks.</w:t>
       </w:r>
     </w:p>
     <w:p>
@@ -25086,14 +25098,14 @@
         <w:pStyle w:val="Bibliography"/>
       </w:pPr>
       <w:r>
-        <w:t xml:space="preserve">4. H. Li, Y. Zheng, and L. Qin, “Progress of Biodegradable Metals,” </w:t>
+        <w:t xml:space="preserve">4. P. K. Bowen, E. R. Shearier, S. Zhao, et al., “Biodegradable Metals for Cardiovascular Stents: From Clinical Concerns to Recent Zn‐Alloys,” </w:t>
       </w:r>
       <w:r>
         <w:rPr>
           <w:i/>
           <w:iCs/>
         </w:rPr>
-        <w:t>Progress in Natural Science: Materials International</w:t>
+        <w:t>Advanced Healthcare Materials</w:t>
       </w:r>
       <w:r>
         <w:t xml:space="preserve"> </w:t>
@@ -25103,10 +25115,10 @@
           <w:i/>
           <w:iCs/>
         </w:rPr>
-        <w:t>24</w:t>
-      </w:r>
-      <w:r>
-        <w:t>, no. 5 (2014): 414–422, https://doi.org/10.1016/j.pnsc.2014.08.014.</w:t>
+        <w:t>5</w:t>
+      </w:r>
+      <w:r>
+        <w:t>, no. 10 (2016): 1121–1140, https://doi.org/10.1002/adhm.201501019.</w:t>
       </w:r>
     </w:p>
     <w:p>
@@ -25114,14 +25126,14 @@
         <w:pStyle w:val="Bibliography"/>
       </w:pPr>
       <w:r>
-        <w:t xml:space="preserve">5. M. Prakasam, J. Locs, K. Salma-Ancane, D. Loca, A. Largeteau, and L. Berzina-Cimdina, “Biodegradable Materials and Metallic Implants—A Review,” </w:t>
+        <w:t xml:space="preserve">5. A. Atrens, G. Song, M. Liu, Z. Shi, F. Cao, and M. S. Dargusch, “Review of Recent Developments in the Field of Magnesium Corrosion,” </w:t>
       </w:r>
       <w:r>
         <w:rPr>
           <w:i/>
           <w:iCs/>
         </w:rPr>
-        <w:t>Journal of Functional Biomaterials</w:t>
+        <w:t>Advanced Engineering Materials</w:t>
       </w:r>
       <w:r>
         <w:t xml:space="preserve"> </w:t>
@@ -25131,10 +25143,10 @@
           <w:i/>
           <w:iCs/>
         </w:rPr>
-        <w:t>8</w:t>
-      </w:r>
-      <w:r>
-        <w:t>, no. 4 (2017): 44, https://doi.org/10.3390/jfb8040044.</w:t>
+        <w:t>17</w:t>
+      </w:r>
+      <w:r>
+        <w:t>, no. 4 (2015): 400–453, https://doi.org/10.1002/adem.201400434.</w:t>
       </w:r>
     </w:p>
     <w:p>
@@ -25142,14 +25154,14 @@
         <w:pStyle w:val="Bibliography"/>
       </w:pPr>
       <w:r>
-        <w:t xml:space="preserve">6. H. Hermawan, “Updates on the Research and Development of Absorbable Metals for Biomedical Applications,” </w:t>
+        <w:t xml:space="preserve">6. G. Katarivas Levy, J. Goldman, and E. Aghion, “The Prospects of Zinc as a Structural Material for Biodegradable Implants—A Review Paper,” </w:t>
       </w:r>
       <w:r>
         <w:rPr>
           <w:i/>
           <w:iCs/>
         </w:rPr>
-        <w:t>Progress in Biomaterials</w:t>
+        <w:t>Metals</w:t>
       </w:r>
       <w:r>
         <w:t xml:space="preserve"> </w:t>
@@ -25162,7 +25174,7 @@
         <w:t>7</w:t>
       </w:r>
       <w:r>
-        <w:t>, no. 2 (2018): 93–110, https://doi.org/10.1007/s40204-018-0091-4.</w:t>
+        <w:t>, no. 10 (2017): 402, https://doi.org/10.3390/met7100402.</w:t>
       </w:r>
     </w:p>
     <w:p>
@@ -25170,14 +25182,14 @@
         <w:pStyle w:val="Bibliography"/>
       </w:pPr>
       <w:r>
-        <w:t xml:space="preserve">7. P. K. Bowen, E. R. Shearier, S. Zhao, et al., “Biodegradable Metals for Cardiovascular Stents: From Clinical Concerns to Recent Zn‐Alloys,” </w:t>
+        <w:t xml:space="preserve">7. D. Vojtěch, J. Kubásek, J. Šerák, and P. Novák, “Mechanical and Corrosion Properties of Newly Developed Biodegradable Zn-Based Alloys for Bone Fixation,” </w:t>
       </w:r>
       <w:r>
         <w:rPr>
           <w:i/>
           <w:iCs/>
         </w:rPr>
-        <w:t>Advanced Healthcare Materials</w:t>
+        <w:t>Acta Biomaterialia</w:t>
       </w:r>
       <w:r>
         <w:t xml:space="preserve"> </w:t>
@@ -25187,10 +25199,10 @@
           <w:i/>
           <w:iCs/>
         </w:rPr>
-        <w:t>5</w:t>
-      </w:r>
-      <w:r>
-        <w:t>, no. 10 (2016): 1121–1140, https://doi.org/10.1002/adhm.201501019.</w:t>
+        <w:t>7</w:t>
+      </w:r>
+      <w:r>
+        <w:t>, no. 9 (2011): 3515–3522, https://doi.org/10.1016/j.actbio.2011.05.008.</w:t>
       </w:r>
     </w:p>
     <w:p>
@@ -25198,14 +25210,14 @@
         <w:pStyle w:val="Bibliography"/>
       </w:pPr>
       <w:r>
-        <w:t xml:space="preserve">8. A. Atrens, G. Song, M. Liu, Z. Shi, F. Cao, and M. S. Dargusch, “Review of Recent Developments in the Field of Magnesium Corrosion,” </w:t>
+        <w:t xml:space="preserve">8. J. Rao, H. Gao, J. Sun, R. Yu, D. Zhao, and Y. Ding, “A Critical Review of Biodegradable Zinc Alloys toward Clinical Applications,” </w:t>
       </w:r>
       <w:r>
         <w:rPr>
           <w:i/>
           <w:iCs/>
         </w:rPr>
-        <w:t>Advanced Engineering Materials</w:t>
+        <w:t>ACS Biomaterials Science &amp; Engineering</w:t>
       </w:r>
       <w:r>
         <w:t xml:space="preserve"> </w:t>
@@ -25215,10 +25227,10 @@
           <w:i/>
           <w:iCs/>
         </w:rPr>
-        <w:t>17</w:t>
-      </w:r>
-      <w:r>
-        <w:t>, no. 4 (2015): 400–453, https://doi.org/10.1002/adem.201400434.</w:t>
+        <w:t>10</w:t>
+      </w:r>
+      <w:r>
+        <w:t>, no. 9 (2024): 5454–5473, https://doi.org/10.1021/acsbiomaterials.4c00210.</w:t>
       </w:r>
     </w:p>
     <w:p>
@@ -25226,14 +25238,14 @@
         <w:pStyle w:val="Bibliography"/>
       </w:pPr>
       <w:r>
-        <w:t xml:space="preserve">9. G. Katarivas Levy, J. Goldman, and E. Aghion, “The Prospects of Zinc as a Structural Material for Biodegradable Implants—A Review Paper,” </w:t>
+        <w:t xml:space="preserve">9. P. Zhao, Z. Wang, H. Yang, et al., “Biodegradable Zn‐Based Implants: Progress, Challenges, and Pathways toward Clinical Translation,” </w:t>
       </w:r>
       <w:r>
         <w:rPr>
           <w:i/>
           <w:iCs/>
         </w:rPr>
-        <w:t>Metals</w:t>
+        <w:t>Advanced Science</w:t>
       </w:r>
       <w:r>
         <w:t xml:space="preserve"> </w:t>
@@ -25243,10 +25255,10 @@
           <w:i/>
           <w:iCs/>
         </w:rPr>
-        <w:t>7</w:t>
-      </w:r>
-      <w:r>
-        <w:t>, no. 10 (2017): 402, https://doi.org/10.3390/met7100402.</w:t>
+        <w:t>13</w:t>
+      </w:r>
+      <w:r>
+        <w:t>, no. 39 (2026): e76066, https://doi.org/10.1002/advs.76066.</w:t>
       </w:r>
     </w:p>
     <w:p>
@@ -25254,14 +25266,14 @@
         <w:pStyle w:val="Bibliography"/>
       </w:pPr>
       <w:r>
-        <w:t xml:space="preserve">10. D. Vojtěch, J. Kubásek, J. Šerák, and P. Novák, “Mechanical and Corrosion Properties of Newly Developed Biodegradable Zn-Based Alloys for Bone Fixation,” </w:t>
+        <w:t xml:space="preserve">10. H. Yang, C. Wang, C. Liu, et al., “Evolution of the Degradation Mechanism of Pure Zinc Stent in the One-Year Study of Rabbit Abdominal Aorta Model,” </w:t>
       </w:r>
       <w:r>
         <w:rPr>
           <w:i/>
           <w:iCs/>
         </w:rPr>
-        <w:t>Acta Biomaterialia</w:t>
+        <w:t>Biomaterials</w:t>
       </w:r>
       <w:r>
         <w:t xml:space="preserve"> </w:t>
@@ -25271,10 +25283,10 @@
           <w:i/>
           <w:iCs/>
         </w:rPr>
-        <w:t>7</w:t>
-      </w:r>
-      <w:r>
-        <w:t>, no. 9 (2011): 3515–3522, https://doi.org/10.1016/j.actbio.2011.05.008.</w:t>
+        <w:t>145</w:t>
+      </w:r>
+      <w:r>
+        <w:t xml:space="preserve"> (2017): 92–105, https://doi.org/10.1016/j.biomaterials.2017.08.022.</w:t>
       </w:r>
     </w:p>
     <w:p>
@@ -25282,14 +25294,14 @@
         <w:pStyle w:val="Bibliography"/>
       </w:pPr>
       <w:r>
-        <w:t xml:space="preserve">11. J. Rao, H. Gao, J. Sun, R. Yu, D. Zhao, and Y. Ding, “A Critical Review of Biodegradable Zinc Alloys toward Clinical Applications,” </w:t>
+        <w:t xml:space="preserve">11. H. Zhang, T. Du, S. Chen, et al., “Finite Element Analysis of the Non-Uniform Degradation of Biodegradable Vascular Stents,” </w:t>
       </w:r>
       <w:r>
         <w:rPr>
           <w:i/>
           <w:iCs/>
         </w:rPr>
-        <w:t>ACS Biomaterials Science &amp; Engineering</w:t>
+        <w:t>Journal of Functional Biomaterials</w:t>
       </w:r>
       <w:r>
         <w:t xml:space="preserve"> </w:t>
@@ -25299,10 +25311,10 @@
           <w:i/>
           <w:iCs/>
         </w:rPr>
-        <w:t>10</w:t>
-      </w:r>
-      <w:r>
-        <w:t>, no. 9 (2024): 5454–5473, https://doi.org/10.1021/acsbiomaterials.4c00210.</w:t>
+        <w:t>13</w:t>
+      </w:r>
+      <w:r>
+        <w:t>, no. 3 (2022): 152, https://doi.org/10.3390/jfb13030152.</w:t>
       </w:r>
     </w:p>
     <w:p>
@@ -25310,7 +25322,7 @@
         <w:pStyle w:val="Bibliography"/>
       </w:pPr>
       <w:r>
-        <w:t xml:space="preserve">12. P. Zhao, Z. Wang, H. Yang, et al., “Biodegradable Zn‐Based Implants: Progress, Challenges, and Pathways toward Clinical Translation,” </w:t>
+        <w:t xml:space="preserve">12. X. Wang, A. Liu, Z. Zhang, et al., “Additively Manufactured Zn‐2Mg Alloy Porous Scaffolds with Customizable Biodegradable Performance and Enhanced Osteogenic Ability,” </w:t>
       </w:r>
       <w:r>
         <w:rPr>
@@ -25327,10 +25339,10 @@
           <w:i/>
           <w:iCs/>
         </w:rPr>
-        <w:t>13</w:t>
-      </w:r>
-      <w:r>
-        <w:t>, no. 39 (2026): e76066, https://doi.org/10.1002/advs.76066.</w:t>
+        <w:t>11</w:t>
+      </w:r>
+      <w:r>
+        <w:t>, no. 5 (2024): 2307329, https://doi.org/10.1002/advs.202307329.</w:t>
       </w:r>
     </w:p>
     <w:p>
@@ -25338,14 +25350,14 @@
         <w:pStyle w:val="Bibliography"/>
       </w:pPr>
       <w:r>
-        <w:t xml:space="preserve">13. H. Yang, C. Wang, C. Liu, et al., “Evolution of the Degradation Mechanism of Pure Zinc Stent in the One-Year Study of Rabbit Abdominal Aorta Model,” </w:t>
+        <w:t xml:space="preserve">13. Y. Shi, W. Xu, H. Che, et al., “The Effect of Topological Design on the Degradation Behavior of Additively Manufactured Porous Zinc Alloy,” </w:t>
       </w:r>
       <w:r>
         <w:rPr>
           <w:i/>
           <w:iCs/>
         </w:rPr>
-        <w:t>Biomaterials</w:t>
+        <w:t>npj Materials Degradation</w:t>
       </w:r>
       <w:r>
         <w:t xml:space="preserve"> </w:t>
@@ -25355,10 +25367,10 @@
           <w:i/>
           <w:iCs/>
         </w:rPr>
-        <w:t>145</w:t>
-      </w:r>
-      <w:r>
-        <w:t xml:space="preserve"> (2017): 92–105, https://doi.org/10.1016/j.biomaterials.2017.08.022.</w:t>
+        <w:t>8</w:t>
+      </w:r>
+      <w:r>
+        <w:t>, no. 1 (2024): 42, https://doi.org/10.1038/s41529-024-00451-z.</w:t>
       </w:r>
     </w:p>
     <w:p>
@@ -25366,14 +25378,14 @@
         <w:pStyle w:val="Bibliography"/>
       </w:pPr>
       <w:r>
-        <w:t xml:space="preserve">14. H. Zhang, T. Du, S. Chen, et al., “Finite Element Analysis of the Non-Uniform Degradation of Biodegradable Vascular Stents,” </w:t>
+        <w:t xml:space="preserve">14. T. Albaraghtheh, R. Willumeit-Römer, and B. Zeller-Plumhoff, “In Silico Studies of Magnesium-Based Implants: A Review of the Current Stage and Challenges,” </w:t>
       </w:r>
       <w:r>
         <w:rPr>
           <w:i/>
           <w:iCs/>
         </w:rPr>
-        <w:t>Journal of Functional Biomaterials</w:t>
+        <w:t>Journal of Magnesium and Alloys</w:t>
       </w:r>
       <w:r>
         <w:t xml:space="preserve"> </w:t>
@@ -25383,10 +25395,10 @@
           <w:i/>
           <w:iCs/>
         </w:rPr>
-        <w:t>13</w:t>
-      </w:r>
-      <w:r>
-        <w:t>, no. 3 (2022): 152, https://doi.org/10.3390/jfb13030152.</w:t>
+        <w:t>10</w:t>
+      </w:r>
+      <w:r>
+        <w:t>, no. 11 (2022): 2968–2996, https://doi.org/10.1016/j.jma.2022.09.029.</w:t>
       </w:r>
     </w:p>
     <w:p>
@@ -25394,14 +25406,14 @@
         <w:pStyle w:val="Bibliography"/>
       </w:pPr>
       <w:r>
-        <w:t xml:space="preserve">15. X. Wang, A. Liu, Z. Zhang, et al., “Additively Manufactured Zn‐2Mg Alloy Porous Scaffolds with Customizable Biodegradable Performance and Enhanced Osteogenic Ability,” </w:t>
+        <w:t xml:space="preserve">15. E. L. Boland, C. J. Shine, N. Kelly, C. A. Sweeney, and P. E. McHugh, “A Review of Material Degradation Modelling for the Analysis and Design of Bioabsorbable Stents,” </w:t>
       </w:r>
       <w:r>
         <w:rPr>
           <w:i/>
           <w:iCs/>
         </w:rPr>
-        <w:t>Advanced Science</w:t>
+        <w:t>Annals of Biomedical Engineering</w:t>
       </w:r>
       <w:r>
         <w:t xml:space="preserve"> </w:t>
@@ -25411,10 +25423,10 @@
           <w:i/>
           <w:iCs/>
         </w:rPr>
-        <w:t>11</w:t>
-      </w:r>
-      <w:r>
-        <w:t>, no. 5 (2024): 2307329, https://doi.org/10.1002/advs.202307329.</w:t>
+        <w:t>44</w:t>
+      </w:r>
+      <w:r>
+        <w:t>, no. 2 (2016): 341–356, https://doi.org/10.1007/s10439-015-1413-5.</w:t>
       </w:r>
     </w:p>
     <w:p>
@@ -25422,14 +25434,14 @@
         <w:pStyle w:val="Bibliography"/>
       </w:pPr>
       <w:r>
-        <w:t xml:space="preserve">16. Y. Shi, W. Xu, H. Che, et al., “The Effect of Topological Design on the Degradation Behavior of Additively Manufactured Porous Zinc Alloy,” </w:t>
+        <w:t xml:space="preserve">16. D. Gastaldi, V. Sassi, L. Petrini, M. Vedani, S. Trasatti, and F. Migliavacca, “Continuum Damage Model for Bioresorbable Magnesium Alloy Devices — Application to Coronary Stents,” </w:t>
       </w:r>
       <w:r>
         <w:rPr>
           <w:i/>
           <w:iCs/>
         </w:rPr>
-        <w:t>npj Materials Degradation</w:t>
+        <w:t>Journal of the Mechanical Behavior of Biomedical Materials</w:t>
       </w:r>
       <w:r>
         <w:t xml:space="preserve"> </w:t>
@@ -25439,10 +25451,10 @@
           <w:i/>
           <w:iCs/>
         </w:rPr>
-        <w:t>8</w:t>
-      </w:r>
-      <w:r>
-        <w:t>, no. 1 (2024): 42, https://doi.org/10.1038/s41529-024-00451-z.</w:t>
+        <w:t>4</w:t>
+      </w:r>
+      <w:r>
+        <w:t>, no. 3 (2011): 352–365, https://doi.org/10.1016/j.jmbbm.2010.11.003.</w:t>
       </w:r>
     </w:p>
     <w:p>
@@ -25450,8 +25462,7 @@
         <w:pStyle w:val="Bibliography"/>
       </w:pPr>
       <w:r>
-        <w:lastRenderedPageBreak/>
-        <w:t xml:space="preserve">17. H. Yang, X. Qu, W. Lin, et al., “In Vitro and in Vivo Studies on Zinc-Hydroxyapatite Composites as Novel Biodegradable Metal Matrix Composite for Orthopedic Applications,” </w:t>
+        <w:t xml:space="preserve">17. J. A. Grogan, B. J. O’Brien, S. B. Leen, and P. E. McHugh, “A Corrosion Model for Bioabsorbable Metallic Stents,” </w:t>
       </w:r>
       <w:r>
         <w:rPr>
@@ -25468,10 +25479,10 @@
           <w:i/>
           <w:iCs/>
         </w:rPr>
-        <w:t>71</w:t>
-      </w:r>
-      <w:r>
-        <w:t xml:space="preserve"> (2018): 200–214, https://doi.org/10.1016/j.actbio.2018.03.007.</w:t>
+        <w:t>7</w:t>
+      </w:r>
+      <w:r>
+        <w:t>, no. 9 (2011): 3523–3533, https://doi.org/10.1016/j.actbio.2011.05.032.</w:t>
       </w:r>
     </w:p>
     <w:p>
@@ -25479,14 +25490,14 @@
         <w:pStyle w:val="Bibliography"/>
       </w:pPr>
       <w:r>
-        <w:t xml:space="preserve">18. T. Albaraghtheh, R. Willumeit-Römer, and B. Zeller-Plumhoff, “In Silico Studies of Magnesium-Based Implants: A Review of the Current Stage and Challenges,” </w:t>
+        <w:t xml:space="preserve">18. M. Barzegari, D. Mei, S. V. Lamaka, and L. Geris, “Computational Modeling of Degradation Process of Biodegradable Magnesium Biomaterials,” </w:t>
       </w:r>
       <w:r>
         <w:rPr>
           <w:i/>
           <w:iCs/>
         </w:rPr>
-        <w:t>Journal of Magnesium and Alloys</w:t>
+        <w:t>Corrosion Science</w:t>
       </w:r>
       <w:r>
         <w:t xml:space="preserve"> </w:t>
@@ -25496,10 +25507,10 @@
           <w:i/>
           <w:iCs/>
         </w:rPr>
-        <w:t>10</w:t>
-      </w:r>
-      <w:r>
-        <w:t>, no. 11 (2022): 2968–2996, https://doi.org/10.1016/j.jma.2022.09.029.</w:t>
+        <w:t>190</w:t>
+      </w:r>
+      <w:r>
+        <w:t xml:space="preserve"> (2021): 109674, https://doi.org/10.1016/j.corsci.2021.109674.</w:t>
       </w:r>
     </w:p>
     <w:p>
@@ -25507,14 +25518,14 @@
         <w:pStyle w:val="Bibliography"/>
       </w:pPr>
       <w:r>
-        <w:t xml:space="preserve">19. E. L. Boland, C. J. Shine, N. Kelly, C. A. Sweeney, and P. E. McHugh, “A Review of Material Degradation Modelling for the Analysis and Design of Bioabsorbable Stents,” </w:t>
+        <w:t xml:space="preserve">19. P. Bajger, J. M. A. Ashbourn, V. Manhas, Y. Guyot, K. Lietaert, and L. Geris, “Mathematical Modelling of the Degradation Behaviour of Biodegradable Metals,” </w:t>
       </w:r>
       <w:r>
         <w:rPr>
           <w:i/>
           <w:iCs/>
         </w:rPr>
-        <w:t>Annals of Biomedical Engineering</w:t>
+        <w:t>Biomechanics and Modeling in Mechanobiology</w:t>
       </w:r>
       <w:r>
         <w:t xml:space="preserve"> </w:t>
@@ -25524,10 +25535,10 @@
           <w:i/>
           <w:iCs/>
         </w:rPr>
-        <w:t>44</w:t>
-      </w:r>
-      <w:r>
-        <w:t>, no. 2 (2016): 341–356, https://doi.org/10.1007/s10439-015-1413-5.</w:t>
+        <w:t>16</w:t>
+      </w:r>
+      <w:r>
+        <w:t>, no. 1 (2017): 227–238, https://doi.org/10.1007/s10237-016-0812-3.</w:t>
       </w:r>
     </w:p>
     <w:p>
@@ -25535,14 +25546,14 @@
         <w:pStyle w:val="Bibliography"/>
       </w:pPr>
       <w:r>
-        <w:t xml:space="preserve">20. D. Gastaldi, V. Sassi, L. Petrini, M. Vedani, S. Trasatti, and F. Migliavacca, “Continuum Damage Model for Bioresorbable Magnesium Alloy Devices — Application to Coronary Stents,” </w:t>
+        <w:t xml:space="preserve">20. S. Thomas, N. V. Medhekar, G. S. Frankel, and N. Birbilis, “Corrosion Mechanism and Hydrogen Evolution on Mg,” </w:t>
       </w:r>
       <w:r>
         <w:rPr>
           <w:i/>
           <w:iCs/>
         </w:rPr>
-        <w:t>Journal of the Mechanical Behavior of Biomedical Materials</w:t>
+        <w:t>Current Opinion in Solid State and Materials Science</w:t>
       </w:r>
       <w:r>
         <w:t xml:space="preserve"> </w:t>
@@ -25552,10 +25563,10 @@
           <w:i/>
           <w:iCs/>
         </w:rPr>
-        <w:t>4</w:t>
-      </w:r>
-      <w:r>
-        <w:t>, no. 3 (2011): 352–365, https://doi.org/10.1016/j.jmbbm.2010.11.003.</w:t>
+        <w:t>19</w:t>
+      </w:r>
+      <w:r>
+        <w:t>, no. 2 (2015): 85–94, https://doi.org/10.1016/j.cossms.2014.09.005.</w:t>
       </w:r>
     </w:p>
     <w:p>
@@ -25563,14 +25574,14 @@
         <w:pStyle w:val="Bibliography"/>
       </w:pPr>
       <w:r>
-        <w:t xml:space="preserve">21. J. A. Grogan, B. J. O’Brien, S. B. Leen, and P. E. McHugh, “A Corrosion Model for Bioabsorbable Metallic Stents,” </w:t>
+        <w:t xml:space="preserve">21. D. Zhang, L. Zhang, X. Zhang, et al., “Comparative Investigation of the Corrosion Behavior of Biomedical Zinc Alloys in Oxygen-Enriched Simulated Body Fluid Environments,” </w:t>
       </w:r>
       <w:r>
         <w:rPr>
           <w:i/>
           <w:iCs/>
         </w:rPr>
-        <w:t>Acta Biomaterialia</w:t>
+        <w:t>Materials Today Communications</w:t>
       </w:r>
       <w:r>
         <w:t xml:space="preserve"> </w:t>
@@ -25580,10 +25591,10 @@
           <w:i/>
           <w:iCs/>
         </w:rPr>
-        <w:t>7</w:t>
-      </w:r>
-      <w:r>
-        <w:t>, no. 9 (2011): 3523–3533, https://doi.org/10.1016/j.actbio.2011.05.032.</w:t>
+        <w:t>39</w:t>
+      </w:r>
+      <w:r>
+        <w:t xml:space="preserve"> (2024): 108811, https://doi.org/10.1016/j.mtcomm.2024.108811.</w:t>
       </w:r>
     </w:p>
     <w:p>
@@ -25591,14 +25602,14 @@
         <w:pStyle w:val="Bibliography"/>
       </w:pPr>
       <w:r>
-        <w:t xml:space="preserve">22. K. Peng, X. Cui, A. Qiao, and Y. Mu, “Mechanical Analysis of a Novel Biodegradable Zinc Alloy Stent Based on a Degradation Model,” </w:t>
+        <w:t xml:space="preserve">22. A. P. Yadav, A. Nishikata, and T. Tsuru, “Oxygen Reduction Mechanism on Corroded Zinc,” </w:t>
       </w:r>
       <w:r>
         <w:rPr>
           <w:i/>
           <w:iCs/>
         </w:rPr>
-        <w:t>BioMedical Engineering OnLine</w:t>
+        <w:t>Journal of Electroanalytical Chemistry</w:t>
       </w:r>
       <w:r>
         <w:t xml:space="preserve"> </w:t>
@@ -25608,10 +25619,10 @@
           <w:i/>
           <w:iCs/>
         </w:rPr>
-        <w:t>18</w:t>
-      </w:r>
-      <w:r>
-        <w:t>, no. 1 (2019): 39, https://doi.org/10.1186/s12938-019-0661-2.</w:t>
+        <w:t>585</w:t>
+      </w:r>
+      <w:r>
+        <w:t>, no. 1 (2005): 142–149, https://doi.org/10.1016/j.jelechem.2005.08.007.</w:t>
       </w:r>
     </w:p>
     <w:p>
@@ -25619,14 +25630,15 @@
         <w:pStyle w:val="Bibliography"/>
       </w:pPr>
       <w:r>
-        <w:t xml:space="preserve">23. J. Qi, H. Zhang, S. Chen, T. Du, Y. Zhang, and A. Qiao, “Numerical Simulation of Dynamic Degradation and Fatigue Damage of Degradable Zinc Alloy Stents,” </w:t>
+        <w:lastRenderedPageBreak/>
+        <w:t xml:space="preserve">23. C. Chen, M. Hofmann, and T. Wallmersperger, “Modeling the Uniform Corrosion Behavior of Zinc in Salt Spray Testing,” </w:t>
       </w:r>
       <w:r>
         <w:rPr>
           <w:i/>
           <w:iCs/>
         </w:rPr>
-        <w:t>Journal of Functional Biomaterials</w:t>
+        <w:t>npj Materials Degradation</w:t>
       </w:r>
       <w:r>
         <w:t xml:space="preserve"> </w:t>
@@ -25636,10 +25648,10 @@
           <w:i/>
           <w:iCs/>
         </w:rPr>
-        <w:t>14</w:t>
-      </w:r>
-      <w:r>
-        <w:t>, no. 11 (2023): 547, https://doi.org/10.3390/jfb14110547.</w:t>
+        <w:t>10</w:t>
+      </w:r>
+      <w:r>
+        <w:t>, no. 1 (2026): 37, https://doi.org/10.1038/s41529-026-00749-0.</w:t>
       </w:r>
     </w:p>
     <w:p>
@@ -25647,14 +25659,14 @@
         <w:pStyle w:val="Bibliography"/>
       </w:pPr>
       <w:r>
-        <w:t xml:space="preserve">24. M. Barzegari, D. Mei, S. V. Lamaka, and L. Geris, “Computational Modeling of Degradation Process of Biodegradable Magnesium Biomaterials,” </w:t>
+        <w:t xml:space="preserve">24. V. A. Bryzgalov, A. A. Kistanov, A. A. Izosimov, and E. A. Korznikova, “Atomic-Scale Study of Lattice Distortion and Oxygen-Rich Environment Impact on the Surface Degradation Dynamics of Zinc-Based Alloys,” </w:t>
       </w:r>
       <w:r>
         <w:rPr>
           <w:i/>
           <w:iCs/>
         </w:rPr>
-        <w:t>Corrosion Science</w:t>
+        <w:t>Computational Materials Science</w:t>
       </w:r>
       <w:r>
         <w:t xml:space="preserve"> </w:t>
@@ -25664,10 +25676,10 @@
           <w:i/>
           <w:iCs/>
         </w:rPr>
-        <w:t>190</w:t>
-      </w:r>
-      <w:r>
-        <w:t xml:space="preserve"> (2021): 109674, https://doi.org/10.1016/j.corsci.2021.109674.</w:t>
+        <w:t>252</w:t>
+      </w:r>
+      <w:r>
+        <w:t xml:space="preserve"> (2025): 113797, https://doi.org/10.1016/j.commatsci.2025.113797.</w:t>
       </w:r>
     </w:p>
     <w:p>
@@ -25675,14 +25687,14 @@
         <w:pStyle w:val="Bibliography"/>
       </w:pPr>
       <w:r>
-        <w:t xml:space="preserve">25. P. Bajger, J. M. A. Ashbourn, V. Manhas, Y. Guyot, K. Lietaert, and L. Geris, “Mathematical Modelling of the Degradation Behaviour of Biodegradable Metals,” </w:t>
+        <w:t xml:space="preserve">25. T. AlBaraghtheh, R. Willumeit‐Römer, and B. Zeller‐Plumhoff, “Best Practices in Developing a Workflow for Uncertainty Quantification for Modeling the Biodegradation of Mg‐Based Implants,” </w:t>
       </w:r>
       <w:r>
         <w:rPr>
           <w:i/>
           <w:iCs/>
         </w:rPr>
-        <w:t>Biomechanics and Modeling in Mechanobiology</w:t>
+        <w:t>Advanced Science</w:t>
       </w:r>
       <w:r>
         <w:t xml:space="preserve"> </w:t>
@@ -25692,10 +25704,10 @@
           <w:i/>
           <w:iCs/>
         </w:rPr>
-        <w:t>16</w:t>
-      </w:r>
-      <w:r>
-        <w:t>, no. 1 (2017): 227–238, https://doi.org/10.1007/s10237-016-0812-3.</w:t>
+        <w:t>11</w:t>
+      </w:r>
+      <w:r>
+        <w:t>, no. 46 (2024): 2403543, https://doi.org/10.1002/advs.202403543.</w:t>
       </w:r>
     </w:p>
     <w:p>
@@ -25703,14 +25715,14 @@
         <w:pStyle w:val="Bibliography"/>
       </w:pPr>
       <w:r>
-        <w:t xml:space="preserve">26. S. Kovacevic, W. Ali, E. Martínez-Pañeda, and J. LLorca, “Phase-Field Modeling of Pitting and Mechanically-Assisted Corrosion of Mg Alloys for Biomedical Applications,” </w:t>
+        <w:t xml:space="preserve">26. S. Huang, W. Wu, Y. Su, L. Qiao, and Y. Yan, “Insight into the Corrosion Behaviour and Degradation Mechanism of Pure Zinc in Simulated Body Fluid,” </w:t>
       </w:r>
       <w:r>
         <w:rPr>
           <w:i/>
           <w:iCs/>
         </w:rPr>
-        <w:t>Acta Biomaterialia</w:t>
+        <w:t>Corrosion Science</w:t>
       </w:r>
       <w:r>
         <w:t xml:space="preserve"> </w:t>
@@ -25720,10 +25732,10 @@
           <w:i/>
           <w:iCs/>
         </w:rPr>
-        <w:t>164</w:t>
-      </w:r>
-      <w:r>
-        <w:t xml:space="preserve"> (2023): 641–658, https://doi.org/10.1016/j.actbio.2023.04.011.</w:t>
+        <w:t>178</w:t>
+      </w:r>
+      <w:r>
+        <w:t xml:space="preserve"> (2021): 109071, https://doi.org/10.1016/j.corsci.2020.109071.</w:t>
       </w:r>
     </w:p>
     <w:p>
@@ -25731,14 +25743,14 @@
         <w:pStyle w:val="Bibliography"/>
       </w:pPr>
       <w:r>
-        <w:t xml:space="preserve">27. G. L. Song, and A. Atrens, “Corrosion Mechanisms of Magnesium Alloys,” </w:t>
+        <w:t xml:space="preserve">27. X. Liu, H. Yang, Y. Liu, et al., “Comparative Studies on Degradation Behavior of Pure Zinc in Various Simulated Body Fluids,” </w:t>
       </w:r>
       <w:r>
         <w:rPr>
           <w:i/>
           <w:iCs/>
         </w:rPr>
-        <w:t>Advanced Engineering Materials</w:t>
+        <w:t>JOM</w:t>
       </w:r>
       <w:r>
         <w:t xml:space="preserve"> </w:t>
@@ -25748,10 +25760,10 @@
           <w:i/>
           <w:iCs/>
         </w:rPr>
-        <w:t>1</w:t>
-      </w:r>
-      <w:r>
-        <w:t>, no. 1 (1999): 11–33, https://doi.org/10.1002/(SICI)1527-2648(199909)1:1%3C11::AID-ADEM11%3E3.0.CO;2-N.</w:t>
+        <w:t>71</w:t>
+      </w:r>
+      <w:r>
+        <w:t>, no. 4 (2019): 1414–1425, https://doi.org/10.1007/s11837-019-03357-3.</w:t>
       </w:r>
     </w:p>
     <w:p>
@@ -25759,14 +25771,14 @@
         <w:pStyle w:val="Bibliography"/>
       </w:pPr>
       <w:r>
-        <w:t xml:space="preserve">28. S. Thomas, N. V. Medhekar, G. S. Frankel, and N. Birbilis, “Corrosion Mechanism and Hydrogen Evolution on Mg,” </w:t>
+        <w:t xml:space="preserve">28. M. E. McMahon, R. J. Santucci, and J. R. Scully, “Advanced Chemical Stability Diagrams to Predict the Formation of Complex Zinc Compounds in a Chloride Environment,” </w:t>
       </w:r>
       <w:r>
         <w:rPr>
           <w:i/>
           <w:iCs/>
         </w:rPr>
-        <w:t>Current Opinion in Solid State and Materials Science</w:t>
+        <w:t>RSC Advances</w:t>
       </w:r>
       <w:r>
         <w:t xml:space="preserve"> </w:t>
@@ -25776,10 +25788,10 @@
           <w:i/>
           <w:iCs/>
         </w:rPr>
-        <w:t>19</w:t>
-      </w:r>
-      <w:r>
-        <w:t>, no. 2 (2015): 85–94, https://doi.org/10.1016/j.cossms.2014.09.005.</w:t>
+        <w:t>9</w:t>
+      </w:r>
+      <w:r>
+        <w:t>, no. 35 (2019): 19905–19916, https://doi.org/10.1039/C9RA00228F.</w:t>
       </w:r>
     </w:p>
     <w:p>
@@ -25787,14 +25799,14 @@
         <w:pStyle w:val="Bibliography"/>
       </w:pPr>
       <w:r>
-        <w:t xml:space="preserve">29. D. Zhang, L. Zhang, X. Zhang, et al., “Comparative Investigation of the Corrosion Behavior of Biomedical Zinc Alloys in Oxygen-Enriched Simulated Body Fluid Environments,” </w:t>
+        <w:t xml:space="preserve">29. P. K. Bowen, J. Drelich, and J. Goldman, “Zinc Exhibits Ideal Physiological Corrosion Behavior for Bioabsorbable Stents,” </w:t>
       </w:r>
       <w:r>
         <w:rPr>
           <w:i/>
           <w:iCs/>
         </w:rPr>
-        <w:t>Materials Today Communications</w:t>
+        <w:t>Advanced Materials</w:t>
       </w:r>
       <w:r>
         <w:t xml:space="preserve"> </w:t>
@@ -25804,10 +25816,10 @@
           <w:i/>
           <w:iCs/>
         </w:rPr>
-        <w:t>39</w:t>
-      </w:r>
-      <w:r>
-        <w:t xml:space="preserve"> (2024): 108811, https://doi.org/10.1016/j.mtcomm.2024.108811.</w:t>
+        <w:t>25</w:t>
+      </w:r>
+      <w:r>
+        <w:t>, no. 18 (2013): 2577–2582, https://doi.org/10.1002/adma.201300226.</w:t>
       </w:r>
     </w:p>
     <w:p>
@@ -25815,14 +25827,14 @@
         <w:pStyle w:val="Bibliography"/>
       </w:pPr>
       <w:r>
-        <w:t xml:space="preserve">30. A. P. Yadav, A. Nishikata, and T. Tsuru, “Oxygen Reduction Mechanism on Corroded Zinc,” </w:t>
+        <w:t xml:space="preserve">30. R. M. Katona, J. Taylor, and R. F. Schaller, “Validating Corrosion Models: A Comparison of Governing Equations,” </w:t>
       </w:r>
       <w:r>
         <w:rPr>
           <w:i/>
           <w:iCs/>
         </w:rPr>
-        <w:t>Journal of Electroanalytical Chemistry</w:t>
+        <w:t>Corrosion Science</w:t>
       </w:r>
       <w:r>
         <w:t xml:space="preserve"> </w:t>
@@ -25832,10 +25844,10 @@
           <w:i/>
           <w:iCs/>
         </w:rPr>
-        <w:t>585</w:t>
-      </w:r>
-      <w:r>
-        <w:t>, no. 1 (2005): 142–149, https://doi.org/10.1016/j.jelechem.2005.08.007.</w:t>
+        <w:t>259</w:t>
+      </w:r>
+      <w:r>
+        <w:t xml:space="preserve"> (2026): 113495, https://doi.org/10.1016/j.corsci.2025.113495.</w:t>
       </w:r>
     </w:p>
     <w:p>
@@ -25843,27 +25855,17 @@
         <w:pStyle w:val="Bibliography"/>
       </w:pPr>
       <w:r>
-        <w:t xml:space="preserve">31. H. Dafydd, D. A. Worsley, and H. N. McMurray, “The Kinetics and Mechanism of Cathodic Oxygen Reduction on Zinc and Zinc–Aluminium Alloy Galvanized Coatings,” </w:t>
+        <w:t xml:space="preserve">31. P. Grathwohl, “Diffusion in Natural Porous Media: Contaminant Transport, Sorption/Desorption and Dissolution Kinetics,” </w:t>
       </w:r>
       <w:r>
         <w:rPr>
           <w:i/>
           <w:iCs/>
         </w:rPr>
-        <w:t>Corrosion Science</w:t>
-      </w:r>
-      <w:r>
-        <w:t xml:space="preserve"> </w:t>
-      </w:r>
-      <w:r>
-        <w:rPr>
-          <w:i/>
-          <w:iCs/>
-        </w:rPr>
-        <w:t>47</w:t>
-      </w:r>
-      <w:r>
-        <w:t>, no. 12 (2005): 3006–3018, https://doi.org/10.1016/j.corsci.2005.05.036.</w:t>
+        <w:t>Diffusion in Natural Porous Media: Contaminant Transport, Sorption/Desorption and Dissolution Kinetics</w:t>
+      </w:r>
+      <w:r>
+        <w:t>, Springer: Boston, MA 1998, https://doi.org/10.1007/978-1-4615-5683-1.</w:t>
       </w:r>
     </w:p>
     <w:p>
@@ -25871,15 +25873,14 @@
         <w:pStyle w:val="Bibliography"/>
       </w:pPr>
       <w:r>
-        <w:lastRenderedPageBreak/>
-        <w:t xml:space="preserve">32. C. Chen, M. Hofmann, and T. Wallmersperger, “Modeling the Uniform Corrosion Behavior of Zinc in Salt Spray Testing,” </w:t>
+        <w:t xml:space="preserve">32. J. W. Wilder, C. Clemons, D. Golovaty, K. L. Kreider, G. W. Young, and R. S. Lillard, “An Adaptive Level Set Approach for Modeling Damage Due to Galvanic Corrosion,” </w:t>
       </w:r>
       <w:r>
         <w:rPr>
           <w:i/>
           <w:iCs/>
         </w:rPr>
-        <w:t>npj Materials Degradation</w:t>
+        <w:t>Journal of Engineering Mathematics</w:t>
       </w:r>
       <w:r>
         <w:t xml:space="preserve"> </w:t>
@@ -25889,10 +25890,10 @@
           <w:i/>
           <w:iCs/>
         </w:rPr>
-        <w:t>10</w:t>
-      </w:r>
-      <w:r>
-        <w:t>, no. 1 (2026): 37, https://doi.org/10.1038/s41529-026-00749-0.</w:t>
+        <w:t>91</w:t>
+      </w:r>
+      <w:r>
+        <w:t>, no. 1 (2015): 121–142, https://doi.org/10.1007/s10665-014-9732-3.</w:t>
       </w:r>
     </w:p>
     <w:p>
@@ -25900,14 +25901,14 @@
         <w:pStyle w:val="Bibliography"/>
       </w:pPr>
       <w:r>
-        <w:t xml:space="preserve">33. V. A. Bryzgalov, A. A. Kistanov, A. A. Izosimov, and E. A. Korznikova, “Atomic-Scale Study of Lattice Distortion and Oxygen-Rich Environment Impact on the Surface Degradation Dynamics of Zinc-Based Alloys,” </w:t>
+        <w:t xml:space="preserve">33. J. A. Grogan, S. B. Leen, and P. E. McHugh, “A Physical Corrosion Model for Bioabsorbable Metal Stents,” </w:t>
       </w:r>
       <w:r>
         <w:rPr>
           <w:i/>
           <w:iCs/>
         </w:rPr>
-        <w:t>Computational Materials Science</w:t>
+        <w:t>Acta Biomaterialia</w:t>
       </w:r>
       <w:r>
         <w:t xml:space="preserve"> </w:t>
@@ -25917,10 +25918,10 @@
           <w:i/>
           <w:iCs/>
         </w:rPr>
-        <w:t>252</w:t>
-      </w:r>
-      <w:r>
-        <w:t xml:space="preserve"> (2025): 113797, https://doi.org/10.1016/j.commatsci.2025.113797.</w:t>
+        <w:t>10</w:t>
+      </w:r>
+      <w:r>
+        <w:t>, no. 5 (2014): 2313–2322, https://doi.org/10.1016/j.actbio.2013.12.059.</w:t>
       </w:r>
     </w:p>
     <w:p>
@@ -25928,27 +25929,17 @@
         <w:pStyle w:val="Bibliography"/>
       </w:pPr>
       <w:r>
-        <w:t xml:space="preserve">34. A. Mukhametov, I. Samikov, E. A. Korznikova, and A. A. Kistanov, “Density Functional Theory-Based Indicators to Estimate the Corrosion Potentials of Zinc Alloys in Chlorine-, Oxidizing-, and Sulfur-Harsh Environments,” </w:t>
+        <w:t xml:space="preserve">34. J. R. Rumble, Ed., “CRC Handbook of Chemistry and Physics,” </w:t>
       </w:r>
       <w:r>
         <w:rPr>
           <w:i/>
           <w:iCs/>
         </w:rPr>
-        <w:t>Molecules</w:t>
-      </w:r>
-      <w:r>
-        <w:t xml:space="preserve"> </w:t>
-      </w:r>
-      <w:r>
-        <w:rPr>
-          <w:i/>
-          <w:iCs/>
-        </w:rPr>
-        <w:t>29</w:t>
-      </w:r>
-      <w:r>
-        <w:t>, no. 16 (2024): 3790, https://doi.org/10.3390/molecules29163790.</w:t>
+        <w:t>CRC handbook of chemistry and physics</w:t>
+      </w:r>
+      <w:r>
+        <w:t>, 98th edition 2017-2018., CRC Press, Taylor &amp; Francis Group: Boca Raton London New York 2017.</w:t>
       </w:r>
     </w:p>
     <w:p>
@@ -25956,27 +25947,18 @@
         <w:pStyle w:val="Bibliography"/>
       </w:pPr>
       <w:r>
-        <w:t xml:space="preserve">35. T. AlBaraghtheh, R. Willumeit‐Römer, and B. Zeller‐Plumhoff, “Best Practices in Developing a Workflow for Uncertainty Quantification for Modeling the Biodegradation of Mg‐Based Implants,” </w:t>
+        <w:lastRenderedPageBreak/>
+        <w:t xml:space="preserve">35. D. R. Lide, Ed., “CRC Handbook of Chemistry and Physics,” </w:t>
       </w:r>
       <w:r>
         <w:rPr>
           <w:i/>
           <w:iCs/>
         </w:rPr>
-        <w:t>Advanced Science</w:t>
-      </w:r>
-      <w:r>
-        <w:t xml:space="preserve"> </w:t>
-      </w:r>
-      <w:r>
-        <w:rPr>
-          <w:i/>
-          <w:iCs/>
-        </w:rPr>
-        <w:t>11</w:t>
-      </w:r>
-      <w:r>
-        <w:t>, no. 46 (2024): 2403543, https://doi.org/10.1002/advs.202403543.</w:t>
+        <w:t>CRC handbook of chemistry and physics</w:t>
+      </w:r>
+      <w:r>
+        <w:t>, 72nd ed., CRC Press: Boca Raton 1991.</w:t>
       </w:r>
     </w:p>
     <w:p>
@@ -25984,14 +25966,90 @@
         <w:pStyle w:val="Bibliography"/>
       </w:pPr>
       <w:r>
-        <w:t xml:space="preserve">36. S. Huang, W. Wu, Y. Su, L. Qiao, and Y. Yan, “Insight into the Corrosion Behaviour and Degradation Mechanism of Pure Zinc in Simulated Body Fluid,” </w:t>
+        <w:t>36. P. Han, and D. M. Bartels, “</w:t>
+      </w:r>
+      <w:r>
+        <w:rPr>
+          <w:b/>
+          <w:bCs/>
+        </w:rPr>
+        <w:t>Temperature Dependence of Oxygen Diffusion in</w:t>
+      </w:r>
+      <w:r>
+        <w:t xml:space="preserve"> </w:t>
+      </w:r>
+      <w:r>
+        <w:rPr>
+          <w:b/>
+          <w:bCs/>
+        </w:rPr>
+        <w:t>H</w:t>
+      </w:r>
+      <w:r>
+        <w:t xml:space="preserve"> </w:t>
+      </w:r>
+      <w:r>
+        <w:rPr>
+          <w:b/>
+          <w:bCs/>
+          <w:vertAlign w:val="subscript"/>
+        </w:rPr>
+        <w:t>2</w:t>
+      </w:r>
+      <w:r>
+        <w:rPr>
+          <w:b/>
+          <w:bCs/>
+        </w:rPr>
+        <w:t xml:space="preserve"> </w:t>
+      </w:r>
+      <w:r>
+        <w:t xml:space="preserve"> </w:t>
+      </w:r>
+      <w:r>
+        <w:rPr>
+          <w:b/>
+          <w:bCs/>
+        </w:rPr>
+        <w:t>O and D</w:t>
+      </w:r>
+      <w:r>
+        <w:t xml:space="preserve"> </w:t>
+      </w:r>
+      <w:r>
+        <w:rPr>
+          <w:b/>
+          <w:bCs/>
+          <w:vertAlign w:val="subscript"/>
+        </w:rPr>
+        <w:t>2</w:t>
+      </w:r>
+      <w:r>
+        <w:rPr>
+          <w:b/>
+          <w:bCs/>
+        </w:rPr>
+        <w:t xml:space="preserve"> </w:t>
+      </w:r>
+      <w:r>
+        <w:t xml:space="preserve"> </w:t>
+      </w:r>
+      <w:r>
+        <w:rPr>
+          <w:b/>
+          <w:bCs/>
+        </w:rPr>
+        <w:t>O</w:t>
+      </w:r>
+      <w:r>
+        <w:t xml:space="preserve">,” </w:t>
       </w:r>
       <w:r>
         <w:rPr>
           <w:i/>
           <w:iCs/>
         </w:rPr>
-        <w:t>Corrosion Science</w:t>
+        <w:t>The Journal of Physical Chemistry</w:t>
       </w:r>
       <w:r>
         <w:t xml:space="preserve"> </w:t>
@@ -26001,10 +26059,10 @@
           <w:i/>
           <w:iCs/>
         </w:rPr>
-        <w:t>178</w:t>
-      </w:r>
-      <w:r>
-        <w:t xml:space="preserve"> (2021): 109071, https://doi.org/10.1016/j.corsci.2020.109071.</w:t>
+        <w:t>100</w:t>
+      </w:r>
+      <w:r>
+        <w:t>, no. 13 (1996): 5597–5602, https://doi.org/10.1021/jp952903y.</w:t>
       </w:r>
     </w:p>
     <w:p>
@@ -26012,14 +26070,14 @@
         <w:pStyle w:val="Bibliography"/>
       </w:pPr>
       <w:r>
-        <w:t xml:space="preserve">37. S. Thomas, I. S. Cole, Y. Gonzalez-Garcia, et al., “Oxygen Consumption upon Electrochemically Polarised Zinc,” </w:t>
+        <w:t xml:space="preserve">37. S.-Y. Park, S.-H. Rho, H.-S. Lee, K.-M. Kim, and H.-C. Lee, “Fabrication of Highly Porous and Pure Zinc Oxide Films Using Modified DC Magnetron Sputtering and Post-Oxidation,” </w:t>
       </w:r>
       <w:r>
         <w:rPr>
           <w:i/>
           <w:iCs/>
         </w:rPr>
-        <w:t>Journal of Applied Electrochemistry</w:t>
+        <w:t>Materials</w:t>
       </w:r>
       <w:r>
         <w:t xml:space="preserve"> </w:t>
@@ -26029,10 +26087,10 @@
           <w:i/>
           <w:iCs/>
         </w:rPr>
-        <w:t>44</w:t>
-      </w:r>
-      <w:r>
-        <w:t>, no. 6 (2014): 747–757, https://doi.org/10.1007/s10800-014-0684-0.</w:t>
+        <w:t>14</w:t>
+      </w:r>
+      <w:r>
+        <w:t>, no. 20 (2021): 6112, https://doi.org/10.3390/ma14206112.</w:t>
       </w:r>
     </w:p>
     <w:p>
@@ -26040,27 +26098,17 @@
         <w:pStyle w:val="Bibliography"/>
       </w:pPr>
       <w:r>
-        <w:t xml:space="preserve">38. X. Liu, H. Yang, Y. Liu, et al., “Comparative Studies on Degradation Behavior of Pure Zinc in Various Simulated Body Fluids,” </w:t>
+        <w:t xml:space="preserve">38. L. Holzer, P. Marmet, M. Fingerle, A. Wiegmann, M. Neumann, and V. Schmidt, “Tortuosity-Porosity Relationships: Review of Empirical Data from Literature,” in </w:t>
       </w:r>
       <w:r>
         <w:rPr>
           <w:i/>
           <w:iCs/>
         </w:rPr>
-        <w:t>JOM</w:t>
-      </w:r>
-      <w:r>
-        <w:t xml:space="preserve"> </w:t>
-      </w:r>
-      <w:r>
-        <w:rPr>
-          <w:i/>
-          <w:iCs/>
-        </w:rPr>
-        <w:t>71</w:t>
-      </w:r>
-      <w:r>
-        <w:t>, no. 4 (2019): 1414–1425, https://doi.org/10.1007/s11837-019-03357-3.</w:t>
+        <w:t>Tortuosity and Microstructure Effects in Porous Media</w:t>
+      </w:r>
+      <w:r>
+        <w:t>, Vol. 333, Springer International Publishing: Cham 2023, pp. 51–89, https://doi.org/10.1007/978-3-031-30477-4_3.</w:t>
       </w:r>
     </w:p>
     <w:p>
@@ -26068,14 +26116,14 @@
         <w:pStyle w:val="Bibliography"/>
       </w:pPr>
       <w:r>
-        <w:t xml:space="preserve">39. M. E. McMahon, R. J. Santucci, and J. R. Scully, “Advanced Chemical Stability Diagrams to Predict the Formation of Complex Zinc Compounds in a Chloride Environment,” </w:t>
+        <w:t xml:space="preserve">39. K. Chen, X. Gu, H. Sun, et al., “Fluid-Induced Corrosion Behavior of Degradable Zinc for Stent Application,” </w:t>
       </w:r>
       <w:r>
         <w:rPr>
           <w:i/>
           <w:iCs/>
         </w:rPr>
-        <w:t>RSC Advances</w:t>
+        <w:t>Journal of Materials Science &amp; Technology</w:t>
       </w:r>
       <w:r>
         <w:t xml:space="preserve"> </w:t>
@@ -26085,10 +26133,10 @@
           <w:i/>
           <w:iCs/>
         </w:rPr>
-        <w:t>9</w:t>
-      </w:r>
-      <w:r>
-        <w:t>, no. 35 (2019): 19905–19916, https://doi.org/10.1039/C9RA00228F.</w:t>
+        <w:t>91</w:t>
+      </w:r>
+      <w:r>
+        <w:t xml:space="preserve"> (2021): 134–147, https://doi.org/10.1016/j.jmst.2021.02.050.</w:t>
       </w:r>
     </w:p>
     <w:p>
@@ -26096,14 +26144,14 @@
         <w:pStyle w:val="Bibliography"/>
       </w:pPr>
       <w:r>
-        <w:t xml:space="preserve">40. D. Pupillo, F. Di Franco, L. Iannucci, S. Grassini, S. Virtanen, and M. Santamaria, “Following Zn Corrosion during Long Term Immersion Test in Physiological Solutions to Establish the Potential of Zinc as Biodegradable Prosthetic Material,” </w:t>
+        <w:t xml:space="preserve">40. J. Tkacz, K. Slouková, J. Minda, et al., “Influence of the Composition of the Hank’s Balanced Salt Solution on the Corrosion Behavior of AZ31 and AZ61 Magnesium Alloys,” </w:t>
       </w:r>
       <w:r>
         <w:rPr>
           <w:i/>
           <w:iCs/>
         </w:rPr>
-        <w:t>Electrochimica Acta</w:t>
+        <w:t>Metals</w:t>
       </w:r>
       <w:r>
         <w:t xml:space="preserve"> </w:t>
@@ -26113,10 +26161,10 @@
           <w:i/>
           <w:iCs/>
         </w:rPr>
-        <w:t>531</w:t>
-      </w:r>
-      <w:r>
-        <w:t xml:space="preserve"> (2025): 146411, https://doi.org/10.1016/j.electacta.2025.146411.</w:t>
+        <w:t>7</w:t>
+      </w:r>
+      <w:r>
+        <w:t>, no. 11 (2017): 465, https://doi.org/10.3390/met7110465.</w:t>
       </w:r>
     </w:p>
     <w:p>
@@ -26124,14 +26172,14 @@
         <w:pStyle w:val="Bibliography"/>
       </w:pPr>
       <w:r>
-        <w:t xml:space="preserve">41. P. K. Bowen, J. Drelich, and J. Goldman, “Zinc Exhibits Ideal Physiological Corrosion Behavior for Bioabsorbable Stents,” </w:t>
+        <w:t xml:space="preserve">41. T. Kokubo, and H. Takadama, “How Useful Is SBF in Predicting in Vivo Bone Bioactivity?,” </w:t>
       </w:r>
       <w:r>
         <w:rPr>
           <w:i/>
           <w:iCs/>
         </w:rPr>
-        <w:t>Advanced Materials</w:t>
+        <w:t>Biomaterials</w:t>
       </w:r>
       <w:r>
         <w:t xml:space="preserve"> </w:t>
@@ -26141,10 +26189,10 @@
           <w:i/>
           <w:iCs/>
         </w:rPr>
-        <w:t>25</w:t>
-      </w:r>
-      <w:r>
-        <w:t>, no. 18 (2013): 2577–2582, https://doi.org/10.1002/adma.201300226.</w:t>
+        <w:t>27</w:t>
+      </w:r>
+      <w:r>
+        <w:t>, no. 15 (2006): 2907–2915, https://doi.org/10.1016/j.biomaterials.2006.01.017.</w:t>
       </w:r>
     </w:p>
     <w:p>
@@ -26152,14 +26200,14 @@
         <w:pStyle w:val="Bibliography"/>
       </w:pPr>
       <w:r>
-        <w:t xml:space="preserve">42. R. M. Katona, J. Taylor, and R. F. Schaller, “Validating Corrosion Models: A Comparison of Governing Equations,” </w:t>
+        <w:t xml:space="preserve">42. L. Liu, Y. Meng, C. Dong, Y. Yan, A. A. Volinsky, and L.-N. Wang, “Initial Formation of Corrosion Products on Pure Zinc in Simulated Body Fluid,” </w:t>
       </w:r>
       <w:r>
         <w:rPr>
           <w:i/>
           <w:iCs/>
         </w:rPr>
-        <w:t>Corrosion Science</w:t>
+        <w:t>Journal of Materials Science &amp; Technology</w:t>
       </w:r>
       <w:r>
         <w:t xml:space="preserve"> </w:t>
@@ -26169,10 +26217,10 @@
           <w:i/>
           <w:iCs/>
         </w:rPr>
-        <w:t>259</w:t>
-      </w:r>
-      <w:r>
-        <w:t xml:space="preserve"> (2026): 113495, https://doi.org/10.1016/j.corsci.2025.113495.</w:t>
+        <w:t>34</w:t>
+      </w:r>
+      <w:r>
+        <w:t>, no. 12 (2018): 2271–2282, https://doi.org/10.1016/j.jmst.2018.05.005.</w:t>
       </w:r>
     </w:p>
     <w:p>
@@ -26180,17 +26228,27 @@
         <w:pStyle w:val="Bibliography"/>
       </w:pPr>
       <w:r>
-        <w:t xml:space="preserve">43. P. Grathwohl, “Diffusion in Natural Porous Media: Contaminant Transport, Sorption/Desorption and Dissolution Kinetics,” </w:t>
+        <w:t xml:space="preserve">43. Y. Meng, L. Liu, D. Zhang, et al., “Initial Formation of Corrosion Products on Pure Zinc in Saline Solution,” </w:t>
       </w:r>
       <w:r>
         <w:rPr>
           <w:i/>
           <w:iCs/>
         </w:rPr>
-        <w:t>Diffusion in Natural Porous Media: Contaminant Transport, Sorption/Desorption and Dissolution Kinetics</w:t>
-      </w:r>
-      <w:r>
-        <w:t>, Springer: Boston, MA 1998, https://doi.org/10.1007/978-1-4615-5683-1.</w:t>
+        <w:t>Bioactive Materials</w:t>
+      </w:r>
+      <w:r>
+        <w:t xml:space="preserve"> </w:t>
+      </w:r>
+      <w:r>
+        <w:rPr>
+          <w:i/>
+          <w:iCs/>
+        </w:rPr>
+        <w:t>4</w:t>
+      </w:r>
+      <w:r>
+        <w:t xml:space="preserve"> (2019): 87–96, https://doi.org/10.1016/j.bioactmat.2018.08.003.</w:t>
       </w:r>
     </w:p>
     <w:p>
@@ -26198,14 +26256,14 @@
         <w:pStyle w:val="Bibliography"/>
       </w:pPr>
       <w:r>
-        <w:t xml:space="preserve">44. J. W. Wilder, C. Clemons, D. Golovaty, K. L. Kreider, G. W. Young, and R. S. Lillard, “An Adaptive Level Set Approach for Modeling Damage Due to Galvanic Corrosion,” </w:t>
+        <w:t xml:space="preserve">44. A. Sutradhar, G. H. Paulino, M. J. Miller, and T. H. Nguyen, “Topological Optimization for Designing Patient-Specific Large Craniofacial Segmental Bone Replacements,” </w:t>
       </w:r>
       <w:r>
         <w:rPr>
           <w:i/>
           <w:iCs/>
         </w:rPr>
-        <w:t>Journal of Engineering Mathematics</w:t>
+        <w:t xml:space="preserve">Proceedings of the National Academy of Sciences</w:t>
       </w:r>
       <w:r>
         <w:t xml:space="preserve"> </w:t>
@@ -26215,10 +26273,10 @@
           <w:i/>
           <w:iCs/>
         </w:rPr>
-        <w:t>91</w:t>
-      </w:r>
-      <w:r>
-        <w:t>, no. 1 (2015): 121–142, https://doi.org/10.1007/s10665-014-9732-3.</w:t>
+        <w:t xml:space="preserve">107</w:t>
+      </w:r>
+      <w:r>
+        <w:t xml:space="preserve">, no. 30 (2010): 13222–13227, https://doi.org/10.1073/pnas.1001208107.</w:t>
       </w:r>
     </w:p>
     <w:p>
@@ -26226,418 +26284,7 @@
         <w:pStyle w:val="Bibliography"/>
       </w:pPr>
       <w:r>
-        <w:t xml:space="preserve">45. J. A. Grogan, S. B. Leen, and P. E. McHugh, “A Physical Corrosion Model for Bioabsorbable Metal Stents,” </w:t>
-      </w:r>
-      <w:r>
-        <w:rPr>
-          <w:i/>
-          <w:iCs/>
-        </w:rPr>
-        <w:t>Acta Biomaterialia</w:t>
-      </w:r>
-      <w:r>
-        <w:t xml:space="preserve"> </w:t>
-      </w:r>
-      <w:r>
-        <w:rPr>
-          <w:i/>
-          <w:iCs/>
-        </w:rPr>
-        <w:t>10</w:t>
-      </w:r>
-      <w:r>
-        <w:t>, no. 5 (2014): 2313–2322, https://doi.org/10.1016/j.actbio.2013.12.059.</w:t>
-      </w:r>
-    </w:p>
-    <w:p>
-      <w:pPr>
-        <w:pStyle w:val="Bibliography"/>
-      </w:pPr>
-      <w:r>
-        <w:t xml:space="preserve">46. J. R. Rumble, Ed., “CRC Handbook of Chemistry and Physics,” </w:t>
-      </w:r>
-      <w:r>
-        <w:rPr>
-          <w:i/>
-          <w:iCs/>
-        </w:rPr>
-        <w:t>CRC handbook of chemistry and physics</w:t>
-      </w:r>
-      <w:r>
-        <w:t>, 98th edition 2017-2018., CRC Press, Taylor &amp; Francis Group: Boca Raton London New York 2017.</w:t>
-      </w:r>
-    </w:p>
-    <w:p>
-      <w:pPr>
-        <w:pStyle w:val="Bibliography"/>
-      </w:pPr>
-      <w:r>
-        <w:lastRenderedPageBreak/>
-        <w:t xml:space="preserve">47. D. R. Lide, Ed., “CRC Handbook of Chemistry and Physics,” </w:t>
-      </w:r>
-      <w:r>
-        <w:rPr>
-          <w:i/>
-          <w:iCs/>
-        </w:rPr>
-        <w:t>CRC handbook of chemistry and physics</w:t>
-      </w:r>
-      <w:r>
-        <w:t>, 72nd ed., CRC Press: Boca Raton 1991.</w:t>
-      </w:r>
-    </w:p>
-    <w:p>
-      <w:pPr>
-        <w:pStyle w:val="Bibliography"/>
-      </w:pPr>
-      <w:r>
-        <w:t>48. P. Han, and D. M. Bartels, “</w:t>
-      </w:r>
-      <w:r>
-        <w:rPr>
-          <w:b/>
-          <w:bCs/>
-        </w:rPr>
-        <w:t>Temperature Dependence of Oxygen Diffusion in</w:t>
-      </w:r>
-      <w:r>
-        <w:t xml:space="preserve"> </w:t>
-      </w:r>
-      <w:r>
-        <w:rPr>
-          <w:b/>
-          <w:bCs/>
-        </w:rPr>
-        <w:t>H</w:t>
-      </w:r>
-      <w:r>
-        <w:t xml:space="preserve"> </w:t>
-      </w:r>
-      <w:r>
-        <w:rPr>
-          <w:b/>
-          <w:bCs/>
-          <w:vertAlign w:val="subscript"/>
-        </w:rPr>
-        <w:t>2</w:t>
-      </w:r>
-      <w:r>
-        <w:rPr>
-          <w:b/>
-          <w:bCs/>
-        </w:rPr>
-        <w:t xml:space="preserve"> </w:t>
-      </w:r>
-      <w:r>
-        <w:t xml:space="preserve"> </w:t>
-      </w:r>
-      <w:r>
-        <w:rPr>
-          <w:b/>
-          <w:bCs/>
-        </w:rPr>
-        <w:t>O and D</w:t>
-      </w:r>
-      <w:r>
-        <w:t xml:space="preserve"> </w:t>
-      </w:r>
-      <w:r>
-        <w:rPr>
-          <w:b/>
-          <w:bCs/>
-          <w:vertAlign w:val="subscript"/>
-        </w:rPr>
-        <w:t>2</w:t>
-      </w:r>
-      <w:r>
-        <w:rPr>
-          <w:b/>
-          <w:bCs/>
-        </w:rPr>
-        <w:t xml:space="preserve"> </w:t>
-      </w:r>
-      <w:r>
-        <w:t xml:space="preserve"> </w:t>
-      </w:r>
-      <w:r>
-        <w:rPr>
-          <w:b/>
-          <w:bCs/>
-        </w:rPr>
-        <w:t>O</w:t>
-      </w:r>
-      <w:r>
-        <w:t xml:space="preserve">,” </w:t>
-      </w:r>
-      <w:r>
-        <w:rPr>
-          <w:i/>
-          <w:iCs/>
-        </w:rPr>
-        <w:t>The Journal of Physical Chemistry</w:t>
-      </w:r>
-      <w:r>
-        <w:t xml:space="preserve"> </w:t>
-      </w:r>
-      <w:r>
-        <w:rPr>
-          <w:i/>
-          <w:iCs/>
-        </w:rPr>
-        <w:t>100</w:t>
-      </w:r>
-      <w:r>
-        <w:t>, no. 13 (1996): 5597–5602, https://doi.org/10.1021/jp952903y.</w:t>
-      </w:r>
-    </w:p>
-    <w:p>
-      <w:pPr>
-        <w:pStyle w:val="Bibliography"/>
-      </w:pPr>
-      <w:r>
-        <w:t xml:space="preserve">49. S.-Y. Park, S.-H. Rho, H.-S. Lee, K.-M. Kim, and H.-C. Lee, “Fabrication of Highly Porous and Pure Zinc Oxide Films Using Modified DC Magnetron Sputtering and Post-Oxidation,” </w:t>
-      </w:r>
-      <w:r>
-        <w:rPr>
-          <w:i/>
-          <w:iCs/>
-        </w:rPr>
-        <w:t>Materials</w:t>
-      </w:r>
-      <w:r>
-        <w:t xml:space="preserve"> </w:t>
-      </w:r>
-      <w:r>
-        <w:rPr>
-          <w:i/>
-          <w:iCs/>
-        </w:rPr>
-        <w:t>14</w:t>
-      </w:r>
-      <w:r>
-        <w:t>, no. 20 (2021): 6112, https://doi.org/10.3390/ma14206112.</w:t>
-      </w:r>
-    </w:p>
-    <w:p>
-      <w:pPr>
-        <w:pStyle w:val="Bibliography"/>
-      </w:pPr>
-      <w:r>
-        <w:t xml:space="preserve">50. L. Holzer, P. Marmet, M. Fingerle, A. Wiegmann, M. Neumann, and V. Schmidt, “Tortuosity-Porosity Relationships: Review of Empirical Data from Literature,” in </w:t>
-      </w:r>
-      <w:r>
-        <w:rPr>
-          <w:i/>
-          <w:iCs/>
-        </w:rPr>
-        <w:t>Tortuosity and Microstructure Effects in Porous Media</w:t>
-      </w:r>
-      <w:r>
-        <w:t>, Vol. 333, Springer International Publishing: Cham 2023, pp. 51–89, https://doi.org/10.1007/978-3-031-30477-4_3.</w:t>
-      </w:r>
-    </w:p>
-    <w:p>
-      <w:pPr>
-        <w:pStyle w:val="Bibliography"/>
-      </w:pPr>
-      <w:r>
-        <w:t xml:space="preserve">51. K. Chen, X. Gu, H. Sun, et al., “Fluid-Induced Corrosion Behavior of Degradable Zinc for Stent Application,” </w:t>
-      </w:r>
-      <w:r>
-        <w:rPr>
-          <w:i/>
-          <w:iCs/>
-        </w:rPr>
-        <w:t>Journal of Materials Science &amp; Technology</w:t>
-      </w:r>
-      <w:r>
-        <w:t xml:space="preserve"> </w:t>
-      </w:r>
-      <w:r>
-        <w:rPr>
-          <w:i/>
-          <w:iCs/>
-        </w:rPr>
-        <w:t>91</w:t>
-      </w:r>
-      <w:r>
-        <w:t xml:space="preserve"> (2021): 134–147, https://doi.org/10.1016/j.jmst.2021.02.050.</w:t>
-      </w:r>
-    </w:p>
-    <w:p>
-      <w:pPr>
-        <w:pStyle w:val="Bibliography"/>
-      </w:pPr>
-      <w:r>
-        <w:t xml:space="preserve">52. J. Tkacz, K. Slouková, J. Minda, et al., “Influence of the Composition of the Hank’s Balanced Salt Solution on the Corrosion Behavior of AZ31 and AZ61 Magnesium Alloys,” </w:t>
-      </w:r>
-      <w:r>
-        <w:rPr>
-          <w:i/>
-          <w:iCs/>
-        </w:rPr>
-        <w:t>Metals</w:t>
-      </w:r>
-      <w:r>
-        <w:t xml:space="preserve"> </w:t>
-      </w:r>
-      <w:r>
-        <w:rPr>
-          <w:i/>
-          <w:iCs/>
-        </w:rPr>
-        <w:t>7</w:t>
-      </w:r>
-      <w:r>
-        <w:t>, no. 11 (2017): 465, https://doi.org/10.3390/met7110465.</w:t>
-      </w:r>
-    </w:p>
-    <w:p>
-      <w:pPr>
-        <w:pStyle w:val="Bibliography"/>
-      </w:pPr>
-      <w:r>
-        <w:t xml:space="preserve">53. T. Kokubo, and H. Takadama, “How Useful Is SBF in Predicting in Vivo Bone Bioactivity?,” </w:t>
-      </w:r>
-      <w:r>
-        <w:rPr>
-          <w:i/>
-          <w:iCs/>
-        </w:rPr>
-        <w:t>Biomaterials</w:t>
-      </w:r>
-      <w:r>
-        <w:t xml:space="preserve"> </w:t>
-      </w:r>
-      <w:r>
-        <w:rPr>
-          <w:i/>
-          <w:iCs/>
-        </w:rPr>
-        <w:t>27</w:t>
-      </w:r>
-      <w:r>
-        <w:t>, no. 15 (2006): 2907–2915, https://doi.org/10.1016/j.biomaterials.2006.01.017.</w:t>
-      </w:r>
-    </w:p>
-    <w:p>
-      <w:pPr>
-        <w:pStyle w:val="Bibliography"/>
-      </w:pPr>
-      <w:r>
-        <w:t xml:space="preserve">54. L. Liu, Y. Meng, C. Dong, Y. Yan, A. A. Volinsky, and L.-N. Wang, “Initial Formation of Corrosion Products on Pure Zinc in Simulated Body Fluid,” </w:t>
-      </w:r>
-      <w:r>
-        <w:rPr>
-          <w:i/>
-          <w:iCs/>
-        </w:rPr>
-        <w:t>Journal of Materials Science &amp; Technology</w:t>
-      </w:r>
-      <w:r>
-        <w:t xml:space="preserve"> </w:t>
-      </w:r>
-      <w:r>
-        <w:rPr>
-          <w:i/>
-          <w:iCs/>
-        </w:rPr>
-        <w:t>34</w:t>
-      </w:r>
-      <w:r>
-        <w:t>, no. 12 (2018): 2271–2282, https://doi.org/10.1016/j.jmst.2018.05.005.</w:t>
-      </w:r>
-    </w:p>
-    <w:p>
-      <w:pPr>
-        <w:pStyle w:val="Bibliography"/>
-      </w:pPr>
-      <w:r>
-        <w:t xml:space="preserve">55. E. Mostaed, M. Sikora-Jasinska, J. W. Drelich, and M. Vedani, “Zinc-Based Alloys for Degradable Vascular Stent Applications,” </w:t>
-      </w:r>
-      <w:r>
-        <w:rPr>
-          <w:i/>
-          <w:iCs/>
-        </w:rPr>
-        <w:t>Acta Biomaterialia</w:t>
-      </w:r>
-      <w:r>
-        <w:t xml:space="preserve"> </w:t>
-      </w:r>
-      <w:r>
-        <w:rPr>
-          <w:i/>
-          <w:iCs/>
-        </w:rPr>
-        <w:t>71</w:t>
-      </w:r>
-      <w:r>
-        <w:t xml:space="preserve"> (2018): 1–23, https://doi.org/10.1016/j.actbio.2018.03.005.</w:t>
-      </w:r>
-    </w:p>
-    <w:p>
-      <w:pPr>
-        <w:pStyle w:val="Bibliography"/>
-      </w:pPr>
-      <w:r>
-        <w:t xml:space="preserve">56. Y. Meng, L. Liu, D. Zhang, et al., “Initial Formation of Corrosion Products on Pure Zinc in Saline Solution,” </w:t>
-      </w:r>
-      <w:r>
-        <w:rPr>
-          <w:i/>
-          <w:iCs/>
-        </w:rPr>
-        <w:t>Bioactive Materials</w:t>
-      </w:r>
-      <w:r>
-        <w:t xml:space="preserve"> </w:t>
-      </w:r>
-      <w:r>
-        <w:rPr>
-          <w:i/>
-          <w:iCs/>
-        </w:rPr>
-        <w:t>4</w:t>
-      </w:r>
-      <w:r>
-        <w:t xml:space="preserve"> (2019): 87–96, https://doi.org/10.1016/j.bioactmat.2018.08.003.</w:t>
-      </w:r>
-    </w:p>
-    <w:p>
-      <w:pPr>
-        <w:pStyle w:val="Bibliography"/>
-      </w:pPr>
-      <w:r>
-        <w:t xml:space="preserve">57. A. Sutradhar, G. H. Paulino, M. J. Miller, and T. H. Nguyen, “Topological Optimization for Designing Patient-Specific Large Craniofacial Segmental Bone Replacements,” </w:t>
-      </w:r>
-      <w:r>
-        <w:rPr>
-          <w:i/>
-          <w:iCs/>
-        </w:rPr>
-        <w:t xml:space="preserve">Proceedings of the National Academy of Sciences</w:t>
-      </w:r>
-      <w:r>
-        <w:t xml:space="preserve"> </w:t>
-      </w:r>
-      <w:r>
-        <w:rPr>
-          <w:i/>
-          <w:iCs/>
-        </w:rPr>
-        <w:t xml:space="preserve">107</w:t>
-      </w:r>
-      <w:r>
-        <w:t xml:space="preserve">, no. 30 (2010): 13222–13227, https://doi.org/10.1073/pnas.1001208107.</w:t>
-      </w:r>
-    </w:p>
-    <w:p>
-      <w:pPr>
-        <w:pStyle w:val="Bibliography"/>
-      </w:pPr>
-      <w:r>
-        <w:t xml:space="preserve">58. S. J. Hollister, “Porous Scaffold Design for Tissue Engineering,” </w:t>
+        <w:t xml:space="preserve">45. S. J. Hollister, “Porous Scaffold Design for Tissue Engineering,” </w:t>
       </w:r>
       <w:r>
         <w:rPr>

</xml_diff>

<commit_message>
Fix Pearson r, soften SA:V and conclusion claims
Co-Authored-By: Claude Sonnet 5.5 <noreply@anthropic.com>
Claude-Session: https://claude.ai/code/session_01Y1g9vByMLTE8eGJ9K81zt6
</commit_message>
<xml_diff>
--- a/Manuscript_AS_original_order.docx
+++ b/Manuscript_AS_original_order.docx
@@ -27,15 +27,7 @@
         <w:spacing w:line="360" w:lineRule="auto"/>
       </w:pPr>
       <w:r>
-        <w:t xml:space="preserve">Henaka Ariyarathna, Xuan Yang, </w:t>
-      </w:r>
-      <w:proofErr w:type="spellStart"/>
-      <w:r>
-        <w:t>Aijun</w:t>
-      </w:r>
-      <w:proofErr w:type="spellEnd"/>
-      <w:r>
-        <w:t xml:space="preserve"> Huang, Yunlong Tang</w:t>
+        <w:t>Henaka Ariyarathna, Xuan Yang, Aijun Huang, Yunlong Tang</w:t>
       </w:r>
       <m:oMath>
         <m:sSup>
@@ -478,7 +470,7 @@
         <w:fldChar w:fldCharType="begin"/>
       </w:r>
       <w:r>
-        <w:instrText xml:space="preserve"> ADDIN ZOTERO_ITEM CSL_CITATION {"citationID":"1rGkhhoi","properties":{"unsorted":false,"formattedCitation":"\\super [4,5]\\nosupersub{}","plainCitation":"[4,5]","noteIndex":0},"citationItems":[{"id":3806,"uris":["http://zotero.org/users/16939557/items/JAHQ7T4K"],"itemData":{"id":3806,"type":"article-journal","abstract":"Metallic stents are used to promote revascularization and maintain patency of plaqued or damaged arteries following balloon angioplasty. To mitigate the long‐term side effects associated with corrosion‐resistant stents (i.e., chronic inflammation and late stage thrombosis), a new generation of so‐called “bioabsorbable” stents is currently being developed. The bioabsorbable coronary stents will corrode and be absorbed by the artery after completing their task as vascular scaffolding. Research spanning the last two decades has focused on biodegradable polymeric, iron‐based, and magnesium‐based stent materials. The inherent mechanical and surface properties of metals make them more attractive stent material candidates than their polymeric counterparts. A third class of metallic bioabsorbable materials that are based on zinc has been introduced in the last few years. This new zinc‐based class of materials demonstrates the potential for an absorbable metallic stent with the mechanical and biodegradation characteristics required for optimal stent performance. This review compares bioabsorbable materials and summarizes progress towards bioabsorbable stents. It emphasizes the current understanding of physiological and biological benefits of zinc and its biocompatibility. Finally, the review provides an outlook on challenges in designing zinc‐based stents of optimal mechanical properties and biodegradation rate.","citation-key":"bowenBiodegradableMetalsCardiovascular2016","container-title":"Advanced Healthcare Materials","DOI":"10.1002/adhm.201501019","ISSN":"2192-2640, 2192-2659","issue":"10","journalAbbreviation":"Adv Healthcare Materials","language":"en","license":"http://onlinelibrary.wiley.com/termsAndConditions#vor","page":"1121-1140","source":"DOI.org (Crossref)","title":"Biodegradable Metals for Cardiovascular Stents: from Clinical Concerns to Recent Zn‐Alloys","title-short":"Biodegradable Metals for Cardiovascular Stents","volume":"5","author":[{"family":"Bowen","given":"Patrick K."},{"family":"Shearier","given":"Emily R."},{"family":"Zhao","given":"Shan"},{"family":"Guillory","given":"Roger J."},{"family":"Zhao","given":"Feng"},{"family":"Goldman","given":"Jeremy"},{"family":"Drelich","given":"Jaroslaw W."}],"issued":{"date-parts":[["2016",5]]}}},{"id":3791,"uris":["http://zotero.org/users/16939557/items/6K3Z95R9"],"itemData":{"id":3791,"type":"article-journal","abstract":"This paper provides a review of recent developments in the field of Mg corrosion and puts those into context. This includes considerations of corrosion manifestations, material influences, surface treatment, anodization, coatings, inhibition, biodegradable medical applications, stress corrosion cracking, flammability, corrosion mechanisms for HP Mg, critical evaluation of corrosion mechanisms, and concluding remarks. There has been much research recently, and much research continues in this area. This is expected to produce significantly better, more‐corrosion‐resistant Mg alloys.","citation-key":"atrensReviewRecentDevelopments2015","container-title":"Advanced Engineering Materials","DOI":"10.1002/adem.201400434","ISSN":"1438-1656, 1527-2648","issue":"4","journalAbbreviation":"Adv Eng Mater","language":"en","license":"http://onlinelibrary.wiley.com/termsAndConditions#vor","page":"400-453","source":"DOI.org (Crossref)","title":"Review of Recent Developments in the Field of Magnesium Corrosion","volume":"17","author":[{"family":"Atrens","given":"Andrej"},{"family":"Song","given":"Guang‐Ling"},{"family":"Liu","given":"Ming"},{"family":"Shi","given":"Zhiming"},{"family":"Cao","given":"Fuyong"},{"family":"Dargusch","given":"Matthew S."}],"issued":{"date-parts":[["2015",4]]}}}],"schema":"https://github.com/citation-style-language/schema/raw/master/csl-citation.json"} </w:instrText>
+        <w:instrText xml:space="preserve"> ADDIN ZOTERO_ITEM CSL_CITATION {"citationID":"r6Z1sbhS","properties":{"unsorted":false,"formattedCitation":"\\super [4,5]\\nosupersub{}","plainCitation":"[4,5]","noteIndex":0},"citationItems":[{"id":3806,"uris":["http://zotero.org/users/16939557/items/JAHQ7T4K"],"itemData":{"id":3806,"type":"article-journal","abstract":"Metallic stents are used to promote revascularization and maintain patency of plaqued or damaged arteries following balloon angioplasty. To mitigate the long‐term side effects associated with corrosion‐resistant stents (i.e., chronic inflammation and late stage thrombosis), a new generation of so‐called “bioabsorbable” stents is currently being developed. The bioabsorbable coronary stents will corrode and be absorbed by the artery after completing their task as vascular scaffolding. Research spanning the last two decades has focused on biodegradable polymeric, iron‐based, and magnesium‐based stent materials. The inherent mechanical and surface properties of metals make them more attractive stent material candidates than their polymeric counterparts. A third class of metallic bioabsorbable materials that are based on zinc has been introduced in the last few years. This new zinc‐based class of materials demonstrates the potential for an absorbable metallic stent with the mechanical and biodegradation characteristics required for optimal stent performance. This review compares bioabsorbable materials and summarizes progress towards bioabsorbable stents. It emphasizes the current understanding of physiological and biological benefits of zinc and its biocompatibility. Finally, the review provides an outlook on challenges in designing zinc‐based stents of optimal mechanical properties and biodegradation rate.","citation-key":"bowenBiodegradableMetalsCardiovascular2016","container-title":"Advanced Healthcare Materials","DOI":"10.1002/adhm.201501019","ISSN":"2192-2640, 2192-2659","issue":"10","journalAbbreviation":"Adv Healthcare Materials","language":"en","license":"http://onlinelibrary.wiley.com/termsAndConditions#vor","page":"1121-1140","source":"DOI.org (Crossref)","title":"Biodegradable Metals for Cardiovascular Stents: from Clinical Concerns to Recent Zn‐Alloys","title-short":"Biodegradable Metals for Cardiovascular Stents","volume":"5","author":[{"family":"Bowen","given":"Patrick K."},{"family":"Shearier","given":"Emily R."},{"family":"Zhao","given":"Shan"},{"family":"Guillory","given":"Roger J."},{"family":"Zhao","given":"Feng"},{"family":"Goldman","given":"Jeremy"},{"family":"Drelich","given":"Jaroslaw W."}],"issued":{"date-parts":[["2016",5]]}}},{"id":3791,"uris":["http://zotero.org/users/16939557/items/6K3Z95R9"],"itemData":{"id":3791,"type":"article-journal","abstract":"This paper provides a review of recent developments in the field of Mg corrosion and puts those into context. This includes considerations of corrosion manifestations, material influences, surface treatment, anodization, coatings, inhibition, biodegradable medical applications, stress corrosion cracking, flammability, corrosion mechanisms for HP Mg, critical evaluation of corrosion mechanisms, and concluding remarks. There has been much research recently, and much research continues in this area. This is expected to produce significantly better, more‐corrosion‐resistant Mg alloys.","citation-key":"atrensReviewRecentDevelopments2015","container-title":"Advanced Engineering Materials","DOI":"10.1002/adem.201400434","ISSN":"1438-1656, 1527-2648","issue":"4","journalAbbreviation":"Adv Eng Mater","language":"en","license":"http://onlinelibrary.wiley.com/termsAndConditions#vor","page":"400-453","source":"DOI.org (Crossref)","title":"Review of Recent Developments in the Field of Magnesium Corrosion","volume":"17","author":[{"family":"Atrens","given":"Andrej"},{"family":"Song","given":"Guang‐Ling"},{"family":"Liu","given":"Ming"},{"family":"Shi","given":"Zhiming"},{"family":"Cao","given":"Fuyong"},{"family":"Dargusch","given":"Matthew S."}],"issued":{"date-parts":[["2015",4]]}}}],"schema":"https://github.com/citation-style-language/schema/raw/master/csl-citation.json"} </w:instrText>
       </w:r>
       <w:r>
         <w:fldChar w:fldCharType="separate"/>
@@ -1174,11 +1166,7 @@
         <w:t>Computational–experimental workflow for developing, calibrating, validating, and applying the mechanistic Zn biodegradation model</w:t>
       </w:r>
       <w:r>
-        <w:t>. (a) Reaction–diffusion model coupling species transport and corrosion-film evolution with moving-interface tracking; (b) calibration of the three effective kinetic parameters (</w:t>
-      </w:r>
-      <w:proofErr w:type="spellStart"/>
-      <w:r>
-        <w:t>k</w:t>
+        <w:t>. (a) Reaction–diffusion model coupling species transport and corrosion-film evolution with moving-interface tracking; (b) calibration of the three effective kinetic parameters (k</w:t>
       </w:r>
       <w:r>
         <w:rPr>
@@ -1186,13 +1174,8 @@
         </w:rPr>
         <w:t>f</w:t>
       </w:r>
-      <w:proofErr w:type="spellEnd"/>
-      <w:r>
-        <w:t xml:space="preserve">, </w:t>
-      </w:r>
-      <w:proofErr w:type="spellStart"/>
-      <w:r>
-        <w:t>k</w:t>
+      <w:r>
+        <w:t>, k</w:t>
       </w:r>
       <w:r>
         <w:rPr>
@@ -1200,13 +1183,8 @@
         </w:rPr>
         <w:t>d</w:t>
       </w:r>
-      <w:proofErr w:type="spellEnd"/>
-      <w:r>
-        <w:t xml:space="preserve">, </w:t>
-      </w:r>
-      <w:proofErr w:type="spellStart"/>
-      <w:r>
-        <w:t>k</w:t>
+      <w:r>
+        <w:t>, k</w:t>
       </w:r>
       <w:r>
         <w:rPr>
@@ -1214,7 +1192,6 @@
         </w:rPr>
         <w:t>ORR</w:t>
       </w:r>
-      <w:proofErr w:type="spellEnd"/>
       <w:r>
         <w:t>) against literature mass-loss data (0–336 h); (c) validation against the mass loss measured in this study (0–672 h) for Ø10 × 2 mm discs; and (d) model predictions for a six-crown Zn stent.</w:t>
       </w:r>
@@ -1246,21 +1223,7 @@
         <w:rPr>
           <w:rFonts w:cs="Times New Roman"/>
         </w:rPr>
-        <w:t xml:space="preserve">Commercially pure Zn (99.99 </w:t>
-      </w:r>
-      <w:proofErr w:type="spellStart"/>
-      <w:r>
-        <w:rPr>
-          <w:rFonts w:cs="Times New Roman"/>
-        </w:rPr>
-        <w:t>wt</w:t>
-      </w:r>
-      <w:proofErr w:type="spellEnd"/>
-      <w:r>
-        <w:rPr>
-          <w:rFonts w:cs="Times New Roman"/>
-        </w:rPr>
-        <w:t xml:space="preserve">%) was processed by casting, homogenization, and hot extrusion to produce fully dense rods (10 mm diameter), from which disc specimens (10 mm diameter, 2 mm thickness) were prepared. Prior to testing, specimens were mechanically ground </w:t>
+        <w:t xml:space="preserve">Commercially pure Zn (99.99 wt%) was processed by casting, homogenization, and hot extrusion to produce fully dense rods (10 mm diameter), from which disc specimens (10 mm diameter, 2 mm thickness) were prepared. Prior to testing, specimens were mechanically ground </w:t>
       </w:r>
       <w:r>
         <w:rPr>
@@ -2879,35 +2842,7 @@
         <w:rPr>
           <w:rFonts w:cs="Times New Roman"/>
         </w:rPr>
-        <w:t xml:space="preserve">Although phosphate and carbonate species may contribute to the formation of secondary corrosion products such as </w:t>
-      </w:r>
-      <w:proofErr w:type="spellStart"/>
-      <w:r>
-        <w:rPr>
-          <w:rFonts w:cs="Times New Roman"/>
-        </w:rPr>
-        <w:t>hopeite</w:t>
-      </w:r>
-      <w:proofErr w:type="spellEnd"/>
-      <w:r>
-        <w:rPr>
-          <w:rFonts w:cs="Times New Roman"/>
-        </w:rPr>
-        <w:t xml:space="preserve">, smithsonite, and </w:t>
-      </w:r>
-      <w:proofErr w:type="spellStart"/>
-      <w:r>
-        <w:rPr>
-          <w:rFonts w:cs="Times New Roman"/>
-        </w:rPr>
-        <w:t>simonkolleite</w:t>
-      </w:r>
-      <w:proofErr w:type="spellEnd"/>
-      <w:r>
-        <w:rPr>
-          <w:rFonts w:cs="Times New Roman"/>
-        </w:rPr>
-        <w:t xml:space="preserve"> at longer timescales </w:t>
+        <w:t>Although phosphate and carbonate species may contribute to the formation of secondary corrosion products such as hopeite, smithsonite, and simonkolleite at longer timescales </w:t>
       </w:r>
       <w:r>
         <w:rPr>
@@ -2957,21 +2892,7 @@
         <w:rPr>
           <w:rFonts w:cs="Times New Roman"/>
         </w:rPr>
-        <w:t xml:space="preserve"> observations indicate that early degradation is dominated by a thin </w:t>
-      </w:r>
-      <w:proofErr w:type="spellStart"/>
-      <w:r>
-        <w:rPr>
-          <w:rFonts w:cs="Times New Roman"/>
-        </w:rPr>
-        <w:t>ZnO</w:t>
-      </w:r>
-      <w:proofErr w:type="spellEnd"/>
-      <w:r>
-        <w:rPr>
-          <w:rFonts w:cs="Times New Roman"/>
-        </w:rPr>
-        <w:t xml:space="preserve"> layer, with more complex phases appearing only after approximately 4.5 months </w:t>
+        <w:t xml:space="preserve"> observations indicate that early degradation is dominated by a thin ZnO layer, with more complex phases appearing only after approximately 4.5 months </w:t>
       </w:r>
       <w:r>
         <w:rPr>
@@ -3008,21 +2929,7 @@
         <w:rPr>
           <w:rFonts w:cs="Times New Roman"/>
         </w:rPr>
-        <w:t xml:space="preserve">. Therefore, for the one-month simulation period considered here, the corrosion film is modeled as a single </w:t>
-      </w:r>
-      <w:proofErr w:type="spellStart"/>
-      <w:r>
-        <w:rPr>
-          <w:rFonts w:cs="Times New Roman"/>
-        </w:rPr>
-        <w:t>ZnO</w:t>
-      </w:r>
-      <w:proofErr w:type="spellEnd"/>
-      <w:r>
-        <w:rPr>
-          <w:rFonts w:cs="Times New Roman"/>
-        </w:rPr>
-        <w:t xml:space="preserve"> phase.</w:t>
+        <w:t>. Therefore, for the one-month simulation period considered here, the corrosion film is modeled as a single ZnO phase.</w:t>
       </w:r>
     </w:p>
     <w:p>
@@ -4445,21 +4352,7 @@
         <w:rPr>
           <w:rFonts w:cs="Times New Roman"/>
         </w:rPr>
-        <w:t xml:space="preserve">, increasing the local alkalinity and promoting formation of a </w:t>
-      </w:r>
-      <w:proofErr w:type="spellStart"/>
-      <w:r>
-        <w:rPr>
-          <w:rFonts w:cs="Times New Roman"/>
-        </w:rPr>
-        <w:t>ZnO</w:t>
-      </w:r>
-      <w:proofErr w:type="spellEnd"/>
-      <w:r>
-        <w:rPr>
-          <w:rFonts w:cs="Times New Roman"/>
-        </w:rPr>
-        <w:t>-based corrosion-product film. At the same time, chloride-induced film dissolution releases hydroxide back into the electrolyte:</w:t>
+        <w:t>, increasing the local alkalinity and promoting formation of a ZnO-based corrosion-product film. At the same time, chloride-induced film dissolution releases hydroxide back into the electrolyte:</w:t>
       </w:r>
     </w:p>
     <w:p>
@@ -5847,15 +5740,7 @@
         <w:t>the</w:t>
       </w:r>
       <w:r>
-        <w:t xml:space="preserve"> balance between </w:t>
-      </w:r>
-      <w:proofErr w:type="spellStart"/>
-      <w:r>
-        <w:t>ZnO</w:t>
-      </w:r>
-      <w:proofErr w:type="spellEnd"/>
-      <w:r>
-        <w:t xml:space="preserve"> precipitation and chloride-mediated dissolution</w:t>
+        <w:t xml:space="preserve"> balance between ZnO precipitation and chloride-mediated dissolution</w:t>
       </w:r>
       <w:r>
         <w:t xml:space="preserve"> as follows</w:t>
@@ -8827,15 +8712,7 @@
         <w:pStyle w:val="BodyText"/>
       </w:pPr>
       <w:r>
-        <w:t xml:space="preserve">The coupled reaction-diffusion and moving-boundary framework was implemented in </w:t>
-      </w:r>
-      <w:proofErr w:type="spellStart"/>
-      <w:r>
-        <w:t>FreeFEM</w:t>
-      </w:r>
-      <w:proofErr w:type="spellEnd"/>
-      <w:r>
-        <w:t xml:space="preserve">++ and solved using first-order finite elements with implicit time integration. </w:t>
+        <w:t xml:space="preserve">The coupled reaction-diffusion and moving-boundary framework was implemented in FreeFEM++ and solved using first-order finite elements with implicit time integration. </w:t>
       </w:r>
       <w:r>
         <w:t xml:space="preserve">Parametrically generated implant geometries were discretized into tetrahedral meshes and embedded within an electrolyte domain at least three times larger than the implant characteristic dimension in each direction to minimize boundary effects. </w:t>
@@ -8868,15 +8745,7 @@
         <w:pStyle w:val="BodyText"/>
       </w:pPr>
       <w:r>
-        <w:t xml:space="preserve">Physiological initial and boundary conditions were imposed throughout the electrolyte domain, including continuous oxygen replenishment at the electrolyte-air interface and kinetic flux conditions at the moving metal-electrolyte boundary. Simulations were executed in parallel using </w:t>
-      </w:r>
-      <w:proofErr w:type="spellStart"/>
-      <w:r>
-        <w:t>FreeFEM</w:t>
-      </w:r>
-      <w:proofErr w:type="spellEnd"/>
-      <w:r>
-        <w:t xml:space="preserve">++ MPI on a high-performance computing cluster, and degradation metrics </w:t>
+        <w:t xml:space="preserve">Physiological initial and boundary conditions were imposed throughout the electrolyte domain, including continuous oxygen replenishment at the electrolyte-air interface and kinetic flux conditions at the moving metal-electrolyte boundary. Simulations were executed in parallel using FreeFEM++ MPI on a high-performance computing cluster, and degradation metrics </w:t>
       </w:r>
       <w:r>
         <w:lastRenderedPageBreak/>
@@ -8915,15 +8784,7 @@
         <w:t>, and dissolved oxygen concentration</w:t>
       </w:r>
       <w:r>
-        <w:t xml:space="preserve"> were extracted during post-processing. The transition between reaction-controlled and diffusion-controlled degradation was quantified using the local </w:t>
-      </w:r>
-      <w:proofErr w:type="spellStart"/>
-      <w:r>
-        <w:t>Damköhler</w:t>
-      </w:r>
-      <w:proofErr w:type="spellEnd"/>
-      <w:r>
-        <w:t xml:space="preserve"> number (</w:t>
+        <w:t xml:space="preserve"> were extracted during post-processing. The transition between reaction-controlled and diffusion-controlled degradation was quantified using the local Damköhler number (</w:t>
       </w:r>
       <w:r>
         <w:rPr>
@@ -14457,15 +14318,7 @@
         <w:t>.</w:t>
       </w:r>
       <w:r>
-        <w:t xml:space="preserve"> Calibration of the Zn biodegradation model. (a) </w:t>
-      </w:r>
-      <w:proofErr w:type="gramStart"/>
-      <w:r>
-        <w:t>Morris</w:t>
-      </w:r>
-      <w:proofErr w:type="gramEnd"/>
-      <w:r>
-        <w:t xml:space="preserve"> sensitivity analysis showing the relative influence of model parameters on predicted Zn mass loss after 168 h</w:t>
+        <w:t xml:space="preserve"> Calibration of the Zn biodegradation model. (a) Morris sensitivity analysis showing the relative influence of model parameters on predicted Zn mass loss after 168 h</w:t>
       </w:r>
       <w:r>
         <w:t xml:space="preserve">; (b) </w:t>
@@ -16563,18 +16416,8 @@
           <w:b/>
           <w:bCs/>
         </w:rPr>
-        <w:t>g–</w:t>
-      </w:r>
-      <w:proofErr w:type="spellStart"/>
-      <w:r>
-        <w:rPr>
-          <w:rFonts w:cs="Times New Roman"/>
-          <w:b/>
-          <w:bCs/>
-        </w:rPr>
-        <w:t>i</w:t>
-      </w:r>
-      <w:proofErr w:type="spellEnd"/>
+        <w:t>g–i</w:t>
+      </w:r>
       <w:r>
         <w:rPr>
           <w:rFonts w:cs="Times New Roman"/>
@@ -17032,15 +16875,7 @@
         <w:t>.</w:t>
       </w:r>
       <w:r>
-        <w:t xml:space="preserve"> Local parameter sweeps of kinetic parameters. Panels (a–c) show cumulative mass loss (%), panels (d–f) show film coverage (%), and panels (g-</w:t>
-      </w:r>
-      <w:proofErr w:type="spellStart"/>
-      <w:r>
-        <w:t>i</w:t>
-      </w:r>
-      <w:proofErr w:type="spellEnd"/>
-      <w:r>
-        <w:t>) show interfacial dissolved oxygen concentration (</w:t>
+        <w:t xml:space="preserve"> Local parameter sweeps of kinetic parameters. Panels (a–c) show cumulative mass loss (%), panels (d–f) show film coverage (%), and panels (g-i) show interfacial dissolved oxygen concentration (</w:t>
       </w:r>
       <w:r>
         <w:rPr>
@@ -18403,13 +18238,8 @@
         </w:rPr>
         <w:t xml:space="preserve">. </w:t>
       </w:r>
-      <w:proofErr w:type="spellStart"/>
-      <w:r>
-        <w:t>Damköhler</w:t>
-      </w:r>
-      <w:proofErr w:type="spellEnd"/>
-      <w:r>
-        <w:t xml:space="preserve">-number analysis quantified this transition, </w:t>
+      <w:r>
+        <w:t xml:space="preserve">Damköhler-number analysis quantified this transition, </w:t>
       </w:r>
       <w:r>
         <w:t xml:space="preserve">revealing an initial degradation regime governed by cathodic reaction kinetics. After approximately </w:t>
@@ -18418,15 +18248,7 @@
         <w:t>40</w:t>
       </w:r>
       <w:r>
-        <w:t xml:space="preserve"> h of immersion, oxygen transport became rate-</w:t>
-      </w:r>
-      <w:proofErr w:type="gramStart"/>
-      <w:r>
-        <w:t>limiting</w:t>
-      </w:r>
-      <w:proofErr w:type="gramEnd"/>
-      <w:r>
-        <w:t>, marking the onset of diffusion-controlled degradation and driving the subsequent decline in corrosion rate.</w:t>
+        <w:t xml:space="preserve"> h of immersion, oxygen transport became rate-limiting, marking the onset of diffusion-controlled degradation and driving the subsequent decline in corrosion rate.</w:t>
       </w:r>
     </w:p>
     <w:p>
@@ -19083,7 +18905,6 @@
         </w:rPr>
         <w:fldChar w:fldCharType="end"/>
       </w:r>
-      <w:proofErr w:type="gramStart"/>
       <w:r>
         <w:rPr>
           <w:rFonts w:cs="Times New Roman"/>
@@ -19092,7 +18913,6 @@
         </w:rPr>
         <w:t>e,f</w:t>
       </w:r>
-      <w:proofErr w:type="gramEnd"/>
       <w:r>
         <w:rPr>
           <w:rFonts w:cs="Times New Roman"/>
@@ -19109,7 +18929,7 @@
         <w:rPr>
           <w:rFonts w:cs="Times New Roman"/>
         </w:rPr>
-        <w:t>(Pearson r = 0.97 for Zn²⁺ and 0.94 for pH)</w:t>
+        <w:t>(Pearson r = 0.96 for Zn²⁺ and 0.95 for pH)</w:t>
       </w:r>
       <w:r>
         <w:rPr>
@@ -19324,23 +19144,7 @@
         <w:t xml:space="preserve"> corrosion-product chemistry. </w:t>
       </w:r>
       <w:r>
-        <w:t>The higher mass loss may be due to the stent's higher surface area-to-volume ratio (</w:t>
-      </w:r>
-      <w:proofErr w:type="gramStart"/>
-      <w:r>
-        <w:t>SA:V</w:t>
-      </w:r>
-      <w:proofErr w:type="gramEnd"/>
-      <w:r>
-        <w:t xml:space="preserve">) compared with the disc. Across the investigated geometries, cumulative mass loss increased approximately linearly with </w:t>
-      </w:r>
-      <w:proofErr w:type="gramStart"/>
-      <w:r>
-        <w:t>SA:V</w:t>
-      </w:r>
-      <w:proofErr w:type="gramEnd"/>
-      <w:r>
-        <w:t>, indicating a very strong correlation between the two variables (Figure S9).</w:t>
+        <w:t>The higher mass loss is consistent with the stent's higher surface area-to-volume ratio (SA:V) compared with the disc. Across the investigated geometries, cumulative mass loss increased approximately linearly with SA:V (Figure S9), although this trend alone cannot account for the stent's behavior.</w:t>
       </w:r>
       <w:r>
         <w:t xml:space="preserve"> Furthermore, the stent exhibited less pronounced temporal deceleration in mass loss than the disc, suggesting that geometry-dependent mass transport altered the evolution of degradation.</w:t>
@@ -19806,7 +19610,6 @@
         </w:rPr>
         <w:fldChar w:fldCharType="end"/>
       </w:r>
-      <w:proofErr w:type="gramStart"/>
       <w:r>
         <w:rPr>
           <w:b/>
@@ -19815,11 +19618,7 @@
         <w:t>c,d</w:t>
       </w:r>
       <w:r>
-        <w:t>.</w:t>
-      </w:r>
-      <w:proofErr w:type="gramEnd"/>
-      <w:r>
-        <w:t xml:space="preserve"> </w:t>
+        <w:t xml:space="preserve">. </w:t>
       </w:r>
       <w:r>
         <w:t>Section 1, located along a relatively straight strut segment, exhibited comparatively uniform recession, with penetration depths ranging from approximately</w:t>
@@ -20145,17 +19944,7 @@
         <w:t>672</w:t>
       </w:r>
       <w:r>
-        <w:t> h, (b) schematic illustration of oxygen transport to the inner and outer-curvature surfaces of the stent crown, (</w:t>
-      </w:r>
-      <w:proofErr w:type="spellStart"/>
-      <w:proofErr w:type="gramStart"/>
-      <w:r>
-        <w:t>c,d</w:t>
-      </w:r>
-      <w:proofErr w:type="spellEnd"/>
-      <w:proofErr w:type="gramEnd"/>
-      <w:r>
-        <w:t>) evolution of the metal cross-sectional profiles at Sections 1 and 2, respectively.</w:t>
+        <w:t> h, (b) schematic illustration of oxygen transport to the inner and outer-curvature surfaces of the stent crown, (c,d) evolution of the metal cross-sectional profiles at Sections 1 and 2, respectively.</w:t>
       </w:r>
     </w:p>
     <w:p>
@@ -20339,15 +20128,7 @@
         <w:t xml:space="preserve">). </w:t>
       </w:r>
       <w:r>
-        <w:t xml:space="preserve">The outer-to-inner recession ratio increased from 1.6 for the 30° arc to 2.6 for the 90° arc and 13.2 for the 150° arc, demonstrating that increasing curvature progressively concentrated degradation along the oxygen-accessible outer surface while suppressing recession along the confined inner curvature. Similarly, the outward-facing to gap-facing recession ratio increased from 1.3 for the isolated wire to 4.5 for the closely spaced pair, before decreasing to 2.5 for the widely spaced pair. The pronounced asymmetry at close spacing resulted from oxygen depletion within the narrow gap, while the outward-facing surfaces remained accessible to the bulk electrolyte. Thus, curvature and spacing had only modest effects on mean penetration but </w:t>
-      </w:r>
-      <w:proofErr w:type="gramStart"/>
-      <w:r>
-        <w:t>strongly</w:t>
-      </w:r>
-      <w:proofErr w:type="gramEnd"/>
-      <w:r>
-        <w:t xml:space="preserve"> influenced where material loss occurred. Therefore, cumulative mass loss and nominal corrosion rate alone may conceal localized degradation that could govern strut thinning, stress concentration, and eventual structural failure.</w:t>
+        <w:t>The outer-to-inner recession ratio increased from 1.6 for the 30° arc to 2.6 for the 90° arc and 13.2 for the 150° arc, demonstrating that increasing curvature progressively concentrated degradation along the oxygen-accessible outer surface while suppressing recession along the confined inner curvature. Similarly, the outward-facing to gap-facing recession ratio increased from 1.3 for the isolated wire to 4.5 for the closely spaced pair, before decreasing to 2.5 for the widely spaced pair. The pronounced asymmetry at close spacing resulted from oxygen depletion within the narrow gap, while the outward-facing surfaces remained accessible to the bulk electrolyte. Thus, curvature and spacing had only modest effects on mean penetration but strongly influenced where material loss occurred. Therefore, cumulative mass loss and nominal corrosion rate alone may conceal localized degradation that could govern strut thinning, stress concentration, and eventual structural failure.</w:t>
       </w:r>
     </w:p>
     <w:p>
@@ -20508,15 +20289,7 @@
         <w:t>The</w:t>
       </w:r>
       <w:r>
-        <w:t xml:space="preserve"> corrosion-product layer is treated as a homogenized </w:t>
-      </w:r>
-      <w:proofErr w:type="spellStart"/>
-      <w:r>
-        <w:t>ZnO</w:t>
-      </w:r>
-      <w:proofErr w:type="spellEnd"/>
-      <w:r>
-        <w:t>-based film rather than a heterogeneous, composition-dependent structure.</w:t>
+        <w:t xml:space="preserve"> corrosion-product layer is treated as a homogenized ZnO-based film rather than a heterogeneous, composition-dependent structure.</w:t>
       </w:r>
       <w:r>
         <w:t xml:space="preserve"> </w:t>
@@ -20601,7 +20374,29 @@
         <w:t xml:space="preserve"> </w:t>
       </w:r>
       <w:r>
-        <w:t>Structural optimization of biomedical implants, from patient-specific bone replacements to porous scaffolds, has so far targeted mechanical performance in the as-fabricated state [44,45]. For biodegradable implants</w:t>
+        <w:t xml:space="preserve">Structural optimization of biomedical implants, from patient-specific bone replacements to porous scaffolds, has so far targeted mechanical performance in the as-fabricated state </w:t>
+      </w:r>
+      <w:r>
+        <w:fldChar w:fldCharType="begin"/>
+      </w:r>
+      <w:r>
+        <w:instrText xml:space="preserve"> ADDIN ZOTERO_ITEM CSL_CITATION {"citationID":"Zd9tPSIo","properties":{"unsorted":false,"formattedCitation":"\\super [45,46]\\nosupersub{}","plainCitation":"[45,46]","noteIndex":0},"citationItems":[{"id":5410,"uris":["http://zotero.org/users/16939557/items/FPYDBSXS"],"itemData":{"id":5410,"type":"article-journal","citation-key":"liOptimizingStructuralDesign2022","container-title":"Materials &amp; Design","DOI":"10.1016/j.matdes.2022.110843","ISSN":"02641275","journalAbbreviation":"Materials &amp; Design","language":"en","page":"110843","source":"DOI.org (Crossref)","title":"Optimizing structural design on biodegradable magnesium alloy vascular stent for reducing strut thickness and raising radial strength","volume":"220","author":[{"family":"Li","given":"Yafei"},{"family":"Wang","given":"Jianfeng"},{"family":"Sheng","given":"Kun"},{"family":"Miao","given":"Fulong"},{"family":"Wang","given":"Yan"},{"family":"Zhang","given":"Yifan"},{"family":"Hou","given":"Ruiqing"},{"family":"Mei","given":"Di"},{"family":"Sun","given":"Yufeng"},{"family":"Zheng","given":"Yufeng"},{"family":"Guan","given":"Shaokang"}],"issued":{"date-parts":[["2022",8]]}}},{"id":5411,"uris":["http://zotero.org/users/16939557/items/3V2WPL8B"],"itemData":{"id":5411,"type":"article-journal","abstract":"The emergence of biodegradable stents addresses the limitations of the long-term presence of permanent bare metal stents in the human body. Following implantation, these stents can significantly reduce the occurrence of chronic complications such as inflammation and thrombosis, thus becoming a mainstream approach in the treatment of interventional cardiovascular diseases. Currently, the materials used for biodegradable stents are typically polymers. However, the inherent properties of the materials dictate that polymer stents exhibit lower mechanical performance and biocompatibility. Magnesium alloy materials, on the basis of their biodegradability, exhibit superior mechanical performance when compared to polymers, possessing the potential to address this issue. However, the presence of stress concentration in the stent structure necessitates further designs and mechanical performance analyses of magnesium alloy stents. In this work, a biodegradable stent based on WE43 alloy is designed. The stent incorporates the micro-protrusion structure to enhance the mechanical performance. Furthermore, to evaluate the clinical applicability of the stent, the mechanical performance of the biodegradable magnesium alloy stent is conducted through finite element analysis (FEA). The results show that the maximum equivalent stress in all four aspects is below the ultimate tensile strength of 370 MPa for the WE43 magnesium alloy, demonstrating excellent mechanical performance. Additionally, after crimping and expansion, the radial support strength and radial support force reached 780 mN/mm and 1.56 N, respectively. Compared to the advanced reported stent structures, the radial support strength and radial support force are enhanced by 13% and 47%, respectively. Additionally, flexibility analysis indicated that the flexibility of the stent design in this study is improved by a factor of 9.76, ensuring the stent’s capability to navigate through complex vasculature during implantation.","citation-key":"chenDesignMechanicalPerformance2024","container-title":"Metals","DOI":"10.3390/met14060704","ISSN":"2075-4701","issue":"6","journalAbbreviation":"Metals","language":"en","page":"704","source":"DOI.org (Crossref)","title":"Design and Mechanical Performance Evaluation of WE43 Magnesium Alloy Biodegradable Stents via Finite Element Analysis","volume":"14","author":[{"family":"Chen","given":"Jiaxuan"},{"family":"Dong","given":"Fang"},{"family":"Liu","given":"Sheng"}],"issued":{"date-parts":[["2024",6,14]]}}}],"schema":"https://github.com/citation-style-language/schema/raw/master/csl-citation.json"} </w:instrText>
+      </w:r>
+      <w:r>
+        <w:fldChar w:fldCharType="separate"/>
+      </w:r>
+      <w:r>
+        <w:rPr>
+          <w:rFonts w:cs="Times New Roman"/>
+          <w:vertAlign w:val="superscript"/>
+        </w:rPr>
+        <w:t>[45,46]</w:t>
+      </w:r>
+      <w:r>
+        <w:fldChar w:fldCharType="end"/>
+      </w:r>
+      <w:r>
+        <w:t>. For biodegradable implants</w:t>
       </w:r>
       <w:r>
         <w:t>,</w:t>
@@ -20637,7 +20432,11 @@
       </w:pPr>
       <w:bookmarkStart w:id="24" w:name="_Hlk238630414"/>
       <w:r>
-        <w:t xml:space="preserve">Zn biodegradation under physiological conditions is a self-limiting, oxygen-transport-controlled process, and implant geometry determines where, not only how fast, material is lost. A predictive three-parameter 3D reaction-diffusion model, calibrated on literature data, reproduced independent 28-day immersion measurements (RMSE of 0.0159%) and, without recalibration, predicted approximately 6% mass loss for a six-crown stent, consistent in magnitude with in vivo reports. Sensitivity and mechanistic analyses identified oxygen availability as the dominant control, with corrosion-product accumulation progressively restricting oxygen transport and shifting degradation from reaction-controlled to diffusion-controlled behavior. Most importantly, localized degradation at oxygen-accessible crown surfaces emerged from transport physics alone, without any prescribed spatial variation in corrosion kinetics. Simplified wire studies showed that curvature and inter-strut spacing change cumulative mass loss only modestly yet strongly redistribute recession, so cumulative mass loss and nominal corrosion rate can mask the localized thinning that governs strut failure. Geometry is therefore a decisive design variable for biodegradable implants. By making geometry-dependent degradation predictable, this framework supplies the missing degradation component for structural optimization of biodegradable implants, particularly Zn stents, enabling designs optimized for mechanical performance throughout degradation rather than at implantation alone.</w:t>
+        <w:t xml:space="preserve">Zn biodegradation under physiological conditions becomes an oxygen-transport-controlled process after an initial reaction-controlled stage in which implant geometry governs the spatial evolution of material loss. The proposed three-parameter 3D reaction-diffusion model closely reproduced independent 28-day immersion data (RMSE = 0.0159%) and, without further calibration, predicted approximately 6% mass loss for a six-crown stent, consistent with reported in vivo observations. Mechanistic and sensitivity analyses identified oxygen availability as the primary driver of degradation, with corrosion-product accumulation progressively restricting transport and leading to diffusion-controlled behavior. Importantly, localized degradation emerged naturally from geometry-dependent transport phenomena, without imposing spatially varying corrosion </w:t>
+      </w:r>
+      <w:r>
+        <w:lastRenderedPageBreak/>
+        <w:t>kinetics. While curvature and inter-strut spacing produced only modest changes in cumulative mass loss, they strongly altered the distribution of material recession, demonstrating that global degradation metrics can obscure the localized thinning responsible for structural failure. These findings establish geometry as a critical determinant of biodegradable implant performance and provide a predictive framework for integrating degradation into the design and optimization of Zn stents and other biodegradable metallic implants, enabling structural performance to be considered throughout the implant lifetime rather than only at implantation.</w:t>
       </w:r>
       <w:bookmarkEnd w:id="24"/>
     </w:p>
@@ -20673,15 +20472,7 @@
         <w:jc w:val="both"/>
       </w:pPr>
       <w:r>
-        <w:t xml:space="preserve">The authors acknowledge the use of Monash University’s High-Performance Computing (M3) facility and the Monash </w:t>
-      </w:r>
-      <w:proofErr w:type="spellStart"/>
-      <w:r>
-        <w:t>eResearch</w:t>
-      </w:r>
-      <w:proofErr w:type="spellEnd"/>
-      <w:r>
-        <w:t xml:space="preserve"> </w:t>
+        <w:t xml:space="preserve">The authors acknowledge the use of Monash University’s High-Performance Computing (M3) facility and the Monash eResearch </w:t>
       </w:r>
       <w:r>
         <w:t>Center</w:t>
@@ -20755,21 +20546,12 @@
       <w:r>
         <w:t xml:space="preserve"> Data curation, Investigation, Writing – original draft. </w:t>
       </w:r>
-      <w:proofErr w:type="spellStart"/>
-      <w:r>
-        <w:rPr>
-          <w:b/>
-          <w:bCs/>
-        </w:rPr>
-        <w:t>Aijun</w:t>
-      </w:r>
-      <w:proofErr w:type="spellEnd"/>
-      <w:r>
-        <w:rPr>
-          <w:b/>
-          <w:bCs/>
-        </w:rPr>
-        <w:t xml:space="preserve"> Huang:</w:t>
+      <w:r>
+        <w:rPr>
+          <w:b/>
+          <w:bCs/>
+        </w:rPr>
+        <w:t>Aijun Huang:</w:t>
       </w:r>
       <w:r>
         <w:t xml:space="preserve"> Conceptualization, Funding acquisition, Project administration, Supervision. </w:t>
@@ -20787,21 +20569,12 @@
       <w:r>
         <w:t xml:space="preserve"> </w:t>
       </w:r>
-      <w:proofErr w:type="spellStart"/>
-      <w:r>
-        <w:rPr>
-          <w:b/>
-          <w:bCs/>
-        </w:rPr>
-        <w:t>Yuman</w:t>
-      </w:r>
-      <w:proofErr w:type="spellEnd"/>
-      <w:r>
-        <w:rPr>
-          <w:b/>
-          <w:bCs/>
-        </w:rPr>
-        <w:t xml:space="preserve"> Zhu:</w:t>
+      <w:r>
+        <w:rPr>
+          <w:b/>
+          <w:bCs/>
+        </w:rPr>
+        <w:t>Yuman Zhu:</w:t>
       </w:r>
       <w:r>
         <w:t xml:space="preserve"> Conceptualization, Supervision, Writing – review &amp; editing.</w:t>
@@ -21146,23 +20919,7 @@
         <w:pStyle w:val="Bibliography"/>
       </w:pPr>
       <w:r>
-        <w:t xml:space="preserve">5. A. </w:t>
-      </w:r>
-      <w:proofErr w:type="spellStart"/>
-      <w:r>
-        <w:t>Atrens</w:t>
-      </w:r>
-      <w:proofErr w:type="spellEnd"/>
-      <w:r>
-        <w:t xml:space="preserve">, G. Song, M. Liu, Z. Shi, F. Cao, and M. S. </w:t>
-      </w:r>
-      <w:proofErr w:type="spellStart"/>
-      <w:r>
-        <w:t>Dargusch</w:t>
-      </w:r>
-      <w:proofErr w:type="spellEnd"/>
-      <w:r>
-        <w:t xml:space="preserve">, “Review of Recent Developments in the Field of Magnesium Corrosion,” </w:t>
+        <w:t xml:space="preserve">5. A. Atrens, G. Song, M. Liu, Z. Shi, F. Cao, and M. S. Dargusch, “Review of Recent Developments in the Field of Magnesium Corrosion,” </w:t>
       </w:r>
       <w:r>
         <w:rPr>
@@ -21190,15 +20947,7 @@
         <w:pStyle w:val="Bibliography"/>
       </w:pPr>
       <w:r>
-        <w:t xml:space="preserve">6. G. </w:t>
-      </w:r>
-      <w:proofErr w:type="spellStart"/>
-      <w:r>
-        <w:t>Katarivas</w:t>
-      </w:r>
-      <w:proofErr w:type="spellEnd"/>
-      <w:r>
-        <w:t xml:space="preserve"> Levy, J. Goldman, and E. Aghion, “The Prospects of Zinc as a Structural Material for Biodegradable Implants—A Review Paper,” </w:t>
+        <w:t xml:space="preserve">6. G. Katarivas Levy, J. Goldman, and E. Aghion, “The Prospects of Zinc as a Structural Material for Biodegradable Implants—A Review Paper,” </w:t>
       </w:r>
       <w:r>
         <w:rPr>
@@ -21233,29 +20982,48 @@
           <w:i/>
           <w:iCs/>
         </w:rPr>
-        <w:t xml:space="preserve">Acta </w:t>
-      </w:r>
-      <w:proofErr w:type="spellStart"/>
+        <w:t>Acta Biomaterialia</w:t>
+      </w:r>
+      <w:r>
+        <w:t xml:space="preserve"> </w:t>
+      </w:r>
       <w:r>
         <w:rPr>
           <w:i/>
           <w:iCs/>
         </w:rPr>
-        <w:t>Biomaterialia</w:t>
-      </w:r>
-      <w:proofErr w:type="spellEnd"/>
-      <w:r>
-        <w:t xml:space="preserve"> </w:t>
+        <w:t>7</w:t>
+      </w:r>
+      <w:r>
+        <w:t>, no. 9 (2011): 3515–3522, https://doi.org/10.1016/j.actbio.2011.05.008.</w:t>
+      </w:r>
+    </w:p>
+    <w:p>
+      <w:pPr>
+        <w:pStyle w:val="Bibliography"/>
+      </w:pPr>
+      <w:r>
+        <w:t xml:space="preserve">8. J. Rao, H. Gao, J. Sun, R. Yu, D. Zhao, and Y. Ding, “A Critical Review of Biodegradable Zinc Alloys toward Clinical Applications,” </w:t>
       </w:r>
       <w:r>
         <w:rPr>
           <w:i/>
           <w:iCs/>
         </w:rPr>
-        <w:t>7</w:t>
-      </w:r>
-      <w:r>
-        <w:t>, no. 9 (2011): 3515–3522, https://doi.org/10.1016/j.actbio.2011.05.008.</w:t>
+        <w:t>ACS Biomaterials Science &amp; Engineering</w:t>
+      </w:r>
+      <w:r>
+        <w:t xml:space="preserve"> </w:t>
+      </w:r>
+      <w:r>
+        <w:rPr>
+          <w:i/>
+          <w:iCs/>
+        </w:rPr>
+        <w:t>10</w:t>
+      </w:r>
+      <w:r>
+        <w:t>, no. 9 (2024): 5454–5473, https://doi.org/10.1021/acsbiomaterials.4c00210.</w:t>
       </w:r>
     </w:p>
     <w:p>
@@ -21263,14 +21031,14 @@
         <w:pStyle w:val="Bibliography"/>
       </w:pPr>
       <w:r>
-        <w:t xml:space="preserve">8. J. Rao, H. Gao, J. Sun, R. Yu, D. Zhao, and Y. Ding, “A Critical Review of Biodegradable Zinc Alloys toward Clinical Applications,” </w:t>
+        <w:t xml:space="preserve">9. P. Zhao, Z. Wang, H. Yang, et al., “Biodegradable Zn‐Based Implants: Progress, Challenges, and Pathways toward Clinical Translation,” </w:t>
       </w:r>
       <w:r>
         <w:rPr>
           <w:i/>
           <w:iCs/>
         </w:rPr>
-        <w:t>ACS Biomaterials Science &amp; Engineering</w:t>
+        <w:t>Advanced Science</w:t>
       </w:r>
       <w:r>
         <w:t xml:space="preserve"> </w:t>
@@ -21280,10 +21048,10 @@
           <w:i/>
           <w:iCs/>
         </w:rPr>
-        <w:t>10</w:t>
-      </w:r>
-      <w:r>
-        <w:t>, no. 9 (2024): 5454–5473, https://doi.org/10.1021/acsbiomaterials.4c00210.</w:t>
+        <w:t>13</w:t>
+      </w:r>
+      <w:r>
+        <w:t>, no. 39 (2026): e76066, https://doi.org/10.1002/advs.76066.</w:t>
       </w:r>
     </w:p>
     <w:p>
@@ -21291,14 +21059,14 @@
         <w:pStyle w:val="Bibliography"/>
       </w:pPr>
       <w:r>
-        <w:t xml:space="preserve">9. P. Zhao, Z. Wang, H. Yang, et al., “Biodegradable Zn‐Based Implants: Progress, Challenges, and Pathways toward Clinical Translation,” </w:t>
+        <w:t xml:space="preserve">10. H. Yang, C. Wang, C. Liu, et al., “Evolution of the Degradation Mechanism of Pure Zinc Stent in the One-Year Study of Rabbit Abdominal Aorta Model,” </w:t>
       </w:r>
       <w:r>
         <w:rPr>
           <w:i/>
           <w:iCs/>
         </w:rPr>
-        <w:t>Advanced Science</w:t>
+        <w:t>Biomaterials</w:t>
       </w:r>
       <w:r>
         <w:t xml:space="preserve"> </w:t>
@@ -21308,10 +21076,10 @@
           <w:i/>
           <w:iCs/>
         </w:rPr>
-        <w:t>13</w:t>
-      </w:r>
-      <w:r>
-        <w:t>, no. 39 (2026): e76066, https://doi.org/10.1002/advs.76066.</w:t>
+        <w:t>145</w:t>
+      </w:r>
+      <w:r>
+        <w:t xml:space="preserve"> (2017): 92–105, https://doi.org/10.1016/j.biomaterials.2017.08.022.</w:t>
       </w:r>
     </w:p>
     <w:p>
@@ -21319,14 +21087,14 @@
         <w:pStyle w:val="Bibliography"/>
       </w:pPr>
       <w:r>
-        <w:t xml:space="preserve">10. H. Yang, C. Wang, C. Liu, et al., “Evolution of the Degradation Mechanism of Pure Zinc Stent in the One-Year Study of Rabbit Abdominal Aorta Model,” </w:t>
+        <w:t xml:space="preserve">11. H. Zhang, T. Du, S. Chen, et al., “Finite Element Analysis of the Non-Uniform Degradation of Biodegradable Vascular Stents,” </w:t>
       </w:r>
       <w:r>
         <w:rPr>
           <w:i/>
           <w:iCs/>
         </w:rPr>
-        <w:t>Biomaterials</w:t>
+        <w:t>Journal of Functional Biomaterials</w:t>
       </w:r>
       <w:r>
         <w:t xml:space="preserve"> </w:t>
@@ -21336,10 +21104,10 @@
           <w:i/>
           <w:iCs/>
         </w:rPr>
-        <w:t>145</w:t>
-      </w:r>
-      <w:r>
-        <w:t xml:space="preserve"> (2017): 92–105, https://doi.org/10.1016/j.biomaterials.2017.08.022.</w:t>
+        <w:t>13</w:t>
+      </w:r>
+      <w:r>
+        <w:t>, no. 3 (2022): 152, https://doi.org/10.3390/jfb13030152.</w:t>
       </w:r>
     </w:p>
     <w:p>
@@ -21347,14 +21115,14 @@
         <w:pStyle w:val="Bibliography"/>
       </w:pPr>
       <w:r>
-        <w:t xml:space="preserve">11. H. Zhang, T. Du, S. Chen, et al., “Finite Element Analysis of the Non-Uniform Degradation of Biodegradable Vascular Stents,” </w:t>
+        <w:t xml:space="preserve">12. X. Wang, A. Liu, Z. Zhang, et al., “Additively Manufactured Zn‐2Mg Alloy Porous Scaffolds with Customizable Biodegradable Performance and Enhanced Osteogenic Ability,” </w:t>
       </w:r>
       <w:r>
         <w:rPr>
           <w:i/>
           <w:iCs/>
         </w:rPr>
-        <w:t>Journal of Functional Biomaterials</w:t>
+        <w:t>Advanced Science</w:t>
       </w:r>
       <w:r>
         <w:t xml:space="preserve"> </w:t>
@@ -21364,10 +21132,10 @@
           <w:i/>
           <w:iCs/>
         </w:rPr>
-        <w:t>13</w:t>
-      </w:r>
-      <w:r>
-        <w:t>, no. 3 (2022): 152, https://doi.org/10.3390/jfb13030152.</w:t>
+        <w:t>11</w:t>
+      </w:r>
+      <w:r>
+        <w:t>, no. 5 (2024): 2307329, https://doi.org/10.1002/advs.202307329.</w:t>
       </w:r>
     </w:p>
     <w:p>
@@ -21375,14 +21143,14 @@
         <w:pStyle w:val="Bibliography"/>
       </w:pPr>
       <w:r>
-        <w:t xml:space="preserve">12. X. Wang, A. Liu, Z. Zhang, et al., “Additively Manufactured Zn‐2Mg Alloy Porous Scaffolds with Customizable Biodegradable Performance and Enhanced Osteogenic Ability,” </w:t>
+        <w:t xml:space="preserve">13. Y. Shi, W. Xu, H. Che, et al., “The Effect of Topological Design on the Degradation Behavior of Additively Manufactured Porous Zinc Alloy,” </w:t>
       </w:r>
       <w:r>
         <w:rPr>
           <w:i/>
           <w:iCs/>
         </w:rPr>
-        <w:t>Advanced Science</w:t>
+        <w:t>npj Materials Degradation</w:t>
       </w:r>
       <w:r>
         <w:t xml:space="preserve"> </w:t>
@@ -21392,10 +21160,10 @@
           <w:i/>
           <w:iCs/>
         </w:rPr>
-        <w:t>11</w:t>
-      </w:r>
-      <w:r>
-        <w:t>, no. 5 (2024): 2307329, https://doi.org/10.1002/advs.202307329.</w:t>
+        <w:t>8</w:t>
+      </w:r>
+      <w:r>
+        <w:t>, no. 1 (2024): 42, https://doi.org/10.1038/s41529-024-00451-z.</w:t>
       </w:r>
     </w:p>
     <w:p>
@@ -21403,36 +21171,55 @@
         <w:pStyle w:val="Bibliography"/>
       </w:pPr>
       <w:r>
-        <w:t xml:space="preserve">13. Y. Shi, W. Xu, H. Che, et al., “The Effect of Topological Design on the Degradation Behavior of Additively Manufactured Porous Zinc Alloy,” </w:t>
-      </w:r>
-      <w:proofErr w:type="spellStart"/>
+        <w:t xml:space="preserve">14. T. Albaraghtheh, R. Willumeit-Römer, and B. Zeller-Plumhoff, “In Silico Studies of Magnesium-Based Implants: A Review of the Current Stage and Challenges,” </w:t>
+      </w:r>
       <w:r>
         <w:rPr>
           <w:i/>
           <w:iCs/>
         </w:rPr>
-        <w:t>npj</w:t>
-      </w:r>
-      <w:proofErr w:type="spellEnd"/>
+        <w:t>Journal of Magnesium and Alloys</w:t>
+      </w:r>
+      <w:r>
+        <w:t xml:space="preserve"> </w:t>
+      </w:r>
       <w:r>
         <w:rPr>
           <w:i/>
           <w:iCs/>
         </w:rPr>
-        <w:t xml:space="preserve"> Materials Degradation</w:t>
-      </w:r>
-      <w:r>
-        <w:t xml:space="preserve"> </w:t>
+        <w:t>10</w:t>
+      </w:r>
+      <w:r>
+        <w:t>, no. 11 (2022): 2968–2996, https://doi.org/10.1016/j.jma.2022.09.029.</w:t>
+      </w:r>
+    </w:p>
+    <w:p>
+      <w:pPr>
+        <w:pStyle w:val="Bibliography"/>
+      </w:pPr>
+      <w:r>
+        <w:t xml:space="preserve">15. E. L. Boland, C. J. Shine, N. Kelly, C. A. Sweeney, and P. E. McHugh, “A Review of Material Degradation Modelling for the Analysis and Design of Bioabsorbable Stents,” </w:t>
       </w:r>
       <w:r>
         <w:rPr>
           <w:i/>
           <w:iCs/>
         </w:rPr>
-        <w:t>8</w:t>
-      </w:r>
-      <w:r>
-        <w:t>, no. 1 (2024): 42, https://doi.org/10.1038/s41529-024-00451-z.</w:t>
+        <w:t>Annals of Biomedical Engineering</w:t>
+      </w:r>
+      <w:r>
+        <w:t xml:space="preserve"> </w:t>
+      </w:r>
+      <w:r>
+        <w:rPr>
+          <w:i/>
+          <w:iCs/>
+        </w:rPr>
+        <w:t>44</w:t>
+      </w:r>
+      <w:r>
+        <w:t>, no. 2 (2016): 341–356, https://doi.org/10.1007/s10439-015-1413-5.</w:t>
       </w:r>
     </w:p>
     <w:p>
@@ -21440,30 +21227,18 @@
         <w:pStyle w:val="Bibliography"/>
       </w:pPr>
       <w:r>
-        <w:t xml:space="preserve">14. T. </w:t>
-      </w:r>
-      <w:proofErr w:type="spellStart"/>
-      <w:r>
-        <w:t>Albaraghtheh</w:t>
-      </w:r>
-      <w:proofErr w:type="spellEnd"/>
-      <w:r>
-        <w:t xml:space="preserve">, R. </w:t>
-      </w:r>
-      <w:proofErr w:type="spellStart"/>
-      <w:r>
-        <w:t>Willumeit</w:t>
-      </w:r>
-      <w:proofErr w:type="spellEnd"/>
-      <w:r>
-        <w:t xml:space="preserve">-Römer, and B. Zeller-Plumhoff, “In Silico Studies of Magnesium-Based Implants: A Review of the Current Stage and Challenges,” </w:t>
+        <w:t xml:space="preserve">16. D. Gastaldi, V. Sassi, L. Petrini, M. Vedani, S. Trasatti, and F. Migliavacca, “Continuum Damage Model for Bioresorbable Magnesium Alloy Devices — Application to Coronary </w:t>
+      </w:r>
+      <w:r>
+        <w:lastRenderedPageBreak/>
+        <w:t xml:space="preserve">Stents,” </w:t>
       </w:r>
       <w:r>
         <w:rPr>
           <w:i/>
           <w:iCs/>
         </w:rPr>
-        <w:t>Journal of Magnesium and Alloys</w:t>
+        <w:t>Journal of the Mechanical Behavior of Biomedical Materials</w:t>
       </w:r>
       <w:r>
         <w:t xml:space="preserve"> </w:t>
@@ -21473,10 +21248,10 @@
           <w:i/>
           <w:iCs/>
         </w:rPr>
-        <w:t>10</w:t>
-      </w:r>
-      <w:r>
-        <w:t>, no. 11 (2022): 2968–2996, https://doi.org/10.1016/j.jma.2022.09.029.</w:t>
+        <w:t>4</w:t>
+      </w:r>
+      <w:r>
+        <w:t>, no. 3 (2011): 352–365, https://doi.org/10.1016/j.jmbbm.2010.11.003.</w:t>
       </w:r>
     </w:p>
     <w:p>
@@ -21484,14 +21259,14 @@
         <w:pStyle w:val="Bibliography"/>
       </w:pPr>
       <w:r>
-        <w:t xml:space="preserve">15. E. L. Boland, C. J. Shine, N. Kelly, C. A. Sweeney, and P. E. McHugh, “A Review of Material Degradation Modelling for the Analysis and Design of Bioabsorbable Stents,” </w:t>
+        <w:t xml:space="preserve">17. J. A. Grogan, B. J. O’Brien, S. B. Leen, and P. E. McHugh, “A Corrosion Model for Bioabsorbable Metallic Stents,” </w:t>
       </w:r>
       <w:r>
         <w:rPr>
           <w:i/>
           <w:iCs/>
         </w:rPr>
-        <w:t>Annals of Biomedical Engineering</w:t>
+        <w:t>Acta Biomaterialia</w:t>
       </w:r>
       <w:r>
         <w:t xml:space="preserve"> </w:t>
@@ -21501,10 +21276,10 @@
           <w:i/>
           <w:iCs/>
         </w:rPr>
-        <w:t>44</w:t>
-      </w:r>
-      <w:r>
-        <w:t>, no. 2 (2016): 341–356, https://doi.org/10.1007/s10439-015-1413-5.</w:t>
+        <w:t>7</w:t>
+      </w:r>
+      <w:r>
+        <w:t>, no. 9 (2011): 3523–3533, https://doi.org/10.1016/j.actbio.2011.05.032.</w:t>
       </w:r>
     </w:p>
     <w:p>
@@ -21512,34 +21287,14 @@
         <w:pStyle w:val="Bibliography"/>
       </w:pPr>
       <w:r>
-        <w:t xml:space="preserve">16. D. Gastaldi, V. Sassi, L. Petrini, M. </w:t>
-      </w:r>
-      <w:proofErr w:type="spellStart"/>
-      <w:r>
-        <w:t>Vedani</w:t>
-      </w:r>
-      <w:proofErr w:type="spellEnd"/>
-      <w:r>
-        <w:t xml:space="preserve">, S. Trasatti, and F. </w:t>
-      </w:r>
-      <w:proofErr w:type="spellStart"/>
-      <w:r>
-        <w:t>Migliavacca</w:t>
-      </w:r>
-      <w:proofErr w:type="spellEnd"/>
-      <w:r>
-        <w:t xml:space="preserve">, “Continuum Damage Model for Bioresorbable Magnesium Alloy Devices — Application to Coronary </w:t>
-      </w:r>
-      <w:r>
-        <w:lastRenderedPageBreak/>
-        <w:t xml:space="preserve">Stents,” </w:t>
+        <w:t xml:space="preserve">18. M. Barzegari, D. Mei, S. V. Lamaka, and L. Geris, “Computational Modeling of Degradation Process of Biodegradable Magnesium Biomaterials,” </w:t>
       </w:r>
       <w:r>
         <w:rPr>
           <w:i/>
           <w:iCs/>
         </w:rPr>
-        <w:t>Journal of the Mechanical Behavior of Biomedical Materials</w:t>
+        <w:t>Corrosion Science</w:t>
       </w:r>
       <w:r>
         <w:t xml:space="preserve"> </w:t>
@@ -21549,10 +21304,10 @@
           <w:i/>
           <w:iCs/>
         </w:rPr>
-        <w:t>4</w:t>
-      </w:r>
-      <w:r>
-        <w:t>, no. 3 (2011): 352–365, https://doi.org/10.1016/j.jmbbm.2010.11.003.</w:t>
+        <w:t>190</w:t>
+      </w:r>
+      <w:r>
+        <w:t xml:space="preserve"> (2021): 109674, https://doi.org/10.1016/j.corsci.2021.109674.</w:t>
       </w:r>
     </w:p>
     <w:p>
@@ -21560,36 +21315,55 @@
         <w:pStyle w:val="Bibliography"/>
       </w:pPr>
       <w:r>
-        <w:t xml:space="preserve">17. J. A. Grogan, B. J. O’Brien, S. B. Leen, and P. E. McHugh, “A Corrosion Model for Bioabsorbable Metallic Stents,” </w:t>
+        <w:t xml:space="preserve">19. P. Bajger, J. M. A. Ashbourn, V. Manhas, Y. Guyot, K. Lietaert, and L. Geris, “Mathematical Modelling of the Degradation Behaviour of Biodegradable Metals,” </w:t>
       </w:r>
       <w:r>
         <w:rPr>
           <w:i/>
           <w:iCs/>
         </w:rPr>
-        <w:t xml:space="preserve">Acta </w:t>
-      </w:r>
-      <w:proofErr w:type="spellStart"/>
+        <w:t>Biomechanics and Modeling in Mechanobiology</w:t>
+      </w:r>
+      <w:r>
+        <w:t xml:space="preserve"> </w:t>
+      </w:r>
       <w:r>
         <w:rPr>
           <w:i/>
           <w:iCs/>
         </w:rPr>
-        <w:t>Biomaterialia</w:t>
-      </w:r>
-      <w:proofErr w:type="spellEnd"/>
-      <w:r>
-        <w:t xml:space="preserve"> </w:t>
+        <w:t>16</w:t>
+      </w:r>
+      <w:r>
+        <w:t>, no. 1 (2017): 227–238, https://doi.org/10.1007/s10237-016-0812-3.</w:t>
+      </w:r>
+    </w:p>
+    <w:p>
+      <w:pPr>
+        <w:pStyle w:val="Bibliography"/>
+      </w:pPr>
+      <w:r>
+        <w:t xml:space="preserve">20. S. Thomas, N. V. Medhekar, G. S. Frankel, and N. Birbilis, “Corrosion Mechanism and Hydrogen Evolution on Mg,” </w:t>
       </w:r>
       <w:r>
         <w:rPr>
           <w:i/>
           <w:iCs/>
         </w:rPr>
-        <w:t>7</w:t>
-      </w:r>
-      <w:r>
-        <w:t>, no. 9 (2011): 3523–3533, https://doi.org/10.1016/j.actbio.2011.05.032.</w:t>
+        <w:t>Current Opinion in Solid State and Materials Science</w:t>
+      </w:r>
+      <w:r>
+        <w:t xml:space="preserve"> </w:t>
+      </w:r>
+      <w:r>
+        <w:rPr>
+          <w:i/>
+          <w:iCs/>
+        </w:rPr>
+        <w:t>19</w:t>
+      </w:r>
+      <w:r>
+        <w:t>, no. 2 (2015): 85–94, https://doi.org/10.1016/j.cossms.2014.09.005.</w:t>
       </w:r>
     </w:p>
     <w:p>
@@ -21597,14 +21371,14 @@
         <w:pStyle w:val="Bibliography"/>
       </w:pPr>
       <w:r>
-        <w:t xml:space="preserve">18. M. Barzegari, D. Mei, S. V. Lamaka, and L. Geris, “Computational Modeling of Degradation Process of Biodegradable Magnesium Biomaterials,” </w:t>
+        <w:t xml:space="preserve">21. D. Zhang, L. Zhang, X. Zhang, et al., “Comparative Investigation of the Corrosion Behavior of Biomedical Zinc Alloys in Oxygen-Enriched Simulated Body Fluid Environments,” </w:t>
       </w:r>
       <w:r>
         <w:rPr>
           <w:i/>
           <w:iCs/>
         </w:rPr>
-        <w:t>Corrosion Science</w:t>
+        <w:t>Materials Today Communications</w:t>
       </w:r>
       <w:r>
         <w:t xml:space="preserve"> </w:t>
@@ -21614,10 +21388,10 @@
           <w:i/>
           <w:iCs/>
         </w:rPr>
-        <w:t>190</w:t>
-      </w:r>
-      <w:r>
-        <w:t xml:space="preserve"> (2021): 109674, https://doi.org/10.1016/j.corsci.2021.109674.</w:t>
+        <w:t>39</w:t>
+      </w:r>
+      <w:r>
+        <w:t xml:space="preserve"> (2024): 108811, https://doi.org/10.1016/j.mtcomm.2024.108811.</w:t>
       </w:r>
     </w:p>
     <w:p>
@@ -21625,38 +21399,14 @@
         <w:pStyle w:val="Bibliography"/>
       </w:pPr>
       <w:r>
-        <w:t xml:space="preserve">19. P. </w:t>
-      </w:r>
-      <w:proofErr w:type="spellStart"/>
-      <w:r>
-        <w:t>Bajger</w:t>
-      </w:r>
-      <w:proofErr w:type="spellEnd"/>
-      <w:r>
-        <w:t xml:space="preserve">, J. M. A. </w:t>
-      </w:r>
-      <w:proofErr w:type="spellStart"/>
-      <w:r>
-        <w:t>Ashbourn</w:t>
-      </w:r>
-      <w:proofErr w:type="spellEnd"/>
-      <w:r>
-        <w:t xml:space="preserve">, V. Manhas, Y. Guyot, K. Lietaert, and L. Geris, “Mathematical Modelling of the Degradation </w:t>
-      </w:r>
-      <w:proofErr w:type="spellStart"/>
-      <w:r>
-        <w:t>Behaviour</w:t>
-      </w:r>
-      <w:proofErr w:type="spellEnd"/>
-      <w:r>
-        <w:t xml:space="preserve"> of Biodegradable Metals,” </w:t>
+        <w:t xml:space="preserve">22. A. P. Yadav, A. Nishikata, and T. Tsuru, “Oxygen Reduction Mechanism on Corroded Zinc,” </w:t>
       </w:r>
       <w:r>
         <w:rPr>
           <w:i/>
           <w:iCs/>
         </w:rPr>
-        <w:t>Biomechanics and Modeling in Mechanobiology</w:t>
+        <w:t>Journal of Electroanalytical Chemistry</w:t>
       </w:r>
       <w:r>
         <w:t xml:space="preserve"> </w:t>
@@ -21666,10 +21416,10 @@
           <w:i/>
           <w:iCs/>
         </w:rPr>
-        <w:t>16</w:t>
-      </w:r>
-      <w:r>
-        <w:t>, no. 1 (2017): 227–238, https://doi.org/10.1007/s10237-016-0812-3.</w:t>
+        <w:t>585</w:t>
+      </w:r>
+      <w:r>
+        <w:t>, no. 1 (2005): 142–149, https://doi.org/10.1016/j.jelechem.2005.08.007.</w:t>
       </w:r>
     </w:p>
     <w:p>
@@ -21677,22 +21427,14 @@
         <w:pStyle w:val="Bibliography"/>
       </w:pPr>
       <w:r>
-        <w:t xml:space="preserve">20. S. Thomas, N. V. </w:t>
-      </w:r>
-      <w:proofErr w:type="spellStart"/>
-      <w:r>
-        <w:t>Medhekar</w:t>
-      </w:r>
-      <w:proofErr w:type="spellEnd"/>
-      <w:r>
-        <w:t xml:space="preserve">, G. S. Frankel, and N. Birbilis, “Corrosion Mechanism and Hydrogen Evolution on Mg,” </w:t>
+        <w:t xml:space="preserve">23. C. Chen, M. Hofmann, and T. Wallmersperger, “Modeling the Uniform Corrosion Behavior of Zinc in Salt Spray Testing,” </w:t>
       </w:r>
       <w:r>
         <w:rPr>
           <w:i/>
           <w:iCs/>
         </w:rPr>
-        <w:t>Current Opinion in Solid State and Materials Science</w:t>
+        <w:t>npj Materials Degradation</w:t>
       </w:r>
       <w:r>
         <w:t xml:space="preserve"> </w:t>
@@ -21702,10 +21444,10 @@
           <w:i/>
           <w:iCs/>
         </w:rPr>
-        <w:t>19</w:t>
-      </w:r>
-      <w:r>
-        <w:t>, no. 2 (2015): 85–94, https://doi.org/10.1016/j.cossms.2014.09.005.</w:t>
+        <w:t>10</w:t>
+      </w:r>
+      <w:r>
+        <w:t>, no. 1 (2026): 37, https://doi.org/10.1038/s41529-026-00749-0.</w:t>
       </w:r>
     </w:p>
     <w:p>
@@ -21713,14 +21455,14 @@
         <w:pStyle w:val="Bibliography"/>
       </w:pPr>
       <w:r>
-        <w:t xml:space="preserve">21. D. Zhang, L. Zhang, X. Zhang, et al., “Comparative Investigation of the Corrosion Behavior of Biomedical Zinc Alloys in Oxygen-Enriched Simulated Body Fluid Environments,” </w:t>
+        <w:t xml:space="preserve">24. V. A. Bryzgalov, A. A. Kistanov, A. A. Izosimov, and E. A. Korznikova, “Atomic-Scale Study of Lattice Distortion and Oxygen-Rich Environment Impact on the Surface Degradation Dynamics of Zinc-Based Alloys,” </w:t>
       </w:r>
       <w:r>
         <w:rPr>
           <w:i/>
           <w:iCs/>
         </w:rPr>
-        <w:t>Materials Today Communications</w:t>
+        <w:t>Computational Materials Science</w:t>
       </w:r>
       <w:r>
         <w:t xml:space="preserve"> </w:t>
@@ -21730,10 +21472,10 @@
           <w:i/>
           <w:iCs/>
         </w:rPr>
-        <w:t>39</w:t>
-      </w:r>
-      <w:r>
-        <w:t xml:space="preserve"> (2024): 108811, https://doi.org/10.1016/j.mtcomm.2024.108811.</w:t>
+        <w:t>252</w:t>
+      </w:r>
+      <w:r>
+        <w:t xml:space="preserve"> (2025): 113797, https://doi.org/10.1016/j.commatsci.2025.113797.</w:t>
       </w:r>
     </w:p>
     <w:p>
@@ -21741,22 +21483,14 @@
         <w:pStyle w:val="Bibliography"/>
       </w:pPr>
       <w:r>
-        <w:t xml:space="preserve">22. A. P. Yadav, A. </w:t>
-      </w:r>
-      <w:proofErr w:type="spellStart"/>
-      <w:r>
-        <w:t>Nishikata</w:t>
-      </w:r>
-      <w:proofErr w:type="spellEnd"/>
-      <w:r>
-        <w:t xml:space="preserve">, and T. Tsuru, “Oxygen Reduction Mechanism on Corroded Zinc,” </w:t>
+        <w:t xml:space="preserve">25. T. AlBaraghtheh, R. Willumeit‐Römer, and B. Zeller‐Plumhoff, “Best Practices in Developing a Workflow for Uncertainty Quantification for Modeling the Biodegradation of Mg‐Based Implants,” </w:t>
       </w:r>
       <w:r>
         <w:rPr>
           <w:i/>
           <w:iCs/>
         </w:rPr>
-        <w:t>Journal of Electroanalytical Chemistry</w:t>
+        <w:t>Advanced Science</w:t>
       </w:r>
       <w:r>
         <w:t xml:space="preserve"> </w:t>
@@ -21766,10 +21500,10 @@
           <w:i/>
           <w:iCs/>
         </w:rPr>
-        <w:t>585</w:t>
-      </w:r>
-      <w:r>
-        <w:t>, no. 1 (2005): 142–149, https://doi.org/10.1016/j.jelechem.2005.08.007.</w:t>
+        <w:t>11</w:t>
+      </w:r>
+      <w:r>
+        <w:t>, no. 46 (2024): 2403543, https://doi.org/10.1002/advs.202403543.</w:t>
       </w:r>
     </w:p>
     <w:p>
@@ -21777,44 +21511,55 @@
         <w:pStyle w:val="Bibliography"/>
       </w:pPr>
       <w:r>
-        <w:t xml:space="preserve">23. C. Chen, M. Hofmann, and T. </w:t>
-      </w:r>
-      <w:proofErr w:type="spellStart"/>
-      <w:r>
-        <w:t>Wallmersperger</w:t>
-      </w:r>
-      <w:proofErr w:type="spellEnd"/>
-      <w:r>
-        <w:t xml:space="preserve">, “Modeling the Uniform Corrosion Behavior of Zinc in Salt Spray Testing,” </w:t>
-      </w:r>
-      <w:proofErr w:type="spellStart"/>
+        <w:t xml:space="preserve">26. S. Huang, W. Wu, Y. Su, L. Qiao, and Y. Yan, “Insight into the Corrosion Behaviour and Degradation Mechanism of Pure Zinc in Simulated Body Fluid,” </w:t>
+      </w:r>
       <w:r>
         <w:rPr>
           <w:i/>
           <w:iCs/>
         </w:rPr>
-        <w:t>npj</w:t>
-      </w:r>
-      <w:proofErr w:type="spellEnd"/>
+        <w:t>Corrosion Science</w:t>
+      </w:r>
+      <w:r>
+        <w:t xml:space="preserve"> </w:t>
+      </w:r>
       <w:r>
         <w:rPr>
           <w:i/>
           <w:iCs/>
         </w:rPr>
-        <w:t xml:space="preserve"> Materials Degradation</w:t>
-      </w:r>
-      <w:r>
-        <w:t xml:space="preserve"> </w:t>
+        <w:t>178</w:t>
+      </w:r>
+      <w:r>
+        <w:t xml:space="preserve"> (2021): 109071, https://doi.org/10.1016/j.corsci.2020.109071.</w:t>
+      </w:r>
+    </w:p>
+    <w:p>
+      <w:pPr>
+        <w:pStyle w:val="Bibliography"/>
+      </w:pPr>
+      <w:r>
+        <w:t xml:space="preserve">27. X. Liu, H. Yang, Y. Liu, et al., “Comparative Studies on Degradation Behavior of Pure Zinc in Various Simulated Body Fluids,” </w:t>
       </w:r>
       <w:r>
         <w:rPr>
           <w:i/>
           <w:iCs/>
         </w:rPr>
-        <w:t>10</w:t>
-      </w:r>
-      <w:r>
-        <w:t>, no. 1 (2026): 37, https://doi.org/10.1038/s41529-026-00749-0.</w:t>
+        <w:t>JOM</w:t>
+      </w:r>
+      <w:r>
+        <w:t xml:space="preserve"> </w:t>
+      </w:r>
+      <w:r>
+        <w:rPr>
+          <w:i/>
+          <w:iCs/>
+        </w:rPr>
+        <w:t>71</w:t>
+      </w:r>
+      <w:r>
+        <w:t>, no. 4 (2019): 1414–1425, https://doi.org/10.1007/s11837-019-03357-3.</w:t>
       </w:r>
     </w:p>
     <w:p>
@@ -21822,22 +21567,14 @@
         <w:pStyle w:val="Bibliography"/>
       </w:pPr>
       <w:r>
-        <w:t xml:space="preserve">24. V. A. Bryzgalov, A. A. Kistanov, A. A. Izosimov, and E. A. </w:t>
-      </w:r>
-      <w:proofErr w:type="spellStart"/>
-      <w:r>
-        <w:t>Korznikova</w:t>
-      </w:r>
-      <w:proofErr w:type="spellEnd"/>
-      <w:r>
-        <w:t xml:space="preserve">, “Atomic-Scale Study of Lattice Distortion and Oxygen-Rich Environment Impact on the Surface Degradation Dynamics of Zinc-Based Alloys,” </w:t>
+        <w:t xml:space="preserve">28. M. E. McMahon, R. J. Santucci, and J. R. Scully, “Advanced Chemical Stability Diagrams to Predict the Formation of Complex Zinc Compounds in a Chloride Environment,” </w:t>
       </w:r>
       <w:r>
         <w:rPr>
           <w:i/>
           <w:iCs/>
         </w:rPr>
-        <w:t>Computational Materials Science</w:t>
+        <w:t>RSC Advances</w:t>
       </w:r>
       <w:r>
         <w:t xml:space="preserve"> </w:t>
@@ -21847,10 +21584,10 @@
           <w:i/>
           <w:iCs/>
         </w:rPr>
-        <w:t>252</w:t>
-      </w:r>
-      <w:r>
-        <w:t xml:space="preserve"> (2025): 113797, https://doi.org/10.1016/j.commatsci.2025.113797.</w:t>
+        <w:t>9</w:t>
+      </w:r>
+      <w:r>
+        <w:t>, no. 35 (2019): 19905–19916, https://doi.org/10.1039/C9RA00228F.</w:t>
       </w:r>
     </w:p>
     <w:p>
@@ -21858,30 +21595,14 @@
         <w:pStyle w:val="Bibliography"/>
       </w:pPr>
       <w:r>
-        <w:t xml:space="preserve">25. T. </w:t>
-      </w:r>
-      <w:proofErr w:type="spellStart"/>
-      <w:r>
-        <w:t>AlBaraghtheh</w:t>
-      </w:r>
-      <w:proofErr w:type="spellEnd"/>
-      <w:r>
-        <w:t xml:space="preserve">, R. </w:t>
-      </w:r>
-      <w:proofErr w:type="spellStart"/>
-      <w:r>
-        <w:t>Willumeit</w:t>
-      </w:r>
-      <w:proofErr w:type="spellEnd"/>
-      <w:r>
-        <w:t xml:space="preserve">‐Römer, and B. Zeller‐Plumhoff, “Best Practices in Developing a Workflow for Uncertainty Quantification for Modeling the Biodegradation of Mg‐Based Implants,” </w:t>
+        <w:t xml:space="preserve">29. P. K. Bowen, J. Drelich, and J. Goldman, “Zinc Exhibits Ideal Physiological Corrosion Behavior for Bioabsorbable Stents,” </w:t>
       </w:r>
       <w:r>
         <w:rPr>
           <w:i/>
           <w:iCs/>
         </w:rPr>
-        <w:t>Advanced Science</w:t>
+        <w:t>Advanced Materials</w:t>
       </w:r>
       <w:r>
         <w:t xml:space="preserve"> </w:t>
@@ -21891,10 +21612,10 @@
           <w:i/>
           <w:iCs/>
         </w:rPr>
-        <w:t>11</w:t>
-      </w:r>
-      <w:r>
-        <w:t>, no. 46 (2024): 2403543, https://doi.org/10.1002/advs.202403543.</w:t>
+        <w:t>25</w:t>
+      </w:r>
+      <w:r>
+        <w:t>, no. 18 (2013): 2577–2582, https://doi.org/10.1002/adma.201300226.</w:t>
       </w:r>
     </w:p>
     <w:p>
@@ -21902,15 +21623,7 @@
         <w:pStyle w:val="Bibliography"/>
       </w:pPr>
       <w:r>
-        <w:t xml:space="preserve">26. S. Huang, W. Wu, Y. Su, L. Qiao, and Y. Yan, “Insight into the Corrosion </w:t>
-      </w:r>
-      <w:proofErr w:type="spellStart"/>
-      <w:r>
-        <w:t>Behaviour</w:t>
-      </w:r>
-      <w:proofErr w:type="spellEnd"/>
-      <w:r>
-        <w:t xml:space="preserve"> and Degradation Mechanism of Pure Zinc in Simulated Body Fluid,” </w:t>
+        <w:t xml:space="preserve">30. R. M. Katona, J. Taylor, and R. F. Schaller, “Validating Corrosion Models: A Comparison of Governing Equations,” </w:t>
       </w:r>
       <w:r>
         <w:rPr>
@@ -21927,10 +21640,10 @@
           <w:i/>
           <w:iCs/>
         </w:rPr>
-        <w:t>178</w:t>
-      </w:r>
-      <w:r>
-        <w:t xml:space="preserve"> (2021): 109071, https://doi.org/10.1016/j.corsci.2020.109071.</w:t>
+        <w:t>259</w:t>
+      </w:r>
+      <w:r>
+        <w:t xml:space="preserve"> (2026): 113495, https://doi.org/10.1016/j.corsci.2025.113495.</w:t>
       </w:r>
     </w:p>
     <w:p>
@@ -21938,27 +21651,25 @@
         <w:pStyle w:val="Bibliography"/>
       </w:pPr>
       <w:r>
-        <w:t xml:space="preserve">27. X. Liu, H. Yang, Y. Liu, et al., “Comparative Studies on Degradation Behavior of Pure Zinc in Various Simulated Body Fluids,” </w:t>
+        <w:t xml:space="preserve">31. P. Grathwohl, “Diffusion in Natural Porous Media: Contaminant Transport, Sorption/Desorption and Dissolution Kinetics,” </w:t>
       </w:r>
       <w:r>
         <w:rPr>
           <w:i/>
           <w:iCs/>
         </w:rPr>
-        <w:t>JOM</w:t>
-      </w:r>
-      <w:r>
-        <w:t xml:space="preserve"> </w:t>
+        <w:t xml:space="preserve">Diffusion in Natural Porous Media: </w:t>
       </w:r>
       <w:r>
         <w:rPr>
           <w:i/>
           <w:iCs/>
         </w:rPr>
-        <w:t>71</w:t>
-      </w:r>
-      <w:r>
-        <w:t>, no. 4 (2019): 1414–1425, https://doi.org/10.1007/s11837-019-03357-3.</w:t>
+        <w:lastRenderedPageBreak/>
+        <w:t>Contaminant Transport, Sorption/Desorption and Dissolution Kinetics</w:t>
+      </w:r>
+      <w:r>
+        <w:t>, Springer: Boston, MA 1998, https://doi.org/10.1007/978-1-4615-5683-1.</w:t>
       </w:r>
     </w:p>
     <w:p>
@@ -21966,14 +21677,14 @@
         <w:pStyle w:val="Bibliography"/>
       </w:pPr>
       <w:r>
-        <w:t xml:space="preserve">28. M. E. McMahon, R. J. Santucci, and J. R. Scully, “Advanced Chemical Stability Diagrams to Predict the Formation of Complex Zinc Compounds in a Chloride Environment,” </w:t>
+        <w:t xml:space="preserve">32. J. W. Wilder, C. Clemons, D. Golovaty, K. L. Kreider, G. W. Young, and R. S. Lillard, “An Adaptive Level Set Approach for Modeling Damage Due to Galvanic Corrosion,” </w:t>
       </w:r>
       <w:r>
         <w:rPr>
           <w:i/>
           <w:iCs/>
         </w:rPr>
-        <w:t>RSC Advances</w:t>
+        <w:t>Journal of Engineering Mathematics</w:t>
       </w:r>
       <w:r>
         <w:t xml:space="preserve"> </w:t>
@@ -21983,10 +21694,10 @@
           <w:i/>
           <w:iCs/>
         </w:rPr>
-        <w:t>9</w:t>
-      </w:r>
-      <w:r>
-        <w:t>, no. 35 (2019): 19905–19916, https://doi.org/10.1039/C9RA00228F.</w:t>
+        <w:t>91</w:t>
+      </w:r>
+      <w:r>
+        <w:t>, no. 1 (2015): 121–142, https://doi.org/10.1007/s10665-014-9732-3.</w:t>
       </w:r>
     </w:p>
     <w:p>
@@ -21994,14 +21705,14 @@
         <w:pStyle w:val="Bibliography"/>
       </w:pPr>
       <w:r>
-        <w:t xml:space="preserve">29. P. K. Bowen, J. Drelich, and J. Goldman, “Zinc Exhibits Ideal Physiological Corrosion Behavior for Bioabsorbable Stents,” </w:t>
+        <w:t xml:space="preserve">33. J. A. Grogan, S. B. Leen, and P. E. McHugh, “A Physical Corrosion Model for Bioabsorbable Metal Stents,” </w:t>
       </w:r>
       <w:r>
         <w:rPr>
           <w:i/>
           <w:iCs/>
         </w:rPr>
-        <w:t>Advanced Materials</w:t>
+        <w:t>Acta Biomaterialia</w:t>
       </w:r>
       <w:r>
         <w:t xml:space="preserve"> </w:t>
@@ -22011,10 +21722,10 @@
           <w:i/>
           <w:iCs/>
         </w:rPr>
-        <w:t>25</w:t>
-      </w:r>
-      <w:r>
-        <w:t>, no. 18 (2013): 2577–2582, https://doi.org/10.1002/adma.201300226.</w:t>
+        <w:t>10</w:t>
+      </w:r>
+      <w:r>
+        <w:t>, no. 5 (2014): 2313–2322, https://doi.org/10.1016/j.actbio.2013.12.059.</w:t>
       </w:r>
     </w:p>
     <w:p>
@@ -22022,27 +21733,35 @@
         <w:pStyle w:val="Bibliography"/>
       </w:pPr>
       <w:r>
-        <w:t xml:space="preserve">30. R. M. Katona, J. Taylor, and R. F. Schaller, “Validating Corrosion Models: A Comparison of Governing Equations,” </w:t>
+        <w:t xml:space="preserve">34. J. R. Rumble, Ed., “CRC Handbook of Chemistry and Physics,” </w:t>
       </w:r>
       <w:r>
         <w:rPr>
           <w:i/>
           <w:iCs/>
         </w:rPr>
-        <w:t>Corrosion Science</w:t>
-      </w:r>
-      <w:r>
-        <w:t xml:space="preserve"> </w:t>
+        <w:t>CRC handbook of chemistry and physics</w:t>
+      </w:r>
+      <w:r>
+        <w:t>, 98th edition 2017-2018., CRC Press, Taylor &amp; Francis Group: Boca Raton London New York 2017.</w:t>
+      </w:r>
+    </w:p>
+    <w:p>
+      <w:pPr>
+        <w:pStyle w:val="Bibliography"/>
+      </w:pPr>
+      <w:r>
+        <w:t xml:space="preserve">35. D. R. Lide, Ed., “CRC Handbook of Chemistry and Physics,” </w:t>
       </w:r>
       <w:r>
         <w:rPr>
           <w:i/>
           <w:iCs/>
         </w:rPr>
-        <w:t>259</w:t>
-      </w:r>
-      <w:r>
-        <w:t xml:space="preserve"> (2026): 113495, https://doi.org/10.1016/j.corsci.2025.113495.</w:t>
+        <w:t>CRC handbook of chemistry and physics</w:t>
+      </w:r>
+      <w:r>
+        <w:t>, 72nd ed., CRC Press: Boca Raton 1991.</w:t>
       </w:r>
     </w:p>
     <w:p>
@@ -22050,25 +21769,103 @@
         <w:pStyle w:val="Bibliography"/>
       </w:pPr>
       <w:r>
-        <w:t xml:space="preserve">31. P. Grathwohl, “Diffusion in Natural Porous Media: Contaminant Transport, Sorption/Desorption and Dissolution Kinetics,” </w:t>
+        <w:t>36. P. Han, and D. M. Bartels, “</w:t>
+      </w:r>
+      <w:r>
+        <w:rPr>
+          <w:b/>
+          <w:bCs/>
+        </w:rPr>
+        <w:t>Temperature Dependence of Oxygen Diffusion in</w:t>
+      </w:r>
+      <w:r>
+        <w:t xml:space="preserve"> </w:t>
+      </w:r>
+      <w:r>
+        <w:rPr>
+          <w:b/>
+          <w:bCs/>
+        </w:rPr>
+        <w:t>H</w:t>
+      </w:r>
+      <w:r>
+        <w:t xml:space="preserve"> </w:t>
+      </w:r>
+      <w:r>
+        <w:rPr>
+          <w:b/>
+          <w:bCs/>
+          <w:vertAlign w:val="subscript"/>
+        </w:rPr>
+        <w:t>2</w:t>
+      </w:r>
+      <w:r>
+        <w:rPr>
+          <w:b/>
+          <w:bCs/>
+        </w:rPr>
+        <w:t xml:space="preserve"> </w:t>
+      </w:r>
+      <w:r>
+        <w:t xml:space="preserve"> </w:t>
+      </w:r>
+      <w:r>
+        <w:rPr>
+          <w:b/>
+          <w:bCs/>
+        </w:rPr>
+        <w:t>O and D</w:t>
+      </w:r>
+      <w:r>
+        <w:t xml:space="preserve"> </w:t>
+      </w:r>
+      <w:r>
+        <w:rPr>
+          <w:b/>
+          <w:bCs/>
+          <w:vertAlign w:val="subscript"/>
+        </w:rPr>
+        <w:t>2</w:t>
+      </w:r>
+      <w:r>
+        <w:rPr>
+          <w:b/>
+          <w:bCs/>
+        </w:rPr>
+        <w:t xml:space="preserve"> </w:t>
+      </w:r>
+      <w:r>
+        <w:t xml:space="preserve"> </w:t>
+      </w:r>
+      <w:r>
+        <w:rPr>
+          <w:b/>
+          <w:bCs/>
+        </w:rPr>
+        <w:t>O</w:t>
+      </w:r>
+      <w:r>
+        <w:t xml:space="preserve">,” </w:t>
       </w:r>
       <w:r>
         <w:rPr>
           <w:i/>
           <w:iCs/>
         </w:rPr>
-        <w:t xml:space="preserve">Diffusion in Natural Porous Media: </w:t>
+        <w:t>The Journal of Physical Chemistry</w:t>
+      </w:r>
+      <w:r>
+        <w:t xml:space="preserve"> </w:t>
       </w:r>
       <w:r>
         <w:rPr>
           <w:i/>
           <w:iCs/>
         </w:rPr>
-        <w:lastRenderedPageBreak/>
-        <w:t>Contaminant Transport, Sorption/Desorption and Dissolution Kinetics</w:t>
-      </w:r>
-      <w:r>
-        <w:t>, Springer: Boston, MA 1998, https://doi.org/10.1007/978-1-4615-5683-1.</w:t>
+        <w:t>100</w:t>
+      </w:r>
+      <w:r>
+        <w:t>, no. 13 (1996): 5597–5602, https://doi.org/10.1021/jp952903y.</w:t>
       </w:r>
     </w:p>
     <w:p>
@@ -22076,22 +21873,14 @@
         <w:pStyle w:val="Bibliography"/>
       </w:pPr>
       <w:r>
-        <w:t xml:space="preserve">32. J. W. Wilder, C. Clemons, D. </w:t>
-      </w:r>
-      <w:proofErr w:type="spellStart"/>
-      <w:r>
-        <w:t>Golovaty</w:t>
-      </w:r>
-      <w:proofErr w:type="spellEnd"/>
-      <w:r>
-        <w:t xml:space="preserve">, K. L. Kreider, G. W. Young, and R. S. Lillard, “An Adaptive Level Set Approach for Modeling Damage Due to Galvanic Corrosion,” </w:t>
+        <w:t xml:space="preserve">37. S.-Y. Park, S.-H. Rho, H.-S. Lee, K.-M. Kim, and H.-C. Lee, “Fabrication of Highly Porous and Pure Zinc Oxide Films Using Modified DC Magnetron Sputtering and Post-Oxidation,” </w:t>
       </w:r>
       <w:r>
         <w:rPr>
           <w:i/>
           <w:iCs/>
         </w:rPr>
-        <w:t>Journal of Engineering Mathematics</w:t>
+        <w:t>Materials</w:t>
       </w:r>
       <w:r>
         <w:t xml:space="preserve"> </w:t>
@@ -22101,10 +21890,10 @@
           <w:i/>
           <w:iCs/>
         </w:rPr>
-        <w:t>91</w:t>
-      </w:r>
-      <w:r>
-        <w:t>, no. 1 (2015): 121–142, https://doi.org/10.1007/s10665-014-9732-3.</w:t>
+        <w:t>14</w:t>
+      </w:r>
+      <w:r>
+        <w:t>, no. 20 (2021): 6112, https://doi.org/10.3390/ma14206112.</w:t>
       </w:r>
     </w:p>
     <w:p>
@@ -22112,24 +21901,33 @@
         <w:pStyle w:val="Bibliography"/>
       </w:pPr>
       <w:r>
-        <w:t xml:space="preserve">33. J. A. Grogan, S. B. Leen, and P. E. McHugh, “A Physical Corrosion Model for Bioabsorbable Metal Stents,” </w:t>
+        <w:t xml:space="preserve">38. L. Holzer, P. Marmet, M. Fingerle, A. Wiegmann, M. Neumann, and V. Schmidt, “Tortuosity-Porosity Relationships: Review of Empirical Data from Literature,” in </w:t>
       </w:r>
       <w:r>
         <w:rPr>
           <w:i/>
           <w:iCs/>
         </w:rPr>
-        <w:t xml:space="preserve">Acta </w:t>
-      </w:r>
-      <w:proofErr w:type="spellStart"/>
+        <w:t>Tortuosity and Microstructure Effects in Porous Media</w:t>
+      </w:r>
+      <w:r>
+        <w:t>, Vol. 333, Springer International Publishing: Cham 2023, pp. 51–89, https://doi.org/10.1007/978-3-031-30477-4_3.</w:t>
+      </w:r>
+    </w:p>
+    <w:p>
+      <w:pPr>
+        <w:pStyle w:val="Bibliography"/>
+      </w:pPr>
+      <w:r>
+        <w:t xml:space="preserve">39. K. Chen, X. Gu, H. Sun, et al., “Fluid-Induced Corrosion Behavior of Degradable Zinc for Stent Application,” </w:t>
+      </w:r>
       <w:r>
         <w:rPr>
           <w:i/>
           <w:iCs/>
         </w:rPr>
-        <w:t>Biomaterialia</w:t>
-      </w:r>
-      <w:proofErr w:type="spellEnd"/>
+        <w:t>Journal of Materials Science &amp; Technology</w:t>
+      </w:r>
       <w:r>
         <w:t xml:space="preserve"> </w:t>
       </w:r>
@@ -22138,10 +21936,10 @@
           <w:i/>
           <w:iCs/>
         </w:rPr>
-        <w:t>10</w:t>
-      </w:r>
-      <w:r>
-        <w:t>, no. 5 (2014): 2313–2322, https://doi.org/10.1016/j.actbio.2013.12.059.</w:t>
+        <w:t>91</w:t>
+      </w:r>
+      <w:r>
+        <w:t xml:space="preserve"> (2021): 134–147, https://doi.org/10.1016/j.jmst.2021.02.050.</w:t>
       </w:r>
     </w:p>
     <w:p>
@@ -22149,17 +21947,27 @@
         <w:pStyle w:val="Bibliography"/>
       </w:pPr>
       <w:r>
-        <w:t xml:space="preserve">34. J. R. Rumble, Ed., “CRC Handbook of Chemistry and Physics,” </w:t>
+        <w:t xml:space="preserve">40. J. Tkacz, K. Slouková, J. Minda, et al., “Influence of the Composition of the Hank’s Balanced Salt Solution on the Corrosion Behavior of AZ31 and AZ61 Magnesium Alloys,” </w:t>
       </w:r>
       <w:r>
         <w:rPr>
           <w:i/>
           <w:iCs/>
         </w:rPr>
-        <w:t>CRC handbook of chemistry and physics</w:t>
-      </w:r>
-      <w:r>
-        <w:t>, 98th edition 2017-2018., CRC Press, Taylor &amp; Francis Group: Boca Raton London New York 2017.</w:t>
+        <w:t>Metals</w:t>
+      </w:r>
+      <w:r>
+        <w:t xml:space="preserve"> </w:t>
+      </w:r>
+      <w:r>
+        <w:rPr>
+          <w:i/>
+          <w:iCs/>
+        </w:rPr>
+        <w:t>7</w:t>
+      </w:r>
+      <w:r>
+        <w:t>, no. 11 (2017): 465, https://doi.org/10.3390/met7110465.</w:t>
       </w:r>
     </w:p>
     <w:p>
@@ -22167,17 +21975,27 @@
         <w:pStyle w:val="Bibliography"/>
       </w:pPr>
       <w:r>
-        <w:t xml:space="preserve">35. D. R. Lide, Ed., “CRC Handbook of Chemistry and Physics,” </w:t>
+        <w:t xml:space="preserve">41. T. Kokubo, and H. Takadama, “How Useful Is SBF in Predicting in Vivo Bone Bioactivity?,” </w:t>
       </w:r>
       <w:r>
         <w:rPr>
           <w:i/>
           <w:iCs/>
         </w:rPr>
-        <w:t>CRC handbook of chemistry and physics</w:t>
-      </w:r>
-      <w:r>
-        <w:t>, 72nd ed., CRC Press: Boca Raton 1991.</w:t>
+        <w:t>Biomaterials</w:t>
+      </w:r>
+      <w:r>
+        <w:t xml:space="preserve"> </w:t>
+      </w:r>
+      <w:r>
+        <w:rPr>
+          <w:i/>
+          <w:iCs/>
+        </w:rPr>
+        <w:t>27</w:t>
+      </w:r>
+      <w:r>
+        <w:t>, no. 15 (2006): 2907–2915, https://doi.org/10.1016/j.biomaterials.2006.01.017.</w:t>
       </w:r>
     </w:p>
     <w:p>
@@ -22185,101 +22003,14 @@
         <w:pStyle w:val="Bibliography"/>
       </w:pPr>
       <w:r>
-        <w:t>36. P. Han, and D. M. Bartels, “</w:t>
-      </w:r>
-      <w:r>
-        <w:rPr>
-          <w:b/>
-          <w:bCs/>
-        </w:rPr>
-        <w:t>Temperature Dependence of Oxygen Diffusion in</w:t>
-      </w:r>
-      <w:r>
-        <w:t xml:space="preserve"> </w:t>
-      </w:r>
-      <w:r>
-        <w:rPr>
-          <w:b/>
-          <w:bCs/>
-        </w:rPr>
-        <w:t>H</w:t>
-      </w:r>
-      <w:r>
-        <w:t xml:space="preserve"> </w:t>
-      </w:r>
-      <w:proofErr w:type="gramStart"/>
-      <w:r>
-        <w:rPr>
-          <w:b/>
-          <w:bCs/>
-          <w:vertAlign w:val="subscript"/>
-        </w:rPr>
-        <w:t>2</w:t>
-      </w:r>
-      <w:r>
-        <w:rPr>
-          <w:b/>
-          <w:bCs/>
-        </w:rPr>
-        <w:t xml:space="preserve"> </w:t>
-      </w:r>
-      <w:r>
-        <w:t xml:space="preserve"> </w:t>
-      </w:r>
-      <w:r>
-        <w:rPr>
-          <w:b/>
-          <w:bCs/>
-        </w:rPr>
-        <w:t>O</w:t>
-      </w:r>
-      <w:proofErr w:type="gramEnd"/>
-      <w:r>
-        <w:rPr>
-          <w:b/>
-          <w:bCs/>
-        </w:rPr>
-        <w:t xml:space="preserve"> and D</w:t>
-      </w:r>
-      <w:r>
-        <w:t xml:space="preserve"> </w:t>
-      </w:r>
-      <w:proofErr w:type="gramStart"/>
-      <w:r>
-        <w:rPr>
-          <w:b/>
-          <w:bCs/>
-          <w:vertAlign w:val="subscript"/>
-        </w:rPr>
-        <w:t>2</w:t>
-      </w:r>
-      <w:r>
-        <w:rPr>
-          <w:b/>
-          <w:bCs/>
-        </w:rPr>
-        <w:t xml:space="preserve"> </w:t>
-      </w:r>
-      <w:r>
-        <w:t xml:space="preserve"> </w:t>
-      </w:r>
-      <w:r>
-        <w:rPr>
-          <w:b/>
-          <w:bCs/>
-        </w:rPr>
-        <w:t>O</w:t>
-      </w:r>
-      <w:proofErr w:type="gramEnd"/>
-      <w:r>
-        <w:t xml:space="preserve">,” </w:t>
+        <w:t xml:space="preserve">42. L. Liu, Y. Meng, C. Dong, Y. Yan, A. A. Volinsky, and L.-N. Wang, “Initial Formation of Corrosion Products on Pure Zinc in Simulated Body Fluid,” </w:t>
       </w:r>
       <w:r>
         <w:rPr>
           <w:i/>
           <w:iCs/>
         </w:rPr>
-        <w:t>The Journal of Physical Chemistry</w:t>
+        <w:t>Journal of Materials Science &amp; Technology</w:t>
       </w:r>
       <w:r>
         <w:t xml:space="preserve"> </w:t>
@@ -22289,10 +22020,10 @@
           <w:i/>
           <w:iCs/>
         </w:rPr>
-        <w:t>100</w:t>
-      </w:r>
-      <w:r>
-        <w:t>, no. 13 (1996): 5597–5602, https://doi.org/10.1021/jp952903y.</w:t>
+        <w:t>34</w:t>
+      </w:r>
+      <w:r>
+        <w:t>, no. 12 (2018): 2271–2282, https://doi.org/10.1016/j.jmst.2018.05.005.</w:t>
       </w:r>
     </w:p>
     <w:p>
@@ -22300,14 +22031,14 @@
         <w:pStyle w:val="Bibliography"/>
       </w:pPr>
       <w:r>
-        <w:t xml:space="preserve">37. S.-Y. Park, S.-H. Rho, H.-S. Lee, K.-M. Kim, and H.-C. Lee, “Fabrication of Highly Porous and Pure Zinc Oxide Films Using Modified DC Magnetron Sputtering and Post-Oxidation,” </w:t>
+        <w:t xml:space="preserve">43. E. Mostaed, M. Sikora-Jasinska, J. W. Drelich, and M. Vedani, “Zinc-Based Alloys for Degradable Vascular Stent Applications,” </w:t>
       </w:r>
       <w:r>
         <w:rPr>
           <w:i/>
           <w:iCs/>
         </w:rPr>
-        <w:t>Materials</w:t>
+        <w:t>Acta Biomaterialia</w:t>
       </w:r>
       <w:r>
         <w:t xml:space="preserve"> </w:t>
@@ -22317,10 +22048,10 @@
           <w:i/>
           <w:iCs/>
         </w:rPr>
-        <w:t>14</w:t>
-      </w:r>
-      <w:r>
-        <w:t>, no. 20 (2021): 6112, https://doi.org/10.3390/ma14206112.</w:t>
+        <w:t>71</w:t>
+      </w:r>
+      <w:r>
+        <w:t xml:space="preserve"> (2018): 1–23, https://doi.org/10.1016/j.actbio.2018.03.005.</w:t>
       </w:r>
     </w:p>
     <w:p>
@@ -22328,17 +22059,27 @@
         <w:pStyle w:val="Bibliography"/>
       </w:pPr>
       <w:r>
-        <w:t xml:space="preserve">38. L. Holzer, P. Marmet, M. Fingerle, A. Wiegmann, M. Neumann, and V. Schmidt, “Tortuosity-Porosity Relationships: Review of Empirical Data from Literature,” in </w:t>
+        <w:t xml:space="preserve">44. Y. Meng, L. Liu, D. Zhang, et al., “Initial Formation of Corrosion Products on Pure Zinc in Saline Solution,” </w:t>
       </w:r>
       <w:r>
         <w:rPr>
           <w:i/>
           <w:iCs/>
         </w:rPr>
-        <w:t>Tortuosity and Microstructure Effects in Porous Media</w:t>
-      </w:r>
-      <w:r>
-        <w:t>, Vol. 333, Springer International Publishing: Cham 2023, pp. 51–89, https://doi.org/10.1007/978-3-031-30477-4_3.</w:t>
+        <w:t>Bioactive Materials</w:t>
+      </w:r>
+      <w:r>
+        <w:t xml:space="preserve"> </w:t>
+      </w:r>
+      <w:r>
+        <w:rPr>
+          <w:i/>
+          <w:iCs/>
+        </w:rPr>
+        <w:t>4</w:t>
+      </w:r>
+      <w:r>
+        <w:t xml:space="preserve"> (2019): 87–96, https://doi.org/10.1016/j.bioactmat.2018.08.003.</w:t>
       </w:r>
     </w:p>
     <w:p>
@@ -22346,14 +22087,14 @@
         <w:pStyle w:val="Bibliography"/>
       </w:pPr>
       <w:r>
-        <w:t xml:space="preserve">39. K. Chen, X. Gu, H. Sun, et al., “Fluid-Induced Corrosion Behavior of Degradable Zinc for Stent Application,” </w:t>
+        <w:t xml:space="preserve">45. Y. Li, J. Wang, K. Sheng, et al., “Optimizing Structural Design on Biodegradable Magnesium Alloy Vascular Stent for Reducing Strut Thickness and Raising Radial Strength,” </w:t>
       </w:r>
       <w:r>
         <w:rPr>
           <w:i/>
           <w:iCs/>
         </w:rPr>
-        <w:t>Journal of Materials Science &amp; Technology</w:t>
+        <w:t>Materials &amp; Design</w:t>
       </w:r>
       <w:r>
         <w:t xml:space="preserve"> </w:t>
@@ -22363,10 +22104,10 @@
           <w:i/>
           <w:iCs/>
         </w:rPr>
-        <w:t>91</w:t>
-      </w:r>
-      <w:r>
-        <w:t xml:space="preserve"> (2021): 134–147, https://doi.org/10.1016/j.jmst.2021.02.050.</w:t>
+        <w:t>220</w:t>
+      </w:r>
+      <w:r>
+        <w:t xml:space="preserve"> (2022): 110843, https://doi.org/10.1016/j.matdes.2022.110843.</w:t>
       </w:r>
     </w:p>
     <w:p>
@@ -22374,15 +22115,7 @@
         <w:pStyle w:val="Bibliography"/>
       </w:pPr>
       <w:r>
-        <w:t xml:space="preserve">40. J. Tkacz, K. </w:t>
-      </w:r>
-      <w:proofErr w:type="spellStart"/>
-      <w:r>
-        <w:t>Slouková</w:t>
-      </w:r>
-      <w:proofErr w:type="spellEnd"/>
-      <w:r>
-        <w:t xml:space="preserve">, J. Minda, et al., “Influence of the Composition of the Hank’s Balanced Salt Solution on the Corrosion Behavior of AZ31 and AZ61 Magnesium Alloys,” </w:t>
+        <w:t xml:space="preserve">46. J. Chen, F. Dong, and S. Liu, “Design and Mechanical Performance Evaluation of WE43 Magnesium Alloy Biodegradable Stents via Finite Element Analysis,” </w:t>
       </w:r>
       <w:r>
         <w:rPr>
@@ -22399,171 +22132,10 @@
           <w:i/>
           <w:iCs/>
         </w:rPr>
-        <w:t>7</w:t>
-      </w:r>
-      <w:r>
-        <w:t>, no. 11 (2017): 465, https://doi.org/10.3390/met7110465.</w:t>
-      </w:r>
-    </w:p>
-    <w:p>
-      <w:pPr>
-        <w:pStyle w:val="Bibliography"/>
-      </w:pPr>
-      <w:r>
-        <w:t xml:space="preserve">41. T. Kokubo, and H. </w:t>
-      </w:r>
-      <w:proofErr w:type="spellStart"/>
-      <w:r>
-        <w:t>Takadama</w:t>
-      </w:r>
-      <w:proofErr w:type="spellEnd"/>
-      <w:r>
-        <w:t xml:space="preserve">, “How Useful Is SBF in Predicting in Vivo Bone </w:t>
-      </w:r>
-      <w:proofErr w:type="gramStart"/>
-      <w:r>
-        <w:t>Bioactivity?,</w:t>
-      </w:r>
-      <w:proofErr w:type="gramEnd"/>
-      <w:r>
-        <w:t xml:space="preserve">” </w:t>
-      </w:r>
-      <w:r>
-        <w:rPr>
-          <w:i/>
-          <w:iCs/>
-        </w:rPr>
-        <w:t>Biomaterials</w:t>
-      </w:r>
-      <w:r>
-        <w:t xml:space="preserve"> </w:t>
-      </w:r>
-      <w:r>
-        <w:rPr>
-          <w:i/>
-          <w:iCs/>
-        </w:rPr>
-        <w:t>27</w:t>
-      </w:r>
-      <w:r>
-        <w:t>, no. 15 (2006): 2907–2915, https://doi.org/10.1016/j.biomaterials.2006.01.017.</w:t>
-      </w:r>
-    </w:p>
-    <w:p>
-      <w:pPr>
-        <w:pStyle w:val="Bibliography"/>
-      </w:pPr>
-      <w:r>
-        <w:t xml:space="preserve">42. L. Liu, Y. Meng, C. Dong, Y. Yan, A. A. Volinsky, and L.-N. Wang, “Initial Formation of Corrosion Products on Pure Zinc in Simulated Body Fluid,” </w:t>
-      </w:r>
-      <w:r>
-        <w:rPr>
-          <w:i/>
-          <w:iCs/>
-        </w:rPr>
-        <w:t>Journal of Materials Science &amp; Technology</w:t>
-      </w:r>
-      <w:r>
-        <w:t xml:space="preserve"> </w:t>
-      </w:r>
-      <w:r>
-        <w:rPr>
-          <w:i/>
-          <w:iCs/>
-        </w:rPr>
-        <w:t>34</w:t>
-      </w:r>
-      <w:r>
-        <w:t>, no. 12 (2018): 2271–2282, https://doi.org/10.1016/j.jmst.2018.05.005.</w:t>
-      </w:r>
-    </w:p>
-    <w:p>
-      <w:pPr>
-        <w:pStyle w:val="Bibliography"/>
-      </w:pPr>
-      <w:r>
-        <w:t xml:space="preserve">43. E. </w:t>
-      </w:r>
-      <w:proofErr w:type="spellStart"/>
-      <w:r>
-        <w:t>Mostaed</w:t>
-      </w:r>
-      <w:proofErr w:type="spellEnd"/>
-      <w:r>
-        <w:t>, M. Sikora-</w:t>
-      </w:r>
-      <w:proofErr w:type="spellStart"/>
-      <w:r>
-        <w:t>Jasinska</w:t>
-      </w:r>
-      <w:proofErr w:type="spellEnd"/>
-      <w:r>
-        <w:t xml:space="preserve">, J. W. Drelich, and M. </w:t>
-      </w:r>
-      <w:proofErr w:type="spellStart"/>
-      <w:r>
-        <w:t>Vedani</w:t>
-      </w:r>
-      <w:proofErr w:type="spellEnd"/>
-      <w:r>
-        <w:t xml:space="preserve">, “Zinc-Based Alloys for Degradable Vascular Stent Applications,” </w:t>
-      </w:r>
-      <w:r>
-        <w:rPr>
-          <w:i/>
-          <w:iCs/>
-        </w:rPr>
-        <w:t xml:space="preserve">Acta </w:t>
-      </w:r>
-      <w:proofErr w:type="spellStart"/>
-      <w:r>
-        <w:rPr>
-          <w:i/>
-          <w:iCs/>
-        </w:rPr>
-        <w:t>Biomaterialia</w:t>
-      </w:r>
-      <w:proofErr w:type="spellEnd"/>
-      <w:r>
-        <w:t xml:space="preserve"> </w:t>
-      </w:r>
-      <w:r>
-        <w:rPr>
-          <w:i/>
-          <w:iCs/>
-        </w:rPr>
-        <w:t>71</w:t>
-      </w:r>
-      <w:r>
-        <w:t xml:space="preserve"> (2018): 1–23, https://doi.org/10.1016/j.actbio.2018.03.005.</w:t>
-      </w:r>
-    </w:p>
-    <w:p>
-      <w:pPr>
-        <w:pStyle w:val="Bibliography"/>
-      </w:pPr>
-      <w:r>
-        <w:t xml:space="preserve">44. Y. Meng, L. Liu, D. Zhang, et al., “Initial Formation of Corrosion Products on Pure Zinc in Saline Solution,” </w:t>
-      </w:r>
-      <w:r>
-        <w:rPr>
-          <w:i/>
-          <w:iCs/>
-        </w:rPr>
-        <w:t>Bioactive Materials</w:t>
-      </w:r>
-      <w:r>
-        <w:t xml:space="preserve"> </w:t>
-      </w:r>
-      <w:r>
-        <w:rPr>
-          <w:i/>
-          <w:iCs/>
-        </w:rPr>
-        <w:t>4</w:t>
-      </w:r>
-      <w:r>
-        <w:t xml:space="preserve"> (2019): 87–96, https://doi.org/10.1016/j.bioactmat.2018.08.003.</w:t>
+        <w:t>14</w:t>
+      </w:r>
+      <w:r>
+        <w:t>, no. 6 (2024): 704, https://doi.org/10.3390/met14060704.</w:t>
       </w:r>
     </w:p>
     <w:p>
@@ -22597,6 +22169,7 @@
         <w:rPr>
           <w:b/>
         </w:rPr>
+        <w:lastRenderedPageBreak/>
         <w:t>Supporting Information</w:t>
       </w:r>
     </w:p>
@@ -24930,31 +24503,6 @@
 </file>
 
 <file path=customXml/item1.xml><?xml version="1.0" encoding="utf-8"?>
-<ControlsStorage xmlns="urn:schemas-microsoft-com.VSTO2008Demos.ControlsStorage">
-  <Controls>AAEAAAD/////AQAAAAAAAAAMAgAAAEVDaGVtNFdvcmQuQ29yZSwgVmVyc2lvbj0xLjAuMC4wLCBDdWx0dXJlPW5ldXRyYWwsIFB1YmxpY0tleVRva2VuPW51bGwHAQAAAAABAAAAAAAAAAQgQ2hlbTRXb3JkLkNvcmUuQ29udHJvbFByb3BlcnRpZXMCAAAACw==</Controls>
-</ControlsStorage>
-</file>
-
-<file path=customXml/item2.xml><?xml version="1.0" encoding="utf-8"?>
-<?mso-contentType ?>
-<FormTemplates xmlns="http://schemas.microsoft.com/sharepoint/v3/contenttype/forms">
-  <Display>DocumentLibraryForm</Display>
-  <Edit>DocumentLibraryForm</Edit>
-  <New>DocumentLibraryForm</New>
-</FormTemplates>
-</file>
-
-<file path=customXml/item3.xml><?xml version="1.0" encoding="utf-8"?>
-<b:Sources xmlns:b="http://schemas.openxmlformats.org/officeDocument/2006/bibliography" xmlns="http://schemas.openxmlformats.org/officeDocument/2006/bibliography" SelectedStyle="\APASixthEditionOfficeOnline.xsl" StyleName="APA" Version="6"/>
-</file>
-
-<file path=customXml/item4.xml><?xml version="1.0" encoding="utf-8"?>
-<p:properties xmlns:p="http://schemas.microsoft.com/office/2006/metadata/properties" xmlns:xsi="http://www.w3.org/2001/XMLSchema-instance" xmlns:pc="http://schemas.microsoft.com/office/infopath/2007/PartnerControls">
-  <documentManagement/>
-</p:properties>
-</file>
-
-<file path=customXml/item5.xml><?xml version="1.0" encoding="utf-8"?>
 <ct:contentTypeSchema xmlns:ct="http://schemas.microsoft.com/office/2006/metadata/contentType" xmlns:ma="http://schemas.microsoft.com/office/2006/metadata/properties/metaAttributes" ct:_="" ma:_="" ma:contentTypeName="Dokument" ma:contentTypeID="0x01010070446C3525B3CB46BD92ABA5C2617223" ma:contentTypeVersion="12" ma:contentTypeDescription="Ein neues Dokument erstellen." ma:contentTypeScope="" ma:versionID="ace6bbd061d3e3241e07436f437a906c">
   <xsd:schema xmlns:xsd="http://www.w3.org/2001/XMLSchema" xmlns:xs="http://www.w3.org/2001/XMLSchema" xmlns:p="http://schemas.microsoft.com/office/2006/metadata/properties" xmlns:ns2="981f2fdf-0e4d-4708-9882-12f25bf7d4fe" xmlns:ns3="4fe7dd48-639f-4daa-8770-f50527565b0b" targetNamespace="http://schemas.microsoft.com/office/2006/metadata/properties" ma:root="true" ma:fieldsID="645148a839964f4ba651d3ea90aa0208" ns2:_="" ns3:_="">
     <xsd:import namespace="981f2fdf-0e4d-4708-9882-12f25bf7d4fe"/>
@@ -25171,40 +24719,32 @@
 </ct:contentTypeSchema>
 </file>
 
-<file path=customXml/itemProps1.xml><?xml version="1.0" encoding="utf-8"?>
-<ds:datastoreItem xmlns:ds="http://schemas.openxmlformats.org/officeDocument/2006/customXml" ds:itemID="{E3F19EBF-8207-4BE7-AD18-240ED1895C11}">
-  <ds:schemaRefs>
-    <ds:schemaRef ds:uri="urn:schemas-microsoft-com.VSTO2008Demos.ControlsStorage"/>
-  </ds:schemaRefs>
-</ds:datastoreItem>
+<file path=customXml/item2.xml><?xml version="1.0" encoding="utf-8"?>
+<ControlsStorage xmlns="urn:schemas-microsoft-com.VSTO2008Demos.ControlsStorage">
+  <Controls>AAEAAAD/////AQAAAAAAAAAMAgAAAEVDaGVtNFdvcmQuQ29yZSwgVmVyc2lvbj0xLjAuMC4wLCBDdWx0dXJlPW5ldXRyYWwsIFB1YmxpY0tleVRva2VuPW51bGwHAQAAAAABAAAAAAAAAAQgQ2hlbTRXb3JkLkNvcmUuQ29udHJvbFByb3BlcnRpZXMCAAAACw==</Controls>
+</ControlsStorage>
 </file>
 
-<file path=customXml/itemProps2.xml><?xml version="1.0" encoding="utf-8"?>
-<ds:datastoreItem xmlns:ds="http://schemas.openxmlformats.org/officeDocument/2006/customXml" ds:itemID="{75886F76-A765-4714-B899-7AC2DC4334A1}">
-  <ds:schemaRefs>
-    <ds:schemaRef ds:uri="http://schemas.microsoft.com/sharepoint/v3/contenttype/forms"/>
-  </ds:schemaRefs>
-</ds:datastoreItem>
+<file path=customXml/item3.xml><?xml version="1.0" encoding="utf-8"?>
+<?mso-contentType ?>
+<FormTemplates xmlns="http://schemas.microsoft.com/sharepoint/v3/contenttype/forms">
+  <Display>DocumentLibraryForm</Display>
+  <Edit>DocumentLibraryForm</Edit>
+  <New>DocumentLibraryForm</New>
+</FormTemplates>
 </file>
 
-<file path=customXml/itemProps3.xml><?xml version="1.0" encoding="utf-8"?>
-<ds:datastoreItem xmlns:ds="http://schemas.openxmlformats.org/officeDocument/2006/customXml" ds:itemID="{DE724972-9DFC-40BC-BA35-EDB291A5A412}">
-  <ds:schemaRefs>
-    <ds:schemaRef ds:uri="http://schemas.openxmlformats.org/officeDocument/2006/bibliography"/>
-  </ds:schemaRefs>
-</ds:datastoreItem>
+<file path=customXml/item4.xml><?xml version="1.0" encoding="utf-8"?>
+<b:Sources xmlns:b="http://schemas.openxmlformats.org/officeDocument/2006/bibliography" xmlns="http://schemas.openxmlformats.org/officeDocument/2006/bibliography" SelectedStyle="\APASixthEditionOfficeOnline.xsl" StyleName="APA" Version="6"/>
 </file>
 
-<file path=customXml/itemProps4.xml><?xml version="1.0" encoding="utf-8"?>
-<ds:datastoreItem xmlns:ds="http://schemas.openxmlformats.org/officeDocument/2006/customXml" ds:itemID="{96D19C85-73BE-4F5D-979F-58BFDE5BBE12}">
-  <ds:schemaRefs>
-    <ds:schemaRef ds:uri="http://schemas.microsoft.com/office/2006/metadata/properties"/>
-    <ds:schemaRef ds:uri="http://schemas.microsoft.com/office/infopath/2007/PartnerControls"/>
-  </ds:schemaRefs>
-</ds:datastoreItem>
+<file path=customXml/item5.xml><?xml version="1.0" encoding="utf-8"?>
+<p:properties xmlns:p="http://schemas.microsoft.com/office/2006/metadata/properties" xmlns:xsi="http://www.w3.org/2001/XMLSchema-instance" xmlns:pc="http://schemas.microsoft.com/office/infopath/2007/PartnerControls">
+  <documentManagement/>
+</p:properties>
 </file>
 
-<file path=customXml/itemProps5.xml><?xml version="1.0" encoding="utf-8"?>
+<file path=customXml/itemProps1.xml><?xml version="1.0" encoding="utf-8"?>
 <ds:datastoreItem xmlns:ds="http://schemas.openxmlformats.org/officeDocument/2006/customXml" ds:itemID="{C86C925C-E763-4769-9959-2FEDA6D7CE8A}">
   <ds:schemaRefs>
     <ds:schemaRef ds:uri="http://schemas.microsoft.com/office/2006/metadata/contentType"/>
@@ -25221,4 +24761,37 @@
     <ds:schemaRef ds:uri="http://schemas.microsoft.com/internal/obd"/>
   </ds:schemaRefs>
 </ds:datastoreItem>
+</file>
+
+<file path=customXml/itemProps2.xml><?xml version="1.0" encoding="utf-8"?>
+<ds:datastoreItem xmlns:ds="http://schemas.openxmlformats.org/officeDocument/2006/customXml" ds:itemID="{E3F19EBF-8207-4BE7-AD18-240ED1895C11}">
+  <ds:schemaRefs>
+    <ds:schemaRef ds:uri="urn:schemas-microsoft-com.VSTO2008Demos.ControlsStorage"/>
+  </ds:schemaRefs>
+</ds:datastoreItem>
+</file>
+
+<file path=customXml/itemProps3.xml><?xml version="1.0" encoding="utf-8"?>
+<ds:datastoreItem xmlns:ds="http://schemas.openxmlformats.org/officeDocument/2006/customXml" ds:itemID="{75886F76-A765-4714-B899-7AC2DC4334A1}">
+  <ds:schemaRefs>
+    <ds:schemaRef ds:uri="http://schemas.microsoft.com/sharepoint/v3/contenttype/forms"/>
+  </ds:schemaRefs>
+</ds:datastoreItem>
+</file>
+
+<file path=customXml/itemProps4.xml><?xml version="1.0" encoding="utf-8"?>
+<ds:datastoreItem xmlns:ds="http://schemas.openxmlformats.org/officeDocument/2006/customXml" ds:itemID="{DE724972-9DFC-40BC-BA35-EDB291A5A412}">
+  <ds:schemaRefs>
+    <ds:schemaRef ds:uri="http://schemas.openxmlformats.org/officeDocument/2006/bibliography"/>
+  </ds:schemaRefs>
+</ds:datastoreItem>
+</file>
+
+<file path=customXml/itemProps5.xml><?xml version="1.0" encoding="utf-8"?>
+<ds:datastoreItem xmlns:ds="http://schemas.openxmlformats.org/officeDocument/2006/customXml" ds:itemID="{96D19C85-73BE-4F5D-979F-58BFDE5BBE12}">
+  <ds:schemaRefs>
+    <ds:schemaRef ds:uri="http://schemas.microsoft.com/office/2006/metadata/properties"/>
+    <ds:schemaRef ds:uri="http://schemas.microsoft.com/office/infopath/2007/PartnerControls"/>
+  </ds:schemaRefs>
+</ds:datastoreItem>
 </file>
</xml_diff>

<commit_message>
Methods: add novelty statement positioning framework against existing Zn and Mg models
Co-Authored-By: Claude Sonnet 5.5 <noreply@anthropic.com>
Claude-Session: https://claude.ai/code/session_01Y1g9vByMLTE8eGJ9K81zt6
</commit_message>
<xml_diff>
--- a/Manuscript_AS_original_order.docx
+++ b/Manuscript_AS_original_order.docx
@@ -27,7 +27,15 @@
         <w:spacing w:line="360" w:lineRule="auto"/>
       </w:pPr>
       <w:r>
-        <w:t>Henaka Ariyarathna, Xuan Yang, Aijun Huang, Yunlong Tang</w:t>
+        <w:t xml:space="preserve">Henaka Ariyarathna, Xuan Yang, </w:t>
+      </w:r>
+      <w:proofErr w:type="spellStart"/>
+      <w:r>
+        <w:t>Aijun</w:t>
+      </w:r>
+      <w:proofErr w:type="spellEnd"/>
+      <w:r>
+        <w:t xml:space="preserve"> Huang, Yunlong Tang</w:t>
       </w:r>
       <m:oMath>
         <m:sSup>
@@ -274,7 +282,7 @@
         <w:jc w:val="both"/>
       </w:pPr>
       <w:r>
-        <w:t xml:space="preserve">Zinc (Zn) is a promising biodegradable metal for temporary implants, yet predictive computational frameworks for its degradation under physiological conditions remain limited. In this study, a three-dimensional (3D) mechanistic reaction-diffusion model is developed by coupling oxygen reduction reaction (ORR) kinetics, mass transport, corrosion-product evolution, and moving-interface tracking. Initial sensitivity analysis demonstrates that dissolved oxygen availability primarily controls Zn biodegradation. Calibrated using three effective kinetic parameters against literature immersion mass-loss data over 14 days, the model predicts the 28-day mass-loss evolution measured in this study without refitting, yielding a root-mean-square error (RMSE) of 0.0159%. The simulations reveal a self-limiting mechanism in which corrosion-product accumulation progressively restricts oxygen transport to the metal surface, driving a transition from reaction-controlled to diffusion-controlled degradation. When applied without geometry-specific recalibration to a six-crown Zn stent, the model predicts approximately 6% mass loss after one month, consistent in magnitude with reported </w:t>
+        <w:t xml:space="preserve">Zinc (Zn) is a promising biodegradable metal for temporary implants, yet predictive computational frameworks for its degradation under physiological conditions remain limited. In this study, a three-dimensional (3D) mechanistic reaction-diffusion model is developed by coupling oxygen reduction reaction (ORR) kinetics, mass transport, corrosion-product evolution, and moving-interface tracking. Initial sensitivity analysis demonstrates that dissolved oxygen availability primarily controls Zn biodegradation. Calibrated using three effective kinetic parameters against literature immersion mass-loss data over 14 days, the model predicts the 28-day mass-loss evolution measured in this study, yielding a root-mean-square error (RMSE) of 0.0159%. The simulations reveal a self-limiting mechanism in which corrosion-product accumulation progressively restricts oxygen transport to the metal surface, driving a transition from reaction-controlled to diffusion-controlled degradation. When applied without geometry-specific recalibration to a six-crown Zn stent, the model predicts approximately 6% mass loss after one month, consistent in magnitude with reported </w:t>
       </w:r>
       <w:r>
         <w:rPr>
@@ -283,7 +291,7 @@
         <w:t>in vivo</w:t>
       </w:r>
       <w:r>
-        <w:t xml:space="preserve"> observations, and captures crown-localized degradation driven by geometry-dependent oxygen transport. By linking implant geometry to degradation rate and spatial morphology, the framework provides a low-dimensional, mechanistic basis for predicting Zn implant degradation and supports data-driven optimization and degradation-informed implant design.</w:t>
+        <w:t xml:space="preserve"> observations, and captures crown-localized degradation driven by geometry-dependent oxygen transport. By linking implant geometry to degradation rate and spatial morphology, the framework provides a low-dimensional, mechanistic basis for predicting Zn implant degradation and supports degradation-informed implant design.</w:t>
       </w:r>
     </w:p>
     <w:p>
@@ -436,7 +444,10 @@
         <w:pStyle w:val="BodyText"/>
       </w:pPr>
       <w:r>
-        <w:t xml:space="preserve">Biodegradable metallic implants are increasingly investigated for clinical applications that require temporary mechanical support followed by gradual resorption after tissue healing, thereby avoiding long-term complications and secondary surgeries associated with permanent implants </w:t>
+        <w:t>Biodegradable metallic implants are increasingly being explored for clinical applications that require temporary mechanical support followed by gradual resorption after tissue healing, thereby avoiding the long-term complications and secondary surgeries associated with permanent devices</w:t>
+      </w:r>
+      <w:r>
+        <w:t xml:space="preserve"> </w:t>
       </w:r>
       <w:r>
         <w:fldChar w:fldCharType="begin"/>
@@ -461,7 +472,7 @@
         <w:t xml:space="preserve">. </w:t>
       </w:r>
       <w:r>
-        <w:t>Among biodegradable metals, Zn has emerged as a promising candidate because its degradation behavior falls between magnesium (Mg) and iron (Fe)</w:t>
+        <w:t>Among biodegradable metals, Zn has attracted considerable interest because its corrosion behavior lies between that of magnesium (Mg) and iron (Fe)</w:t>
       </w:r>
       <w:r>
         <w:t> </w:t>
@@ -489,7 +500,7 @@
         <w:t xml:space="preserve">. </w:t>
       </w:r>
       <w:r>
-        <w:t>This balanced corrosion profile offers a degradation rate more compatible with tissue-healing timescales than either Mg or Fe, while generating negligible hydrogen evolution, thereby enhancing its suitability for temporary biodegradable implant applications</w:t>
+        <w:t>This intermediate degradation profile provides a rate that is better aligned with tissue-healing timescales while producing negligible hydrogen evolution, making Zn particularly suitable for transient implant applications</w:t>
       </w:r>
       <w:r>
         <w:t> </w:t>
@@ -520,7 +531,10 @@
         <w:t xml:space="preserve"> </w:t>
       </w:r>
       <w:r>
-        <w:t>Despite these advantages, the clinical translation of Zn-based implants remains challenging because biodegradation continuously alters implant geometry and mechanical integrity. Progressive material loss changes local stress distributions, load-bearing capacity, and structural reliability throughout the service period</w:t>
+        <w:t xml:space="preserve">Despite these advantages, </w:t>
+      </w:r>
+      <w:r>
+        <w:t>the clinical translation of Zn-based implants remains challenging because biodegradation continuously changes implant morphology and structural integrity. As material is progressively removed, local stress distributions, load-bearing capacity, and overall mechanical performance evolve throughout the implant's service life, complicating the prediction of long-term functionality</w:t>
       </w:r>
       <w:r>
         <w:t> </w:t>
@@ -571,7 +585,10 @@
         <w:t xml:space="preserve"> </w:t>
       </w:r>
       <w:r>
-        <w:t xml:space="preserve">Recent studies of porous Zn scaffolds have further demonstrated that topology and permeability can significantly influence transport processes, corrosion-product accumulation, degradation kinetics, and degradation localization, highlighting the need to explicitly resolve geometry-transport interactions during degradation </w:t>
+        <w:t>Studies of porous Zn scaffolds have demonstrated that topology and permeability can strongly influence mass transport, corrosion-product accumulation, degradation kinetics, and localization, highlighting the governing role of geometry in corrosion progression</w:t>
+      </w:r>
+      <w:r>
+        <w:t xml:space="preserve"> </w:t>
       </w:r>
       <w:r>
         <w:fldChar w:fldCharType="begin"/>
@@ -633,7 +650,10 @@
         <w:fldChar w:fldCharType="end"/>
       </w:r>
       <w:r>
-        <w:t>. Predictive computational models are therefore required to quantitatively link implant architecture, species transport, electrochemical reactions, and corrosion-product evolution to the resulting degradation morphology and structural performance of biodegradable implants.</w:t>
+        <w:t xml:space="preserve">. </w:t>
+      </w:r>
+      <w:r>
+        <w:t>Predictive computational models are therefore required to quantitatively link implant architecture to degradation evolution and the resulting structural performance of biodegradable implants.</w:t>
       </w:r>
     </w:p>
     <w:p>
@@ -672,11 +692,20 @@
         <w:t xml:space="preserve"> </w:t>
       </w:r>
       <w:r>
-        <w:t xml:space="preserve">However, because the local electrochemical environment is not explicitly resolved, the effects of species transport, </w:t>
+        <w:t xml:space="preserve">However, because the local electrochemical environment is not explicitly resolved, </w:t>
+      </w:r>
+      <w:r>
+        <w:t xml:space="preserve">mechanistic descriptions of the processes </w:t>
+      </w:r>
+      <w:r>
+        <w:t>governing material loss are embedded in</w:t>
+      </w:r>
+      <w:r>
+        <w:t xml:space="preserve"> calibrated parameters. Their predictive </w:t>
       </w:r>
       <w:r>
         <w:lastRenderedPageBreak/>
-        <w:t>corrosion products, and geometry-dependent mass transfer are embedded within calibrated parameters. Their predictive capability may therefore be limited outside the geometries and environmental conditions used for calibration</w:t>
+        <w:t>capability may therefore be limited outside the geometries and environmental conditions used for calibration</w:t>
       </w:r>
       <w:r>
         <w:t xml:space="preserve"> </w:t>
@@ -796,7 +825,10 @@
         <w:t xml:space="preserve">For example, </w:t>
       </w:r>
       <w:r>
-        <w:t>Chen et al. coupled electrochemical kinetics, mass transport, and corrosion-product formation under salt-spray conditions, providing an important foundation for physics-based Zn corrosion modeling</w:t>
+        <w:t xml:space="preserve">Chen et al. coupled electrochemical kinetics, mass transport, and corrosion-product formation under salt-spray conditions, </w:t>
+      </w:r>
+      <w:r>
+        <w:t>demonstrating the feasibility of physics-based modeling approaches for Zn corrosion</w:t>
       </w:r>
       <w:r>
         <w:t xml:space="preserve"> </w:t>
@@ -954,11 +986,7 @@
         <w:t>Using this approach, the present study investigates the role of oxygen availability in regulating Zn biodegradation and examines how implant geometry influences degradation through its effects on local transport conditions and corrosion-product evolution.</w:t>
       </w:r>
       <w:r>
-        <w:t xml:space="preserve"> The study therefore advances Zn biodegradation </w:t>
-      </w:r>
-      <w:r>
-        <w:lastRenderedPageBreak/>
-        <w:t>modeling from calibrated material-loss descriptions toward transferable, geometry-resolved prediction of evolving implant morphology.</w:t>
+        <w:t xml:space="preserve"> The study therefore advances Zn biodegradation modeling from calibrated material-loss descriptions toward transferable, geometry-resolved prediction of evolving implant morphology.</w:t>
       </w:r>
     </w:p>
     <w:p>
@@ -966,6 +994,7 @@
         <w:pStyle w:val="Heading1"/>
       </w:pPr>
       <w:r>
+        <w:lastRenderedPageBreak/>
         <w:t>Method</w:t>
       </w:r>
       <w:r>
@@ -1166,7 +1195,11 @@
         <w:t>Computational–experimental workflow for developing, calibrating, validating, and applying the mechanistic Zn biodegradation model</w:t>
       </w:r>
       <w:r>
-        <w:t>. (a) Reaction–diffusion model coupling species transport and corrosion-film evolution with moving-interface tracking; (b) calibration of the three effective kinetic parameters (k</w:t>
+        <w:t>. (a) Reaction–diffusion model coupling species transport and corrosion-film evolution with moving-interface tracking; (b) calibration of the three effective kinetic parameters (</w:t>
+      </w:r>
+      <w:proofErr w:type="spellStart"/>
+      <w:r>
+        <w:t>k</w:t>
       </w:r>
       <w:r>
         <w:rPr>
@@ -1174,8 +1207,13 @@
         </w:rPr>
         <w:t>f</w:t>
       </w:r>
-      <w:r>
-        <w:t>, k</w:t>
+      <w:proofErr w:type="spellEnd"/>
+      <w:r>
+        <w:t xml:space="preserve">, </w:t>
+      </w:r>
+      <w:proofErr w:type="spellStart"/>
+      <w:r>
+        <w:t>k</w:t>
       </w:r>
       <w:r>
         <w:rPr>
@@ -1183,8 +1221,13 @@
         </w:rPr>
         <w:t>d</w:t>
       </w:r>
-      <w:r>
-        <w:t>, k</w:t>
+      <w:proofErr w:type="spellEnd"/>
+      <w:r>
+        <w:t xml:space="preserve">, </w:t>
+      </w:r>
+      <w:proofErr w:type="spellStart"/>
+      <w:r>
+        <w:t>k</w:t>
       </w:r>
       <w:r>
         <w:rPr>
@@ -1192,6 +1235,7 @@
         </w:rPr>
         <w:t>ORR</w:t>
       </w:r>
+      <w:proofErr w:type="spellEnd"/>
       <w:r>
         <w:t>) against literature mass-loss data (0–336 h); (c) validation against the mass loss measured in this study (0–672 h) for Ø10 × 2 mm discs; and (d) model predictions for a six-crown Zn stent.</w:t>
       </w:r>
@@ -1223,14 +1267,21 @@
         <w:rPr>
           <w:rFonts w:cs="Times New Roman"/>
         </w:rPr>
-        <w:t xml:space="preserve">Commercially pure Zn (99.99 wt%) was processed by casting, homogenization, and hot extrusion to produce fully dense rods (10 mm diameter), from which disc specimens (10 mm diameter, 2 mm thickness) were prepared. Prior to testing, specimens were mechanically ground </w:t>
-      </w:r>
-      <w:r>
-        <w:rPr>
-          <w:rFonts w:cs="Times New Roman"/>
-        </w:rPr>
-        <w:lastRenderedPageBreak/>
-        <w:t xml:space="preserve">through successive silicon carbide abrasive grades and finished with </w:t>
+        <w:t xml:space="preserve">Commercially pure Zn (99.99 </w:t>
+      </w:r>
+      <w:proofErr w:type="spellStart"/>
+      <w:r>
+        <w:rPr>
+          <w:rFonts w:cs="Times New Roman"/>
+        </w:rPr>
+        <w:t>wt</w:t>
+      </w:r>
+      <w:proofErr w:type="spellEnd"/>
+      <w:r>
+        <w:rPr>
+          <w:rFonts w:cs="Times New Roman"/>
+        </w:rPr>
+        <w:t xml:space="preserve">%) was processed by casting, homogenization, and hot extrusion to produce fully dense rods (10 mm diameter), from which disc specimens (10 mm diameter, 2 mm thickness) were prepared. Prior to testing, specimens were mechanically ground through successive silicon carbide abrasive grades and finished with </w:t>
       </w:r>
       <m:oMath>
         <m:r>
@@ -1244,7 +1295,14 @@
         <w:rPr>
           <w:rFonts w:cs="Times New Roman"/>
         </w:rPr>
-        <w:t xml:space="preserve"> diamond suspension to produce a reproducible and well-defined surface condition. The polished specimens were ultrasonically cleaned in Milli-Q water, acetone, and ethanol to remove residual surface contaminants, then dried and stored under vacuum until use. Hanks’ Balanced Salt Solution (HBSS; Gibco, calcium- and magnesium-free) was selected as the immersion medium.</w:t>
+        <w:t xml:space="preserve"> diamond suspension to produce a reproducible and well-defined surface condition. The polished specimens were </w:t>
+      </w:r>
+      <w:r>
+        <w:rPr>
+          <w:rFonts w:cs="Times New Roman"/>
+        </w:rPr>
+        <w:lastRenderedPageBreak/>
+        <w:t>ultrasonically cleaned in Milli-Q water, acetone, and ethanol to remove residual surface contaminants, then dried and stored under vacuum until use. Hanks’ Balanced Salt Solution (HBSS; Gibco, calcium- and magnesium-free) was selected as the immersion medium.</w:t>
       </w:r>
     </w:p>
     <w:p>
@@ -1392,6 +1450,21 @@
       </w:pPr>
       <w:r>
         <w:t>Mechanistic Modeling Framework</w:t>
+      </w:r>
+    </w:p>
+    <w:p>
+      <w:pPr>
+        <w:pStyle w:val="FirstParagraph"/>
+        <w:ind w:firstLine="357"/>
+        <w:rPr>
+          <w:rFonts w:cs="Times New Roman"/>
+        </w:rPr>
+      </w:pPr>
+      <w:r>
+        <w:rPr>
+          <w:rFonts w:cs="Times New Roman"/>
+        </w:rPr>
+        <w:t>Existing models of Zn degradation are either atomistic, describing oxygen and chloride adsorption on Zn surfaces [24]; implant-scale finite element models in which material loss follows prescribed corrosion kinetics within a continuum-damage framework [11]; or a one-dimensional mechanistic description of uniform Zn corrosion under salt spray [23]. Mechanistic three-dimensional reaction–diffusion models with moving-interface tracking have been established for Mg [18,19], but they cannot be applied directly to Zn because Zn degradation is governed by cathodic oxygen reduction and the oxygen-limiting corrosion-product film. To our knowledge, the framework presented here is the first three-dimensional mechanistic model for Zn that explicitly couples oxygen-reduction kinetics, multi-species transport, corrosion-product film evolution, and level-set interface tracking, with a local velocity-selection rule that lets the controlling mechanism vary in space and time. Only three effective kinetic parameters require calibration, and localized degradation emerges from the coupled physics without prescribing spatially varying corrosion kinetics.</w:t>
       </w:r>
     </w:p>
     <w:p>
@@ -2842,7 +2915,35 @@
         <w:rPr>
           <w:rFonts w:cs="Times New Roman"/>
         </w:rPr>
-        <w:t>Although phosphate and carbonate species may contribute to the formation of secondary corrosion products such as hopeite, smithsonite, and simonkolleite at longer timescales </w:t>
+        <w:t xml:space="preserve">Although phosphate and carbonate species may contribute to the formation of secondary corrosion products such as </w:t>
+      </w:r>
+      <w:proofErr w:type="spellStart"/>
+      <w:r>
+        <w:rPr>
+          <w:rFonts w:cs="Times New Roman"/>
+        </w:rPr>
+        <w:t>hopeite</w:t>
+      </w:r>
+      <w:proofErr w:type="spellEnd"/>
+      <w:r>
+        <w:rPr>
+          <w:rFonts w:cs="Times New Roman"/>
+        </w:rPr>
+        <w:t xml:space="preserve">, smithsonite, and </w:t>
+      </w:r>
+      <w:proofErr w:type="spellStart"/>
+      <w:r>
+        <w:rPr>
+          <w:rFonts w:cs="Times New Roman"/>
+        </w:rPr>
+        <w:t>simonkolleite</w:t>
+      </w:r>
+      <w:proofErr w:type="spellEnd"/>
+      <w:r>
+        <w:rPr>
+          <w:rFonts w:cs="Times New Roman"/>
+        </w:rPr>
+        <w:t xml:space="preserve"> at longer timescales </w:t>
       </w:r>
       <w:r>
         <w:rPr>
@@ -2892,7 +2993,21 @@
         <w:rPr>
           <w:rFonts w:cs="Times New Roman"/>
         </w:rPr>
-        <w:t xml:space="preserve"> observations indicate that early degradation is dominated by a thin ZnO layer, with more complex phases appearing only after approximately 4.5 months </w:t>
+        <w:t xml:space="preserve"> observations indicate that early degradation is dominated by a thin </w:t>
+      </w:r>
+      <w:proofErr w:type="spellStart"/>
+      <w:r>
+        <w:rPr>
+          <w:rFonts w:cs="Times New Roman"/>
+        </w:rPr>
+        <w:t>ZnO</w:t>
+      </w:r>
+      <w:proofErr w:type="spellEnd"/>
+      <w:r>
+        <w:rPr>
+          <w:rFonts w:cs="Times New Roman"/>
+        </w:rPr>
+        <w:t xml:space="preserve"> layer, with more complex phases appearing only after approximately 4.5 months </w:t>
       </w:r>
       <w:r>
         <w:rPr>
@@ -2929,7 +3044,21 @@
         <w:rPr>
           <w:rFonts w:cs="Times New Roman"/>
         </w:rPr>
-        <w:t>. Therefore, for the one-month simulation period considered here, the corrosion film is modeled as a single ZnO phase.</w:t>
+        <w:t xml:space="preserve">. Therefore, for the one-month simulation period considered here, the corrosion film is modeled as a single </w:t>
+      </w:r>
+      <w:proofErr w:type="spellStart"/>
+      <w:r>
+        <w:rPr>
+          <w:rFonts w:cs="Times New Roman"/>
+        </w:rPr>
+        <w:t>ZnO</w:t>
+      </w:r>
+      <w:proofErr w:type="spellEnd"/>
+      <w:r>
+        <w:rPr>
+          <w:rFonts w:cs="Times New Roman"/>
+        </w:rPr>
+        <w:t xml:space="preserve"> phase.</w:t>
       </w:r>
     </w:p>
     <w:p>
@@ -4254,10 +4383,6 @@
     <w:p>
       <w:pPr>
         <w:pStyle w:val="BodyText"/>
-        <w:tabs>
-          <w:tab w:val="right" w:pos="9360"/>
-        </w:tabs>
-        <w:spacing w:before="240" w:after="240"/>
         <w:ind w:firstLine="0"/>
         <w:rPr>
           <w:rFonts w:cs="Times New Roman"/>
@@ -4267,665 +4392,7 @@
         <w:rPr>
           <w:rFonts w:cs="Times New Roman"/>
         </w:rPr>
-        <w:t xml:space="preserve">Reduction of oxygen at the interface generates </w:t>
-      </w:r>
-      <m:oMath>
-        <m:r>
-          <m:rPr>
-            <m:sty m:val="p"/>
-          </m:rPr>
-          <w:rPr>
-            <w:rFonts w:ascii="Cambria Math" w:hAnsi="Cambria Math" w:cs="Times New Roman"/>
-          </w:rPr>
-          <m:t>O</m:t>
-        </m:r>
-        <m:sSup>
-          <m:sSupPr>
-            <m:ctrlPr>
-              <w:rPr>
-                <w:rFonts w:ascii="Cambria Math" w:hAnsi="Cambria Math" w:cs="Times New Roman"/>
-              </w:rPr>
-            </m:ctrlPr>
-          </m:sSupPr>
-          <m:e>
-            <m:r>
-              <m:rPr>
-                <m:sty m:val="p"/>
-              </m:rPr>
-              <w:rPr>
-                <w:rFonts w:ascii="Cambria Math" w:hAnsi="Cambria Math" w:cs="Times New Roman"/>
-              </w:rPr>
-              <m:t>H</m:t>
-            </m:r>
-          </m:e>
-          <m:sup>
-            <m:r>
-              <m:rPr>
-                <m:sty m:val="p"/>
-              </m:rPr>
-              <w:rPr>
-                <w:rFonts w:ascii="Cambria Math" w:hAnsi="Cambria Math" w:cs="Times New Roman"/>
-              </w:rPr>
-              <m:t>-</m:t>
-            </m:r>
-          </m:sup>
-        </m:sSup>
-      </m:oMath>
-      <w:r>
-        <w:rPr>
-          <w:rFonts w:cs="Times New Roman"/>
-        </w:rPr>
-        <w:t xml:space="preserve"> via the four-electron ORR </w:t>
-      </w:r>
-      <w:r>
-        <w:rPr>
-          <w:rFonts w:cs="Times New Roman"/>
-        </w:rPr>
-        <w:fldChar w:fldCharType="begin"/>
-      </w:r>
-      <w:r>
-        <w:rPr>
-          <w:rFonts w:cs="Times New Roman"/>
-        </w:rPr>
-        <w:instrText xml:space="preserve"> ADDIN ZOTERO_ITEM CSL_CITATION {"citationID":"rN5Gluur","properties":{"unsorted":false,"formattedCitation":"\\super [22]\\nosupersub{}","plainCitation":"[22]","noteIndex":0},"citationItems":[{"id":3601,"uris":["http://zotero.org/users/16939557/items/WLSBQ7BL"],"itemData":{"id":3601,"type":"article-journal","citation-key":"yadavOxygenReductionMechanism2005","container-title":"Journal of Electroanalytical Chemistry","DOI":"10.1016/j.jelechem.2005.08.007","ISSN":"15726657","issue":"1","journalAbbreviation":"Journal of Electroanalytical Chemistry","language":"en","license":"https://www.elsevier.com/tdm/userlicense/1.0/","page":"142-149","source":"DOI.org (Crossref)","title":"Oxygen reduction mechanism on corroded zinc","volume":"585","author":[{"family":"Yadav","given":"Amar Prasad"},{"family":"Nishikata","given":"Atsushi"},{"family":"Tsuru","given":"Tooru"}],"issued":{"date-parts":[["2005",11]]}}}],"schema":"https://github.com/citation-style-language/schema/raw/master/csl-citation.json"} </w:instrText>
-      </w:r>
-      <w:r>
-        <w:rPr>
-          <w:rFonts w:cs="Times New Roman"/>
-        </w:rPr>
-        <w:fldChar w:fldCharType="separate"/>
-      </w:r>
-      <w:r>
-        <w:rPr>
-          <w:rFonts w:cs="Times New Roman"/>
-          <w:vertAlign w:val="superscript"/>
-        </w:rPr>
-        <w:t>[22]</w:t>
-      </w:r>
-      <w:r>
-        <w:rPr>
-          <w:rFonts w:cs="Times New Roman"/>
-        </w:rPr>
-        <w:fldChar w:fldCharType="end"/>
-      </w:r>
-      <w:r>
-        <w:rPr>
-          <w:rFonts w:cs="Times New Roman"/>
-        </w:rPr>
-        <w:t>, increasing the local alkalinity and promoting formation of a ZnO-based corrosion-product film. At the same time, chloride-induced film dissolution releases hydroxide back into the electrolyte:</w:t>
-      </w:r>
-    </w:p>
-    <w:p>
-      <w:pPr>
-        <w:pStyle w:val="BodyText"/>
-        <w:tabs>
-          <w:tab w:val="right" w:pos="9360"/>
-        </w:tabs>
-        <w:spacing w:before="240" w:after="240"/>
-        <w:ind w:firstLine="0"/>
-        <w:rPr>
-          <w:rFonts w:cs="Times New Roman"/>
-        </w:rPr>
-      </w:pPr>
-      <m:oMath>
-        <m:m>
-          <m:mPr>
-            <m:plcHide m:val="1"/>
-            <m:mcs>
-              <m:mc>
-                <m:mcPr>
-                  <m:count m:val="1"/>
-                  <m:mcJc m:val="right"/>
-                </m:mcPr>
-              </m:mc>
-            </m:mcs>
-            <m:ctrlPr>
-              <w:rPr>
-                <w:rFonts w:ascii="Cambria Math" w:hAnsi="Cambria Math" w:cs="Times New Roman"/>
-              </w:rPr>
-            </m:ctrlPr>
-          </m:mPr>
-          <m:mr>
-            <m:e>
-              <m:f>
-                <m:fPr>
-                  <m:ctrlPr>
-                    <w:rPr>
-                      <w:rFonts w:ascii="Cambria Math" w:hAnsi="Cambria Math" w:cs="Times New Roman"/>
-                    </w:rPr>
-                  </m:ctrlPr>
-                </m:fPr>
-                <m:num>
-                  <m:r>
-                    <m:rPr>
-                      <m:sty m:val="p"/>
-                    </m:rPr>
-                    <w:rPr>
-                      <w:rFonts w:ascii="Cambria Math" w:hAnsi="Cambria Math" w:cs="Times New Roman"/>
-                    </w:rPr>
-                    <m:t>∂</m:t>
-                  </m:r>
-                  <m:sSub>
-                    <m:sSubPr>
-                      <m:ctrlPr>
-                        <w:rPr>
-                          <w:rFonts w:ascii="Cambria Math" w:hAnsi="Cambria Math" w:cs="Times New Roman"/>
-                        </w:rPr>
-                      </m:ctrlPr>
-                    </m:sSubPr>
-                    <m:e>
-                      <m:r>
-                        <w:rPr>
-                          <w:rFonts w:ascii="Cambria Math" w:hAnsi="Cambria Math" w:cs="Times New Roman"/>
-                        </w:rPr>
-                        <m:t>C</m:t>
-                      </m:r>
-                    </m:e>
-                    <m:sub>
-                      <m:r>
-                        <m:rPr>
-                          <m:sty m:val="p"/>
-                        </m:rPr>
-                        <w:rPr>
-                          <w:rFonts w:ascii="Cambria Math" w:hAnsi="Cambria Math" w:cs="Times New Roman"/>
-                        </w:rPr>
-                        <m:t>OH</m:t>
-                      </m:r>
-                    </m:sub>
-                  </m:sSub>
-                </m:num>
-                <m:den>
-                  <m:r>
-                    <m:rPr>
-                      <m:sty m:val="p"/>
-                    </m:rPr>
-                    <w:rPr>
-                      <w:rFonts w:ascii="Cambria Math" w:hAnsi="Cambria Math" w:cs="Times New Roman"/>
-                    </w:rPr>
-                    <m:t>∂</m:t>
-                  </m:r>
-                  <m:r>
-                    <w:rPr>
-                      <w:rFonts w:ascii="Cambria Math" w:hAnsi="Cambria Math" w:cs="Times New Roman"/>
-                    </w:rPr>
-                    <m:t>t</m:t>
-                  </m:r>
-                </m:den>
-              </m:f>
-              <m:r>
-                <m:rPr>
-                  <m:sty m:val="p"/>
-                </m:rPr>
-                <w:rPr>
-                  <w:rFonts w:ascii="Cambria Math" w:hAnsi="Cambria Math" w:cs="Times New Roman"/>
-                </w:rPr>
-                <m:t>=∇⋅</m:t>
-              </m:r>
-              <m:d>
-                <m:dPr>
-                  <m:ctrlPr>
-                    <w:rPr>
-                      <w:rFonts w:ascii="Cambria Math" w:hAnsi="Cambria Math" w:cs="Times New Roman"/>
-                    </w:rPr>
-                  </m:ctrlPr>
-                </m:dPr>
-                <m:e>
-                  <m:sSubSup>
-                    <m:sSubSupPr>
-                      <m:ctrlPr>
-                        <w:rPr>
-                          <w:rFonts w:ascii="Cambria Math" w:hAnsi="Cambria Math" w:cs="Times New Roman"/>
-                        </w:rPr>
-                      </m:ctrlPr>
-                    </m:sSubSupPr>
-                    <m:e>
-                      <m:r>
-                        <w:rPr>
-                          <w:rFonts w:ascii="Cambria Math" w:hAnsi="Cambria Math" w:cs="Times New Roman"/>
-                        </w:rPr>
-                        <m:t>D</m:t>
-                      </m:r>
-                    </m:e>
-                    <m:sub>
-                      <m:r>
-                        <m:rPr>
-                          <m:sty m:val="p"/>
-                        </m:rPr>
-                        <w:rPr>
-                          <w:rFonts w:ascii="Cambria Math" w:hAnsi="Cambria Math" w:cs="Times New Roman"/>
-                        </w:rPr>
-                        <m:t>OH</m:t>
-                      </m:r>
-                    </m:sub>
-                    <m:sup>
-                      <m:r>
-                        <m:rPr>
-                          <m:nor/>
-                        </m:rPr>
-                        <w:rPr>
-                          <w:rFonts w:cs="Times New Roman"/>
-                        </w:rPr>
-                        <m:t>eff</m:t>
-                      </m:r>
-                    </m:sup>
-                  </m:sSubSup>
-                  <m:r>
-                    <w:rPr>
-                      <w:rFonts w:ascii="Cambria Math" w:hAnsi="Cambria Math" w:cs="Times New Roman"/>
-                    </w:rPr>
-                    <m:t> </m:t>
-                  </m:r>
-                  <m:r>
-                    <m:rPr>
-                      <m:sty m:val="p"/>
-                    </m:rPr>
-                    <w:rPr>
-                      <w:rFonts w:ascii="Cambria Math" w:hAnsi="Cambria Math" w:cs="Times New Roman"/>
-                    </w:rPr>
-                    <m:t>∇</m:t>
-                  </m:r>
-                  <m:sSub>
-                    <m:sSubPr>
-                      <m:ctrlPr>
-                        <w:rPr>
-                          <w:rFonts w:ascii="Cambria Math" w:hAnsi="Cambria Math" w:cs="Times New Roman"/>
-                        </w:rPr>
-                      </m:ctrlPr>
-                    </m:sSubPr>
-                    <m:e>
-                      <m:r>
-                        <w:rPr>
-                          <w:rFonts w:ascii="Cambria Math" w:hAnsi="Cambria Math" w:cs="Times New Roman"/>
-                        </w:rPr>
-                        <m:t>C</m:t>
-                      </m:r>
-                    </m:e>
-                    <m:sub>
-                      <m:r>
-                        <m:rPr>
-                          <m:sty m:val="p"/>
-                        </m:rPr>
-                        <w:rPr>
-                          <w:rFonts w:ascii="Cambria Math" w:hAnsi="Cambria Math" w:cs="Times New Roman"/>
-                        </w:rPr>
-                        <m:t>OH</m:t>
-                      </m:r>
-                    </m:sub>
-                  </m:sSub>
-                </m:e>
-              </m:d>
-              <m:r>
-                <m:rPr>
-                  <m:sty m:val="p"/>
-                </m:rPr>
-                <w:rPr>
-                  <w:rFonts w:ascii="Cambria Math" w:hAnsi="Cambria Math" w:cs="Times New Roman"/>
-                </w:rPr>
-                <m:t>+</m:t>
-              </m:r>
-              <m:r>
-                <w:rPr>
-                  <w:rFonts w:ascii="Cambria Math" w:hAnsi="Cambria Math" w:cs="Times New Roman"/>
-                </w:rPr>
-                <m:t>4 </m:t>
-              </m:r>
-              <m:sSub>
-                <m:sSubPr>
-                  <m:ctrlPr>
-                    <w:rPr>
-                      <w:rFonts w:ascii="Cambria Math" w:hAnsi="Cambria Math" w:cs="Times New Roman"/>
-                    </w:rPr>
-                  </m:ctrlPr>
-                </m:sSubPr>
-                <m:e>
-                  <m:r>
-                    <w:rPr>
-                      <w:rFonts w:ascii="Cambria Math" w:hAnsi="Cambria Math" w:cs="Times New Roman"/>
-                    </w:rPr>
-                    <m:t>k</m:t>
-                  </m:r>
-                </m:e>
-                <m:sub>
-                  <m:r>
-                    <m:rPr>
-                      <m:sty m:val="p"/>
-                    </m:rPr>
-                    <w:rPr>
-                      <w:rFonts w:ascii="Cambria Math" w:hAnsi="Cambria Math" w:cs="Times New Roman"/>
-                    </w:rPr>
-                    <m:t>ORR</m:t>
-                  </m:r>
-                </m:sub>
-              </m:sSub>
-              <m:r>
-                <w:rPr>
-                  <w:rFonts w:ascii="Cambria Math" w:hAnsi="Cambria Math" w:cs="Times New Roman"/>
-                </w:rPr>
-                <m:t> </m:t>
-              </m:r>
-              <m:sSub>
-                <m:sSubPr>
-                  <m:ctrlPr>
-                    <w:rPr>
-                      <w:rFonts w:ascii="Cambria Math" w:hAnsi="Cambria Math" w:cs="Times New Roman"/>
-                    </w:rPr>
-                  </m:ctrlPr>
-                </m:sSubPr>
-                <m:e>
-                  <m:r>
-                    <w:rPr>
-                      <w:rFonts w:ascii="Cambria Math" w:hAnsi="Cambria Math" w:cs="Times New Roman"/>
-                    </w:rPr>
-                    <m:t>C</m:t>
-                  </m:r>
-                </m:e>
-                <m:sub>
-                  <m:sSub>
-                    <m:sSubPr>
-                      <m:ctrlPr>
-                        <w:rPr>
-                          <w:rFonts w:ascii="Cambria Math" w:hAnsi="Cambria Math" w:cs="Times New Roman"/>
-                        </w:rPr>
-                      </m:ctrlPr>
-                    </m:sSubPr>
-                    <m:e>
-                      <m:r>
-                        <m:rPr>
-                          <m:sty m:val="p"/>
-                        </m:rPr>
-                        <w:rPr>
-                          <w:rFonts w:ascii="Cambria Math" w:hAnsi="Cambria Math" w:cs="Times New Roman"/>
-                        </w:rPr>
-                        <m:t>O</m:t>
-                      </m:r>
-                    </m:e>
-                    <m:sub>
-                      <m:r>
-                        <m:rPr>
-                          <m:sty m:val="p"/>
-                        </m:rPr>
-                        <w:rPr>
-                          <w:rFonts w:ascii="Cambria Math" w:hAnsi="Cambria Math" w:cs="Times New Roman"/>
-                        </w:rPr>
-                        <m:t>2</m:t>
-                      </m:r>
-                    </m:sub>
-                  </m:sSub>
-                </m:sub>
-              </m:sSub>
-              <m:r>
-                <w:rPr>
-                  <w:rFonts w:ascii="Cambria Math" w:hAnsi="Cambria Math" w:cs="Times New Roman"/>
-                </w:rPr>
-                <m:t> </m:t>
-              </m:r>
-              <m:sSub>
-                <m:sSubPr>
-                  <m:ctrlPr>
-                    <w:rPr>
-                      <w:rFonts w:ascii="Cambria Math" w:hAnsi="Cambria Math" w:cs="Times New Roman"/>
-                    </w:rPr>
-                  </m:ctrlPr>
-                </m:sSubPr>
-                <m:e>
-                  <m:r>
-                    <w:rPr>
-                      <w:rFonts w:ascii="Cambria Math" w:hAnsi="Cambria Math" w:cs="Times New Roman"/>
-                    </w:rPr>
-                    <m:t>δ</m:t>
-                  </m:r>
-                </m:e>
-                <m:sub>
-                  <m:r>
-                    <m:rPr>
-                      <m:sty m:val="p"/>
-                    </m:rPr>
-                    <w:rPr>
-                      <w:rFonts w:ascii="Cambria Math" w:hAnsi="Cambria Math" w:cs="Times New Roman"/>
-                    </w:rPr>
-                    <m:t>Γ</m:t>
-                  </m:r>
-                </m:sub>
-              </m:sSub>
-              <m:r>
-                <w:rPr>
-                  <w:rFonts w:ascii="Cambria Math" w:hAnsi="Cambria Math" w:cs="Times New Roman"/>
-                </w:rPr>
-                <m:t>-2</m:t>
-              </m:r>
-              <m:sSub>
-                <m:sSubPr>
-                  <m:ctrlPr>
-                    <w:rPr>
-                      <w:rFonts w:ascii="Cambria Math" w:hAnsi="Cambria Math" w:cs="Times New Roman"/>
-                    </w:rPr>
-                  </m:ctrlPr>
-                </m:sSubPr>
-                <m:e>
-                  <m:r>
-                    <w:rPr>
-                      <w:rFonts w:ascii="Cambria Math" w:hAnsi="Cambria Math" w:cs="Times New Roman"/>
-                    </w:rPr>
-                    <m:t>k</m:t>
-                  </m:r>
-                </m:e>
-                <m:sub>
-                  <m:r>
-                    <w:rPr>
-                      <w:rFonts w:ascii="Cambria Math" w:hAnsi="Cambria Math" w:cs="Times New Roman"/>
-                    </w:rPr>
-                    <m:t>f</m:t>
-                  </m:r>
-                </m:sub>
-              </m:sSub>
-              <m:sSub>
-                <m:sSubPr>
-                  <m:ctrlPr>
-                    <w:rPr>
-                      <w:rFonts w:ascii="Cambria Math" w:hAnsi="Cambria Math" w:cs="Times New Roman"/>
-                    </w:rPr>
-                  </m:ctrlPr>
-                </m:sSubPr>
-                <m:e>
-                  <m:r>
-                    <w:rPr>
-                      <w:rFonts w:ascii="Cambria Math" w:hAnsi="Cambria Math" w:cs="Times New Roman"/>
-                    </w:rPr>
-                    <m:t>C</m:t>
-                  </m:r>
-                </m:e>
-                <m:sub>
-                  <m:r>
-                    <m:rPr>
-                      <m:sty m:val="p"/>
-                    </m:rPr>
-                    <w:rPr>
-                      <w:rFonts w:ascii="Cambria Math" w:hAnsi="Cambria Math" w:cs="Times New Roman"/>
-                    </w:rPr>
-                    <m:t>Zn</m:t>
-                  </m:r>
-                </m:sub>
-              </m:sSub>
-              <m:d>
-                <m:dPr>
-                  <m:ctrlPr>
-                    <w:rPr>
-                      <w:rFonts w:ascii="Cambria Math" w:hAnsi="Cambria Math" w:cs="Times New Roman"/>
-                      <w:i/>
-                    </w:rPr>
-                  </m:ctrlPr>
-                </m:dPr>
-                <m:e>
-                  <m:r>
-                    <w:rPr>
-                      <w:rFonts w:ascii="Cambria Math" w:hAnsi="Cambria Math" w:cs="Times New Roman"/>
-                    </w:rPr>
-                    <m:t>1-</m:t>
-                  </m:r>
-                  <m:f>
-                    <m:fPr>
-                      <m:ctrlPr>
-                        <w:rPr>
-                          <w:rFonts w:ascii="Cambria Math" w:hAnsi="Cambria Math" w:cs="Times New Roman"/>
-                          <w:i/>
-                        </w:rPr>
-                      </m:ctrlPr>
-                    </m:fPr>
-                    <m:num>
-                      <m:r>
-                        <w:rPr>
-                          <w:rFonts w:ascii="Cambria Math" w:hAnsi="Cambria Math" w:cs="Times New Roman"/>
-                        </w:rPr>
-                        <m:t>F</m:t>
-                      </m:r>
-                    </m:num>
-                    <m:den>
-                      <m:sSub>
-                        <m:sSubPr>
-                          <m:ctrlPr>
-                            <w:rPr>
-                              <w:rFonts w:ascii="Cambria Math" w:hAnsi="Cambria Math" w:cs="Times New Roman"/>
-                              <w:i/>
-                            </w:rPr>
-                          </m:ctrlPr>
-                        </m:sSubPr>
-                        <m:e>
-                          <m:r>
-                            <w:rPr>
-                              <w:rFonts w:ascii="Cambria Math" w:hAnsi="Cambria Math" w:cs="Times New Roman"/>
-                            </w:rPr>
-                            <m:t>F</m:t>
-                          </m:r>
-                        </m:e>
-                        <m:sub>
-                          <m:r>
-                            <w:rPr>
-                              <w:rFonts w:ascii="Cambria Math" w:hAnsi="Cambria Math" w:cs="Times New Roman"/>
-                            </w:rPr>
-                            <m:t>max</m:t>
-                          </m:r>
-                        </m:sub>
-                      </m:sSub>
-                    </m:den>
-                  </m:f>
-                </m:e>
-              </m:d>
-              <m:r>
-                <w:rPr>
-                  <w:rFonts w:ascii="Cambria Math" w:hAnsi="Cambria Math" w:cs="Times New Roman"/>
-                </w:rPr>
-                <m:t>+</m:t>
-              </m:r>
-              <m:sSub>
-                <m:sSubPr>
-                  <m:ctrlPr>
-                    <w:rPr>
-                      <w:rFonts w:ascii="Cambria Math" w:hAnsi="Cambria Math" w:cs="Times New Roman"/>
-                    </w:rPr>
-                  </m:ctrlPr>
-                </m:sSubPr>
-                <m:e>
-                  <m:r>
-                    <w:rPr>
-                      <w:rFonts w:ascii="Cambria Math" w:hAnsi="Cambria Math" w:cs="Times New Roman"/>
-                    </w:rPr>
-                    <m:t>k</m:t>
-                  </m:r>
-                </m:e>
-                <m:sub>
-                  <m:r>
-                    <w:rPr>
-                      <w:rFonts w:ascii="Cambria Math" w:hAnsi="Cambria Math" w:cs="Times New Roman"/>
-                    </w:rPr>
-                    <m:t>d</m:t>
-                  </m:r>
-                </m:sub>
-              </m:sSub>
-              <m:r>
-                <w:rPr>
-                  <w:rFonts w:ascii="Cambria Math" w:hAnsi="Cambria Math" w:cs="Times New Roman"/>
-                </w:rPr>
-                <m:t> F </m:t>
-              </m:r>
-              <m:sSubSup>
-                <m:sSubSupPr>
-                  <m:ctrlPr>
-                    <w:rPr>
-                      <w:rFonts w:ascii="Cambria Math" w:hAnsi="Cambria Math" w:cs="Times New Roman"/>
-                    </w:rPr>
-                  </m:ctrlPr>
-                </m:sSubSupPr>
-                <m:e>
-                  <m:r>
-                    <w:rPr>
-                      <w:rFonts w:ascii="Cambria Math" w:hAnsi="Cambria Math" w:cs="Times New Roman"/>
-                    </w:rPr>
-                    <m:t>C</m:t>
-                  </m:r>
-                </m:e>
-                <m:sub>
-                  <m:r>
-                    <m:rPr>
-                      <m:sty m:val="p"/>
-                    </m:rPr>
-                    <w:rPr>
-                      <w:rFonts w:ascii="Cambria Math" w:hAnsi="Cambria Math" w:cs="Times New Roman"/>
-                    </w:rPr>
-                    <m:t>Cl</m:t>
-                  </m:r>
-                </m:sub>
-                <m:sup>
-                  <m:r>
-                    <w:rPr>
-                      <w:rFonts w:ascii="Cambria Math" w:hAnsi="Cambria Math" w:cs="Times New Roman"/>
-                    </w:rPr>
-                    <m:t>2</m:t>
-                  </m:r>
-                </m:sup>
-              </m:sSubSup>
-            </m:e>
-          </m:mr>
-        </m:m>
-      </m:oMath>
-      <w:r>
-        <w:rPr>
-          <w:rFonts w:cs="Times New Roman"/>
-        </w:rPr>
-        <w:tab/>
-        <w:t>(</w:t>
-      </w:r>
-      <w:r>
-        <w:rPr>
-          <w:rFonts w:cs="Times New Roman"/>
-        </w:rPr>
-        <w:t>8</w:t>
-      </w:r>
-      <w:r>
-        <w:rPr>
-          <w:rFonts w:cs="Times New Roman"/>
-        </w:rPr>
-        <w:t>)</w:t>
-      </w:r>
-    </w:p>
-    <w:p>
-      <w:pPr>
-        <w:pStyle w:val="BodyText"/>
-        <w:ind w:firstLine="0"/>
-        <w:rPr>
-          <w:rFonts w:cs="Times New Roman"/>
-        </w:rPr>
-      </w:pPr>
-      <w:r>
-        <w:rPr>
-          <w:rFonts w:cs="Times New Roman"/>
-        </w:rPr>
-        <w:t>Chloride acts as a catalytic species, being regenerated during film breakdown rather than consumed</w:t>
-      </w:r>
-      <w:r>
-        <w:rPr>
-          <w:rFonts w:cs="Times New Roman"/>
-        </w:rPr>
-        <w:t xml:space="preserve"> </w:t>
+        <w:t xml:space="preserve">Chloride acts as a catalytic species, being regenerated during film breakdown rather than consumed </w:t>
       </w:r>
       <w:r>
         <w:rPr>
@@ -5207,7 +4674,7 @@
         <w:rPr>
           <w:rFonts w:cs="Times New Roman"/>
         </w:rPr>
-        <w:t>9</w:t>
+        <w:t>8</w:t>
       </w:r>
       <w:r>
         <w:rPr>
@@ -5275,7 +4742,112 @@
         <w:rPr>
           <w:rFonts w:cs="Times New Roman"/>
         </w:rPr>
-        <w:t xml:space="preserve"> ions into the electrolyte. These dissolved ions may either remain in solution or precipitate to form corrosion products. Their transport and reaction are described by:</w:t>
+        <w:t xml:space="preserve"> ions into the electrolyte</w:t>
+      </w:r>
+      <w:r>
+        <w:rPr>
+          <w:rFonts w:cs="Times New Roman"/>
+        </w:rPr>
+        <w:t>,</w:t>
+      </w:r>
+      <w:r>
+        <w:rPr>
+          <w:rFonts w:cs="Times New Roman"/>
+        </w:rPr>
+        <w:t xml:space="preserve"> </w:t>
+      </w:r>
+      <w:r>
+        <w:rPr>
+          <w:rFonts w:cs="Times New Roman"/>
+        </w:rPr>
+        <w:t>where they may either remain in solution or precipitate as corrosion products</w:t>
+      </w:r>
+      <w:r>
+        <w:rPr>
+          <w:rFonts w:cs="Times New Roman"/>
+        </w:rPr>
+        <w:t xml:space="preserve">. </w:t>
+      </w:r>
+      <w:r>
+        <w:rPr>
+          <w:rFonts w:cs="Times New Roman"/>
+        </w:rPr>
+        <w:t>At the metal-electrolyte interface, oxygen reduction proceeds via the four-electron ORR</w:t>
+      </w:r>
+      <w:r>
+        <w:rPr>
+          <w:rFonts w:cs="Times New Roman"/>
+        </w:rPr>
+        <w:t xml:space="preserve"> </w:t>
+      </w:r>
+      <w:r>
+        <w:rPr>
+          <w:rFonts w:cs="Times New Roman"/>
+        </w:rPr>
+        <w:fldChar w:fldCharType="begin"/>
+      </w:r>
+      <w:r>
+        <w:rPr>
+          <w:rFonts w:cs="Times New Roman"/>
+        </w:rPr>
+        <w:instrText xml:space="preserve"> ADDIN ZOTERO_ITEM CSL_CITATION {"citationID":"rN5Gluur","properties":{"unsorted":false,"formattedCitation":"\\super [22]\\nosupersub{}","plainCitation":"[22]","noteIndex":0},"citationItems":[{"id":3601,"uris":["http://zotero.org/users/16939557/items/WLSBQ7BL"],"itemData":{"id":3601,"type":"article-journal","citation-key":"yadavOxygenReductionMechanism2005","container-title":"Journal of Electroanalytical Chemistry","DOI":"10.1016/j.jelechem.2005.08.007","ISSN":"15726657","issue":"1","journalAbbreviation":"Journal of Electroanalytical Chemistry","language":"en","license":"https://www.elsevier.com/tdm/userlicense/1.0/","page":"142-149","source":"DOI.org (Crossref)","title":"Oxygen reduction mechanism on corroded zinc","volume":"585","author":[{"family":"Yadav","given":"Amar Prasad"},{"family":"Nishikata","given":"Atsushi"},{"family":"Tsuru","given":"Tooru"}],"issued":{"date-parts":[["2005",11]]}}}],"schema":"https://github.com/citation-style-language/schema/raw/master/csl-citation.json"} </w:instrText>
+      </w:r>
+      <w:r>
+        <w:rPr>
+          <w:rFonts w:cs="Times New Roman"/>
+        </w:rPr>
+        <w:fldChar w:fldCharType="separate"/>
+      </w:r>
+      <w:r>
+        <w:rPr>
+          <w:rFonts w:cs="Times New Roman"/>
+          <w:vertAlign w:val="superscript"/>
+        </w:rPr>
+        <w:t>[22]</w:t>
+      </w:r>
+      <w:r>
+        <w:rPr>
+          <w:rFonts w:cs="Times New Roman"/>
+        </w:rPr>
+        <w:fldChar w:fldCharType="end"/>
+      </w:r>
+      <w:r>
+        <w:rPr>
+          <w:rFonts w:cs="Times New Roman"/>
+        </w:rPr>
+        <w:t xml:space="preserve">, </w:t>
+      </w:r>
+      <w:r>
+        <w:rPr>
+          <w:rFonts w:cs="Times New Roman"/>
+        </w:rPr>
+        <w:t xml:space="preserve">generating OH⁻ ions that increase the local alkalinity and promote formation of a </w:t>
+      </w:r>
+      <w:proofErr w:type="spellStart"/>
+      <w:r>
+        <w:rPr>
+          <w:rFonts w:cs="Times New Roman"/>
+        </w:rPr>
+        <w:t>ZnO</w:t>
+      </w:r>
+      <w:proofErr w:type="spellEnd"/>
+      <w:r>
+        <w:rPr>
+          <w:rFonts w:cs="Times New Roman"/>
+        </w:rPr>
+        <w:t>-based corrosion-product film</w:t>
+      </w:r>
+      <w:r>
+        <w:rPr>
+          <w:rFonts w:cs="Times New Roman"/>
+        </w:rPr>
+        <w:t>. At the same time, chloride-induced film dissolution releases hydroxide back into the electrolyte</w:t>
+      </w:r>
+      <w:r>
+        <w:rPr>
+          <w:rFonts w:cs="Times New Roman"/>
+        </w:rPr>
+        <w:t>.</w:t>
       </w:r>
     </w:p>
     <w:p>
@@ -5665,13 +5237,13 @@
           <w:rFonts w:cs="Times New Roman"/>
         </w:rPr>
         <w:tab/>
-        <w:t>(1</w:t>
-      </w:r>
-      <w:r>
-        <w:rPr>
-          <w:rFonts w:cs="Times New Roman"/>
-        </w:rPr>
-        <w:t>0</w:t>
+        <w:t>(</w:t>
+      </w:r>
+      <w:r>
+        <w:rPr>
+          <w:rFonts w:cs="Times New Roman"/>
+        </w:rPr>
+        <w:t>9</w:t>
       </w:r>
       <w:r>
         <w:rPr>
@@ -5679,6 +5251,424 @@
         </w:rPr>
         <w:t>)</w:t>
       </w:r>
+    </w:p>
+    <w:p>
+      <w:pPr>
+        <w:pStyle w:val="BodyText"/>
+        <w:tabs>
+          <w:tab w:val="right" w:pos="9360"/>
+        </w:tabs>
+        <w:spacing w:before="240" w:after="240"/>
+        <w:ind w:firstLine="0"/>
+        <w:rPr>
+          <w:rFonts w:cs="Times New Roman"/>
+        </w:rPr>
+      </w:pPr>
+      <m:oMath>
+        <m:m>
+          <m:mPr>
+            <m:plcHide m:val="1"/>
+            <m:mcs>
+              <m:mc>
+                <m:mcPr>
+                  <m:count m:val="1"/>
+                  <m:mcJc m:val="right"/>
+                </m:mcPr>
+              </m:mc>
+            </m:mcs>
+            <m:ctrlPr>
+              <w:rPr>
+                <w:rFonts w:ascii="Cambria Math" w:hAnsi="Cambria Math" w:cs="Times New Roman"/>
+              </w:rPr>
+            </m:ctrlPr>
+          </m:mPr>
+          <m:mr>
+            <m:e>
+              <m:f>
+                <m:fPr>
+                  <m:ctrlPr>
+                    <w:rPr>
+                      <w:rFonts w:ascii="Cambria Math" w:hAnsi="Cambria Math" w:cs="Times New Roman"/>
+                    </w:rPr>
+                  </m:ctrlPr>
+                </m:fPr>
+                <m:num>
+                  <m:r>
+                    <m:rPr>
+                      <m:sty m:val="p"/>
+                    </m:rPr>
+                    <w:rPr>
+                      <w:rFonts w:ascii="Cambria Math" w:hAnsi="Cambria Math" w:cs="Times New Roman"/>
+                    </w:rPr>
+                    <m:t>∂</m:t>
+                  </m:r>
+                  <m:sSub>
+                    <m:sSubPr>
+                      <m:ctrlPr>
+                        <w:rPr>
+                          <w:rFonts w:ascii="Cambria Math" w:hAnsi="Cambria Math" w:cs="Times New Roman"/>
+                        </w:rPr>
+                      </m:ctrlPr>
+                    </m:sSubPr>
+                    <m:e>
+                      <m:r>
+                        <w:rPr>
+                          <w:rFonts w:ascii="Cambria Math" w:hAnsi="Cambria Math" w:cs="Times New Roman"/>
+                        </w:rPr>
+                        <m:t>C</m:t>
+                      </m:r>
+                    </m:e>
+                    <m:sub>
+                      <m:r>
+                        <m:rPr>
+                          <m:sty m:val="p"/>
+                        </m:rPr>
+                        <w:rPr>
+                          <w:rFonts w:ascii="Cambria Math" w:hAnsi="Cambria Math" w:cs="Times New Roman"/>
+                        </w:rPr>
+                        <m:t>OH</m:t>
+                      </m:r>
+                    </m:sub>
+                  </m:sSub>
+                </m:num>
+                <m:den>
+                  <m:r>
+                    <m:rPr>
+                      <m:sty m:val="p"/>
+                    </m:rPr>
+                    <w:rPr>
+                      <w:rFonts w:ascii="Cambria Math" w:hAnsi="Cambria Math" w:cs="Times New Roman"/>
+                    </w:rPr>
+                    <m:t>∂</m:t>
+                  </m:r>
+                  <m:r>
+                    <w:rPr>
+                      <w:rFonts w:ascii="Cambria Math" w:hAnsi="Cambria Math" w:cs="Times New Roman"/>
+                    </w:rPr>
+                    <m:t>t</m:t>
+                  </m:r>
+                </m:den>
+              </m:f>
+              <m:r>
+                <m:rPr>
+                  <m:sty m:val="p"/>
+                </m:rPr>
+                <w:rPr>
+                  <w:rFonts w:ascii="Cambria Math" w:hAnsi="Cambria Math" w:cs="Times New Roman"/>
+                </w:rPr>
+                <m:t>=∇⋅</m:t>
+              </m:r>
+              <m:d>
+                <m:dPr>
+                  <m:ctrlPr>
+                    <w:rPr>
+                      <w:rFonts w:ascii="Cambria Math" w:hAnsi="Cambria Math" w:cs="Times New Roman"/>
+                    </w:rPr>
+                  </m:ctrlPr>
+                </m:dPr>
+                <m:e>
+                  <m:sSubSup>
+                    <m:sSubSupPr>
+                      <m:ctrlPr>
+                        <w:rPr>
+                          <w:rFonts w:ascii="Cambria Math" w:hAnsi="Cambria Math" w:cs="Times New Roman"/>
+                        </w:rPr>
+                      </m:ctrlPr>
+                    </m:sSubSupPr>
+                    <m:e>
+                      <m:r>
+                        <w:rPr>
+                          <w:rFonts w:ascii="Cambria Math" w:hAnsi="Cambria Math" w:cs="Times New Roman"/>
+                        </w:rPr>
+                        <m:t>D</m:t>
+                      </m:r>
+                    </m:e>
+                    <m:sub>
+                      <m:r>
+                        <m:rPr>
+                          <m:sty m:val="p"/>
+                        </m:rPr>
+                        <w:rPr>
+                          <w:rFonts w:ascii="Cambria Math" w:hAnsi="Cambria Math" w:cs="Times New Roman"/>
+                        </w:rPr>
+                        <m:t>OH</m:t>
+                      </m:r>
+                    </m:sub>
+                    <m:sup>
+                      <m:r>
+                        <m:rPr>
+                          <m:nor/>
+                        </m:rPr>
+                        <w:rPr>
+                          <w:rFonts w:cs="Times New Roman"/>
+                        </w:rPr>
+                        <m:t>eff</m:t>
+                      </m:r>
+                    </m:sup>
+                  </m:sSubSup>
+                  <m:r>
+                    <w:rPr>
+                      <w:rFonts w:ascii="Cambria Math" w:hAnsi="Cambria Math" w:cs="Times New Roman"/>
+                    </w:rPr>
+                    <m:t> </m:t>
+                  </m:r>
+                  <m:r>
+                    <m:rPr>
+                      <m:sty m:val="p"/>
+                    </m:rPr>
+                    <w:rPr>
+                      <w:rFonts w:ascii="Cambria Math" w:hAnsi="Cambria Math" w:cs="Times New Roman"/>
+                    </w:rPr>
+                    <m:t>∇</m:t>
+                  </m:r>
+                  <m:sSub>
+                    <m:sSubPr>
+                      <m:ctrlPr>
+                        <w:rPr>
+                          <w:rFonts w:ascii="Cambria Math" w:hAnsi="Cambria Math" w:cs="Times New Roman"/>
+                        </w:rPr>
+                      </m:ctrlPr>
+                    </m:sSubPr>
+                    <m:e>
+                      <m:r>
+                        <w:rPr>
+                          <w:rFonts w:ascii="Cambria Math" w:hAnsi="Cambria Math" w:cs="Times New Roman"/>
+                        </w:rPr>
+                        <m:t>C</m:t>
+                      </m:r>
+                    </m:e>
+                    <m:sub>
+                      <m:r>
+                        <m:rPr>
+                          <m:sty m:val="p"/>
+                        </m:rPr>
+                        <w:rPr>
+                          <w:rFonts w:ascii="Cambria Math" w:hAnsi="Cambria Math" w:cs="Times New Roman"/>
+                        </w:rPr>
+                        <m:t>OH</m:t>
+                      </m:r>
+                    </m:sub>
+                  </m:sSub>
+                </m:e>
+              </m:d>
+              <m:r>
+                <m:rPr>
+                  <m:sty m:val="p"/>
+                </m:rPr>
+                <w:rPr>
+                  <w:rFonts w:ascii="Cambria Math" w:hAnsi="Cambria Math" w:cs="Times New Roman"/>
+                </w:rPr>
+                <m:t>+</m:t>
+              </m:r>
+              <m:r>
+                <w:rPr>
+                  <w:rFonts w:ascii="Cambria Math" w:hAnsi="Cambria Math" w:cs="Times New Roman"/>
+                </w:rPr>
+                <m:t>4 </m:t>
+              </m:r>
+              <m:sSub>
+                <m:sSubPr>
+                  <m:ctrlPr>
+                    <w:rPr>
+                      <w:rFonts w:ascii="Cambria Math" w:hAnsi="Cambria Math" w:cs="Times New Roman"/>
+                    </w:rPr>
+                  </m:ctrlPr>
+                </m:sSubPr>
+                <m:e>
+                  <m:r>
+                    <w:rPr>
+                      <w:rFonts w:ascii="Cambria Math" w:hAnsi="Cambria Math" w:cs="Times New Roman"/>
+                    </w:rPr>
+                    <m:t>k</m:t>
+                  </m:r>
+                </m:e>
+                <m:sub>
+                  <m:r>
+                    <m:rPr>
+                      <m:sty m:val="p"/>
+                    </m:rPr>
+                    <w:rPr>
+                      <w:rFonts w:ascii="Cambria Math" w:hAnsi="Cambria Math" w:cs="Times New Roman"/>
+                    </w:rPr>
+                    <m:t>ORR</m:t>
+                  </m:r>
+                </m:sub>
+              </m:sSub>
+              <m:r>
+                <w:rPr>
+                  <w:rFonts w:ascii="Cambria Math" w:hAnsi="Cambria Math" w:cs="Times New Roman"/>
+                </w:rPr>
+                <m:t> </m:t>
+              </m:r>
+              <m:sSub>
+                <m:sSubPr>
+                  <m:ctrlPr>
+                    <w:rPr>
+                      <w:rFonts w:ascii="Cambria Math" w:hAnsi="Cambria Math" w:cs="Times New Roman"/>
+                    </w:rPr>
+                  </m:ctrlPr>
+                </m:sSubPr>
+                <m:e>
+                  <m:r>
+                    <w:rPr>
+                      <w:rFonts w:ascii="Cambria Math" w:hAnsi="Cambria Math" w:cs="Times New Roman"/>
+                    </w:rPr>
+                    <m:t>C</m:t>
+                  </m:r>
+                </m:e>
+                <m:sub>
+                  <m:sSub>
+                    <m:sSubPr>
+                      <m:ctrlPr>
+                        <w:rPr>
+                          <w:rFonts w:ascii="Cambria Math" w:hAnsi="Cambria Math" w:cs="Times New Roman"/>
+                        </w:rPr>
+                      </m:ctrlPr>
+                    </m:sSubPr>
+                    <m:e>
+                      <m:r>
+                        <m:rPr>
+                          <m:sty m:val="p"/>
+                        </m:rPr>
+                        <w:rPr>
+                          <w:rFonts w:ascii="Cambria Math" w:hAnsi="Cambria Math" w:cs="Times New Roman"/>
+                        </w:rPr>
+                        <m:t>O</m:t>
+                      </m:r>
+                    </m:e>
+                    <m:sub>
+                      <m:r>
+                        <m:rPr>
+                          <m:sty m:val="p"/>
+                        </m:rPr>
+                        <w:rPr>
+                          <w:rFonts w:ascii="Cambria Math" w:hAnsi="Cambria Math" w:cs="Times New Roman"/>
+                        </w:rPr>
+                        <m:t>2</m:t>
+                      </m:r>
+                    </m:sub>
+                  </m:sSub>
+                </m:sub>
+              </m:sSub>
+              <m:r>
+                <w:rPr>
+                  <w:rFonts w:ascii="Cambria Math" w:hAnsi="Cambria Math" w:cs="Times New Roman"/>
+                </w:rPr>
+                <m:t> </m:t>
+              </m:r>
+              <m:sSub>
+                <m:sSubPr>
+                  <m:ctrlPr>
+                    <w:rPr>
+                      <w:rFonts w:ascii="Cambria Math" w:hAnsi="Cambria Math" w:cs="Times New Roman"/>
+                    </w:rPr>
+                  </m:ctrlPr>
+                </m:sSubPr>
+                <m:e>
+                  <m:r>
+                    <w:rPr>
+                      <w:rFonts w:ascii="Cambria Math" w:hAnsi="Cambria Math" w:cs="Times New Roman"/>
+                    </w:rPr>
+                    <m:t>δ</m:t>
+                  </m:r>
+                </m:e>
+                <m:sub>
+                  <m:r>
+                    <m:rPr>
+                      <m:sty m:val="p"/>
+                    </m:rPr>
+                    <w:rPr>
+                      <w:rFonts w:ascii="Cambria Math" w:hAnsi="Cambria Math" w:cs="Times New Roman"/>
+                    </w:rPr>
+                    <m:t>Γ</m:t>
+                  </m:r>
+                </m:sub>
+              </m:sSub>
+              <m:r>
+                <w:rPr>
+                  <w:rFonts w:ascii="Cambria Math" w:hAnsi="Cambria Math" w:cs="Times New Roman"/>
+                </w:rPr>
+                <m:t>-2</m:t>
+              </m:r>
+              <m:f>
+                <m:fPr>
+                  <m:ctrlPr>
+                    <w:rPr>
+                      <w:rFonts w:ascii="Cambria Math" w:hAnsi="Cambria Math" w:cs="Times New Roman"/>
+                    </w:rPr>
+                  </m:ctrlPr>
+                </m:fPr>
+                <m:num>
+                  <m:r>
+                    <m:rPr>
+                      <m:sty m:val="p"/>
+                    </m:rPr>
+                    <w:rPr>
+                      <w:rFonts w:ascii="Cambria Math" w:hAnsi="Cambria Math" w:cs="Times New Roman"/>
+                    </w:rPr>
+                    <m:t>∂</m:t>
+                  </m:r>
+                  <m:r>
+                    <w:rPr>
+                      <w:rFonts w:ascii="Cambria Math" w:hAnsi="Cambria Math" w:cs="Times New Roman"/>
+                    </w:rPr>
+                    <m:t>F</m:t>
+                  </m:r>
+                </m:num>
+                <m:den>
+                  <m:r>
+                    <m:rPr>
+                      <m:sty m:val="p"/>
+                    </m:rPr>
+                    <w:rPr>
+                      <w:rFonts w:ascii="Cambria Math" w:hAnsi="Cambria Math" w:cs="Times New Roman"/>
+                    </w:rPr>
+                    <m:t>∂</m:t>
+                  </m:r>
+                  <m:r>
+                    <w:rPr>
+                      <w:rFonts w:ascii="Cambria Math" w:hAnsi="Cambria Math" w:cs="Times New Roman"/>
+                    </w:rPr>
+                    <m:t>t</m:t>
+                  </m:r>
+                </m:den>
+              </m:f>
+            </m:e>
+          </m:mr>
+        </m:m>
+      </m:oMath>
+      <w:r>
+        <w:rPr>
+          <w:rFonts w:cs="Times New Roman"/>
+        </w:rPr>
+        <w:tab/>
+        <w:t>(</w:t>
+      </w:r>
+      <w:r>
+        <w:rPr>
+          <w:rFonts w:cs="Times New Roman"/>
+        </w:rPr>
+        <w:t>10</w:t>
+      </w:r>
+      <w:r>
+        <w:rPr>
+          <w:rFonts w:cs="Times New Roman"/>
+        </w:rPr>
+        <w:t>)</w:t>
+      </w:r>
+    </w:p>
+    <w:p>
+      <w:pPr>
+        <w:pStyle w:val="BodyText"/>
+        <w:tabs>
+          <w:tab w:val="right" w:pos="9360"/>
+        </w:tabs>
+        <w:spacing w:before="240" w:after="240"/>
+        <w:ind w:firstLine="0"/>
+        <w:rPr>
+          <w:rFonts w:cs="Times New Roman"/>
+        </w:rPr>
+      </w:pPr>
     </w:p>
     <w:p>
       <w:pPr>
@@ -5740,7 +5730,15 @@
         <w:t>the</w:t>
       </w:r>
       <w:r>
-        <w:t xml:space="preserve"> balance between ZnO precipitation and chloride-mediated dissolution</w:t>
+        <w:t xml:space="preserve"> balance between </w:t>
+      </w:r>
+      <w:proofErr w:type="spellStart"/>
+      <w:r>
+        <w:t>ZnO</w:t>
+      </w:r>
+      <w:proofErr w:type="spellEnd"/>
+      <w:r>
+        <w:t xml:space="preserve"> precipitation and chloride-mediated dissolution</w:t>
       </w:r>
       <w:r>
         <w:t xml:space="preserve"> as follows</w:t>
@@ -5993,6 +5991,7 @@
             <m:ctrlPr>
               <w:rPr>
                 <w:rFonts w:ascii="Cambria Math" w:hAnsi="Cambria Math" w:cs="Times New Roman"/>
+                <w:i/>
               </w:rPr>
             </m:ctrlPr>
           </m:sSubSupPr>
@@ -8712,7 +8711,15 @@
         <w:pStyle w:val="BodyText"/>
       </w:pPr>
       <w:r>
-        <w:t xml:space="preserve">The coupled reaction-diffusion and moving-boundary framework was implemented in FreeFEM++ and solved using first-order finite elements with implicit time integration. </w:t>
+        <w:t xml:space="preserve">The coupled reaction-diffusion and moving-boundary framework was implemented in </w:t>
+      </w:r>
+      <w:proofErr w:type="spellStart"/>
+      <w:r>
+        <w:t>FreeFEM</w:t>
+      </w:r>
+      <w:proofErr w:type="spellEnd"/>
+      <w:r>
+        <w:t xml:space="preserve">++ and solved using first-order finite elements with implicit time integration. </w:t>
       </w:r>
       <w:r>
         <w:t xml:space="preserve">Parametrically generated implant geometries were discretized into tetrahedral meshes and embedded within an electrolyte domain at least three times larger than the implant characteristic dimension in each direction to minimize boundary effects. </w:t>
@@ -8745,7 +8752,15 @@
         <w:pStyle w:val="BodyText"/>
       </w:pPr>
       <w:r>
-        <w:t xml:space="preserve">Physiological initial and boundary conditions were imposed throughout the electrolyte domain, including continuous oxygen replenishment at the electrolyte-air interface and kinetic flux conditions at the moving metal-electrolyte boundary. Simulations were executed in parallel using FreeFEM++ MPI on a high-performance computing cluster, and degradation metrics </w:t>
+        <w:t xml:space="preserve">Physiological initial and boundary conditions were imposed throughout the electrolyte domain, including continuous oxygen replenishment at the electrolyte-air interface and kinetic flux conditions at the moving metal-electrolyte boundary. Simulations were executed in parallel using </w:t>
+      </w:r>
+      <w:proofErr w:type="spellStart"/>
+      <w:r>
+        <w:t>FreeFEM</w:t>
+      </w:r>
+      <w:proofErr w:type="spellEnd"/>
+      <w:r>
+        <w:t xml:space="preserve">++ MPI on a high-performance computing cluster, and degradation metrics </w:t>
       </w:r>
       <w:r>
         <w:lastRenderedPageBreak/>
@@ -8784,7 +8799,15 @@
         <w:t>, and dissolved oxygen concentration</w:t>
       </w:r>
       <w:r>
-        <w:t xml:space="preserve"> were extracted during post-processing. The transition between reaction-controlled and diffusion-controlled degradation was quantified using the local Damköhler number (</w:t>
+        <w:t xml:space="preserve"> were extracted during post-processing. The transition between reaction-controlled and diffusion-controlled degradation was quantified using the local </w:t>
+      </w:r>
+      <w:proofErr w:type="spellStart"/>
+      <w:r>
+        <w:t>Damköhler</w:t>
+      </w:r>
+      <w:proofErr w:type="spellEnd"/>
+      <w:r>
+        <w:t xml:space="preserve"> number (</w:t>
       </w:r>
       <w:r>
         <w:rPr>
@@ -12641,7 +12664,17 @@
         <w:pStyle w:val="BodyText"/>
       </w:pPr>
       <w:r>
-        <w:t xml:space="preserve">To identify the dominant factors governing Zn biodegradation, a global sensitivity analysis (GSA) was performed using the Morris elementary effects method. Eight parameters associated with oxygen transport, corrosion-product evolution, electrochemical kinetics, and ionic diffusion were evaluated for their influence on cumulative mass loss (Section S4). </w:t>
+        <w:t>To identify the dominant factors governing Zn biodegradation, a global sensitivity analysis (GSA) was performed using the Morris elementary effects method. Eight parameters associated with oxygen transport, corrosion-product evolution, electrochemical kinetics, and ionic diffusion were evaluated for their influence on cumulative mass loss (</w:t>
+      </w:r>
+      <w:r>
+        <w:rPr>
+          <w:b/>
+          <w:bCs/>
+        </w:rPr>
+        <w:t>Section S4</w:t>
+      </w:r>
+      <w:r>
+        <w:t xml:space="preserve">). </w:t>
       </w:r>
       <w:r>
         <w:t>This analysis identified the three effective kinetic parameters</w:t>
@@ -12749,16 +12782,35 @@
         <w:t xml:space="preserve"> </w:t>
       </w:r>
       <w:r>
-        <w:t xml:space="preserve">Following </w:t>
-      </w:r>
-      <w:r>
-        <w:t xml:space="preserve">the sensitivity analysis, the identified kinetic parameters </w:t>
-      </w:r>
-      <w:r>
-        <w:t xml:space="preserve">were calibrated within the full 3D model using Bayesian optimization. </w:t>
-      </w:r>
-      <w:r>
-        <w:t>A Gaussian Process surrogate model was initialized using a 12-point Latin Hypercube sampling (LHS) design spanning the admissible parameter space and iteratively refined using the Expected Improvement acquisition function. The calibration</w:t>
+        <w:t>These</w:t>
+      </w:r>
+      <w:r>
+        <w:t xml:space="preserve"> identified kinetic parameters </w:t>
+      </w:r>
+      <w:r>
+        <w:t>were calibrated using Bayesian optimization</w:t>
+      </w:r>
+      <w:r>
+        <w:t xml:space="preserve"> </w:t>
+      </w:r>
+      <w:r>
+        <w:t>(</w:t>
+      </w:r>
+      <w:r>
+        <w:rPr>
+          <w:b/>
+          <w:bCs/>
+        </w:rPr>
+        <w:t>Section S5</w:t>
+      </w:r>
+      <w:r>
+        <w:t>)</w:t>
+      </w:r>
+      <w:r>
+        <w:t>.</w:t>
+      </w:r>
+      <w:r>
+        <w:t xml:space="preserve"> The calibration</w:t>
       </w:r>
       <w:r>
         <w:t xml:space="preserve"> used published 14-day mass-loss measurements obtained from revised simulated body fluid (r-SBF) immersion experiments reported by Liu et al. </w:t>
@@ -12795,7 +12847,17 @@
         <w:fldChar w:fldCharType="end"/>
       </w:r>
       <w:r>
-        <w:t xml:space="preserve"> (Section S5). Optimal parameter combinations were identified by minimizing the RMSE between simulated and literature mass-loss data. </w:t>
+        <w:t xml:space="preserve"> (</w:t>
+      </w:r>
+      <w:r>
+        <w:rPr>
+          <w:b/>
+          <w:bCs/>
+        </w:rPr>
+        <w:t>Table S7</w:t>
+      </w:r>
+      <w:r>
+        <w:t xml:space="preserve">). Optimal parameter combinations were identified by minimizing the RMSE between simulated and literature mass-loss data. </w:t>
       </w:r>
       <w:r>
         <w:t xml:space="preserve">The calibrated model was then validated against the HBSS immersion dataset generated in the present study. </w:t>
@@ -12917,7 +12979,7 @@
         </m:r>
       </m:oMath>
       <w:r>
-        <w:t xml:space="preserve">. Each parameter was varied across representative values spanning its calibrated range while the remaining parameters were held constant. The resulting changes in mass loss, corrosion-film coverage, and interfacial oxygen concentration were analyzed to </w:t>
+        <w:t xml:space="preserve">. Each parameter was varied across representative values while the remaining parameters were held constant. The resulting changes in mass loss, corrosion-film coverage, and interfacial oxygen concentration were analyzed to </w:t>
       </w:r>
       <w:r>
         <w:t>investigate</w:t>
@@ -12947,7 +13009,19 @@
         <w:pStyle w:val="BodyText"/>
       </w:pPr>
       <w:r>
-        <w:t xml:space="preserve">To evaluate the transferability of the calibrated framework beyond the disc-specimen geometry used for calibration and validation, the model was applied to a six-crown Zn endovascular stent representative of previously reported stent designs </w:t>
+        <w:t xml:space="preserve">To evaluate the </w:t>
+      </w:r>
+      <w:r>
+        <w:t>framework's transferability</w:t>
+      </w:r>
+      <w:r>
+        <w:t xml:space="preserve"> beyond the </w:t>
+      </w:r>
+      <w:r>
+        <w:t>disc specimen</w:t>
+      </w:r>
+      <w:r>
+        <w:t xml:space="preserve">, the model was applied to a six-crown Zn endovascular stent representative of previously reported stent designs </w:t>
       </w:r>
       <w:r>
         <w:fldChar w:fldCharType="begin"/>
@@ -12978,7 +13052,13 @@
         <w:t>electrolyte exposure, the stent contains complex geometric features, including curved struts, junction regions, and variable strut spacing,</w:t>
       </w:r>
       <w:r>
-        <w:t xml:space="preserve"> that can generate heterogeneous local transport conditions and degradation patterns. The stent geometry was discretized into a tetrahedral finite-element mesh and embedded within a surrounding electrolyte domain using the same meshing and numerical procedures described in </w:t>
+        <w:t xml:space="preserve"> that can generate heterogeneous local transport conditions and degradation patterns. The stent geometry </w:t>
+      </w:r>
+      <w:r>
+        <w:t>used</w:t>
+      </w:r>
+      <w:r>
+        <w:t xml:space="preserve"> the same meshing and numerical procedures described in </w:t>
       </w:r>
       <w:r>
         <w:rPr>
@@ -13178,7 +13258,11 @@
         <w:t>.</w:t>
       </w:r>
       <w:r>
-        <w:t xml:space="preserve"> To quantify geometry-dependent degradation, spatial distributions of oxygen concentration, corrosion-product accumulation, and interface recession were analyzed throughout the simulation. Cross-sectional profiles extracted from representative straight-strut and crown regions were used to evaluate local penetration depth and degradation heterogeneity.</w:t>
+        <w:t xml:space="preserve"> To quantify geometry-dependent degradation, spatial distributions of oxygen concentration, corrosion-</w:t>
+      </w:r>
+      <w:r>
+        <w:lastRenderedPageBreak/>
+        <w:t>product accumulation, and interface recession were analyzed throughout the simulation. Cross-sectional profiles extracted from representative straight-strut and crown regions were used to evaluate local penetration depth and degradation heterogeneity.</w:t>
       </w:r>
     </w:p>
     <w:p>
@@ -14035,7 +14119,7 @@
         <w:pStyle w:val="BodyText"/>
       </w:pPr>
       <w:r>
-        <w:t xml:space="preserve">These parameters were then calibrated within the full 3D reaction-diffusion framework using Bayesian optimization. </w:t>
+        <w:t xml:space="preserve">These parameters were then calibrated within the 3D reaction-diffusion framework using Bayesian optimization. </w:t>
       </w:r>
       <w:r>
         <w:t>Following the initial exploration of the admissible parameter space, the optimization rapidly reduced the RMSE from approximately 0.28% to below 0.05% and identified a distinct optimum after 22 iterations</w:t>
@@ -14181,11 +14265,7 @@
         <w:t>4</w:t>
       </w:r>
       <w:r>
-        <w:t xml:space="preserve">2% against the calibration dataset. These results show that the proposed three-parameter framework can closely reproduce the calibration measurements (Section S5). The combination of low calibration error and rapid convergence supports the </w:t>
-      </w:r>
-      <w:r>
-        <w:lastRenderedPageBreak/>
-        <w:t>framework’s potential as a computationally tractable basis for predictive Zn biodegradation modeling, subject to independent validation.</w:t>
+        <w:t>2% against the calibration dataset. These results show that the proposed three-parameter framework can closely reproduce the calibration measurements. The combination of low calibration error and rapid convergence supports the framework’s potential as a computationally tractable basis for predictive Zn biodegradation modeling, subject to independent validation.</w:t>
       </w:r>
     </w:p>
     <w:p>
@@ -14204,6 +14284,7 @@
         <w:rPr>
           <w:noProof/>
         </w:rPr>
+        <w:lastRenderedPageBreak/>
         <w:drawing>
           <wp:inline distT="0" distB="0" distL="0" distR="0" wp14:anchorId="36BA34D6" wp14:editId="69364FA5">
             <wp:extent cx="5760720" cy="2099310"/>
@@ -15930,11 +16011,7 @@
         <w:t>2+</w:t>
       </w:r>
       <w:r>
-        <w:t xml:space="preserve"> into corrosion products through the film-growth term, resulting in faster film </w:t>
-      </w:r>
-      <w:r>
-        <w:lastRenderedPageBreak/>
-        <w:t>accumulation and greater surface coverage</w:t>
+        <w:t xml:space="preserve"> into corrosion products through the film-growth term, resulting in faster film accumulation and greater surface coverage</w:t>
       </w:r>
       <w:r>
         <w:t xml:space="preserve"> </w:t>
@@ -16216,6 +16293,7 @@
         <w:t xml:space="preserve"> </w:t>
       </w:r>
       <w:r>
+        <w:lastRenderedPageBreak/>
         <w:t>because oxygen reduction influences film growth only indirectly through its effect on the</w:t>
       </w:r>
       <w:r>
@@ -16416,8 +16494,18 @@
           <w:b/>
           <w:bCs/>
         </w:rPr>
-        <w:t>g–i</w:t>
-      </w:r>
+        <w:t>g–</w:t>
+      </w:r>
+      <w:proofErr w:type="spellStart"/>
+      <w:r>
+        <w:rPr>
+          <w:rFonts w:cs="Times New Roman"/>
+          <w:b/>
+          <w:bCs/>
+        </w:rPr>
+        <w:t>i</w:t>
+      </w:r>
+      <w:proofErr w:type="spellEnd"/>
       <w:r>
         <w:rPr>
           <w:rFonts w:cs="Times New Roman"/>
@@ -16875,7 +16963,15 @@
         <w:t>.</w:t>
       </w:r>
       <w:r>
-        <w:t xml:space="preserve"> Local parameter sweeps of kinetic parameters. Panels (a–c) show cumulative mass loss (%), panels (d–f) show film coverage (%), and panels (g-i) show interfacial dissolved oxygen concentration (</w:t>
+        <w:t xml:space="preserve"> Local parameter sweeps of kinetic parameters. Panels (a–c) show cumulative mass loss (%), panels (d–f) show film coverage (%), and panels (g-</w:t>
+      </w:r>
+      <w:proofErr w:type="spellStart"/>
+      <w:r>
+        <w:t>i</w:t>
+      </w:r>
+      <w:proofErr w:type="spellEnd"/>
+      <w:r>
+        <w:t>) show interfacial dissolved oxygen concentration (</w:t>
       </w:r>
       <w:r>
         <w:rPr>
@@ -18089,7 +18185,7 @@
         <w:rPr>
           <w:rFonts w:cs="Times New Roman"/>
         </w:rPr>
-        <w:t xml:space="preserve">; Section S6), with an RMSE of 0.0159% and a </w:t>
+        <w:t xml:space="preserve">), with an RMSE of 0.0159% and a </w:t>
       </w:r>
       <m:oMath>
         <m:sSup>
@@ -18238,8 +18334,13 @@
         </w:rPr>
         <w:t xml:space="preserve">. </w:t>
       </w:r>
-      <w:r>
-        <w:t xml:space="preserve">Damköhler-number analysis quantified this transition, </w:t>
+      <w:proofErr w:type="spellStart"/>
+      <w:r>
+        <w:t>Damköhler</w:t>
+      </w:r>
+      <w:proofErr w:type="spellEnd"/>
+      <w:r>
+        <w:t xml:space="preserve">-number analysis quantified this transition, </w:t>
       </w:r>
       <w:r>
         <w:t xml:space="preserve">revealing an initial degradation regime governed by cathodic reaction kinetics. After approximately </w:t>
@@ -18851,7 +18952,21 @@
         <w:rPr>
           <w:rFonts w:cs="Times New Roman"/>
         </w:rPr>
-        <w:t xml:space="preserve"> (Table S8)</w:t>
+        <w:t xml:space="preserve"> (</w:t>
+      </w:r>
+      <w:r>
+        <w:rPr>
+          <w:rFonts w:cs="Times New Roman"/>
+          <w:b/>
+          <w:bCs/>
+        </w:rPr>
+        <w:t>Table S8</w:t>
+      </w:r>
+      <w:r>
+        <w:rPr>
+          <w:rFonts w:cs="Times New Roman"/>
+        </w:rPr>
+        <w:t>)</w:t>
       </w:r>
       <w:r>
         <w:rPr>
@@ -19144,10 +19259,29 @@
         <w:t xml:space="preserve"> corrosion-product chemistry. </w:t>
       </w:r>
       <w:r>
-        <w:t>The higher mass loss is consistent with the stent's higher surface area-to-volume ratio (SA:V) compared with the disc. Across the investigated geometries, cumulative mass loss increased approximately linearly with SA:V (Figure S9), although this trend alone cannot account for the stent's behavior.</w:t>
-      </w:r>
-      <w:r>
-        <w:t xml:space="preserve"> Furthermore, the stent exhibited less pronounced temporal deceleration in mass loss than the disc, suggesting that geometry-dependent mass transport altered the evolution of degradation.</w:t>
+        <w:t>The higher mass loss is consistent with the observed relationship between surface area-to-volume ratio (SA:V) and degradation, where cumulative mass loss increased approximately linearly with SA:V</w:t>
+      </w:r>
+      <w:r>
+        <w:t xml:space="preserve"> (</w:t>
+      </w:r>
+      <w:r>
+        <w:rPr>
+          <w:b/>
+          <w:bCs/>
+        </w:rPr>
+        <w:t>Figure S9</w:t>
+      </w:r>
+      <w:r>
+        <w:t>)</w:t>
+      </w:r>
+      <w:r>
+        <w:t>.</w:t>
+      </w:r>
+      <w:r>
+        <w:t xml:space="preserve"> </w:t>
+      </w:r>
+      <w:r>
+        <w:t>However, the stent exhibited less pronounced temporal deceleration in mass loss than the disc, indicating that geometric influences on degradation extend beyond SA:V alone.</w:t>
       </w:r>
     </w:p>
     <w:p>
@@ -19224,7 +19358,13 @@
         <w:t xml:space="preserve"> </w:t>
       </w:r>
       <w:r>
-        <w:t>Consistent with this interpretation, oxygen transport became rate-limiting after approximately 100 h in the stent, compared with approximately 40 h in the disc, demonstrating that the open architecture sustained reaction-controlled degradation for longer before transitioning to oxygen-transport-limited behavior.</w:t>
+        <w:t xml:space="preserve">Consistent with this interpretation, oxygen transport became rate-limiting after approximately 100 h in the stent, compared with approximately 40 h in the disc, </w:t>
+      </w:r>
+      <w:r>
+        <w:t xml:space="preserve">showing that the open architecture sustained reaction-controlled degradation longer </w:t>
+      </w:r>
+      <w:r>
+        <w:t>before transitioning to oxygen-transport-limited behavior. This delayed onset of transport limitation maintained greater oxygen availability at the degrading surface, supporting higher corrosion rates and contributing to the increased cumulative mass loss observed in the stent.</w:t>
       </w:r>
     </w:p>
     <w:p>
@@ -19386,18 +19526,13 @@
     </w:p>
     <w:p>
       <w:pPr>
-        <w:pStyle w:val="Captions"/>
+        <w:pStyle w:val="BodyText"/>
       </w:pPr>
     </w:p>
     <w:p>
       <w:pPr>
         <w:pStyle w:val="BodyText"/>
       </w:pPr>
-    </w:p>
-    <w:p>
-      <w:pPr>
-        <w:pStyle w:val="BodyText"/>
-      </w:pPr>
       <w:r>
         <w:t>The influence of geometry-dependent transport is further revealed by the spatial evolution of degradation shown in</w:t>
       </w:r>
@@ -19550,7 +19685,14 @@
         <w:fldChar w:fldCharType="end"/>
       </w:r>
       <w:r>
-        <w:t>b; Section S7).</w:t>
+        <w:rPr>
+          <w:b/>
+          <w:bCs/>
+        </w:rPr>
+        <w:t>b</w:t>
+      </w:r>
+      <w:r>
+        <w:t>).</w:t>
       </w:r>
       <w:r>
         <w:t xml:space="preserve"> </w:t>
@@ -19789,11 +19931,11 @@
         <w:t>d</w:t>
       </w:r>
       <w:r>
-        <w:t xml:space="preserve">). </w:t>
+        <w:t xml:space="preserve">). This asymmetric recession shows that the nominal corrosion rate alone cannot predict local </w:t>
       </w:r>
       <w:r>
         <w:lastRenderedPageBreak/>
-        <w:t>This asymmetric recession shows that the nominal corrosion rate alone cannot predict local material loss because device geometry redistributes oxygen availability and corrosion activity across the implant surface.</w:t>
+        <w:t>material loss because device geometry redistributes oxygen availability and corrosion activity across the implant surface.</w:t>
       </w:r>
     </w:p>
     <w:p>
@@ -19932,7 +20074,13 @@
         <w:t>672</w:t>
       </w:r>
       <w:r>
-        <w:t> h. (a) stent geometry with two representative cross-sections and enlarged views of strut recession at 0, 3</w:t>
+        <w:t xml:space="preserve"> h. (a) </w:t>
+      </w:r>
+      <w:r>
+        <w:t>S</w:t>
+      </w:r>
+      <w:r>
+        <w:t>tent geometry with two representative cross-sections and enlarged views of strut recession at 0, 3</w:t>
       </w:r>
       <w:r>
         <w:t>36</w:t>
@@ -19944,7 +20092,15 @@
         <w:t>672</w:t>
       </w:r>
       <w:r>
-        <w:t> h, (b) schematic illustration of oxygen transport to the inner and outer-curvature surfaces of the stent crown, (c,d) evolution of the metal cross-sectional profiles at Sections 1 and 2, respectively.</w:t>
+        <w:t> h, (b) schematic illustration of oxygen transport to the inner and outer-curvature surfaces of the stent crown, (</w:t>
+      </w:r>
+      <w:proofErr w:type="spellStart"/>
+      <w:r>
+        <w:t>c,d</w:t>
+      </w:r>
+      <w:proofErr w:type="spellEnd"/>
+      <w:r>
+        <w:t>) evolution of the metal cross-sectional profiles at Sections 1 and 2, respectively.</w:t>
       </w:r>
     </w:p>
     <w:p>
@@ -19957,7 +20113,26 @@
         <w:pStyle w:val="BodyText"/>
       </w:pPr>
       <w:r>
-        <w:t>Following the stent-scale analysis, the role of individual geometric features was further isolated using simplified wire configurations (Section S7). Curvature produced only modest differences in cumulative mass loss, although mass loss increased progressively with arc angle and was highest for the 150° arc</w:t>
+        <w:t>Following the stent-scale analysis, the role of individual geometric features was further isolated using simplified wire configurations (</w:t>
+      </w:r>
+      <w:r>
+        <w:rPr>
+          <w:b/>
+          <w:bCs/>
+        </w:rPr>
+        <w:t>Section S7</w:t>
+      </w:r>
+      <w:r>
+        <w:t xml:space="preserve">). </w:t>
+      </w:r>
+      <w:r>
+        <w:t xml:space="preserve">Increasing curvature </w:t>
+      </w:r>
+      <w:r>
+        <w:t>progressively increased mass loss, with the 150° arc showing</w:t>
+      </w:r>
+      <w:r>
+        <w:t xml:space="preserve"> the highest degradation</w:t>
       </w:r>
       <w:r>
         <w:t xml:space="preserve"> (</w:t>
@@ -20000,7 +20175,16 @@
         <w:t xml:space="preserve">). </w:t>
       </w:r>
       <w:r>
-        <w:t>Although curvature redistributed degradation between the outward-facing surface and inner curvature, these opposing local effects produced only minor changes in total mass loss.</w:t>
+        <w:t xml:space="preserve">Although curvature altered the spatial distribution of degradation between the outward-facing and inner surfaces, these opposing local effects </w:t>
+      </w:r>
+      <w:r>
+        <w:t xml:space="preserve">produced only modest changes in </w:t>
+      </w:r>
+      <w:r>
+        <w:t>overall mass loss</w:t>
+      </w:r>
+      <w:r>
+        <w:t>.</w:t>
       </w:r>
       <w:r>
         <w:t xml:space="preserve"> </w:t>
@@ -20052,11 +20236,17 @@
         <w:t xml:space="preserve">). </w:t>
       </w:r>
       <w:r>
-        <w:t xml:space="preserve">The mass-loss trajectories were initially similar but diverged at later times, suggesting that spacing became increasingly important as corrosion products accumulated. At a center-to-center spacing of 0.30 mm, overlapping oxygen-depletion fields restricted oxygen availability within the gap and suppressed the overall oxygen-reduction reaction, resulting in lower cumulative mass loss. Increasing the spacing to 1.60 mm weakened </w:t>
+        <w:t xml:space="preserve">The mass-loss trajectories were initially similar but diverged </w:t>
+      </w:r>
+      <w:r>
+        <w:t>later</w:t>
+      </w:r>
+      <w:r>
+        <w:t xml:space="preserve">, suggesting that spacing became increasingly important as corrosion products accumulated. At a center-to-center spacing of 0.30 mm, overlapping oxygen-depletion fields restricted oxygen availability within the gap and suppressed the overall oxygen-reduction reaction, resulting in lower cumulative mass loss. Increasing the spacing to 1.60 mm weakened this interaction, allowing each wire to receive oxygen more independently and shifting the response toward that of the isolated wire. This transport-shielding behavior is </w:t>
       </w:r>
       <w:r>
         <w:lastRenderedPageBreak/>
-        <w:t>this interaction, allowing each wire to receive oxygen more independently and shifting the response toward that of the isolated wire. This transport-shielding behavior is consistent with observations in porous Zn scaffolds</w:t>
+        <w:t>consistent with observations in porous Zn scaffolds</w:t>
       </w:r>
       <w:r>
         <w:t xml:space="preserve"> </w:t>
@@ -20096,7 +20286,10 @@
         </w:rPr>
       </w:pPr>
       <w:r>
-        <w:t>Although the effects on cumulative mass loss were relatively modest, geometry strongly influenced the spatial distribution of degradation. Mean penetration depths ranged only from approximately 2.1 to 2.7 µm across the investigated configurations</w:t>
+        <w:t xml:space="preserve">Although the effects on cumulative mass loss were relatively modest, geometry strongly influenced the spatial distribution of degradation. Mean </w:t>
+      </w:r>
+      <w:r>
+        <w:t>penetration depths varied only slightly, ranging from approximately 2.1 to 2.7 µm across the curved-wire configurations (30°, 90°, and 150° arcs) and from 2.1 to 2.7 µm across the straight, closely spaced, and widely spaced wire configurations</w:t>
       </w:r>
       <w:r>
         <w:t xml:space="preserve"> (</w:t>
@@ -20112,7 +20305,7 @@
         <w:t xml:space="preserve">). </w:t>
       </w:r>
       <w:r>
-        <w:t>The 30°, 90°, and 150° arcs exhibited mean depths of approximately 2.4, 2.7, and 2.6 µm, respectively, while the straight, closely spaced, and widely spaced wires exhibited values of approximately 2.4, 2.1, and 2.3 µm. However, the directional recession ratios revealed substantial local asymmetry</w:t>
+        <w:t>However, the directional recession ratios revealed substantial local asymmetry</w:t>
       </w:r>
       <w:r>
         <w:t xml:space="preserve"> (</w:t>
@@ -20289,7 +20482,15 @@
         <w:t>The</w:t>
       </w:r>
       <w:r>
-        <w:t xml:space="preserve"> corrosion-product layer is treated as a homogenized ZnO-based film rather than a heterogeneous, composition-dependent structure.</w:t>
+        <w:t xml:space="preserve"> corrosion-product layer is treated as a homogenized </w:t>
+      </w:r>
+      <w:proofErr w:type="spellStart"/>
+      <w:r>
+        <w:t>ZnO</w:t>
+      </w:r>
+      <w:proofErr w:type="spellEnd"/>
+      <w:r>
+        <w:t>-based film rather than a heterogeneous, composition-dependent structure.</w:t>
       </w:r>
       <w:r>
         <w:t xml:space="preserve"> </w:t>
@@ -20373,8 +20574,19 @@
       <w:r>
         <w:t xml:space="preserve"> </w:t>
       </w:r>
-      <w:r>
-        <w:t xml:space="preserve">Structural optimization of biomedical implants, from patient-specific bone replacements to porous scaffolds, has so far targeted mechanical performance in the as-fabricated state </w:t>
+    </w:p>
+    <w:p>
+      <w:pPr>
+        <w:pStyle w:val="BodyText"/>
+      </w:pPr>
+      <w:r>
+        <w:t xml:space="preserve">Structural optimization of </w:t>
+      </w:r>
+      <w:r>
+        <w:t>biodegradable</w:t>
+      </w:r>
+      <w:r>
+        <w:t xml:space="preserve"> implants, from patient-specific bone replacements to porous scaffolds, has so far targeted mechanical performance in the as-fabricated state </w:t>
       </w:r>
       <w:r>
         <w:fldChar w:fldCharType="begin"/>
@@ -20402,13 +20614,10 @@
         <w:t>,</w:t>
       </w:r>
       <w:r>
-        <w:t xml:space="preserve"> this is insufficient</w:t>
-      </w:r>
-      <w:r>
-        <w:t xml:space="preserve"> because geometry, transport, and degradation are coupled: degradation reshapes the load-bearing structure, so mechanical properties evolve over</w:t>
-      </w:r>
-      <w:r>
-        <w:t xml:space="preserve"> time. By resolving how geometry controls local oxygen availability and recession, the present formulation supplies the degradation component that such optimization currently lacks.</w:t>
+        <w:t xml:space="preserve"> </w:t>
+      </w:r>
+      <w:r>
+        <w:t>this approach is insufficient because geometry, mass transport, and degradation evolve in a coupled manner, continuously altering the load-bearing architecture and its mechanical response. By explicitly resolving the influence of geometry on local oxygen availability and surface recession, the present framework provides the degradation component required to extend structural optimization from the initial design state to performance throughout the degradation process.</w:t>
       </w:r>
     </w:p>
     <w:p>
@@ -20432,11 +20641,21 @@
       </w:pPr>
       <w:bookmarkStart w:id="24" w:name="_Hlk238630414"/>
       <w:r>
-        <w:t xml:space="preserve">Zn biodegradation under physiological conditions becomes an oxygen-transport-controlled process after an initial reaction-controlled stage in which implant geometry governs the spatial evolution of material loss. The proposed three-parameter 3D reaction-diffusion model closely reproduced independent 28-day immersion data (RMSE = 0.0159%) and, without further calibration, predicted approximately 6% mass loss for a six-crown stent, consistent with reported in vivo observations. Mechanistic and sensitivity analyses identified oxygen availability as the primary driver of degradation, with corrosion-product accumulation progressively restricting transport and leading to diffusion-controlled behavior. Importantly, localized degradation emerged naturally from geometry-dependent transport phenomena, without imposing spatially varying corrosion </w:t>
+        <w:t xml:space="preserve">Zn biodegradation under physiological conditions becomes an oxygen-transport-controlled process after an initial reaction-controlled stage in which implant geometry governs the spatial evolution of material loss. The proposed 3D reaction-diffusion model closely reproduced independent 28-day immersion data (RMSE = 0.0159%) and, without further calibration, predicted approximately 6% mass loss for a six-crown stent, consistent with reported </w:t>
+      </w:r>
+      <w:r>
+        <w:rPr>
+          <w:i/>
+          <w:iCs/>
+        </w:rPr>
+        <w:t>in vivo</w:t>
+      </w:r>
+      <w:r>
+        <w:t xml:space="preserve"> observations. Mechanistic and sensitivity analyses identified oxygen availability as the primary driver of degradation, with corrosion-product accumulation progressively restricting transport </w:t>
       </w:r>
       <w:r>
         <w:lastRenderedPageBreak/>
-        <w:t>kinetics. While curvature and inter-strut spacing produced only modest changes in cumulative mass loss, they strongly altered the distribution of material recession, demonstrating that global degradation metrics can obscure the localized thinning responsible for structural failure. These findings establish geometry as a critical determinant of biodegradable implant performance and provide a predictive framework for integrating degradation into the design and optimization of Zn stents and other biodegradable metallic implants, enabling structural performance to be considered throughout the implant lifetime rather than only at implantation.</w:t>
+        <w:t>and leading to diffusion-controlled behavior. Importantly, localized degradation emerged naturally from geometry-dependent transport phenomena, without imposing spatially varying corrosion kinetics. While curvature and inter-strut spacing produced only modest changes in cumulative mass loss, they strongly altered the distribution of material recession, demonstrating that global degradation metrics can obscure the localized thinning responsible for structural failure. These findings establish geometry as a critical determinant of biodegradable implant performance and provide a predictive framework for integrating degradation into the design and optimization of Zn stents and other biodegradable metallic implants, enabling structural performance to be considered throughout the implant lifetime rather than only at implantation.</w:t>
       </w:r>
       <w:bookmarkEnd w:id="24"/>
     </w:p>
@@ -20472,7 +20691,15 @@
         <w:jc w:val="both"/>
       </w:pPr>
       <w:r>
-        <w:t xml:space="preserve">The authors acknowledge the use of Monash University’s High-Performance Computing (M3) facility and the Monash eResearch </w:t>
+        <w:t xml:space="preserve">The authors acknowledge the use of Monash University’s High-Performance Computing (M3) facility and the Monash </w:t>
+      </w:r>
+      <w:proofErr w:type="spellStart"/>
+      <w:r>
+        <w:t>eResearch</w:t>
+      </w:r>
+      <w:proofErr w:type="spellEnd"/>
+      <w:r>
+        <w:t xml:space="preserve"> </w:t>
       </w:r>
       <w:r>
         <w:t>Center</w:t>
@@ -20546,12 +20773,21 @@
       <w:r>
         <w:t xml:space="preserve"> Data curation, Investigation, Writing – original draft. </w:t>
       </w:r>
-      <w:r>
-        <w:rPr>
-          <w:b/>
-          <w:bCs/>
-        </w:rPr>
-        <w:t>Aijun Huang:</w:t>
+      <w:proofErr w:type="spellStart"/>
+      <w:r>
+        <w:rPr>
+          <w:b/>
+          <w:bCs/>
+        </w:rPr>
+        <w:t>Aijun</w:t>
+      </w:r>
+      <w:proofErr w:type="spellEnd"/>
+      <w:r>
+        <w:rPr>
+          <w:b/>
+          <w:bCs/>
+        </w:rPr>
+        <w:t xml:space="preserve"> Huang:</w:t>
       </w:r>
       <w:r>
         <w:t xml:space="preserve"> Conceptualization, Funding acquisition, Project administration, Supervision. </w:t>
@@ -20569,12 +20805,21 @@
       <w:r>
         <w:t xml:space="preserve"> </w:t>
       </w:r>
-      <w:r>
-        <w:rPr>
-          <w:b/>
-          <w:bCs/>
-        </w:rPr>
-        <w:t>Yuman Zhu:</w:t>
+      <w:proofErr w:type="spellStart"/>
+      <w:r>
+        <w:rPr>
+          <w:b/>
+          <w:bCs/>
+        </w:rPr>
+        <w:t>Yuman</w:t>
+      </w:r>
+      <w:proofErr w:type="spellEnd"/>
+      <w:r>
+        <w:rPr>
+          <w:b/>
+          <w:bCs/>
+        </w:rPr>
+        <w:t xml:space="preserve"> Zhu:</w:t>
       </w:r>
       <w:r>
         <w:t xml:space="preserve"> Conceptualization, Supervision, Writing – review &amp; editing.</w:t>
@@ -20650,15 +20895,17 @@
       <w:r>
         <w:t xml:space="preserve">: </w:t>
       </w:r>
-      <w:hyperlink r:id="rId23">
+      <w:hyperlink r:id="rId23" w:history="1">
         <w:r>
           <w:rPr>
             <w:rStyle w:val="Hyperlink"/>
-            <w:color w:val="0563C1"/>
           </w:rPr>
-          <w:t>https://doi.org/10.5281/zenodo.23053518</w:t>
+          <w:t>https://doi.org/10.5281/zenodo.23053517</w:t>
         </w:r>
       </w:hyperlink>
+      <w:r>
+        <w:t xml:space="preserve"> </w:t>
+      </w:r>
     </w:p>
     <w:p>
       <w:pPr>
@@ -20681,7 +20928,6 @@
           <w:b/>
           <w:bCs/>
         </w:rPr>
-        <w:lastRenderedPageBreak/>
         <w:t>Data Availability Statement</w:t>
       </w:r>
     </w:p>
@@ -24503,6 +24749,12 @@
 </file>
 
 <file path=customXml/item1.xml><?xml version="1.0" encoding="utf-8"?>
+<ControlsStorage xmlns="urn:schemas-microsoft-com.VSTO2008Demos.ControlsStorage">
+  <Controls>AAEAAAD/////AQAAAAAAAAAMAgAAAEVDaGVtNFdvcmQuQ29yZSwgVmVyc2lvbj0xLjAuMC4wLCBDdWx0dXJlPW5ldXRyYWwsIFB1YmxpY0tleVRva2VuPW51bGwHAQAAAAABAAAAAAAAAAQgQ2hlbTRXb3JkLkNvcmUuQ29udHJvbFByb3BlcnRpZXMCAAAACw==</Controls>
+</ControlsStorage>
+</file>
+
+<file path=customXml/item2.xml><?xml version="1.0" encoding="utf-8"?>
 <ct:contentTypeSchema xmlns:ct="http://schemas.microsoft.com/office/2006/metadata/contentType" xmlns:ma="http://schemas.microsoft.com/office/2006/metadata/properties/metaAttributes" ct:_="" ma:_="" ma:contentTypeName="Dokument" ma:contentTypeID="0x01010070446C3525B3CB46BD92ABA5C2617223" ma:contentTypeVersion="12" ma:contentTypeDescription="Ein neues Dokument erstellen." ma:contentTypeScope="" ma:versionID="ace6bbd061d3e3241e07436f437a906c">
   <xsd:schema xmlns:xsd="http://www.w3.org/2001/XMLSchema" xmlns:xs="http://www.w3.org/2001/XMLSchema" xmlns:p="http://schemas.microsoft.com/office/2006/metadata/properties" xmlns:ns2="981f2fdf-0e4d-4708-9882-12f25bf7d4fe" xmlns:ns3="4fe7dd48-639f-4daa-8770-f50527565b0b" targetNamespace="http://schemas.microsoft.com/office/2006/metadata/properties" ma:root="true" ma:fieldsID="645148a839964f4ba651d3ea90aa0208" ns2:_="" ns3:_="">
     <xsd:import namespace="981f2fdf-0e4d-4708-9882-12f25bf7d4fe"/>
@@ -24719,13 +24971,17 @@
 </ct:contentTypeSchema>
 </file>
 
-<file path=customXml/item2.xml><?xml version="1.0" encoding="utf-8"?>
-<ControlsStorage xmlns="urn:schemas-microsoft-com.VSTO2008Demos.ControlsStorage">
-  <Controls>AAEAAAD/////AQAAAAAAAAAMAgAAAEVDaGVtNFdvcmQuQ29yZSwgVmVyc2lvbj0xLjAuMC4wLCBDdWx0dXJlPW5ldXRyYWwsIFB1YmxpY0tleVRva2VuPW51bGwHAQAAAAABAAAAAAAAAAQgQ2hlbTRXb3JkLkNvcmUuQ29udHJvbFByb3BlcnRpZXMCAAAACw==</Controls>
-</ControlsStorage>
+<file path=customXml/item3.xml><?xml version="1.0" encoding="utf-8"?>
+<p:properties xmlns:p="http://schemas.microsoft.com/office/2006/metadata/properties" xmlns:xsi="http://www.w3.org/2001/XMLSchema-instance" xmlns:pc="http://schemas.microsoft.com/office/infopath/2007/PartnerControls">
+  <documentManagement/>
+</p:properties>
 </file>
 
-<file path=customXml/item3.xml><?xml version="1.0" encoding="utf-8"?>
+<file path=customXml/item4.xml><?xml version="1.0" encoding="utf-8"?>
+<b:Sources xmlns:b="http://schemas.openxmlformats.org/officeDocument/2006/bibliography" xmlns="http://schemas.openxmlformats.org/officeDocument/2006/bibliography" SelectedStyle="\APASixthEditionOfficeOnline.xsl" StyleName="APA" Version="6"/>
+</file>
+
+<file path=customXml/item5.xml><?xml version="1.0" encoding="utf-8"?>
 <?mso-contentType ?>
 <FormTemplates xmlns="http://schemas.microsoft.com/sharepoint/v3/contenttype/forms">
   <Display>DocumentLibraryForm</Display>
@@ -24734,17 +24990,15 @@
 </FormTemplates>
 </file>
 
-<file path=customXml/item4.xml><?xml version="1.0" encoding="utf-8"?>
-<b:Sources xmlns:b="http://schemas.openxmlformats.org/officeDocument/2006/bibliography" xmlns="http://schemas.openxmlformats.org/officeDocument/2006/bibliography" SelectedStyle="\APASixthEditionOfficeOnline.xsl" StyleName="APA" Version="6"/>
+<file path=customXml/itemProps1.xml><?xml version="1.0" encoding="utf-8"?>
+<ds:datastoreItem xmlns:ds="http://schemas.openxmlformats.org/officeDocument/2006/customXml" ds:itemID="{E3F19EBF-8207-4BE7-AD18-240ED1895C11}">
+  <ds:schemaRefs>
+    <ds:schemaRef ds:uri="urn:schemas-microsoft-com.VSTO2008Demos.ControlsStorage"/>
+  </ds:schemaRefs>
+</ds:datastoreItem>
 </file>
 
-<file path=customXml/item5.xml><?xml version="1.0" encoding="utf-8"?>
-<p:properties xmlns:p="http://schemas.microsoft.com/office/2006/metadata/properties" xmlns:xsi="http://www.w3.org/2001/XMLSchema-instance" xmlns:pc="http://schemas.microsoft.com/office/infopath/2007/PartnerControls">
-  <documentManagement/>
-</p:properties>
-</file>
-
-<file path=customXml/itemProps1.xml><?xml version="1.0" encoding="utf-8"?>
+<file path=customXml/itemProps2.xml><?xml version="1.0" encoding="utf-8"?>
 <ds:datastoreItem xmlns:ds="http://schemas.openxmlformats.org/officeDocument/2006/customXml" ds:itemID="{C86C925C-E763-4769-9959-2FEDA6D7CE8A}">
   <ds:schemaRefs>
     <ds:schemaRef ds:uri="http://schemas.microsoft.com/office/2006/metadata/contentType"/>
@@ -24763,18 +25017,11 @@
 </ds:datastoreItem>
 </file>
 
-<file path=customXml/itemProps2.xml><?xml version="1.0" encoding="utf-8"?>
-<ds:datastoreItem xmlns:ds="http://schemas.openxmlformats.org/officeDocument/2006/customXml" ds:itemID="{E3F19EBF-8207-4BE7-AD18-240ED1895C11}">
+<file path=customXml/itemProps3.xml><?xml version="1.0" encoding="utf-8"?>
+<ds:datastoreItem xmlns:ds="http://schemas.openxmlformats.org/officeDocument/2006/customXml" ds:itemID="{96D19C85-73BE-4F5D-979F-58BFDE5BBE12}">
   <ds:schemaRefs>
-    <ds:schemaRef ds:uri="urn:schemas-microsoft-com.VSTO2008Demos.ControlsStorage"/>
-  </ds:schemaRefs>
-</ds:datastoreItem>
-</file>
-
-<file path=customXml/itemProps3.xml><?xml version="1.0" encoding="utf-8"?>
-<ds:datastoreItem xmlns:ds="http://schemas.openxmlformats.org/officeDocument/2006/customXml" ds:itemID="{75886F76-A765-4714-B899-7AC2DC4334A1}">
-  <ds:schemaRefs>
-    <ds:schemaRef ds:uri="http://schemas.microsoft.com/sharepoint/v3/contenttype/forms"/>
+    <ds:schemaRef ds:uri="http://schemas.microsoft.com/office/2006/metadata/properties"/>
+    <ds:schemaRef ds:uri="http://schemas.microsoft.com/office/infopath/2007/PartnerControls"/>
   </ds:schemaRefs>
 </ds:datastoreItem>
 </file>
@@ -24788,10 +25035,9 @@
 </file>
 
 <file path=customXml/itemProps5.xml><?xml version="1.0" encoding="utf-8"?>
-<ds:datastoreItem xmlns:ds="http://schemas.openxmlformats.org/officeDocument/2006/customXml" ds:itemID="{96D19C85-73BE-4F5D-979F-58BFDE5BBE12}">
+<ds:datastoreItem xmlns:ds="http://schemas.openxmlformats.org/officeDocument/2006/customXml" ds:itemID="{75886F76-A765-4714-B899-7AC2DC4334A1}">
   <ds:schemaRefs>
-    <ds:schemaRef ds:uri="http://schemas.microsoft.com/office/2006/metadata/properties"/>
-    <ds:schemaRef ds:uri="http://schemas.microsoft.com/office/infopath/2007/PartnerControls"/>
+    <ds:schemaRef ds:uri="http://schemas.microsoft.com/sharepoint/v3/contenttype/forms"/>
   </ds:schemaRefs>
 </ds:datastoreItem>
 </file>
</xml_diff>